<commit_message>
Update architecture for waveform and timing decisions
</commit_message>
<xml_diff>
--- a/docs/architecture/VX-SSA-001_Vanguard_X_Software_System_Architecture.docx
+++ b/docs/architecture/VX-SSA-001_Vanguard_X_Software_System_Architecture.docx
@@ -877,25 +877,33 @@
       </w:r>
     </w:p>
     <w:p>
-      <w:pPr/>
+      <w:pPr>
+        <w:pStyle w:val="ListBullet"/>
+      </w:pPr>
       <w:r>
         <w:t>ADR-0010: Use a fixed 40 MS/s SDR sample rate for the initial hardware path.</w:t>
       </w:r>
     </w:p>
     <w:p>
-      <w:pPr/>
+      <w:pPr>
+        <w:pStyle w:val="ListBullet"/>
+      </w:pPr>
       <w:r>
         <w:t>ADR-0011: Use one authoritative sampled waveform for transmit, simulation and matched filtering.</w:t>
       </w:r>
     </w:p>
     <w:p>
-      <w:pPr/>
+      <w:pPr>
+        <w:pStyle w:val="ListBullet"/>
+      </w:pPr>
       <w:r>
         <w:t>ADR-0012: Make PRF and pulses per CPI operator-selectable within validated limits.</w:t>
       </w:r>
     </w:p>
     <w:p>
-      <w:pPr/>
+      <w:pPr>
+        <w:pStyle w:val="ListBullet"/>
+      </w:pPr>
       <w:r>
         <w:t>ADR-0013: Derive receive timing and sample count from waveform duration and instrumented range.</w:t>
       </w:r>
@@ -2435,7 +2443,7 @@
     </w:p>
     <w:p>
       <w:r>
-        <w:t>Waveforms are reusable immutable signal definitions stored by WaveformLibrary. Each definition contains code-family identity, chip sequence, chip count, chip rate, SDR sample rate, integer samples per chip, sampled waveform length and pulse duration. Search or track purpose is not embedded in waveform samples; an execution profile associates a waveform with task and processing intent.</w:t>
+        <w:t>Waveforms are reusable immutable signal definitions stored by WaveformLibrary. Each definition contains WaveformId, code-family identity, chip sequence, chip count, nominal chip rate, fixed SDR sample rate, integer samples per chip, sampled waveform length and pulse duration. WaveformId explicitly includes nominal chip rate, for example Frank10_10MHz or Frank10_20MHz. Search or track purpose is not embedded in waveform samples; an execution profile associates a waveform with task and processing intent.</w:t>
       </w:r>
     </w:p>
     <w:p>
@@ -2447,13 +2455,814 @@
     <w:p>
       <w:pPr/>
       <w:r>
-        <w:t>The initial 20 Mchip/s Barker13 and Frank10 definitions use two samples per chip. Barker13 therefore contains 26 transmit samples and lasts 0.65 microseconds; Frank10 contains 200 transmit samples and lasts 5.00 microseconds.</w:t>
+        <w:t>The initial search waveform is Frank10_20MHz and the initial track waveform is Barker13_20MHz. At 20 Mchip/s these use two samples per chip: Barker13_20MHz contains 26 transmit samples and lasts 0.65 microseconds; Frank10_20MHz contains 200 transmit samples and lasts 5.00 microseconds.</w:t>
       </w:r>
     </w:p>
     <w:p>
       <w:pPr/>
       <w:r>
-        <w:t>Waveform chip rates shall divide 40 MS/s by an integer until fractional resampling is deliberately implemented. The initial supported rates are 20 Mchip/s at two samples per chip and 10 Mchip/s at four samples per chip.</w:t>
+        <w:t>Waveform chip rates shall divide 40 MS/s by an integer until fractional resampling is deliberately implemented. The initial catalogue supports 10 Mchip/s at four samples per chip and 20 Mchip/s at two samples per chip. Ambiguous rate-free identifiers such as Frank10 and Barker13 shall not be used in new plans or configuration.</w:t>
+      </w:r>
+    </w:p>
+    <w:p>
+      <w:pPr>
+        <w:pStyle w:val="Heading3"/>
+      </w:pPr>
+      <w:r>
+        <w:t>10.1.1 Initial waveform identifiers</w:t>
+      </w:r>
+    </w:p>
+    <w:tbl>
+      <w:tblPr>
+        <w:tblStyle w:val="TableGrid"/>
+        <w:tblW w:type="dxa" w:w="9840"/>
+        <w:jc w:val="left"/>
+        <w:tblLayout w:type="fixed"/>
+        <w:tblLook w:firstColumn="1" w:firstRow="1" w:lastColumn="0" w:lastRow="0" w:noHBand="0" w:noVBand="1" w:val="04A0"/>
+        <w:tblInd w:type="dxa" w:w="120"/>
+      </w:tblPr>
+      <w:tblGrid>
+        <w:gridCol w:w="2700"/>
+        <w:gridCol w:w="900"/>
+        <w:gridCol w:w="1600"/>
+        <w:gridCol w:w="1550"/>
+        <w:gridCol w:w="1450"/>
+        <w:gridCol w:w="1640"/>
+      </w:tblGrid>
+      <w:tr>
+        <w:trPr>
+          <w:tblHeader w:val="true"/>
+        </w:trPr>
+        <w:tc>
+          <w:tcPr>
+            <w:tcW w:type="dxa" w:w="2700"/>
+            <w:vAlign w:val="center"/>
+            <w:tcMar>
+              <w:top w:w="70" w:type="dxa"/>
+              <w:bottom w:w="70" w:type="dxa"/>
+              <w:start w:w="100" w:type="dxa"/>
+              <w:end w:w="100" w:type="dxa"/>
+            </w:tcMar>
+          </w:tcPr>
+          <w:p>
+            <w:pPr>
+              <w:spacing w:before="0" w:after="0" w:line="240" w:lineRule="auto"/>
+              <w:jc w:val="left"/>
+            </w:pPr>
+            <w:r>
+              <w:rPr>
+                <w:b/>
+                <w:sz w:val="17"/>
+              </w:rPr>
+              <w:t>WaveformId</w:t>
+            </w:r>
+          </w:p>
+        </w:tc>
+        <w:tc>
+          <w:tcPr>
+            <w:tcW w:type="dxa" w:w="900"/>
+            <w:vAlign w:val="center"/>
+            <w:tcMar>
+              <w:top w:w="70" w:type="dxa"/>
+              <w:bottom w:w="70" w:type="dxa"/>
+              <w:start w:w="100" w:type="dxa"/>
+              <w:end w:w="100" w:type="dxa"/>
+            </w:tcMar>
+          </w:tcPr>
+          <w:p>
+            <w:pPr>
+              <w:spacing w:before="0" w:after="0" w:line="240" w:lineRule="auto"/>
+              <w:jc w:val="center"/>
+            </w:pPr>
+            <w:r>
+              <w:rPr>
+                <w:b/>
+                <w:sz w:val="17"/>
+              </w:rPr>
+              <w:t>Chips</w:t>
+            </w:r>
+          </w:p>
+        </w:tc>
+        <w:tc>
+          <w:tcPr>
+            <w:tcW w:type="dxa" w:w="1600"/>
+            <w:vAlign w:val="center"/>
+            <w:tcMar>
+              <w:top w:w="70" w:type="dxa"/>
+              <w:bottom w:w="70" w:type="dxa"/>
+              <w:start w:w="100" w:type="dxa"/>
+              <w:end w:w="100" w:type="dxa"/>
+            </w:tcMar>
+          </w:tcPr>
+          <w:p>
+            <w:pPr>
+              <w:spacing w:before="0" w:after="0" w:line="240" w:lineRule="auto"/>
+              <w:jc w:val="center"/>
+            </w:pPr>
+            <w:r>
+              <w:rPr>
+                <w:b/>
+                <w:sz w:val="17"/>
+              </w:rPr>
+              <w:t>Chip rate</w:t>
+            </w:r>
+          </w:p>
+        </w:tc>
+        <w:tc>
+          <w:tcPr>
+            <w:tcW w:type="dxa" w:w="1550"/>
+            <w:vAlign w:val="center"/>
+            <w:tcMar>
+              <w:top w:w="70" w:type="dxa"/>
+              <w:bottom w:w="70" w:type="dxa"/>
+              <w:start w:w="100" w:type="dxa"/>
+              <w:end w:w="100" w:type="dxa"/>
+            </w:tcMar>
+          </w:tcPr>
+          <w:p>
+            <w:pPr>
+              <w:spacing w:before="0" w:after="0" w:line="240" w:lineRule="auto"/>
+              <w:jc w:val="center"/>
+            </w:pPr>
+            <w:r>
+              <w:rPr>
+                <w:b/>
+                <w:sz w:val="17"/>
+              </w:rPr>
+              <w:t>Samples/chip</w:t>
+            </w:r>
+          </w:p>
+        </w:tc>
+        <w:tc>
+          <w:tcPr>
+            <w:tcW w:type="dxa" w:w="1450"/>
+            <w:vAlign w:val="center"/>
+            <w:tcMar>
+              <w:top w:w="70" w:type="dxa"/>
+              <w:bottom w:w="70" w:type="dxa"/>
+              <w:start w:w="100" w:type="dxa"/>
+              <w:end w:w="100" w:type="dxa"/>
+            </w:tcMar>
+          </w:tcPr>
+          <w:p>
+            <w:pPr>
+              <w:spacing w:before="0" w:after="0" w:line="240" w:lineRule="auto"/>
+              <w:jc w:val="center"/>
+            </w:pPr>
+            <w:r>
+              <w:rPr>
+                <w:b/>
+                <w:sz w:val="17"/>
+              </w:rPr>
+              <w:t>TX samples</w:t>
+            </w:r>
+          </w:p>
+        </w:tc>
+        <w:tc>
+          <w:tcPr>
+            <w:tcW w:type="dxa" w:w="1640"/>
+            <w:vAlign w:val="center"/>
+            <w:tcMar>
+              <w:top w:w="70" w:type="dxa"/>
+              <w:bottom w:w="70" w:type="dxa"/>
+              <w:start w:w="100" w:type="dxa"/>
+              <w:end w:w="100" w:type="dxa"/>
+            </w:tcMar>
+          </w:tcPr>
+          <w:p>
+            <w:pPr>
+              <w:spacing w:before="0" w:after="0" w:line="240" w:lineRule="auto"/>
+              <w:jc w:val="center"/>
+            </w:pPr>
+            <w:r>
+              <w:rPr>
+                <w:b/>
+                <w:sz w:val="17"/>
+              </w:rPr>
+              <w:t>Pulse duration</w:t>
+            </w:r>
+          </w:p>
+        </w:tc>
+      </w:tr>
+      <w:tr>
+        <w:trPr/>
+        <w:tc>
+          <w:tcPr>
+            <w:tcW w:type="dxa" w:w="2700"/>
+            <w:vAlign w:val="center"/>
+            <w:tcMar>
+              <w:top w:w="70" w:type="dxa"/>
+              <w:bottom w:w="70" w:type="dxa"/>
+              <w:start w:w="100" w:type="dxa"/>
+              <w:end w:w="100" w:type="dxa"/>
+            </w:tcMar>
+          </w:tcPr>
+          <w:p>
+            <w:pPr>
+              <w:spacing w:before="0" w:after="0" w:line="240" w:lineRule="auto"/>
+              <w:jc w:val="left"/>
+            </w:pPr>
+            <w:r>
+              <w:rPr>
+                <w:b w:val="0"/>
+                <w:sz w:val="17"/>
+              </w:rPr>
+              <w:t>Barker13_10MHz</w:t>
+            </w:r>
+          </w:p>
+        </w:tc>
+        <w:tc>
+          <w:tcPr>
+            <w:tcW w:type="dxa" w:w="900"/>
+            <w:vAlign w:val="center"/>
+            <w:tcMar>
+              <w:top w:w="70" w:type="dxa"/>
+              <w:bottom w:w="70" w:type="dxa"/>
+              <w:start w:w="100" w:type="dxa"/>
+              <w:end w:w="100" w:type="dxa"/>
+            </w:tcMar>
+          </w:tcPr>
+          <w:p>
+            <w:pPr>
+              <w:spacing w:before="0" w:after="0" w:line="240" w:lineRule="auto"/>
+              <w:jc w:val="center"/>
+            </w:pPr>
+            <w:r>
+              <w:rPr>
+                <w:b w:val="0"/>
+                <w:sz w:val="17"/>
+              </w:rPr>
+              <w:t>13</w:t>
+            </w:r>
+          </w:p>
+        </w:tc>
+        <w:tc>
+          <w:tcPr>
+            <w:tcW w:type="dxa" w:w="1600"/>
+            <w:vAlign w:val="center"/>
+            <w:tcMar>
+              <w:top w:w="70" w:type="dxa"/>
+              <w:bottom w:w="70" w:type="dxa"/>
+              <w:start w:w="100" w:type="dxa"/>
+              <w:end w:w="100" w:type="dxa"/>
+            </w:tcMar>
+          </w:tcPr>
+          <w:p>
+            <w:pPr>
+              <w:spacing w:before="0" w:after="0" w:line="240" w:lineRule="auto"/>
+              <w:jc w:val="center"/>
+            </w:pPr>
+            <w:r>
+              <w:rPr>
+                <w:b w:val="0"/>
+                <w:sz w:val="17"/>
+              </w:rPr>
+              <w:t>10 Mchip/s</w:t>
+            </w:r>
+          </w:p>
+        </w:tc>
+        <w:tc>
+          <w:tcPr>
+            <w:tcW w:type="dxa" w:w="1550"/>
+            <w:vAlign w:val="center"/>
+            <w:tcMar>
+              <w:top w:w="70" w:type="dxa"/>
+              <w:bottom w:w="70" w:type="dxa"/>
+              <w:start w:w="100" w:type="dxa"/>
+              <w:end w:w="100" w:type="dxa"/>
+            </w:tcMar>
+          </w:tcPr>
+          <w:p>
+            <w:pPr>
+              <w:spacing w:before="0" w:after="0" w:line="240" w:lineRule="auto"/>
+              <w:jc w:val="center"/>
+            </w:pPr>
+            <w:r>
+              <w:rPr>
+                <w:b w:val="0"/>
+                <w:sz w:val="17"/>
+              </w:rPr>
+              <w:t>4</w:t>
+            </w:r>
+          </w:p>
+        </w:tc>
+        <w:tc>
+          <w:tcPr>
+            <w:tcW w:type="dxa" w:w="1450"/>
+            <w:vAlign w:val="center"/>
+            <w:tcMar>
+              <w:top w:w="70" w:type="dxa"/>
+              <w:bottom w:w="70" w:type="dxa"/>
+              <w:start w:w="100" w:type="dxa"/>
+              <w:end w:w="100" w:type="dxa"/>
+            </w:tcMar>
+          </w:tcPr>
+          <w:p>
+            <w:pPr>
+              <w:spacing w:before="0" w:after="0" w:line="240" w:lineRule="auto"/>
+              <w:jc w:val="center"/>
+            </w:pPr>
+            <w:r>
+              <w:rPr>
+                <w:b w:val="0"/>
+                <w:sz w:val="17"/>
+              </w:rPr>
+              <w:t>52</w:t>
+            </w:r>
+          </w:p>
+        </w:tc>
+        <w:tc>
+          <w:tcPr>
+            <w:tcW w:type="dxa" w:w="1640"/>
+            <w:vAlign w:val="center"/>
+            <w:tcMar>
+              <w:top w:w="70" w:type="dxa"/>
+              <w:bottom w:w="70" w:type="dxa"/>
+              <w:start w:w="100" w:type="dxa"/>
+              <w:end w:w="100" w:type="dxa"/>
+            </w:tcMar>
+          </w:tcPr>
+          <w:p>
+            <w:pPr>
+              <w:spacing w:before="0" w:after="0" w:line="240" w:lineRule="auto"/>
+              <w:jc w:val="center"/>
+            </w:pPr>
+            <w:r>
+              <w:rPr>
+                <w:b w:val="0"/>
+                <w:sz w:val="17"/>
+              </w:rPr>
+              <w:t>1.30 µs</w:t>
+            </w:r>
+          </w:p>
+        </w:tc>
+      </w:tr>
+      <w:tr>
+        <w:trPr/>
+        <w:tc>
+          <w:tcPr>
+            <w:tcW w:type="dxa" w:w="2700"/>
+            <w:vAlign w:val="center"/>
+            <w:tcMar>
+              <w:top w:w="70" w:type="dxa"/>
+              <w:bottom w:w="70" w:type="dxa"/>
+              <w:start w:w="100" w:type="dxa"/>
+              <w:end w:w="100" w:type="dxa"/>
+            </w:tcMar>
+          </w:tcPr>
+          <w:p>
+            <w:pPr>
+              <w:spacing w:before="0" w:after="0" w:line="240" w:lineRule="auto"/>
+              <w:jc w:val="left"/>
+            </w:pPr>
+            <w:r>
+              <w:rPr>
+                <w:b w:val="0"/>
+                <w:sz w:val="17"/>
+              </w:rPr>
+              <w:t>Barker13_20MHz</w:t>
+            </w:r>
+          </w:p>
+        </w:tc>
+        <w:tc>
+          <w:tcPr>
+            <w:tcW w:type="dxa" w:w="900"/>
+            <w:vAlign w:val="center"/>
+            <w:tcMar>
+              <w:top w:w="70" w:type="dxa"/>
+              <w:bottom w:w="70" w:type="dxa"/>
+              <w:start w:w="100" w:type="dxa"/>
+              <w:end w:w="100" w:type="dxa"/>
+            </w:tcMar>
+          </w:tcPr>
+          <w:p>
+            <w:pPr>
+              <w:spacing w:before="0" w:after="0" w:line="240" w:lineRule="auto"/>
+              <w:jc w:val="center"/>
+            </w:pPr>
+            <w:r>
+              <w:rPr>
+                <w:b w:val="0"/>
+                <w:sz w:val="17"/>
+              </w:rPr>
+              <w:t>13</w:t>
+            </w:r>
+          </w:p>
+        </w:tc>
+        <w:tc>
+          <w:tcPr>
+            <w:tcW w:type="dxa" w:w="1600"/>
+            <w:vAlign w:val="center"/>
+            <w:tcMar>
+              <w:top w:w="70" w:type="dxa"/>
+              <w:bottom w:w="70" w:type="dxa"/>
+              <w:start w:w="100" w:type="dxa"/>
+              <w:end w:w="100" w:type="dxa"/>
+            </w:tcMar>
+          </w:tcPr>
+          <w:p>
+            <w:pPr>
+              <w:spacing w:before="0" w:after="0" w:line="240" w:lineRule="auto"/>
+              <w:jc w:val="center"/>
+            </w:pPr>
+            <w:r>
+              <w:rPr>
+                <w:b w:val="0"/>
+                <w:sz w:val="17"/>
+              </w:rPr>
+              <w:t>20 Mchip/s</w:t>
+            </w:r>
+          </w:p>
+        </w:tc>
+        <w:tc>
+          <w:tcPr>
+            <w:tcW w:type="dxa" w:w="1550"/>
+            <w:vAlign w:val="center"/>
+            <w:tcMar>
+              <w:top w:w="70" w:type="dxa"/>
+              <w:bottom w:w="70" w:type="dxa"/>
+              <w:start w:w="100" w:type="dxa"/>
+              <w:end w:w="100" w:type="dxa"/>
+            </w:tcMar>
+          </w:tcPr>
+          <w:p>
+            <w:pPr>
+              <w:spacing w:before="0" w:after="0" w:line="240" w:lineRule="auto"/>
+              <w:jc w:val="center"/>
+            </w:pPr>
+            <w:r>
+              <w:rPr>
+                <w:b w:val="0"/>
+                <w:sz w:val="17"/>
+              </w:rPr>
+              <w:t>2</w:t>
+            </w:r>
+          </w:p>
+        </w:tc>
+        <w:tc>
+          <w:tcPr>
+            <w:tcW w:type="dxa" w:w="1450"/>
+            <w:vAlign w:val="center"/>
+            <w:tcMar>
+              <w:top w:w="70" w:type="dxa"/>
+              <w:bottom w:w="70" w:type="dxa"/>
+              <w:start w:w="100" w:type="dxa"/>
+              <w:end w:w="100" w:type="dxa"/>
+            </w:tcMar>
+          </w:tcPr>
+          <w:p>
+            <w:pPr>
+              <w:spacing w:before="0" w:after="0" w:line="240" w:lineRule="auto"/>
+              <w:jc w:val="center"/>
+            </w:pPr>
+            <w:r>
+              <w:rPr>
+                <w:b w:val="0"/>
+                <w:sz w:val="17"/>
+              </w:rPr>
+              <w:t>26</w:t>
+            </w:r>
+          </w:p>
+        </w:tc>
+        <w:tc>
+          <w:tcPr>
+            <w:tcW w:type="dxa" w:w="1640"/>
+            <w:vAlign w:val="center"/>
+            <w:tcMar>
+              <w:top w:w="70" w:type="dxa"/>
+              <w:bottom w:w="70" w:type="dxa"/>
+              <w:start w:w="100" w:type="dxa"/>
+              <w:end w:w="100" w:type="dxa"/>
+            </w:tcMar>
+          </w:tcPr>
+          <w:p>
+            <w:pPr>
+              <w:spacing w:before="0" w:after="0" w:line="240" w:lineRule="auto"/>
+              <w:jc w:val="center"/>
+            </w:pPr>
+            <w:r>
+              <w:rPr>
+                <w:b w:val="0"/>
+                <w:sz w:val="17"/>
+              </w:rPr>
+              <w:t>0.65 µs</w:t>
+            </w:r>
+          </w:p>
+        </w:tc>
+      </w:tr>
+      <w:tr>
+        <w:trPr/>
+        <w:tc>
+          <w:tcPr>
+            <w:tcW w:type="dxa" w:w="2700"/>
+            <w:vAlign w:val="center"/>
+            <w:tcMar>
+              <w:top w:w="70" w:type="dxa"/>
+              <w:bottom w:w="70" w:type="dxa"/>
+              <w:start w:w="100" w:type="dxa"/>
+              <w:end w:w="100" w:type="dxa"/>
+            </w:tcMar>
+          </w:tcPr>
+          <w:p>
+            <w:pPr>
+              <w:spacing w:before="0" w:after="0" w:line="240" w:lineRule="auto"/>
+              <w:jc w:val="left"/>
+            </w:pPr>
+            <w:r>
+              <w:rPr>
+                <w:b w:val="0"/>
+                <w:sz w:val="17"/>
+              </w:rPr>
+              <w:t>Frank10_10MHz</w:t>
+            </w:r>
+          </w:p>
+        </w:tc>
+        <w:tc>
+          <w:tcPr>
+            <w:tcW w:type="dxa" w:w="900"/>
+            <w:vAlign w:val="center"/>
+            <w:tcMar>
+              <w:top w:w="70" w:type="dxa"/>
+              <w:bottom w:w="70" w:type="dxa"/>
+              <w:start w:w="100" w:type="dxa"/>
+              <w:end w:w="100" w:type="dxa"/>
+            </w:tcMar>
+          </w:tcPr>
+          <w:p>
+            <w:pPr>
+              <w:spacing w:before="0" w:after="0" w:line="240" w:lineRule="auto"/>
+              <w:jc w:val="center"/>
+            </w:pPr>
+            <w:r>
+              <w:rPr>
+                <w:b w:val="0"/>
+                <w:sz w:val="17"/>
+              </w:rPr>
+              <w:t>100</w:t>
+            </w:r>
+          </w:p>
+        </w:tc>
+        <w:tc>
+          <w:tcPr>
+            <w:tcW w:type="dxa" w:w="1600"/>
+            <w:vAlign w:val="center"/>
+            <w:tcMar>
+              <w:top w:w="70" w:type="dxa"/>
+              <w:bottom w:w="70" w:type="dxa"/>
+              <w:start w:w="100" w:type="dxa"/>
+              <w:end w:w="100" w:type="dxa"/>
+            </w:tcMar>
+          </w:tcPr>
+          <w:p>
+            <w:pPr>
+              <w:spacing w:before="0" w:after="0" w:line="240" w:lineRule="auto"/>
+              <w:jc w:val="center"/>
+            </w:pPr>
+            <w:r>
+              <w:rPr>
+                <w:b w:val="0"/>
+                <w:sz w:val="17"/>
+              </w:rPr>
+              <w:t>10 Mchip/s</w:t>
+            </w:r>
+          </w:p>
+        </w:tc>
+        <w:tc>
+          <w:tcPr>
+            <w:tcW w:type="dxa" w:w="1550"/>
+            <w:vAlign w:val="center"/>
+            <w:tcMar>
+              <w:top w:w="70" w:type="dxa"/>
+              <w:bottom w:w="70" w:type="dxa"/>
+              <w:start w:w="100" w:type="dxa"/>
+              <w:end w:w="100" w:type="dxa"/>
+            </w:tcMar>
+          </w:tcPr>
+          <w:p>
+            <w:pPr>
+              <w:spacing w:before="0" w:after="0" w:line="240" w:lineRule="auto"/>
+              <w:jc w:val="center"/>
+            </w:pPr>
+            <w:r>
+              <w:rPr>
+                <w:b w:val="0"/>
+                <w:sz w:val="17"/>
+              </w:rPr>
+              <w:t>4</w:t>
+            </w:r>
+          </w:p>
+        </w:tc>
+        <w:tc>
+          <w:tcPr>
+            <w:tcW w:type="dxa" w:w="1450"/>
+            <w:vAlign w:val="center"/>
+            <w:tcMar>
+              <w:top w:w="70" w:type="dxa"/>
+              <w:bottom w:w="70" w:type="dxa"/>
+              <w:start w:w="100" w:type="dxa"/>
+              <w:end w:w="100" w:type="dxa"/>
+            </w:tcMar>
+          </w:tcPr>
+          <w:p>
+            <w:pPr>
+              <w:spacing w:before="0" w:after="0" w:line="240" w:lineRule="auto"/>
+              <w:jc w:val="center"/>
+            </w:pPr>
+            <w:r>
+              <w:rPr>
+                <w:b w:val="0"/>
+                <w:sz w:val="17"/>
+              </w:rPr>
+              <w:t>400</w:t>
+            </w:r>
+          </w:p>
+        </w:tc>
+        <w:tc>
+          <w:tcPr>
+            <w:tcW w:type="dxa" w:w="1640"/>
+            <w:vAlign w:val="center"/>
+            <w:tcMar>
+              <w:top w:w="70" w:type="dxa"/>
+              <w:bottom w:w="70" w:type="dxa"/>
+              <w:start w:w="100" w:type="dxa"/>
+              <w:end w:w="100" w:type="dxa"/>
+            </w:tcMar>
+          </w:tcPr>
+          <w:p>
+            <w:pPr>
+              <w:spacing w:before="0" w:after="0" w:line="240" w:lineRule="auto"/>
+              <w:jc w:val="center"/>
+            </w:pPr>
+            <w:r>
+              <w:rPr>
+                <w:b w:val="0"/>
+                <w:sz w:val="17"/>
+              </w:rPr>
+              <w:t>10.00 µs</w:t>
+            </w:r>
+          </w:p>
+        </w:tc>
+      </w:tr>
+      <w:tr>
+        <w:trPr/>
+        <w:tc>
+          <w:tcPr>
+            <w:tcW w:type="dxa" w:w="2700"/>
+            <w:vAlign w:val="center"/>
+            <w:tcMar>
+              <w:top w:w="70" w:type="dxa"/>
+              <w:bottom w:w="70" w:type="dxa"/>
+              <w:start w:w="100" w:type="dxa"/>
+              <w:end w:w="100" w:type="dxa"/>
+            </w:tcMar>
+          </w:tcPr>
+          <w:p>
+            <w:pPr>
+              <w:spacing w:before="0" w:after="0" w:line="240" w:lineRule="auto"/>
+              <w:jc w:val="left"/>
+            </w:pPr>
+            <w:r>
+              <w:rPr>
+                <w:b w:val="0"/>
+                <w:sz w:val="17"/>
+              </w:rPr>
+              <w:t>Frank10_20MHz</w:t>
+            </w:r>
+          </w:p>
+        </w:tc>
+        <w:tc>
+          <w:tcPr>
+            <w:tcW w:type="dxa" w:w="900"/>
+            <w:vAlign w:val="center"/>
+            <w:tcMar>
+              <w:top w:w="70" w:type="dxa"/>
+              <w:bottom w:w="70" w:type="dxa"/>
+              <w:start w:w="100" w:type="dxa"/>
+              <w:end w:w="100" w:type="dxa"/>
+            </w:tcMar>
+          </w:tcPr>
+          <w:p>
+            <w:pPr>
+              <w:spacing w:before="0" w:after="0" w:line="240" w:lineRule="auto"/>
+              <w:jc w:val="center"/>
+            </w:pPr>
+            <w:r>
+              <w:rPr>
+                <w:b w:val="0"/>
+                <w:sz w:val="17"/>
+              </w:rPr>
+              <w:t>100</w:t>
+            </w:r>
+          </w:p>
+        </w:tc>
+        <w:tc>
+          <w:tcPr>
+            <w:tcW w:type="dxa" w:w="1600"/>
+            <w:vAlign w:val="center"/>
+            <w:tcMar>
+              <w:top w:w="70" w:type="dxa"/>
+              <w:bottom w:w="70" w:type="dxa"/>
+              <w:start w:w="100" w:type="dxa"/>
+              <w:end w:w="100" w:type="dxa"/>
+            </w:tcMar>
+          </w:tcPr>
+          <w:p>
+            <w:pPr>
+              <w:spacing w:before="0" w:after="0" w:line="240" w:lineRule="auto"/>
+              <w:jc w:val="center"/>
+            </w:pPr>
+            <w:r>
+              <w:rPr>
+                <w:b w:val="0"/>
+                <w:sz w:val="17"/>
+              </w:rPr>
+              <w:t>20 Mchip/s</w:t>
+            </w:r>
+          </w:p>
+        </w:tc>
+        <w:tc>
+          <w:tcPr>
+            <w:tcW w:type="dxa" w:w="1550"/>
+            <w:vAlign w:val="center"/>
+            <w:tcMar>
+              <w:top w:w="70" w:type="dxa"/>
+              <w:bottom w:w="70" w:type="dxa"/>
+              <w:start w:w="100" w:type="dxa"/>
+              <w:end w:w="100" w:type="dxa"/>
+            </w:tcMar>
+          </w:tcPr>
+          <w:p>
+            <w:pPr>
+              <w:spacing w:before="0" w:after="0" w:line="240" w:lineRule="auto"/>
+              <w:jc w:val="center"/>
+            </w:pPr>
+            <w:r>
+              <w:rPr>
+                <w:b w:val="0"/>
+                <w:sz w:val="17"/>
+              </w:rPr>
+              <w:t>2</w:t>
+            </w:r>
+          </w:p>
+        </w:tc>
+        <w:tc>
+          <w:tcPr>
+            <w:tcW w:type="dxa" w:w="1450"/>
+            <w:vAlign w:val="center"/>
+            <w:tcMar>
+              <w:top w:w="70" w:type="dxa"/>
+              <w:bottom w:w="70" w:type="dxa"/>
+              <w:start w:w="100" w:type="dxa"/>
+              <w:end w:w="100" w:type="dxa"/>
+            </w:tcMar>
+          </w:tcPr>
+          <w:p>
+            <w:pPr>
+              <w:spacing w:before="0" w:after="0" w:line="240" w:lineRule="auto"/>
+              <w:jc w:val="center"/>
+            </w:pPr>
+            <w:r>
+              <w:rPr>
+                <w:b w:val="0"/>
+                <w:sz w:val="17"/>
+              </w:rPr>
+              <w:t>200</w:t>
+            </w:r>
+          </w:p>
+        </w:tc>
+        <w:tc>
+          <w:tcPr>
+            <w:tcW w:type="dxa" w:w="1640"/>
+            <w:vAlign w:val="center"/>
+            <w:tcMar>
+              <w:top w:w="70" w:type="dxa"/>
+              <w:bottom w:w="70" w:type="dxa"/>
+              <w:start w:w="100" w:type="dxa"/>
+              <w:end w:w="100" w:type="dxa"/>
+            </w:tcMar>
+          </w:tcPr>
+          <w:p>
+            <w:pPr>
+              <w:spacing w:before="0" w:after="0" w:line="240" w:lineRule="auto"/>
+              <w:jc w:val="center"/>
+            </w:pPr>
+            <w:r>
+              <w:rPr>
+                <w:b w:val="0"/>
+                <w:sz w:val="17"/>
+              </w:rPr>
+              <w:t>5.00 µs</w:t>
+            </w:r>
+          </w:p>
+        </w:tc>
+      </w:tr>
+    </w:tbl>
+    <w:p>
+      <w:pPr>
+        <w:spacing w:before="80" w:after="60"/>
+      </w:pPr>
+      <w:r>
+        <w:t>The spelling and capitalisation of each WaveformId are part of the software interface. The suffix records nominal chip rate; it does not change the fixed 40 MS/s SDR sample rate.</w:t>
       </w:r>
     </w:p>
     <w:p>
@@ -4888,7 +5697,7 @@
         <w:pStyle w:val="ListBullet"/>
       </w:pPr>
       <w:r>
-        <w:t>Verification that 20 Mchip/s Barker13 and Frank10 waveforms contain 26 and 200 samples respectively at 40 MS/s.</w:t>
+        <w:t>Verification that Barker13_20MHz and Frank10_20MHz contain 26 and 200 samples respectively, and that Barker13_10MHz and Frank10_10MHz contain 52 and 400 samples respectively, at the fixed 40 MS/s sample rate.</w:t>
       </w:r>
     </w:p>
     <w:p>
@@ -4918,32 +5727,47 @@
     <w:tbl>
       <w:tblPr>
         <w:tblStyle w:val="TableGrid"/>
-        <w:tblW w:type="auto" w:w="0"/>
-        <w:jc w:val="center"/>
+        <w:tblW w:type="dxa" w:w="9840"/>
+        <w:jc w:val="left"/>
+        <w:tblLayout w:type="fixed"/>
         <w:tblLook w:firstColumn="1" w:firstRow="1" w:lastColumn="0" w:lastRow="0" w:noHBand="0" w:noVBand="1" w:val="04A0"/>
+        <w:tblInd w:type="dxa" w:w="120"/>
       </w:tblPr>
       <w:tblGrid>
-        <w:gridCol w:w="2016"/>
-        <w:gridCol w:w="2016"/>
-        <w:gridCol w:w="2016"/>
-        <w:gridCol w:w="2016"/>
-        <w:gridCol w:w="2016"/>
+        <w:gridCol w:w="1250"/>
+        <w:gridCol w:w="2600"/>
+        <w:gridCol w:w="1400"/>
+        <w:gridCol w:w="2300"/>
+        <w:gridCol w:w="2290"/>
       </w:tblGrid>
       <w:tr>
         <w:trPr>
           <w:tblHeader/>
           <w:cantSplit/>
+          <w:tblHeader w:val="true"/>
         </w:trPr>
         <w:tc>
           <w:tcPr>
-            <w:tcW w:type="dxa" w:w="2016"/>
+            <w:tcW w:type="dxa" w:w="1250"/>
             <w:shd w:fill="1F4E79"/>
-          </w:tcPr>
-          <w:p>
+            <w:vAlign w:val="center"/>
+            <w:tcMar>
+              <w:top w:w="55" w:type="dxa"/>
+              <w:bottom w:w="55" w:type="dxa"/>
+              <w:start w:w="80" w:type="dxa"/>
+              <w:end w:w="80" w:type="dxa"/>
+            </w:tcMar>
+          </w:tcPr>
+          <w:p>
+            <w:pPr>
+              <w:spacing w:before="0" w:after="0" w:line="240" w:lineRule="auto"/>
+              <w:jc w:val="left"/>
+            </w:pPr>
             <w:r>
               <w:rPr>
                 <w:b/>
                 <w:color w:val="FFFFFF"/>
+                <w:sz w:val="16"/>
               </w:rPr>
               <w:t>Requirement</w:t>
             </w:r>
@@ -4951,14 +5775,26 @@
         </w:tc>
         <w:tc>
           <w:tcPr>
-            <w:tcW w:type="dxa" w:w="2016"/>
+            <w:tcW w:type="dxa" w:w="2600"/>
             <w:shd w:fill="1F4E79"/>
-          </w:tcPr>
-          <w:p>
+            <w:vAlign w:val="center"/>
+            <w:tcMar>
+              <w:top w:w="55" w:type="dxa"/>
+              <w:bottom w:w="55" w:type="dxa"/>
+              <w:start w:w="80" w:type="dxa"/>
+              <w:end w:w="80" w:type="dxa"/>
+            </w:tcMar>
+          </w:tcPr>
+          <w:p>
+            <w:pPr>
+              <w:spacing w:before="0" w:after="0" w:line="240" w:lineRule="auto"/>
+              <w:jc w:val="left"/>
+            </w:pPr>
             <w:r>
               <w:rPr>
                 <w:b/>
                 <w:color w:val="FFFFFF"/>
+                <w:sz w:val="16"/>
               </w:rPr>
               <w:t>Statement</w:t>
             </w:r>
@@ -4966,14 +5802,26 @@
         </w:tc>
         <w:tc>
           <w:tcPr>
-            <w:tcW w:type="dxa" w:w="2016"/>
+            <w:tcW w:type="dxa" w:w="1400"/>
             <w:shd w:fill="1F4E79"/>
-          </w:tcPr>
-          <w:p>
+            <w:vAlign w:val="center"/>
+            <w:tcMar>
+              <w:top w:w="55" w:type="dxa"/>
+              <w:bottom w:w="55" w:type="dxa"/>
+              <w:start w:w="80" w:type="dxa"/>
+              <w:end w:w="80" w:type="dxa"/>
+            </w:tcMar>
+          </w:tcPr>
+          <w:p>
+            <w:pPr>
+              <w:spacing w:before="0" w:after="0" w:line="240" w:lineRule="auto"/>
+              <w:jc w:val="left"/>
+            </w:pPr>
             <w:r>
               <w:rPr>
                 <w:b/>
                 <w:color w:val="FFFFFF"/>
+                <w:sz w:val="16"/>
               </w:rPr>
               <w:t>Architecture</w:t>
             </w:r>
@@ -4981,14 +5829,26 @@
         </w:tc>
         <w:tc>
           <w:tcPr>
-            <w:tcW w:type="dxa" w:w="2016"/>
+            <w:tcW w:type="dxa" w:w="2300"/>
             <w:shd w:fill="1F4E79"/>
-          </w:tcPr>
-          <w:p>
+            <w:vAlign w:val="center"/>
+            <w:tcMar>
+              <w:top w:w="55" w:type="dxa"/>
+              <w:bottom w:w="55" w:type="dxa"/>
+              <w:start w:w="80" w:type="dxa"/>
+              <w:end w:w="80" w:type="dxa"/>
+            </w:tcMar>
+          </w:tcPr>
+          <w:p>
+            <w:pPr>
+              <w:spacing w:before="0" w:after="0" w:line="240" w:lineRule="auto"/>
+              <w:jc w:val="left"/>
+            </w:pPr>
             <w:r>
               <w:rPr>
                 <w:b/>
                 <w:color w:val="FFFFFF"/>
+                <w:sz w:val="16"/>
               </w:rPr>
               <w:t>Implementation</w:t>
             </w:r>
@@ -4996,14 +5856,26 @@
         </w:tc>
         <w:tc>
           <w:tcPr>
-            <w:tcW w:type="dxa" w:w="2016"/>
+            <w:tcW w:type="dxa" w:w="2290"/>
             <w:shd w:fill="1F4E79"/>
-          </w:tcPr>
-          <w:p>
+            <w:vAlign w:val="center"/>
+            <w:tcMar>
+              <w:top w:w="55" w:type="dxa"/>
+              <w:bottom w:w="55" w:type="dxa"/>
+              <w:start w:w="80" w:type="dxa"/>
+              <w:end w:w="80" w:type="dxa"/>
+            </w:tcMar>
+          </w:tcPr>
+          <w:p>
+            <w:pPr>
+              <w:spacing w:before="0" w:after="0" w:line="240" w:lineRule="auto"/>
+              <w:jc w:val="left"/>
+            </w:pPr>
             <w:r>
               <w:rPr>
                 <w:b/>
                 <w:color w:val="FFFFFF"/>
+                <w:sz w:val="16"/>
               </w:rPr>
               <w:t>Verification</w:t>
             </w:r>
@@ -5016,50 +5888,125 @@
         </w:trPr>
         <w:tc>
           <w:tcPr>
-            <w:tcW w:type="dxa" w:w="2016"/>
-          </w:tcPr>
-          <w:p>
-            <w:r>
+            <w:tcW w:type="dxa" w:w="1250"/>
+            <w:vAlign w:val="center"/>
+            <w:tcMar>
+              <w:top w:w="55" w:type="dxa"/>
+              <w:bottom w:w="55" w:type="dxa"/>
+              <w:start w:w="80" w:type="dxa"/>
+              <w:end w:w="80" w:type="dxa"/>
+            </w:tcMar>
+          </w:tcPr>
+          <w:p>
+            <w:pPr>
+              <w:spacing w:before="0" w:after="0" w:line="240" w:lineRule="auto"/>
+              <w:jc w:val="left"/>
+            </w:pPr>
+            <w:r>
+              <w:rPr>
+                <w:b w:val="0"/>
+                <w:sz w:val="16"/>
+              </w:rPr>
               <w:t>VX-SYS-001</w:t>
             </w:r>
           </w:p>
         </w:tc>
         <w:tc>
           <w:tcPr>
-            <w:tcW w:type="dxa" w:w="2016"/>
-          </w:tcPr>
-          <w:p>
-            <w:r>
+            <w:tcW w:type="dxa" w:w="2600"/>
+            <w:vAlign w:val="center"/>
+            <w:tcMar>
+              <w:top w:w="55" w:type="dxa"/>
+              <w:bottom w:w="55" w:type="dxa"/>
+              <w:start w:w="80" w:type="dxa"/>
+              <w:end w:w="80" w:type="dxa"/>
+            </w:tcMar>
+          </w:tcPr>
+          <w:p>
+            <w:pPr>
+              <w:spacing w:before="0" w:after="0" w:line="240" w:lineRule="auto"/>
+              <w:jc w:val="left"/>
+            </w:pPr>
+            <w:r>
+              <w:rPr>
+                <w:b w:val="0"/>
+                <w:sz w:val="16"/>
+              </w:rPr>
               <w:t>Simulation and hardware sources shall use a common operational interface.</w:t>
             </w:r>
           </w:p>
         </w:tc>
         <w:tc>
           <w:tcPr>
-            <w:tcW w:type="dxa" w:w="2016"/>
-          </w:tcPr>
-          <w:p>
-            <w:r>
+            <w:tcW w:type="dxa" w:w="1400"/>
+            <w:vAlign w:val="center"/>
+            <w:tcMar>
+              <w:top w:w="55" w:type="dxa"/>
+              <w:bottom w:w="55" w:type="dxa"/>
+              <w:start w:w="80" w:type="dxa"/>
+              <w:end w:w="80" w:type="dxa"/>
+            </w:tcMar>
+          </w:tcPr>
+          <w:p>
+            <w:pPr>
+              <w:spacing w:before="0" w:after="0" w:line="240" w:lineRule="auto"/>
+              <w:jc w:val="left"/>
+            </w:pPr>
+            <w:r>
+              <w:rPr>
+                <w:b w:val="0"/>
+                <w:sz w:val="16"/>
+              </w:rPr>
               <w:t>Sections 4, 9, 15</w:t>
             </w:r>
           </w:p>
         </w:tc>
         <w:tc>
           <w:tcPr>
-            <w:tcW w:type="dxa" w:w="2016"/>
-          </w:tcPr>
-          <w:p>
-            <w:r>
+            <w:tcW w:type="dxa" w:w="2300"/>
+            <w:vAlign w:val="center"/>
+            <w:tcMar>
+              <w:top w:w="55" w:type="dxa"/>
+              <w:bottom w:w="55" w:type="dxa"/>
+              <w:start w:w="80" w:type="dxa"/>
+              <w:end w:w="80" w:type="dxa"/>
+            </w:tcMar>
+          </w:tcPr>
+          <w:p>
+            <w:pPr>
+              <w:spacing w:before="0" w:after="0" w:line="240" w:lineRule="auto"/>
+              <w:jc w:val="left"/>
+            </w:pPr>
+            <w:r>
+              <w:rPr>
+                <w:b w:val="0"/>
+                <w:sz w:val="16"/>
+              </w:rPr>
               <w:t>SimulatedSource.py; EttusRadarSource.py</w:t>
             </w:r>
           </w:p>
         </w:tc>
         <w:tc>
           <w:tcPr>
-            <w:tcW w:type="dxa" w:w="2016"/>
-          </w:tcPr>
-          <w:p>
-            <w:r>
+            <w:tcW w:type="dxa" w:w="2290"/>
+            <w:vAlign w:val="center"/>
+            <w:tcMar>
+              <w:top w:w="55" w:type="dxa"/>
+              <w:bottom w:w="55" w:type="dxa"/>
+              <w:start w:w="80" w:type="dxa"/>
+              <w:end w:w="80" w:type="dxa"/>
+            </w:tcMar>
+          </w:tcPr>
+          <w:p>
+            <w:pPr>
+              <w:spacing w:before="0" w:after="0" w:line="240" w:lineRule="auto"/>
+              <w:jc w:val="left"/>
+            </w:pPr>
+            <w:r>
+              <w:rPr>
+                <w:b w:val="0"/>
+                <w:sz w:val="16"/>
+              </w:rPr>
               <w:t>Source regression tests</w:t>
             </w:r>
           </w:p>
@@ -5071,50 +6018,125 @@
         </w:trPr>
         <w:tc>
           <w:tcPr>
-            <w:tcW w:type="dxa" w:w="2016"/>
-          </w:tcPr>
-          <w:p>
-            <w:r>
+            <w:tcW w:type="dxa" w:w="1250"/>
+            <w:vAlign w:val="center"/>
+            <w:tcMar>
+              <w:top w:w="55" w:type="dxa"/>
+              <w:bottom w:w="55" w:type="dxa"/>
+              <w:start w:w="80" w:type="dxa"/>
+              <w:end w:w="80" w:type="dxa"/>
+            </w:tcMar>
+          </w:tcPr>
+          <w:p>
+            <w:pPr>
+              <w:spacing w:before="0" w:after="0" w:line="240" w:lineRule="auto"/>
+              <w:jc w:val="left"/>
+            </w:pPr>
+            <w:r>
+              <w:rPr>
+                <w:b w:val="0"/>
+                <w:sz w:val="16"/>
+              </w:rPr>
               <w:t>VX-SYS-002</w:t>
             </w:r>
           </w:p>
         </w:tc>
         <w:tc>
           <w:tcPr>
-            <w:tcW w:type="dxa" w:w="2016"/>
-          </w:tcPr>
-          <w:p>
-            <w:r>
+            <w:tcW w:type="dxa" w:w="2600"/>
+            <w:vAlign w:val="center"/>
+            <w:tcMar>
+              <w:top w:w="55" w:type="dxa"/>
+              <w:bottom w:w="55" w:type="dxa"/>
+              <w:start w:w="80" w:type="dxa"/>
+              <w:end w:w="80" w:type="dxa"/>
+            </w:tcMar>
+          </w:tcPr>
+          <w:p>
+            <w:pPr>
+              <w:spacing w:before="0" w:after="0" w:line="240" w:lineRule="auto"/>
+              <w:jc w:val="left"/>
+            </w:pPr>
+            <w:r>
+              <w:rPr>
+                <w:b w:val="0"/>
+                <w:sz w:val="16"/>
+              </w:rPr>
               <w:t>Only one component shall command antenna movement.</w:t>
             </w:r>
           </w:p>
         </w:tc>
         <w:tc>
           <w:tcPr>
-            <w:tcW w:type="dxa" w:w="2016"/>
-          </w:tcPr>
-          <w:p>
-            <w:r>
+            <w:tcW w:type="dxa" w:w="1400"/>
+            <w:vAlign w:val="center"/>
+            <w:tcMar>
+              <w:top w:w="55" w:type="dxa"/>
+              <w:bottom w:w="55" w:type="dxa"/>
+              <w:start w:w="80" w:type="dxa"/>
+              <w:end w:w="80" w:type="dxa"/>
+            </w:tcMar>
+          </w:tcPr>
+          <w:p>
+            <w:pPr>
+              <w:spacing w:before="0" w:after="0" w:line="240" w:lineRule="auto"/>
+              <w:jc w:val="left"/>
+            </w:pPr>
+            <w:r>
+              <w:rPr>
+                <w:b w:val="0"/>
+                <w:sz w:val="16"/>
+              </w:rPr>
               <w:t>Section 8</w:t>
             </w:r>
           </w:p>
         </w:tc>
         <w:tc>
           <w:tcPr>
-            <w:tcW w:type="dxa" w:w="2016"/>
-          </w:tcPr>
-          <w:p>
-            <w:r>
+            <w:tcW w:type="dxa" w:w="2300"/>
+            <w:vAlign w:val="center"/>
+            <w:tcMar>
+              <w:top w:w="55" w:type="dxa"/>
+              <w:bottom w:w="55" w:type="dxa"/>
+              <w:start w:w="80" w:type="dxa"/>
+              <w:end w:w="80" w:type="dxa"/>
+            </w:tcMar>
+          </w:tcPr>
+          <w:p>
+            <w:pPr>
+              <w:spacing w:before="0" w:after="0" w:line="240" w:lineRule="auto"/>
+              <w:jc w:val="left"/>
+            </w:pPr>
+            <w:r>
+              <w:rPr>
+                <w:b w:val="0"/>
+                <w:sz w:val="16"/>
+              </w:rPr>
               <w:t>PointingManager.py</w:t>
             </w:r>
           </w:p>
         </w:tc>
         <w:tc>
           <w:tcPr>
-            <w:tcW w:type="dxa" w:w="2016"/>
-          </w:tcPr>
-          <w:p>
-            <w:r>
+            <w:tcW w:type="dxa" w:w="2290"/>
+            <w:vAlign w:val="center"/>
+            <w:tcMar>
+              <w:top w:w="55" w:type="dxa"/>
+              <w:bottom w:w="55" w:type="dxa"/>
+              <w:start w:w="80" w:type="dxa"/>
+              <w:end w:w="80" w:type="dxa"/>
+            </w:tcMar>
+          </w:tcPr>
+          <w:p>
+            <w:pPr>
+              <w:spacing w:before="0" w:after="0" w:line="240" w:lineRule="auto"/>
+              <w:jc w:val="left"/>
+            </w:pPr>
+            <w:r>
+              <w:rPr>
+                <w:b w:val="0"/>
+                <w:sz w:val="16"/>
+              </w:rPr>
               <w:t>Pointing regression</w:t>
             </w:r>
           </w:p>
@@ -5126,50 +6148,125 @@
         </w:trPr>
         <w:tc>
           <w:tcPr>
-            <w:tcW w:type="dxa" w:w="2016"/>
-          </w:tcPr>
-          <w:p>
-            <w:r>
+            <w:tcW w:type="dxa" w:w="1250"/>
+            <w:vAlign w:val="center"/>
+            <w:tcMar>
+              <w:top w:w="55" w:type="dxa"/>
+              <w:bottom w:w="55" w:type="dxa"/>
+              <w:start w:w="80" w:type="dxa"/>
+              <w:end w:w="80" w:type="dxa"/>
+            </w:tcMar>
+          </w:tcPr>
+          <w:p>
+            <w:pPr>
+              <w:spacing w:before="0" w:after="0" w:line="240" w:lineRule="auto"/>
+              <w:jc w:val="left"/>
+            </w:pPr>
+            <w:r>
+              <w:rPr>
+                <w:b w:val="0"/>
+                <w:sz w:val="16"/>
+              </w:rPr>
               <w:t>VX-EXEC-001</w:t>
             </w:r>
           </w:p>
         </w:tc>
         <w:tc>
           <w:tcPr>
-            <w:tcW w:type="dxa" w:w="2016"/>
-          </w:tcPr>
-          <w:p>
-            <w:r>
+            <w:tcW w:type="dxa" w:w="2600"/>
+            <w:vAlign w:val="center"/>
+            <w:tcMar>
+              <w:top w:w="55" w:type="dxa"/>
+              <w:bottom w:w="55" w:type="dxa"/>
+              <w:start w:w="80" w:type="dxa"/>
+              <w:end w:w="80" w:type="dxa"/>
+            </w:tcMar>
+          </w:tcPr>
+          <w:p>
+            <w:pPr>
+              <w:spacing w:before="0" w:after="0" w:line="240" w:lineRule="auto"/>
+              <w:jc w:val="left"/>
+            </w:pPr>
+            <w:r>
+              <w:rPr>
+                <w:b w:val="0"/>
+                <w:sz w:val="16"/>
+              </w:rPr>
               <w:t>RadarExecutor shall own task-to-dwell translation and source execution.</w:t>
             </w:r>
           </w:p>
         </w:tc>
         <w:tc>
           <w:tcPr>
-            <w:tcW w:type="dxa" w:w="2016"/>
-          </w:tcPr>
-          <w:p>
-            <w:r>
+            <w:tcW w:type="dxa" w:w="1400"/>
+            <w:vAlign w:val="center"/>
+            <w:tcMar>
+              <w:top w:w="55" w:type="dxa"/>
+              <w:bottom w:w="55" w:type="dxa"/>
+              <w:start w:w="80" w:type="dxa"/>
+              <w:end w:w="80" w:type="dxa"/>
+            </w:tcMar>
+          </w:tcPr>
+          <w:p>
+            <w:pPr>
+              <w:spacing w:before="0" w:after="0" w:line="240" w:lineRule="auto"/>
+              <w:jc w:val="left"/>
+            </w:pPr>
+            <w:r>
+              <w:rPr>
+                <w:b w:val="0"/>
+                <w:sz w:val="16"/>
+              </w:rPr>
               <w:t>Section 9</w:t>
             </w:r>
           </w:p>
         </w:tc>
         <w:tc>
           <w:tcPr>
-            <w:tcW w:type="dxa" w:w="2016"/>
-          </w:tcPr>
-          <w:p>
-            <w:r>
+            <w:tcW w:type="dxa" w:w="2300"/>
+            <w:vAlign w:val="center"/>
+            <w:tcMar>
+              <w:top w:w="55" w:type="dxa"/>
+              <w:bottom w:w="55" w:type="dxa"/>
+              <w:start w:w="80" w:type="dxa"/>
+              <w:end w:w="80" w:type="dxa"/>
+            </w:tcMar>
+          </w:tcPr>
+          <w:p>
+            <w:pPr>
+              <w:spacing w:before="0" w:after="0" w:line="240" w:lineRule="auto"/>
+              <w:jc w:val="left"/>
+            </w:pPr>
+            <w:r>
+              <w:rPr>
+                <w:b w:val="0"/>
+                <w:sz w:val="16"/>
+              </w:rPr>
               <w:t>RadarExecutor.py</w:t>
             </w:r>
           </w:p>
         </w:tc>
         <w:tc>
           <w:tcPr>
-            <w:tcW w:type="dxa" w:w="2016"/>
-          </w:tcPr>
-          <w:p>
-            <w:r>
+            <w:tcW w:type="dxa" w:w="2290"/>
+            <w:vAlign w:val="center"/>
+            <w:tcMar>
+              <w:top w:w="55" w:type="dxa"/>
+              <w:bottom w:w="55" w:type="dxa"/>
+              <w:start w:w="80" w:type="dxa"/>
+              <w:end w:w="80" w:type="dxa"/>
+            </w:tcMar>
+          </w:tcPr>
+          <w:p>
+            <w:pPr>
+              <w:spacing w:before="0" w:after="0" w:line="240" w:lineRule="auto"/>
+              <w:jc w:val="left"/>
+            </w:pPr>
+            <w:r>
+              <w:rPr>
+                <w:b w:val="0"/>
+                <w:sz w:val="16"/>
+              </w:rPr>
               <w:t>Execution-path regression</w:t>
             </w:r>
           </w:p>
@@ -5181,50 +6278,125 @@
         </w:trPr>
         <w:tc>
           <w:tcPr>
-            <w:tcW w:type="dxa" w:w="2016"/>
-          </w:tcPr>
-          <w:p>
-            <w:r>
+            <w:tcW w:type="dxa" w:w="1250"/>
+            <w:vAlign w:val="center"/>
+            <w:tcMar>
+              <w:top w:w="55" w:type="dxa"/>
+              <w:bottom w:w="55" w:type="dxa"/>
+              <w:start w:w="80" w:type="dxa"/>
+              <w:end w:w="80" w:type="dxa"/>
+            </w:tcMar>
+          </w:tcPr>
+          <w:p>
+            <w:pPr>
+              <w:spacing w:before="0" w:after="0" w:line="240" w:lineRule="auto"/>
+              <w:jc w:val="left"/>
+            </w:pPr>
+            <w:r>
+              <w:rPr>
+                <w:b w:val="0"/>
+                <w:sz w:val="16"/>
+              </w:rPr>
               <w:t>VX-SDR-001</w:t>
             </w:r>
           </w:p>
         </w:tc>
         <w:tc>
           <w:tcPr>
-            <w:tcW w:type="dxa" w:w="2016"/>
-          </w:tcPr>
-          <w:p>
-            <w:r>
+            <w:tcW w:type="dxa" w:w="2600"/>
+            <w:vAlign w:val="center"/>
+            <w:tcMar>
+              <w:top w:w="55" w:type="dxa"/>
+              <w:bottom w:w="55" w:type="dxa"/>
+              <w:start w:w="80" w:type="dxa"/>
+              <w:end w:w="80" w:type="dxa"/>
+            </w:tcMar>
+          </w:tcPr>
+          <w:p>
+            <w:pPr>
+              <w:spacing w:before="0" w:after="0" w:line="240" w:lineRule="auto"/>
+              <w:jc w:val="left"/>
+            </w:pPr>
+            <w:r>
+              <w:rPr>
+                <w:b w:val="0"/>
+                <w:sz w:val="16"/>
+              </w:rPr>
               <w:t>Pulse and receive timing shall use SDR hardware timestamps.</w:t>
             </w:r>
           </w:p>
         </w:tc>
         <w:tc>
           <w:tcPr>
-            <w:tcW w:type="dxa" w:w="2016"/>
-          </w:tcPr>
-          <w:p>
-            <w:r>
+            <w:tcW w:type="dxa" w:w="1400"/>
+            <w:vAlign w:val="center"/>
+            <w:tcMar>
+              <w:top w:w="55" w:type="dxa"/>
+              <w:bottom w:w="55" w:type="dxa"/>
+              <w:start w:w="80" w:type="dxa"/>
+              <w:end w:w="80" w:type="dxa"/>
+            </w:tcMar>
+          </w:tcPr>
+          <w:p>
+            <w:pPr>
+              <w:spacing w:before="0" w:after="0" w:line="240" w:lineRule="auto"/>
+              <w:jc w:val="left"/>
+            </w:pPr>
+            <w:r>
+              <w:rPr>
+                <w:b w:val="0"/>
+                <w:sz w:val="16"/>
+              </w:rPr>
               <w:t>Sections 13, 14</w:t>
             </w:r>
           </w:p>
         </w:tc>
         <w:tc>
           <w:tcPr>
-            <w:tcW w:type="dxa" w:w="2016"/>
-          </w:tcPr>
-          <w:p>
-            <w:r>
+            <w:tcW w:type="dxa" w:w="2300"/>
+            <w:vAlign w:val="center"/>
+            <w:tcMar>
+              <w:top w:w="55" w:type="dxa"/>
+              <w:bottom w:w="55" w:type="dxa"/>
+              <w:start w:w="80" w:type="dxa"/>
+              <w:end w:w="80" w:type="dxa"/>
+            </w:tcMar>
+          </w:tcPr>
+          <w:p>
+            <w:pPr>
+              <w:spacing w:before="0" w:after="0" w:line="240" w:lineRule="auto"/>
+              <w:jc w:val="left"/>
+            </w:pPr>
+            <w:r>
+              <w:rPr>
+                <w:b w:val="0"/>
+                <w:sz w:val="16"/>
+              </w:rPr>
               <w:t>EttusRadarSource.py</w:t>
             </w:r>
           </w:p>
         </w:tc>
         <w:tc>
           <w:tcPr>
-            <w:tcW w:type="dxa" w:w="2016"/>
-          </w:tcPr>
-          <w:p>
-            <w:r>
+            <w:tcW w:type="dxa" w:w="2290"/>
+            <w:vAlign w:val="center"/>
+            <w:tcMar>
+              <w:top w:w="55" w:type="dxa"/>
+              <w:bottom w:w="55" w:type="dxa"/>
+              <w:start w:w="80" w:type="dxa"/>
+              <w:end w:w="80" w:type="dxa"/>
+            </w:tcMar>
+          </w:tcPr>
+          <w:p>
+            <w:pPr>
+              <w:spacing w:before="0" w:after="0" w:line="240" w:lineRule="auto"/>
+              <w:jc w:val="left"/>
+            </w:pPr>
+            <w:r>
+              <w:rPr>
+                <w:b w:val="0"/>
+                <w:sz w:val="16"/>
+              </w:rPr>
               <w:t>Timed receive test</w:t>
             </w:r>
           </w:p>
@@ -5236,50 +6408,125 @@
         </w:trPr>
         <w:tc>
           <w:tcPr>
-            <w:tcW w:type="dxa" w:w="2016"/>
-          </w:tcPr>
-          <w:p>
-            <w:r>
+            <w:tcW w:type="dxa" w:w="1250"/>
+            <w:vAlign w:val="center"/>
+            <w:tcMar>
+              <w:top w:w="55" w:type="dxa"/>
+              <w:bottom w:w="55" w:type="dxa"/>
+              <w:start w:w="80" w:type="dxa"/>
+              <w:end w:w="80" w:type="dxa"/>
+            </w:tcMar>
+          </w:tcPr>
+          <w:p>
+            <w:pPr>
+              <w:spacing w:before="0" w:after="0" w:line="240" w:lineRule="auto"/>
+              <w:jc w:val="left"/>
+            </w:pPr>
+            <w:r>
+              <w:rPr>
+                <w:b w:val="0"/>
+                <w:sz w:val="16"/>
+              </w:rPr>
               <w:t>VX-SDR-002</w:t>
             </w:r>
           </w:p>
         </w:tc>
         <w:tc>
           <w:tcPr>
-            <w:tcW w:type="dxa" w:w="2016"/>
-          </w:tcPr>
-          <w:p>
-            <w:r>
+            <w:tcW w:type="dxa" w:w="2600"/>
+            <w:vAlign w:val="center"/>
+            <w:tcMar>
+              <w:top w:w="55" w:type="dxa"/>
+              <w:bottom w:w="55" w:type="dxa"/>
+              <w:start w:w="80" w:type="dxa"/>
+              <w:end w:w="80" w:type="dxa"/>
+            </w:tcMar>
+          </w:tcPr>
+          <w:p>
+            <w:pPr>
+              <w:spacing w:before="0" w:after="0" w:line="240" w:lineRule="auto"/>
+              <w:jc w:val="left"/>
+            </w:pPr>
+            <w:r>
+              <w:rPr>
+                <w:b w:val="0"/>
+                <w:sz w:val="16"/>
+              </w:rPr>
               <w:t>Command lead time shall be applied once per dwell.</w:t>
             </w:r>
           </w:p>
         </w:tc>
         <w:tc>
           <w:tcPr>
-            <w:tcW w:type="dxa" w:w="2016"/>
-          </w:tcPr>
-          <w:p>
-            <w:r>
+            <w:tcW w:type="dxa" w:w="1400"/>
+            <w:vAlign w:val="center"/>
+            <w:tcMar>
+              <w:top w:w="55" w:type="dxa"/>
+              <w:bottom w:w="55" w:type="dxa"/>
+              <w:start w:w="80" w:type="dxa"/>
+              <w:end w:w="80" w:type="dxa"/>
+            </w:tcMar>
+          </w:tcPr>
+          <w:p>
+            <w:pPr>
+              <w:spacing w:before="0" w:after="0" w:line="240" w:lineRule="auto"/>
+              <w:jc w:val="left"/>
+            </w:pPr>
+            <w:r>
+              <w:rPr>
+                <w:b w:val="0"/>
+                <w:sz w:val="16"/>
+              </w:rPr>
               <w:t>Section 13.5</w:t>
             </w:r>
           </w:p>
         </w:tc>
         <w:tc>
           <w:tcPr>
-            <w:tcW w:type="dxa" w:w="2016"/>
-          </w:tcPr>
-          <w:p>
-            <w:r>
+            <w:tcW w:type="dxa" w:w="2300"/>
+            <w:vAlign w:val="center"/>
+            <w:tcMar>
+              <w:top w:w="55" w:type="dxa"/>
+              <w:bottom w:w="55" w:type="dxa"/>
+              <w:start w:w="80" w:type="dxa"/>
+              <w:end w:w="80" w:type="dxa"/>
+            </w:tcMar>
+          </w:tcPr>
+          <w:p>
+            <w:pPr>
+              <w:spacing w:before="0" w:after="0" w:line="240" w:lineRule="auto"/>
+              <w:jc w:val="left"/>
+            </w:pPr>
+            <w:r>
+              <w:rPr>
+                <w:b w:val="0"/>
+                <w:sz w:val="16"/>
+              </w:rPr>
               <w:t>EttusRadarSource.py</w:t>
             </w:r>
           </w:p>
         </w:tc>
         <w:tc>
           <w:tcPr>
-            <w:tcW w:type="dxa" w:w="2016"/>
-          </w:tcPr>
-          <w:p>
-            <w:r>
+            <w:tcW w:type="dxa" w:w="2290"/>
+            <w:vAlign w:val="center"/>
+            <w:tcMar>
+              <w:top w:w="55" w:type="dxa"/>
+              <w:bottom w:w="55" w:type="dxa"/>
+              <w:start w:w="80" w:type="dxa"/>
+              <w:end w:w="80" w:type="dxa"/>
+            </w:tcMar>
+          </w:tcPr>
+          <w:p>
+            <w:pPr>
+              <w:spacing w:before="0" w:after="0" w:line="240" w:lineRule="auto"/>
+              <w:jc w:val="left"/>
+            </w:pPr>
+            <w:r>
+              <w:rPr>
+                <w:b w:val="0"/>
+                <w:sz w:val="16"/>
+              </w:rPr>
               <w:t>Collection-time evidence</w:t>
             </w:r>
           </w:p>
@@ -5291,50 +6538,125 @@
         </w:trPr>
         <w:tc>
           <w:tcPr>
-            <w:tcW w:type="dxa" w:w="2016"/>
-          </w:tcPr>
-          <w:p>
-            <w:r>
+            <w:tcW w:type="dxa" w:w="1250"/>
+            <w:vAlign w:val="center"/>
+            <w:tcMar>
+              <w:top w:w="55" w:type="dxa"/>
+              <w:bottom w:w="55" w:type="dxa"/>
+              <w:start w:w="80" w:type="dxa"/>
+              <w:end w:w="80" w:type="dxa"/>
+            </w:tcMar>
+          </w:tcPr>
+          <w:p>
+            <w:pPr>
+              <w:spacing w:before="0" w:after="0" w:line="240" w:lineRule="auto"/>
+              <w:jc w:val="left"/>
+            </w:pPr>
+            <w:r>
+              <w:rPr>
+                <w:b w:val="0"/>
+                <w:sz w:val="16"/>
+              </w:rPr>
               <w:t>VX-SDR-003</w:t>
             </w:r>
           </w:p>
         </w:tc>
         <w:tc>
           <w:tcPr>
-            <w:tcW w:type="dxa" w:w="2016"/>
-          </w:tcPr>
-          <w:p>
-            <w:r>
+            <w:tcW w:type="dxa" w:w="2600"/>
+            <w:vAlign w:val="center"/>
+            <w:tcMar>
+              <w:top w:w="55" w:type="dxa"/>
+              <w:bottom w:w="55" w:type="dxa"/>
+              <w:start w:w="80" w:type="dxa"/>
+              <w:end w:w="80" w:type="dxa"/>
+            </w:tcMar>
+          </w:tcPr>
+          <w:p>
+            <w:pPr>
+              <w:spacing w:before="0" w:after="0" w:line="240" w:lineRule="auto"/>
+              <w:jc w:val="left"/>
+            </w:pPr>
+            <w:r>
+              <w:rPr>
+                <w:b w:val="0"/>
+                <w:sz w:val="16"/>
+              </w:rPr>
               <w:t>All timed receive commands shall be queued before collection blocks.</w:t>
             </w:r>
           </w:p>
         </w:tc>
         <w:tc>
           <w:tcPr>
-            <w:tcW w:type="dxa" w:w="2016"/>
-          </w:tcPr>
-          <w:p>
-            <w:r>
+            <w:tcW w:type="dxa" w:w="1400"/>
+            <w:vAlign w:val="center"/>
+            <w:tcMar>
+              <w:top w:w="55" w:type="dxa"/>
+              <w:bottom w:w="55" w:type="dxa"/>
+              <w:start w:w="80" w:type="dxa"/>
+              <w:end w:w="80" w:type="dxa"/>
+            </w:tcMar>
+          </w:tcPr>
+          <w:p>
+            <w:pPr>
+              <w:spacing w:before="0" w:after="0" w:line="240" w:lineRule="auto"/>
+              <w:jc w:val="left"/>
+            </w:pPr>
+            <w:r>
+              <w:rPr>
+                <w:b w:val="0"/>
+                <w:sz w:val="16"/>
+              </w:rPr>
               <w:t>Section 13.4</w:t>
             </w:r>
           </w:p>
         </w:tc>
         <w:tc>
           <w:tcPr>
-            <w:tcW w:type="dxa" w:w="2016"/>
-          </w:tcPr>
-          <w:p>
-            <w:r>
+            <w:tcW w:type="dxa" w:w="2300"/>
+            <w:vAlign w:val="center"/>
+            <w:tcMar>
+              <w:top w:w="55" w:type="dxa"/>
+              <w:bottom w:w="55" w:type="dxa"/>
+              <w:start w:w="80" w:type="dxa"/>
+              <w:end w:w="80" w:type="dxa"/>
+            </w:tcMar>
+          </w:tcPr>
+          <w:p>
+            <w:pPr>
+              <w:spacing w:before="0" w:after="0" w:line="240" w:lineRule="auto"/>
+              <w:jc w:val="left"/>
+            </w:pPr>
+            <w:r>
+              <w:rPr>
+                <w:b w:val="0"/>
+                <w:sz w:val="16"/>
+              </w:rPr>
               <w:t>EttusRadarSource.py</w:t>
             </w:r>
           </w:p>
         </w:tc>
         <w:tc>
           <w:tcPr>
-            <w:tcW w:type="dxa" w:w="2016"/>
-          </w:tcPr>
-          <w:p>
-            <w:r>
+            <w:tcW w:type="dxa" w:w="2290"/>
+            <w:vAlign w:val="center"/>
+            <w:tcMar>
+              <w:top w:w="55" w:type="dxa"/>
+              <w:bottom w:w="55" w:type="dxa"/>
+              <w:start w:w="80" w:type="dxa"/>
+              <w:end w:w="80" w:type="dxa"/>
+            </w:tcMar>
+          </w:tcPr>
+          <w:p>
+            <w:pPr>
+              <w:spacing w:before="0" w:after="0" w:line="240" w:lineRule="auto"/>
+              <w:jc w:val="left"/>
+            </w:pPr>
+            <w:r>
+              <w:rPr>
+                <w:b w:val="0"/>
+                <w:sz w:val="16"/>
+              </w:rPr>
               <w:t>Diagnostic flag and hardware test</w:t>
             </w:r>
           </w:p>
@@ -5346,50 +6668,125 @@
         </w:trPr>
         <w:tc>
           <w:tcPr>
-            <w:tcW w:type="dxa" w:w="2016"/>
-          </w:tcPr>
-          <w:p>
-            <w:r>
+            <w:tcW w:type="dxa" w:w="1250"/>
+            <w:vAlign w:val="center"/>
+            <w:tcMar>
+              <w:top w:w="55" w:type="dxa"/>
+              <w:bottom w:w="55" w:type="dxa"/>
+              <w:start w:w="80" w:type="dxa"/>
+              <w:end w:w="80" w:type="dxa"/>
+            </w:tcMar>
+          </w:tcPr>
+          <w:p>
+            <w:pPr>
+              <w:spacing w:before="0" w:after="0" w:line="240" w:lineRule="auto"/>
+              <w:jc w:val="left"/>
+            </w:pPr>
+            <w:r>
+              <w:rPr>
+                <w:b w:val="0"/>
+                <w:sz w:val="16"/>
+              </w:rPr>
               <w:t>VX-PTZ-001</w:t>
             </w:r>
           </w:p>
         </w:tc>
         <w:tc>
           <w:tcPr>
-            <w:tcW w:type="dxa" w:w="2016"/>
-          </w:tcPr>
-          <w:p>
-            <w:r>
+            <w:tcW w:type="dxa" w:w="2600"/>
+            <w:vAlign w:val="center"/>
+            <w:tcMar>
+              <w:top w:w="55" w:type="dxa"/>
+              <w:bottom w:w="55" w:type="dxa"/>
+              <w:start w:w="80" w:type="dxa"/>
+              <w:end w:w="80" w:type="dxa"/>
+            </w:tcMar>
+          </w:tcPr>
+          <w:p>
+            <w:pPr>
+              <w:spacing w:before="0" w:after="0" w:line="240" w:lineRule="auto"/>
+              <w:jc w:val="left"/>
+            </w:pPr>
+            <w:r>
+              <w:rPr>
+                <w:b w:val="0"/>
+                <w:sz w:val="16"/>
+              </w:rPr>
               <w:t>Measured pointing shall be associated with every dwell.</w:t>
             </w:r>
           </w:p>
         </w:tc>
         <w:tc>
           <w:tcPr>
-            <w:tcW w:type="dxa" w:w="2016"/>
-          </w:tcPr>
-          <w:p>
-            <w:r>
+            <w:tcW w:type="dxa" w:w="1400"/>
+            <w:vAlign w:val="center"/>
+            <w:tcMar>
+              <w:top w:w="55" w:type="dxa"/>
+              <w:bottom w:w="55" w:type="dxa"/>
+              <w:start w:w="80" w:type="dxa"/>
+              <w:end w:w="80" w:type="dxa"/>
+            </w:tcMar>
+          </w:tcPr>
+          <w:p>
+            <w:pPr>
+              <w:spacing w:before="0" w:after="0" w:line="240" w:lineRule="auto"/>
+              <w:jc w:val="left"/>
+            </w:pPr>
+            <w:r>
+              <w:rPr>
+                <w:b w:val="0"/>
+                <w:sz w:val="16"/>
+              </w:rPr>
               <w:t>Sections 8, 15</w:t>
             </w:r>
           </w:p>
         </w:tc>
         <w:tc>
           <w:tcPr>
-            <w:tcW w:type="dxa" w:w="2016"/>
-          </w:tcPr>
-          <w:p>
-            <w:r>
+            <w:tcW w:type="dxa" w:w="2300"/>
+            <w:vAlign w:val="center"/>
+            <w:tcMar>
+              <w:top w:w="55" w:type="dxa"/>
+              <w:bottom w:w="55" w:type="dxa"/>
+              <w:start w:w="80" w:type="dxa"/>
+              <w:end w:w="80" w:type="dxa"/>
+            </w:tcMar>
+          </w:tcPr>
+          <w:p>
+            <w:pPr>
+              <w:spacing w:before="0" w:after="0" w:line="240" w:lineRule="auto"/>
+              <w:jc w:val="left"/>
+            </w:pPr>
+            <w:r>
+              <w:rPr>
+                <w:b w:val="0"/>
+                <w:sz w:val="16"/>
+              </w:rPr>
               <w:t>PointingManager.py; RadarExecutor.py</w:t>
             </w:r>
           </w:p>
         </w:tc>
         <w:tc>
           <w:tcPr>
-            <w:tcW w:type="dxa" w:w="2016"/>
-          </w:tcPr>
-          <w:p>
-            <w:r>
+            <w:tcW w:type="dxa" w:w="2290"/>
+            <w:vAlign w:val="center"/>
+            <w:tcMar>
+              <w:top w:w="55" w:type="dxa"/>
+              <w:bottom w:w="55" w:type="dxa"/>
+              <w:start w:w="80" w:type="dxa"/>
+              <w:end w:w="80" w:type="dxa"/>
+            </w:tcMar>
+          </w:tcPr>
+          <w:p>
+            <w:pPr>
+              <w:spacing w:before="0" w:after="0" w:line="240" w:lineRule="auto"/>
+              <w:jc w:val="left"/>
+            </w:pPr>
+            <w:r>
+              <w:rPr>
+                <w:b w:val="0"/>
+                <w:sz w:val="16"/>
+              </w:rPr>
               <w:t>Metadata inspection</w:t>
             </w:r>
           </w:p>
@@ -5401,50 +6798,125 @@
         </w:trPr>
         <w:tc>
           <w:tcPr>
-            <w:tcW w:type="dxa" w:w="2016"/>
-          </w:tcPr>
-          <w:p>
-            <w:r>
+            <w:tcW w:type="dxa" w:w="1250"/>
+            <w:vAlign w:val="center"/>
+            <w:tcMar>
+              <w:top w:w="55" w:type="dxa"/>
+              <w:bottom w:w="55" w:type="dxa"/>
+              <w:start w:w="80" w:type="dxa"/>
+              <w:end w:w="80" w:type="dxa"/>
+            </w:tcMar>
+          </w:tcPr>
+          <w:p>
+            <w:pPr>
+              <w:spacing w:before="0" w:after="0" w:line="240" w:lineRule="auto"/>
+              <w:jc w:val="left"/>
+            </w:pPr>
+            <w:r>
+              <w:rPr>
+                <w:b w:val="0"/>
+                <w:sz w:val="16"/>
+              </w:rPr>
               <w:t>VX-PROC-001</w:t>
             </w:r>
           </w:p>
         </w:tc>
         <w:tc>
           <w:tcPr>
-            <w:tcW w:type="dxa" w:w="2016"/>
-          </w:tcPr>
-          <w:p>
-            <w:r>
+            <w:tcW w:type="dxa" w:w="2600"/>
+            <w:vAlign w:val="center"/>
+            <w:tcMar>
+              <w:top w:w="55" w:type="dxa"/>
+              <w:bottom w:w="55" w:type="dxa"/>
+              <w:start w:w="80" w:type="dxa"/>
+              <w:end w:w="80" w:type="dxa"/>
+            </w:tcMar>
+          </w:tcPr>
+          <w:p>
+            <w:pPr>
+              <w:spacing w:before="0" w:after="0" w:line="240" w:lineRule="auto"/>
+              <w:jc w:val="left"/>
+            </w:pPr>
+            <w:r>
+              <w:rPr>
+                <w:b w:val="0"/>
+                <w:sz w:val="16"/>
+              </w:rPr>
               <w:t>RadarProcessor shall not command hardware.</w:t>
             </w:r>
           </w:p>
         </w:tc>
         <w:tc>
           <w:tcPr>
-            <w:tcW w:type="dxa" w:w="2016"/>
-          </w:tcPr>
-          <w:p>
-            <w:r>
+            <w:tcW w:type="dxa" w:w="1400"/>
+            <w:vAlign w:val="center"/>
+            <w:tcMar>
+              <w:top w:w="55" w:type="dxa"/>
+              <w:bottom w:w="55" w:type="dxa"/>
+              <w:start w:w="80" w:type="dxa"/>
+              <w:end w:w="80" w:type="dxa"/>
+            </w:tcMar>
+          </w:tcPr>
+          <w:p>
+            <w:pPr>
+              <w:spacing w:before="0" w:after="0" w:line="240" w:lineRule="auto"/>
+              <w:jc w:val="left"/>
+            </w:pPr>
+            <w:r>
+              <w:rPr>
+                <w:b w:val="0"/>
+                <w:sz w:val="16"/>
+              </w:rPr>
               <w:t>Sections 4, 11</w:t>
             </w:r>
           </w:p>
         </w:tc>
         <w:tc>
           <w:tcPr>
-            <w:tcW w:type="dxa" w:w="2016"/>
-          </w:tcPr>
-          <w:p>
-            <w:r>
+            <w:tcW w:type="dxa" w:w="2300"/>
+            <w:vAlign w:val="center"/>
+            <w:tcMar>
+              <w:top w:w="55" w:type="dxa"/>
+              <w:bottom w:w="55" w:type="dxa"/>
+              <w:start w:w="80" w:type="dxa"/>
+              <w:end w:w="80" w:type="dxa"/>
+            </w:tcMar>
+          </w:tcPr>
+          <w:p>
+            <w:pPr>
+              <w:spacing w:before="0" w:after="0" w:line="240" w:lineRule="auto"/>
+              <w:jc w:val="left"/>
+            </w:pPr>
+            <w:r>
+              <w:rPr>
+                <w:b w:val="0"/>
+                <w:sz w:val="16"/>
+              </w:rPr>
               <w:t>RadarProcessor.py</w:t>
             </w:r>
           </w:p>
         </w:tc>
         <w:tc>
           <w:tcPr>
-            <w:tcW w:type="dxa" w:w="2016"/>
-          </w:tcPr>
-          <w:p>
-            <w:r>
+            <w:tcW w:type="dxa" w:w="2290"/>
+            <w:vAlign w:val="center"/>
+            <w:tcMar>
+              <w:top w:w="55" w:type="dxa"/>
+              <w:bottom w:w="55" w:type="dxa"/>
+              <w:start w:w="80" w:type="dxa"/>
+              <w:end w:w="80" w:type="dxa"/>
+            </w:tcMar>
+          </w:tcPr>
+          <w:p>
+            <w:pPr>
+              <w:spacing w:before="0" w:after="0" w:line="240" w:lineRule="auto"/>
+              <w:jc w:val="left"/>
+            </w:pPr>
+            <w:r>
+              <w:rPr>
+                <w:b w:val="0"/>
+                <w:sz w:val="16"/>
+              </w:rPr>
               <w:t>Architecture review</w:t>
             </w:r>
           </w:p>
@@ -5456,50 +6928,125 @@
         </w:trPr>
         <w:tc>
           <w:tcPr>
-            <w:tcW w:type="dxa" w:w="2016"/>
-          </w:tcPr>
-          <w:p>
-            <w:r>
+            <w:tcW w:type="dxa" w:w="1250"/>
+            <w:vAlign w:val="center"/>
+            <w:tcMar>
+              <w:top w:w="55" w:type="dxa"/>
+              <w:bottom w:w="55" w:type="dxa"/>
+              <w:start w:w="80" w:type="dxa"/>
+              <w:end w:w="80" w:type="dxa"/>
+            </w:tcMar>
+          </w:tcPr>
+          <w:p>
+            <w:pPr>
+              <w:spacing w:before="0" w:after="0" w:line="240" w:lineRule="auto"/>
+              <w:jc w:val="left"/>
+            </w:pPr>
+            <w:r>
+              <w:rPr>
+                <w:b w:val="0"/>
+                <w:sz w:val="16"/>
+              </w:rPr>
               <w:t>VX-TRM-001</w:t>
             </w:r>
           </w:p>
         </w:tc>
         <w:tc>
           <w:tcPr>
-            <w:tcW w:type="dxa" w:w="2016"/>
-          </w:tcPr>
-          <w:p>
-            <w:r>
+            <w:tcW w:type="dxa" w:w="2600"/>
+            <w:vAlign w:val="center"/>
+            <w:tcMar>
+              <w:top w:w="55" w:type="dxa"/>
+              <w:bottom w:w="55" w:type="dxa"/>
+              <w:start w:w="80" w:type="dxa"/>
+              <w:end w:w="80" w:type="dxa"/>
+            </w:tcMar>
+          </w:tcPr>
+          <w:p>
+            <w:pPr>
+              <w:spacing w:before="0" w:after="0" w:line="240" w:lineRule="auto"/>
+              <w:jc w:val="left"/>
+            </w:pPr>
+            <w:r>
+              <w:rPr>
+                <w:b w:val="0"/>
+                <w:sz w:val="16"/>
+              </w:rPr>
               <w:t>STM32 shall provide slow 28-bit TRM control only.</w:t>
             </w:r>
           </w:p>
         </w:tc>
         <w:tc>
           <w:tcPr>
-            <w:tcW w:type="dxa" w:w="2016"/>
-          </w:tcPr>
-          <w:p>
-            <w:r>
+            <w:tcW w:type="dxa" w:w="1400"/>
+            <w:vAlign w:val="center"/>
+            <w:tcMar>
+              <w:top w:w="55" w:type="dxa"/>
+              <w:bottom w:w="55" w:type="dxa"/>
+              <w:start w:w="80" w:type="dxa"/>
+              <w:end w:w="80" w:type="dxa"/>
+            </w:tcMar>
+          </w:tcPr>
+          <w:p>
+            <w:pPr>
+              <w:spacing w:before="0" w:after="0" w:line="240" w:lineRule="auto"/>
+              <w:jc w:val="left"/>
+            </w:pPr>
+            <w:r>
+              <w:rPr>
+                <w:b w:val="0"/>
+                <w:sz w:val="16"/>
+              </w:rPr>
               <w:t>Section 12.1</w:t>
             </w:r>
           </w:p>
         </w:tc>
         <w:tc>
           <w:tcPr>
-            <w:tcW w:type="dxa" w:w="2016"/>
-          </w:tcPr>
-          <w:p>
-            <w:r>
+            <w:tcW w:type="dxa" w:w="2300"/>
+            <w:vAlign w:val="center"/>
+            <w:tcMar>
+              <w:top w:w="55" w:type="dxa"/>
+              <w:bottom w:w="55" w:type="dxa"/>
+              <w:start w:w="80" w:type="dxa"/>
+              <w:end w:w="80" w:type="dxa"/>
+            </w:tcMar>
+          </w:tcPr>
+          <w:p>
+            <w:pPr>
+              <w:spacing w:before="0" w:after="0" w:line="240" w:lineRule="auto"/>
+              <w:jc w:val="left"/>
+            </w:pPr>
+            <w:r>
+              <w:rPr>
+                <w:b w:val="0"/>
+                <w:sz w:val="16"/>
+              </w:rPr>
               <w:t>TRMInterface.py; TRMController.py</w:t>
             </w:r>
           </w:p>
         </w:tc>
         <w:tc>
           <w:tcPr>
-            <w:tcW w:type="dxa" w:w="2016"/>
-          </w:tcPr>
-          <w:p>
-            <w:r>
+            <w:tcW w:type="dxa" w:w="2290"/>
+            <w:vAlign w:val="center"/>
+            <w:tcMar>
+              <w:top w:w="55" w:type="dxa"/>
+              <w:bottom w:w="55" w:type="dxa"/>
+              <w:start w:w="80" w:type="dxa"/>
+              <w:end w:w="80" w:type="dxa"/>
+            </w:tcMar>
+          </w:tcPr>
+          <w:p>
+            <w:pPr>
+              <w:spacing w:before="0" w:after="0" w:line="240" w:lineRule="auto"/>
+              <w:jc w:val="left"/>
+            </w:pPr>
+            <w:r>
+              <w:rPr>
+                <w:b w:val="0"/>
+                <w:sz w:val="16"/>
+              </w:rPr>
               <w:t>Scope and protocol test</w:t>
             </w:r>
           </w:p>
@@ -5511,50 +7058,125 @@
         </w:trPr>
         <w:tc>
           <w:tcPr>
-            <w:tcW w:type="dxa" w:w="2016"/>
-          </w:tcPr>
-          <w:p>
-            <w:r>
+            <w:tcW w:type="dxa" w:w="1250"/>
+            <w:vAlign w:val="center"/>
+            <w:tcMar>
+              <w:top w:w="55" w:type="dxa"/>
+              <w:bottom w:w="55" w:type="dxa"/>
+              <w:start w:w="80" w:type="dxa"/>
+              <w:end w:w="80" w:type="dxa"/>
+            </w:tcMar>
+          </w:tcPr>
+          <w:p>
+            <w:pPr>
+              <w:spacing w:before="0" w:after="0" w:line="240" w:lineRule="auto"/>
+              <w:jc w:val="left"/>
+            </w:pPr>
+            <w:r>
+              <w:rPr>
+                <w:b w:val="0"/>
+                <w:sz w:val="16"/>
+              </w:rPr>
               <w:t>VX-VER-001</w:t>
             </w:r>
           </w:p>
         </w:tc>
         <w:tc>
           <w:tcPr>
-            <w:tcW w:type="dxa" w:w="2016"/>
-          </w:tcPr>
-          <w:p>
-            <w:r>
+            <w:tcW w:type="dxa" w:w="2600"/>
+            <w:vAlign w:val="center"/>
+            <w:tcMar>
+              <w:top w:w="55" w:type="dxa"/>
+              <w:bottom w:w="55" w:type="dxa"/>
+              <w:start w:w="80" w:type="dxa"/>
+              <w:end w:w="80" w:type="dxa"/>
+            </w:tcMar>
+          </w:tcPr>
+          <w:p>
+            <w:pPr>
+              <w:spacing w:before="0" w:after="0" w:line="240" w:lineRule="auto"/>
+              <w:jc w:val="left"/>
+            </w:pPr>
+            <w:r>
+              <w:rPr>
+                <w:b w:val="0"/>
+                <w:sz w:val="16"/>
+              </w:rPr>
               <w:t>Timed TX shall be scope-verified before connection to the high-power path.</w:t>
             </w:r>
           </w:p>
         </w:tc>
         <w:tc>
           <w:tcPr>
-            <w:tcW w:type="dxa" w:w="2016"/>
-          </w:tcPr>
-          <w:p>
-            <w:r>
+            <w:tcW w:type="dxa" w:w="1400"/>
+            <w:vAlign w:val="center"/>
+            <w:tcMar>
+              <w:top w:w="55" w:type="dxa"/>
+              <w:bottom w:w="55" w:type="dxa"/>
+              <w:start w:w="80" w:type="dxa"/>
+              <w:end w:w="80" w:type="dxa"/>
+            </w:tcMar>
+          </w:tcPr>
+          <w:p>
+            <w:pPr>
+              <w:spacing w:before="0" w:after="0" w:line="240" w:lineRule="auto"/>
+              <w:jc w:val="left"/>
+            </w:pPr>
+            <w:r>
+              <w:rPr>
+                <w:b w:val="0"/>
+                <w:sz w:val="16"/>
+              </w:rPr>
               <w:t>Section 17.3</w:t>
             </w:r>
           </w:p>
         </w:tc>
         <w:tc>
           <w:tcPr>
-            <w:tcW w:type="dxa" w:w="2016"/>
-          </w:tcPr>
-          <w:p>
-            <w:r>
+            <w:tcW w:type="dxa" w:w="2300"/>
+            <w:vAlign w:val="center"/>
+            <w:tcMar>
+              <w:top w:w="55" w:type="dxa"/>
+              <w:bottom w:w="55" w:type="dxa"/>
+              <w:start w:w="80" w:type="dxa"/>
+              <w:end w:w="80" w:type="dxa"/>
+            </w:tcMar>
+          </w:tcPr>
+          <w:p>
+            <w:pPr>
+              <w:spacing w:before="0" w:after="0" w:line="240" w:lineRule="auto"/>
+              <w:jc w:val="left"/>
+            </w:pPr>
+            <w:r>
+              <w:rPr>
+                <w:b w:val="0"/>
+                <w:sz w:val="16"/>
+              </w:rPr>
               <w:t>Version 0.8</w:t>
             </w:r>
           </w:p>
         </w:tc>
         <w:tc>
           <w:tcPr>
-            <w:tcW w:type="dxa" w:w="2016"/>
-          </w:tcPr>
-          <w:p>
-            <w:r>
+            <w:tcW w:type="dxa" w:w="2290"/>
+            <w:vAlign w:val="center"/>
+            <w:tcMar>
+              <w:top w:w="55" w:type="dxa"/>
+              <w:bottom w:w="55" w:type="dxa"/>
+              <w:start w:w="80" w:type="dxa"/>
+              <w:end w:w="80" w:type="dxa"/>
+            </w:tcMar>
+          </w:tcPr>
+          <w:p>
+            <w:pPr>
+              <w:spacing w:before="0" w:after="0" w:line="240" w:lineRule="auto"/>
+              <w:jc w:val="left"/>
+            </w:pPr>
+            <w:r>
+              <w:rPr>
+                <w:b w:val="0"/>
+                <w:sz w:val="16"/>
+              </w:rPr>
               <w:t>Oscilloscope procedure</w:t>
             </w:r>
           </w:p>
@@ -5566,70 +7188,130 @@
         </w:trPr>
         <w:tc>
           <w:tcPr>
-            <w:tcW w:type="dxa" w:w="2016"/>
+            <w:tcW w:type="dxa" w:w="1250"/>
             <w:tcW w:type="dxa" w:w="2016"/>
             <w:vAlign w:val="center"/>
-          </w:tcPr>
-          <w:p>
-            <w:pPr/>
-            <w:r>
-              <w:rPr/>
+            <w:tcMar>
+              <w:top w:w="55" w:type="dxa"/>
+              <w:bottom w:w="55" w:type="dxa"/>
+              <w:start w:w="80" w:type="dxa"/>
+              <w:end w:w="80" w:type="dxa"/>
+            </w:tcMar>
+          </w:tcPr>
+          <w:p>
+            <w:pPr>
+              <w:spacing w:before="0" w:after="0" w:line="240" w:lineRule="auto"/>
+              <w:jc w:val="left"/>
+            </w:pPr>
+            <w:r>
+              <w:rPr>
+                <w:b w:val="0"/>
+                <w:sz w:val="16"/>
+              </w:rPr>
               <w:t>VX-WFM-001</w:t>
             </w:r>
           </w:p>
         </w:tc>
         <w:tc>
           <w:tcPr>
-            <w:tcW w:type="dxa" w:w="2016"/>
+            <w:tcW w:type="dxa" w:w="2600"/>
             <w:tcW w:type="dxa" w:w="2016"/>
             <w:vAlign w:val="center"/>
-          </w:tcPr>
-          <w:p>
-            <w:pPr/>
-            <w:r>
-              <w:rPr/>
+            <w:tcMar>
+              <w:top w:w="55" w:type="dxa"/>
+              <w:bottom w:w="55" w:type="dxa"/>
+              <w:start w:w="80" w:type="dxa"/>
+              <w:end w:w="80" w:type="dxa"/>
+            </w:tcMar>
+          </w:tcPr>
+          <w:p>
+            <w:pPr>
+              <w:spacing w:before="0" w:after="0" w:line="240" w:lineRule="auto"/>
+              <w:jc w:val="left"/>
+            </w:pPr>
+            <w:r>
+              <w:rPr>
+                <w:b w:val="0"/>
+                <w:sz w:val="16"/>
+              </w:rPr>
               <w:t>The initial SDR sample rate shall remain fixed at 40 MS/s.</w:t>
             </w:r>
           </w:p>
         </w:tc>
         <w:tc>
           <w:tcPr>
-            <w:tcW w:type="dxa" w:w="2016"/>
+            <w:tcW w:type="dxa" w:w="1400"/>
             <w:tcW w:type="dxa" w:w="2016"/>
             <w:vAlign w:val="center"/>
-          </w:tcPr>
-          <w:p>
-            <w:pPr/>
-            <w:r>
-              <w:rPr/>
+            <w:tcMar>
+              <w:top w:w="55" w:type="dxa"/>
+              <w:bottom w:w="55" w:type="dxa"/>
+              <w:start w:w="80" w:type="dxa"/>
+              <w:end w:w="80" w:type="dxa"/>
+            </w:tcMar>
+          </w:tcPr>
+          <w:p>
+            <w:pPr>
+              <w:spacing w:before="0" w:after="0" w:line="240" w:lineRule="auto"/>
+              <w:jc w:val="left"/>
+            </w:pPr>
+            <w:r>
+              <w:rPr>
+                <w:b w:val="0"/>
+                <w:sz w:val="16"/>
+              </w:rPr>
               <w:t>Sections 10, 13</w:t>
             </w:r>
           </w:p>
         </w:tc>
         <w:tc>
           <w:tcPr>
-            <w:tcW w:type="dxa" w:w="2016"/>
+            <w:tcW w:type="dxa" w:w="2300"/>
             <w:tcW w:type="dxa" w:w="2016"/>
             <w:vAlign w:val="center"/>
-          </w:tcPr>
-          <w:p>
-            <w:pPr/>
-            <w:r>
-              <w:rPr/>
+            <w:tcMar>
+              <w:top w:w="55" w:type="dxa"/>
+              <w:bottom w:w="55" w:type="dxa"/>
+              <w:start w:w="80" w:type="dxa"/>
+              <w:end w:w="80" w:type="dxa"/>
+            </w:tcMar>
+          </w:tcPr>
+          <w:p>
+            <w:pPr>
+              <w:spacing w:before="0" w:after="0" w:line="240" w:lineRule="auto"/>
+              <w:jc w:val="left"/>
+            </w:pPr>
+            <w:r>
+              <w:rPr>
+                <w:b w:val="0"/>
+                <w:sz w:val="16"/>
+              </w:rPr>
               <w:t>WaveformLibrary.py; EttusRadarSource.py</w:t>
             </w:r>
           </w:p>
         </w:tc>
         <w:tc>
           <w:tcPr>
-            <w:tcW w:type="dxa" w:w="2016"/>
+            <w:tcW w:type="dxa" w:w="2290"/>
             <w:tcW w:type="dxa" w:w="2016"/>
             <w:vAlign w:val="center"/>
-          </w:tcPr>
-          <w:p>
-            <w:pPr/>
-            <w:r>
-              <w:rPr/>
+            <w:tcMar>
+              <w:top w:w="55" w:type="dxa"/>
+              <w:bottom w:w="55" w:type="dxa"/>
+              <w:start w:w="80" w:type="dxa"/>
+              <w:end w:w="80" w:type="dxa"/>
+            </w:tcMar>
+          </w:tcPr>
+          <w:p>
+            <w:pPr>
+              <w:spacing w:before="0" w:after="0" w:line="240" w:lineRule="auto"/>
+              <w:jc w:val="left"/>
+            </w:pPr>
+            <w:r>
+              <w:rPr>
+                <w:b w:val="0"/>
+                <w:sz w:val="16"/>
+              </w:rPr>
               <w:t>Waveform metadata and rate test</w:t>
             </w:r>
           </w:p>
@@ -5641,71 +7323,259 @@
         </w:trPr>
         <w:tc>
           <w:tcPr>
-            <w:tcW w:type="dxa" w:w="2016"/>
+            <w:tcW w:type="dxa" w:w="1250"/>
             <w:tcW w:type="dxa" w:w="2016"/>
             <w:vAlign w:val="center"/>
-          </w:tcPr>
-          <w:p>
-            <w:pPr/>
-            <w:r>
-              <w:rPr/>
+            <w:tcMar>
+              <w:top w:w="55" w:type="dxa"/>
+              <w:bottom w:w="55" w:type="dxa"/>
+              <w:start w:w="80" w:type="dxa"/>
+              <w:end w:w="80" w:type="dxa"/>
+            </w:tcMar>
+          </w:tcPr>
+          <w:p>
+            <w:pPr>
+              <w:spacing w:before="0" w:after="0" w:line="240" w:lineRule="auto"/>
+              <w:jc w:val="left"/>
+            </w:pPr>
+            <w:r>
+              <w:rPr>
+                <w:b w:val="0"/>
+                <w:sz w:val="16"/>
+              </w:rPr>
               <w:t>VX-WFM-002</w:t>
             </w:r>
           </w:p>
         </w:tc>
         <w:tc>
           <w:tcPr>
-            <w:tcW w:type="dxa" w:w="2016"/>
+            <w:tcW w:type="dxa" w:w="2600"/>
             <w:tcW w:type="dxa" w:w="2016"/>
             <w:vAlign w:val="center"/>
-          </w:tcPr>
-          <w:p>
-            <w:pPr/>
-            <w:r>
-              <w:rPr/>
+            <w:tcMar>
+              <w:top w:w="55" w:type="dxa"/>
+              <w:bottom w:w="55" w:type="dxa"/>
+              <w:start w:w="80" w:type="dxa"/>
+              <w:end w:w="80" w:type="dxa"/>
+            </w:tcMar>
+          </w:tcPr>
+          <w:p>
+            <w:pPr>
+              <w:spacing w:before="0" w:after="0" w:line="240" w:lineRule="auto"/>
+              <w:jc w:val="left"/>
+            </w:pPr>
+            <w:r>
+              <w:rPr>
+                <w:b w:val="0"/>
+                <w:sz w:val="16"/>
+              </w:rPr>
               <w:t>Transmit, simulation and matched filtering shall use the same sampled waveform.</w:t>
             </w:r>
           </w:p>
         </w:tc>
         <w:tc>
           <w:tcPr>
-            <w:tcW w:type="dxa" w:w="2016"/>
+            <w:tcW w:type="dxa" w:w="1400"/>
             <w:tcW w:type="dxa" w:w="2016"/>
             <w:vAlign w:val="center"/>
-          </w:tcPr>
-          <w:p>
-            <w:pPr/>
-            <w:r>
-              <w:rPr/>
+            <w:tcMar>
+              <w:top w:w="55" w:type="dxa"/>
+              <w:bottom w:w="55" w:type="dxa"/>
+              <w:start w:w="80" w:type="dxa"/>
+              <w:end w:w="80" w:type="dxa"/>
+            </w:tcMar>
+          </w:tcPr>
+          <w:p>
+            <w:pPr>
+              <w:spacing w:before="0" w:after="0" w:line="240" w:lineRule="auto"/>
+              <w:jc w:val="left"/>
+            </w:pPr>
+            <w:r>
+              <w:rPr>
+                <w:b w:val="0"/>
+                <w:sz w:val="16"/>
+              </w:rPr>
               <w:t>Section 10</w:t>
             </w:r>
           </w:p>
         </w:tc>
         <w:tc>
           <w:tcPr>
-            <w:tcW w:type="dxa" w:w="2016"/>
+            <w:tcW w:type="dxa" w:w="2300"/>
             <w:tcW w:type="dxa" w:w="2016"/>
             <w:vAlign w:val="center"/>
-          </w:tcPr>
-          <w:p>
-            <w:pPr/>
-            <w:r>
-              <w:rPr/>
+            <w:tcMar>
+              <w:top w:w="55" w:type="dxa"/>
+              <w:bottom w:w="55" w:type="dxa"/>
+              <w:start w:w="80" w:type="dxa"/>
+              <w:end w:w="80" w:type="dxa"/>
+            </w:tcMar>
+          </w:tcPr>
+          <w:p>
+            <w:pPr>
+              <w:spacing w:before="0" w:after="0" w:line="240" w:lineRule="auto"/>
+              <w:jc w:val="left"/>
+            </w:pPr>
+            <w:r>
+              <w:rPr>
+                <w:b w:val="0"/>
+                <w:sz w:val="16"/>
+              </w:rPr>
               <w:t>WaveformLibrary.py; SimulatedSource.py; RadarProcessor.py</w:t>
             </w:r>
           </w:p>
         </w:tc>
         <w:tc>
           <w:tcPr>
-            <w:tcW w:type="dxa" w:w="2016"/>
+            <w:tcW w:type="dxa" w:w="2290"/>
             <w:tcW w:type="dxa" w:w="2016"/>
             <w:vAlign w:val="center"/>
-          </w:tcPr>
-          <w:p>
-            <w:pPr/>
-            <w:r>
-              <w:rPr/>
+            <w:tcMar>
+              <w:top w:w="55" w:type="dxa"/>
+              <w:bottom w:w="55" w:type="dxa"/>
+              <w:start w:w="80" w:type="dxa"/>
+              <w:end w:w="80" w:type="dxa"/>
+            </w:tcMar>
+          </w:tcPr>
+          <w:p>
+            <w:pPr>
+              <w:spacing w:before="0" w:after="0" w:line="240" w:lineRule="auto"/>
+              <w:jc w:val="left"/>
+            </w:pPr>
+            <w:r>
+              <w:rPr>
+                <w:b w:val="0"/>
+                <w:sz w:val="16"/>
+              </w:rPr>
               <w:t>Waveform identity regression</w:t>
+            </w:r>
+          </w:p>
+        </w:tc>
+      </w:tr>
+      <w:tr>
+        <w:trPr/>
+        <w:tc>
+          <w:tcPr>
+            <w:tcW w:type="dxa" w:w="1250"/>
+            <w:vAlign w:val="center"/>
+            <w:tcMar>
+              <w:top w:w="55" w:type="dxa"/>
+              <w:bottom w:w="55" w:type="dxa"/>
+              <w:start w:w="80" w:type="dxa"/>
+              <w:end w:w="80" w:type="dxa"/>
+            </w:tcMar>
+          </w:tcPr>
+          <w:p>
+            <w:pPr>
+              <w:spacing w:before="0" w:after="0" w:line="240" w:lineRule="auto"/>
+              <w:jc w:val="left"/>
+            </w:pPr>
+            <w:r>
+              <w:rPr>
+                <w:b w:val="0"/>
+                <w:sz w:val="16"/>
+              </w:rPr>
+              <w:t>VX-WFM-003</w:t>
+            </w:r>
+          </w:p>
+        </w:tc>
+        <w:tc>
+          <w:tcPr>
+            <w:tcW w:type="dxa" w:w="2600"/>
+            <w:vAlign w:val="center"/>
+            <w:tcMar>
+              <w:top w:w="55" w:type="dxa"/>
+              <w:bottom w:w="55" w:type="dxa"/>
+              <w:start w:w="80" w:type="dxa"/>
+              <w:end w:w="80" w:type="dxa"/>
+            </w:tcMar>
+          </w:tcPr>
+          <w:p>
+            <w:pPr>
+              <w:spacing w:before="0" w:after="0" w:line="240" w:lineRule="auto"/>
+              <w:jc w:val="left"/>
+            </w:pPr>
+            <w:r>
+              <w:rPr>
+                <w:b w:val="0"/>
+                <w:sz w:val="16"/>
+              </w:rPr>
+              <w:t>WaveformId shall include nominal chip rate and resolve to complete sampled-waveform metadata.</w:t>
+            </w:r>
+          </w:p>
+        </w:tc>
+        <w:tc>
+          <w:tcPr>
+            <w:tcW w:type="dxa" w:w="1400"/>
+            <w:vAlign w:val="center"/>
+            <w:tcMar>
+              <w:top w:w="55" w:type="dxa"/>
+              <w:bottom w:w="55" w:type="dxa"/>
+              <w:start w:w="80" w:type="dxa"/>
+              <w:end w:w="80" w:type="dxa"/>
+            </w:tcMar>
+          </w:tcPr>
+          <w:p>
+            <w:pPr>
+              <w:spacing w:before="0" w:after="0" w:line="240" w:lineRule="auto"/>
+              <w:jc w:val="left"/>
+            </w:pPr>
+            <w:r>
+              <w:rPr>
+                <w:b w:val="0"/>
+                <w:sz w:val="16"/>
+              </w:rPr>
+              <w:t>Section 10.1</w:t>
+            </w:r>
+          </w:p>
+        </w:tc>
+        <w:tc>
+          <w:tcPr>
+            <w:tcW w:type="dxa" w:w="2300"/>
+            <w:vAlign w:val="center"/>
+            <w:tcMar>
+              <w:top w:w="55" w:type="dxa"/>
+              <w:bottom w:w="55" w:type="dxa"/>
+              <w:start w:w="80" w:type="dxa"/>
+              <w:end w:w="80" w:type="dxa"/>
+            </w:tcMar>
+          </w:tcPr>
+          <w:p>
+            <w:pPr>
+              <w:spacing w:before="0" w:after="0" w:line="240" w:lineRule="auto"/>
+              <w:jc w:val="left"/>
+            </w:pPr>
+            <w:r>
+              <w:rPr>
+                <w:b w:val="0"/>
+                <w:sz w:val="16"/>
+              </w:rPr>
+              <w:t>WaveformLibrary.py; RadarExecutor.py</w:t>
+            </w:r>
+          </w:p>
+        </w:tc>
+        <w:tc>
+          <w:tcPr>
+            <w:tcW w:type="dxa" w:w="2290"/>
+            <w:vAlign w:val="center"/>
+            <w:tcMar>
+              <w:top w:w="55" w:type="dxa"/>
+              <w:bottom w:w="55" w:type="dxa"/>
+              <w:start w:w="80" w:type="dxa"/>
+              <w:end w:w="80" w:type="dxa"/>
+            </w:tcMar>
+          </w:tcPr>
+          <w:p>
+            <w:pPr>
+              <w:spacing w:before="0" w:after="0" w:line="240" w:lineRule="auto"/>
+              <w:jc w:val="left"/>
+            </w:pPr>
+            <w:r>
+              <w:rPr>
+                <w:b w:val="0"/>
+                <w:sz w:val="16"/>
+              </w:rPr>
+              <w:t>Waveform catalogue and invalid-identifier tests</w:t>
             </w:r>
           </w:p>
         </w:tc>
@@ -5716,70 +7586,130 @@
         </w:trPr>
         <w:tc>
           <w:tcPr>
-            <w:tcW w:type="dxa" w:w="2016"/>
+            <w:tcW w:type="dxa" w:w="1250"/>
             <w:tcW w:type="dxa" w:w="2016"/>
             <w:vAlign w:val="center"/>
-          </w:tcPr>
-          <w:p>
-            <w:pPr/>
-            <w:r>
-              <w:rPr/>
+            <w:tcMar>
+              <w:top w:w="55" w:type="dxa"/>
+              <w:bottom w:w="55" w:type="dxa"/>
+              <w:start w:w="80" w:type="dxa"/>
+              <w:end w:w="80" w:type="dxa"/>
+            </w:tcMar>
+          </w:tcPr>
+          <w:p>
+            <w:pPr>
+              <w:spacing w:before="0" w:after="0" w:line="240" w:lineRule="auto"/>
+              <w:jc w:val="left"/>
+            </w:pPr>
+            <w:r>
+              <w:rPr>
+                <w:b w:val="0"/>
+                <w:sz w:val="16"/>
+              </w:rPr>
               <w:t>VX-TIM-001</w:t>
             </w:r>
           </w:p>
         </w:tc>
         <w:tc>
           <w:tcPr>
-            <w:tcW w:type="dxa" w:w="2016"/>
+            <w:tcW w:type="dxa" w:w="2600"/>
             <w:tcW w:type="dxa" w:w="2016"/>
             <w:vAlign w:val="center"/>
-          </w:tcPr>
-          <w:p>
-            <w:pPr/>
-            <w:r>
-              <w:rPr/>
+            <w:tcMar>
+              <w:top w:w="55" w:type="dxa"/>
+              <w:bottom w:w="55" w:type="dxa"/>
+              <w:start w:w="80" w:type="dxa"/>
+              <w:end w:w="80" w:type="dxa"/>
+            </w:tcMar>
+          </w:tcPr>
+          <w:p>
+            <w:pPr>
+              <w:spacing w:before="0" w:after="0" w:line="240" w:lineRule="auto"/>
+              <w:jc w:val="left"/>
+            </w:pPr>
+            <w:r>
+              <w:rPr>
+                <w:b w:val="0"/>
+                <w:sz w:val="16"/>
+              </w:rPr>
               <w:t>The operator shall select PRF from 1-4 kHz and pulses per CPI; PRI and CPI duration shall be derived.</w:t>
             </w:r>
           </w:p>
         </w:tc>
         <w:tc>
           <w:tcPr>
-            <w:tcW w:type="dxa" w:w="2016"/>
+            <w:tcW w:type="dxa" w:w="1400"/>
             <w:tcW w:type="dxa" w:w="2016"/>
             <w:vAlign w:val="center"/>
-          </w:tcPr>
-          <w:p>
-            <w:pPr/>
-            <w:r>
-              <w:rPr/>
+            <w:tcMar>
+              <w:top w:w="55" w:type="dxa"/>
+              <w:bottom w:w="55" w:type="dxa"/>
+              <w:start w:w="80" w:type="dxa"/>
+              <w:end w:w="80" w:type="dxa"/>
+            </w:tcMar>
+          </w:tcPr>
+          <w:p>
+            <w:pPr>
+              <w:spacing w:before="0" w:after="0" w:line="240" w:lineRule="auto"/>
+              <w:jc w:val="left"/>
+            </w:pPr>
+            <w:r>
+              <w:rPr>
+                <w:b w:val="0"/>
+                <w:sz w:val="16"/>
+              </w:rPr>
               <w:t>Section 14</w:t>
             </w:r>
           </w:p>
         </w:tc>
         <w:tc>
           <w:tcPr>
-            <w:tcW w:type="dxa" w:w="2016"/>
+            <w:tcW w:type="dxa" w:w="2300"/>
             <w:tcW w:type="dxa" w:w="2016"/>
             <w:vAlign w:val="center"/>
-          </w:tcPr>
-          <w:p>
-            <w:pPr/>
-            <w:r>
-              <w:rPr/>
+            <w:tcMar>
+              <w:top w:w="55" w:type="dxa"/>
+              <w:bottom w:w="55" w:type="dxa"/>
+              <w:start w:w="80" w:type="dxa"/>
+              <w:end w:w="80" w:type="dxa"/>
+            </w:tcMar>
+          </w:tcPr>
+          <w:p>
+            <w:pPr>
+              <w:spacing w:before="0" w:after="0" w:line="240" w:lineRule="auto"/>
+              <w:jc w:val="left"/>
+            </w:pPr>
+            <w:r>
+              <w:rPr>
+                <w:b w:val="0"/>
+                <w:sz w:val="16"/>
+              </w:rPr>
               <w:t>RadarDisplayQt5.py; RadarExecutor.py</w:t>
             </w:r>
           </w:p>
         </w:tc>
         <w:tc>
           <w:tcPr>
-            <w:tcW w:type="dxa" w:w="2016"/>
+            <w:tcW w:type="dxa" w:w="2290"/>
             <w:tcW w:type="dxa" w:w="2016"/>
             <w:vAlign w:val="center"/>
-          </w:tcPr>
-          <w:p>
-            <w:pPr/>
-            <w:r>
-              <w:rPr/>
+            <w:tcMar>
+              <w:top w:w="55" w:type="dxa"/>
+              <w:bottom w:w="55" w:type="dxa"/>
+              <w:start w:w="80" w:type="dxa"/>
+              <w:end w:w="80" w:type="dxa"/>
+            </w:tcMar>
+          </w:tcPr>
+          <w:p>
+            <w:pPr>
+              <w:spacing w:before="0" w:after="0" w:line="240" w:lineRule="auto"/>
+              <w:jc w:val="left"/>
+            </w:pPr>
+            <w:r>
+              <w:rPr>
+                <w:b w:val="0"/>
+                <w:sz w:val="16"/>
+              </w:rPr>
               <w:t>UI and plan validation test</w:t>
             </w:r>
           </w:p>
@@ -5791,70 +7721,130 @@
         </w:trPr>
         <w:tc>
           <w:tcPr>
-            <w:tcW w:type="dxa" w:w="2016"/>
+            <w:tcW w:type="dxa" w:w="1250"/>
             <w:tcW w:type="dxa" w:w="2016"/>
             <w:vAlign w:val="center"/>
-          </w:tcPr>
-          <w:p>
-            <w:pPr/>
-            <w:r>
-              <w:rPr/>
+            <w:tcMar>
+              <w:top w:w="55" w:type="dxa"/>
+              <w:bottom w:w="55" w:type="dxa"/>
+              <w:start w:w="80" w:type="dxa"/>
+              <w:end w:w="80" w:type="dxa"/>
+            </w:tcMar>
+          </w:tcPr>
+          <w:p>
+            <w:pPr>
+              <w:spacing w:before="0" w:after="0" w:line="240" w:lineRule="auto"/>
+              <w:jc w:val="left"/>
+            </w:pPr>
+            <w:r>
+              <w:rPr>
+                <w:b w:val="0"/>
+                <w:sz w:val="16"/>
+              </w:rPr>
               <w:t>VX-TIM-002</w:t>
             </w:r>
           </w:p>
         </w:tc>
         <w:tc>
           <w:tcPr>
-            <w:tcW w:type="dxa" w:w="2016"/>
+            <w:tcW w:type="dxa" w:w="2600"/>
             <w:tcW w:type="dxa" w:w="2016"/>
             <w:vAlign w:val="center"/>
-          </w:tcPr>
-          <w:p>
-            <w:pPr/>
-            <w:r>
-              <w:rPr/>
+            <w:tcMar>
+              <w:top w:w="55" w:type="dxa"/>
+              <w:bottom w:w="55" w:type="dxa"/>
+              <w:start w:w="80" w:type="dxa"/>
+              <w:end w:w="80" w:type="dxa"/>
+            </w:tcMar>
+          </w:tcPr>
+          <w:p>
+            <w:pPr>
+              <w:spacing w:before="0" w:after="0" w:line="240" w:lineRule="auto"/>
+              <w:jc w:val="left"/>
+            </w:pPr>
+            <w:r>
+              <w:rPr>
+                <w:b w:val="0"/>
+                <w:sz w:val="16"/>
+              </w:rPr>
               <w:t>Receive timing and sample count shall be derived from waveform duration, recovery, margins and maximum range.</w:t>
             </w:r>
           </w:p>
         </w:tc>
         <w:tc>
           <w:tcPr>
-            <w:tcW w:type="dxa" w:w="2016"/>
+            <w:tcW w:type="dxa" w:w="1400"/>
             <w:tcW w:type="dxa" w:w="2016"/>
             <w:vAlign w:val="center"/>
-          </w:tcPr>
-          <w:p>
-            <w:pPr/>
-            <w:r>
-              <w:rPr/>
+            <w:tcMar>
+              <w:top w:w="55" w:type="dxa"/>
+              <w:bottom w:w="55" w:type="dxa"/>
+              <w:start w:w="80" w:type="dxa"/>
+              <w:end w:w="80" w:type="dxa"/>
+            </w:tcMar>
+          </w:tcPr>
+          <w:p>
+            <w:pPr>
+              <w:spacing w:before="0" w:after="0" w:line="240" w:lineRule="auto"/>
+              <w:jc w:val="left"/>
+            </w:pPr>
+            <w:r>
+              <w:rPr>
+                <w:b w:val="0"/>
+                <w:sz w:val="16"/>
+              </w:rPr>
               <w:t>Sections 14, 15</w:t>
             </w:r>
           </w:p>
         </w:tc>
         <w:tc>
           <w:tcPr>
-            <w:tcW w:type="dxa" w:w="2016"/>
+            <w:tcW w:type="dxa" w:w="2300"/>
             <w:tcW w:type="dxa" w:w="2016"/>
             <w:vAlign w:val="center"/>
-          </w:tcPr>
-          <w:p>
-            <w:pPr/>
-            <w:r>
-              <w:rPr/>
+            <w:tcMar>
+              <w:top w:w="55" w:type="dxa"/>
+              <w:bottom w:w="55" w:type="dxa"/>
+              <w:start w:w="80" w:type="dxa"/>
+              <w:end w:w="80" w:type="dxa"/>
+            </w:tcMar>
+          </w:tcPr>
+          <w:p>
+            <w:pPr>
+              <w:spacing w:before="0" w:after="0" w:line="240" w:lineRule="auto"/>
+              <w:jc w:val="left"/>
+            </w:pPr>
+            <w:r>
+              <w:rPr>
+                <w:b w:val="0"/>
+                <w:sz w:val="16"/>
+              </w:rPr>
               <w:t>RadarPlans.py; RadarExecutor.py; EttusRadarSource.py</w:t>
             </w:r>
           </w:p>
         </w:tc>
         <w:tc>
           <w:tcPr>
-            <w:tcW w:type="dxa" w:w="2016"/>
+            <w:tcW w:type="dxa" w:w="2290"/>
             <w:tcW w:type="dxa" w:w="2016"/>
             <w:vAlign w:val="center"/>
-          </w:tcPr>
-          <w:p>
-            <w:pPr/>
-            <w:r>
-              <w:rPr/>
+            <w:tcMar>
+              <w:top w:w="55" w:type="dxa"/>
+              <w:bottom w:w="55" w:type="dxa"/>
+              <w:start w:w="80" w:type="dxa"/>
+              <w:end w:w="80" w:type="dxa"/>
+            </w:tcMar>
+          </w:tcPr>
+          <w:p>
+            <w:pPr>
+              <w:spacing w:before="0" w:after="0" w:line="240" w:lineRule="auto"/>
+              <w:jc w:val="left"/>
+            </w:pPr>
+            <w:r>
+              <w:rPr>
+                <w:b w:val="0"/>
+                <w:sz w:val="16"/>
+              </w:rPr>
               <w:t>Timing-model unit test and scope verification</w:t>
             </w:r>
           </w:p>
@@ -6354,7 +8344,7 @@
         <w:pStyle w:val="ListBullet"/>
       </w:pPr>
       <w:r>
-        <w:t>Implement sampled-waveform metadata and integer samples-per-chip expansion at the fixed 40 MS/s sample rate.</w:t>
+        <w:t>Implement the explicit Barker13_10MHz, Barker13_20MHz, Frank10_10MHz and Frank10_20MHz definitions, sampled-waveform metadata and integer samples-per-chip expansion at the fixed 40 MS/s sample rate.</w:t>
       </w:r>
     </w:p>
     <w:p>
@@ -6638,7 +8628,7 @@
     <w:p>
       <w:pPr/>
       <w:r>
-        <w:t>Decision and rationale: Use a fixed 40 MS/s complex sample rate for the initial hardware path. Represent waveform bandwidth through chip rate and integer samples per chip so SDR configuration remains stable while 10 and 20 Mchip/s waveform definitions are supported.</w:t>
+        <w:t>Decision and rationale: Use a fixed 40 MS/s complex sample rate for the initial hardware path. Represent waveform bandwidth through chip rate and integer samples per chip so SDR configuration remains stable. The initial catalogue uses the explicit identifiers Barker13_10MHz, Barker13_20MHz, Frank10_10MHz and Frank10_20MHz; rate-free identifiers are not permitted in new plans.</w:t>
       </w:r>
     </w:p>
     <w:p>
@@ -7135,6 +9125,46 @@
             <w:r>
               <w:rPr/>
               <w:t>Pulse Repetition Frequency; the reciprocal of PRI.</w:t>
+            </w:r>
+          </w:p>
+        </w:tc>
+      </w:tr>
+      <w:tr>
+        <w:tc>
+          <w:tcPr>
+            <w:tcW w:type="dxa" w:w="5040"/>
+            <w:vAlign w:val="center"/>
+          </w:tcPr>
+          <w:p>
+            <w:pPr>
+              <w:spacing w:before="0" w:after="0" w:line="240" w:lineRule="auto"/>
+              <w:jc w:val="left"/>
+            </w:pPr>
+            <w:r>
+              <w:rPr>
+                <w:b w:val="0"/>
+                <w:sz w:val="18"/>
+              </w:rPr>
+              <w:t>WaveformId</w:t>
+            </w:r>
+          </w:p>
+        </w:tc>
+        <w:tc>
+          <w:tcPr>
+            <w:tcW w:type="dxa" w:w="5040"/>
+            <w:vAlign w:val="center"/>
+          </w:tcPr>
+          <w:p>
+            <w:pPr>
+              <w:spacing w:before="0" w:after="0" w:line="240" w:lineRule="auto"/>
+              <w:jc w:val="left"/>
+            </w:pPr>
+            <w:r>
+              <w:rPr>
+                <w:b w:val="0"/>
+                <w:sz w:val="18"/>
+              </w:rPr>
+              <w:t>Stable waveform identifier containing code family/order and nominal chip rate, for example Frank10_20MHz.</w:t>
             </w:r>
           </w:p>
         </w:tc>

</xml_diff>

<commit_message>
Document timed TX/RX hardware validation and post-CPI processing and Mission
</commit_message>
<xml_diff>
--- a/docs/architecture/VX-SSA-001_Vanguard_X_Software_System_Architecture.docx
+++ b/docs/architecture/VX-SSA-001_Vanguard_X_Software_System_Architecture.docx
@@ -32,12 +32,7 @@
         <w:jc w:val="center"/>
       </w:pPr>
       <w:r>
-        <w:rPr>
-          <w:b/>
-          <w:color w:val="17365D"/>
-          <w:sz w:val="32"/>
-        </w:rPr>
-        <w:t>Version 0.7b - Waveform and Timing Decision Baseline</w:t>
+        <w:t>Version 0.7d - Mission, Scheduling and Dwell-Management Architecture Baseline</w:t>
       </w:r>
     </w:p>
     <w:p>
@@ -112,7 +107,7 @@
           </w:tcPr>
           <w:p>
             <w:r>
-              <w:t>0.7b</w:t>
+              <w:t>0.7d</w:t>
             </w:r>
           </w:p>
         </w:tc>
@@ -262,7 +257,7 @@
           </w:tcPr>
           <w:p>
             <w:r>
-              <w:t>Hardware-timed receive with accepted waveform and operator timing decisions</w:t>
+              <w:t>Fixed 40 MS/s waveform/timing and bounded timed TX/RX baseline, extended with mission profiles, scheduler arbitration and explicit dwell-management architecture; ATR/TRM integration deferred</w:t>
             </w:r>
           </w:p>
         </w:tc>
@@ -774,9 +769,99 @@
             <w:vAlign w:val="center"/>
           </w:tcPr>
           <w:p>
-            <w:pPr/>
-            <w:r>
-              <w:rPr/>
+            <w:r>
+              <w:t>Superseded</w:t>
+            </w:r>
+          </w:p>
+        </w:tc>
+      </w:tr>
+      <w:tr>
+        <w:tc>
+          <w:tcPr>
+            <w:tcW w:type="dxa" w:w="2520"/>
+            <w:tcW w:type="dxa" w:w="2520"/>
+            <w:vAlign w:val="center"/>
+          </w:tcPr>
+          <w:p>
+            <w:r>
+              <w:t>0.7c</w:t>
+            </w:r>
+          </w:p>
+        </w:tc>
+        <w:tc>
+          <w:tcPr>
+            <w:tcW w:type="dxa" w:w="2520"/>
+            <w:tcW w:type="dxa" w:w="2520"/>
+            <w:vAlign w:val="center"/>
+          </w:tcPr>
+          <w:p>
+            <w:r>
+              <w:t>18 Jul 2026</w:t>
+            </w:r>
+          </w:p>
+        </w:tc>
+        <w:tc>
+          <w:tcPr>
+            <w:tcW w:type="dxa" w:w="2520"/>
+            <w:tcW w:type="dxa" w:w="2520"/>
+            <w:vAlign w:val="center"/>
+          </w:tcPr>
+          <w:p>
+            <w:r>
+              <w:t>Implemented waveform/timing controls and recorded bounded timed TX/RX B200mini validation through 4 kHz and 128 pulses</w:t>
+            </w:r>
+          </w:p>
+        </w:tc>
+        <w:tc>
+          <w:tcPr>
+            <w:tcW w:type="dxa" w:w="2520"/>
+            <w:tcW w:type="dxa" w:w="2520"/>
+            <w:vAlign w:val="center"/>
+          </w:tcPr>
+          <w:p>
+            <w:r>
+              <w:t>Superseded</w:t>
+            </w:r>
+          </w:p>
+        </w:tc>
+      </w:tr>
+      <w:tr>
+        <w:tc>
+          <w:tcPr>
+            <w:tcW w:type="dxa" w:w="2520"/>
+          </w:tcPr>
+          <w:p>
+            <w:r>
+              <w:t>0.7d</w:t>
+            </w:r>
+          </w:p>
+        </w:tc>
+        <w:tc>
+          <w:tcPr>
+            <w:tcW w:type="dxa" w:w="2520"/>
+          </w:tcPr>
+          <w:p>
+            <w:r>
+              <w:t>18 Jul 2026</w:t>
+            </w:r>
+          </w:p>
+        </w:tc>
+        <w:tc>
+          <w:tcPr>
+            <w:tcW w:type="dxa" w:w="2520"/>
+          </w:tcPr>
+          <w:p>
+            <w:r>
+              <w:t>Documented waveform catalogue ownership, scheduler/dwell lifecycle and adaptive mission profiles</w:t>
+            </w:r>
+          </w:p>
+        </w:tc>
+        <w:tc>
+          <w:tcPr>
+            <w:tcW w:type="dxa" w:w="2520"/>
+          </w:tcPr>
+          <w:p>
+            <w:r>
               <w:t>Current</w:t>
             </w:r>
           </w:p>
@@ -915,6 +1000,46 @@
     </w:p>
     <w:p>
       <w:pPr>
+        <w:pStyle w:val="ListBullet"/>
+      </w:pPr>
+      <w:r>
+        <w:t>ADR-0014: Use bounded finite per-PRI TX/RX command pipelines.</w:t>
+      </w:r>
+    </w:p>
+    <w:p>
+      <w:pPr>
+        <w:pStyle w:val="ListBullet"/>
+      </w:pPr>
+      <w:r>
+        <w:t>ADR-0015: Keep CPI processing outside the timing-critical acquisition loop.</w:t>
+      </w:r>
+    </w:p>
+    <w:p>
+      <w:pPr>
+        <w:pStyle w:val="ListBullet"/>
+      </w:pPr>
+      <w:r>
+        <w:t>ADR-0016: Place MissionProfile policy above RadarScheduler task arbitration.</w:t>
+      </w:r>
+    </w:p>
+    <w:p>
+      <w:pPr>
+        <w:pStyle w:val="ListBullet"/>
+      </w:pPr>
+      <w:r>
+        <w:t>ADR-0017: Treat RadarExecutor as the current dwell-management boundary.</w:t>
+      </w:r>
+    </w:p>
+    <w:p>
+      <w:pPr>
+        <w:pStyle w:val="ListBullet"/>
+      </w:pPr>
+      <w:r>
+        <w:t>ADR-0018: Preserve interrupted coverage and a minimum surveillance duty cycle.</w:t>
+      </w:r>
+    </w:p>
+    <w:p>
+      <w:pPr>
         <w:pStyle w:val="Heading1"/>
       </w:pPr>
       <w:r>
@@ -1147,7 +1272,7 @@
     </w:p>
     <w:p>
       <w:r>
-        <w:t>Version 0.7 remains the first hardware execution baseline. Version 0.7b records the accepted waveform-sampling and operator timing decisions that govern the Version 0.8 timed-transmit implementation. The operational path remains receive-only until timed transmit and ATR verification are complete.</w:t>
+        <w:t>Version 0.7 remains the first hardware execution baseline. Version 0.7b recorded the accepted waveform-sampling and operator timing decisions. Version 0.7c records their implementation and protected B200mini timed TX/RX validation. The operational application remains transmitter-inhibited until ATR non-overlap is verified on the oscilloscope; the TRM and PA remain disconnected.</w:t>
       </w:r>
     </w:p>
     <w:p>
@@ -1299,6 +1424,32 @@
       </w:pPr>
       <w:r>
         <w:t>Adaptive waveform, PRI, frequency and attenuation selection.</w:t>
+      </w:r>
+    </w:p>
+    <w:p>
+      <w:pPr>
+        <w:pStyle w:val="Heading2"/>
+      </w:pPr>
+      <w:r>
+        <w:t>2.5 Mission-driven surveillance</w:t>
+      </w:r>
+    </w:p>
+    <w:p>
+      <w:r>
+        <w:t>The radar mission is a time allocation policy above individual tasks and dwells. The initial adaptive mission concept begins with rapid 360-degree surveillance, promotes areas of interest to higher-resolution sector search, services confirmed tracks through predicted-position revisits, and performs a small local scan around the prediction when a revisit misses. Mission policy changes task generation and scheduling parameters; it does not directly command the PTZ, SDR or signal processor.</w:t>
+      </w:r>
+    </w:p>
+    <w:p>
+      <w:pPr>
+        <w:pStyle w:val="Heading2"/>
+      </w:pPr>
+      <w:r>
+        <w:t>2.6 Coverage continuity</w:t>
+      </w:r>
+    </w:p>
+    <w:p>
+      <w:r>
+        <w:t>Search interruption is reversible. The system records the interrupted sector, direction, scan cycle and encoder position, services the higher-priority work, and resumes coverage without restarting the complete scan. Track demand shall not monopolise the radar: each MissionProfile defines a minimum surveillance duty cycle, maximum time away from search and track-revisit admission policy.</w:t>
       </w:r>
     </w:p>
     <w:p>
@@ -1688,7 +1839,7 @@
           </w:tcPr>
           <w:p>
             <w:r>
-              <w:t>Hardware-timed SDR receive execution and receive diagnostics.</w:t>
+              <w:t>Bounded finite per-PRI timed SDR execution, TX/RX streamer ownership, receive-path warm-up and hardware diagnostics.</w:t>
             </w:r>
           </w:p>
         </w:tc>
@@ -2199,6 +2350,525 @@
     </w:p>
     <w:p>
       <w:pPr>
+        <w:pStyle w:val="Heading2"/>
+      </w:pPr>
+      <w:r>
+        <w:t>7.4 Scheduler task lifecycle</w:t>
+      </w:r>
+    </w:p>
+    <w:p>
+      <w:r>
+        <w:t>RadarScheduler implements a deterministic, non-hardware task lifecycle:</w:t>
+      </w:r>
+    </w:p>
+    <w:p>
+      <w:pPr>
+        <w:pStyle w:val="ListBullet"/>
+      </w:pPr>
+      <w:r>
+        <w:t>Accept or update tracker RevisitRequest objects; at most one queued TrackTask is retained per TrackId.</w:t>
+      </w:r>
+    </w:p>
+    <w:p>
+      <w:pPr>
+        <w:pStyle w:val="ListBullet"/>
+      </w:pPr>
+      <w:r>
+        <w:t>Continue the active task until the main loop reports completion or failure.</w:t>
+      </w:r>
+    </w:p>
+    <w:p>
+      <w:pPr>
+        <w:pStyle w:val="ListBullet"/>
+      </w:pPr>
+      <w:r>
+        <w:t>When idle, select the ready TrackTask with the highest base-priority and deadline-urgency score.</w:t>
+      </w:r>
+    </w:p>
+    <w:p>
+      <w:pPr>
+        <w:pStyle w:val="ListBullet"/>
+      </w:pPr>
+      <w:r>
+        <w:t>If no track task is ready, select or resume the persistent SearchTask.</w:t>
+      </w:r>
+    </w:p>
+    <w:p>
+      <w:pPr>
+        <w:pStyle w:val="ListBullet"/>
+      </w:pPr>
+      <w:r>
+        <w:t>Pause search during track ownership, then release the one-shot TrackTask and resume the saved SearchTask.</w:t>
+      </w:r>
+    </w:p>
+    <w:p>
+      <w:pPr>
+        <w:pStyle w:val="Heading2"/>
+      </w:pPr>
+      <w:r>
+        <w:t>7.5 MissionProfile layer</w:t>
+      </w:r>
+    </w:p>
+    <w:p>
+      <w:r>
+        <w:t>MissionProfile is the planned configuration and policy layer above RadarScheduler. It defines which persistent search task exists, the permitted sector geometry, angular sampling, waveform/timing profile, revisit and reacquisition policy, coverage safeguards and mode-transition rules. RadarScheduler remains responsible for choosing the next eligible RadarTask; MissionProfile shall not bypass task, pointing or dwell interfaces.</w:t>
+      </w:r>
+    </w:p>
+    <w:tbl>
+      <w:tblPr>
+        <w:tblStyle w:val="TableGrid"/>
+        <w:tblW w:type="auto" w:w="0"/>
+        <w:tblLook w:firstColumn="1" w:firstRow="1" w:lastColumn="0" w:lastRow="0" w:noHBand="0" w:noVBand="1" w:val="04A0"/>
+      </w:tblPr>
+      <w:tblGrid>
+        <w:gridCol w:w="2016"/>
+        <w:gridCol w:w="2016"/>
+        <w:gridCol w:w="2016"/>
+        <w:gridCol w:w="2016"/>
+        <w:gridCol w:w="2016"/>
+      </w:tblGrid>
+      <w:tr>
+        <w:tc>
+          <w:tcPr>
+            <w:tcW w:type="dxa" w:w="2016"/>
+          </w:tcPr>
+          <w:p>
+            <w:r>
+              <w:t>Mission mode</w:t>
+            </w:r>
+          </w:p>
+        </w:tc>
+        <w:tc>
+          <w:tcPr>
+            <w:tcW w:type="dxa" w:w="2016"/>
+          </w:tcPr>
+          <w:p>
+            <w:r>
+              <w:t>Purpose</w:t>
+            </w:r>
+          </w:p>
+        </w:tc>
+        <w:tc>
+          <w:tcPr>
+            <w:tcW w:type="dxa" w:w="2016"/>
+          </w:tcPr>
+          <w:p>
+            <w:r>
+              <w:t>Search geometry</w:t>
+            </w:r>
+          </w:p>
+        </w:tc>
+        <w:tc>
+          <w:tcPr>
+            <w:tcW w:type="dxa" w:w="2016"/>
+          </w:tcPr>
+          <w:p>
+            <w:r>
+              <w:t>Typical dwell policy</w:t>
+            </w:r>
+          </w:p>
+        </w:tc>
+        <w:tc>
+          <w:tcPr>
+            <w:tcW w:type="dxa" w:w="2016"/>
+          </w:tcPr>
+          <w:p>
+            <w:r>
+              <w:t>Exit/transition</w:t>
+            </w:r>
+          </w:p>
+        </w:tc>
+      </w:tr>
+      <w:tr>
+        <w:tc>
+          <w:tcPr>
+            <w:tcW w:type="dxa" w:w="2016"/>
+          </w:tcPr>
+          <w:p>
+            <w:r>
+              <w:t>Rapid surveillance</w:t>
+            </w:r>
+          </w:p>
+        </w:tc>
+        <w:tc>
+          <w:tcPr>
+            <w:tcW w:type="dxa" w:w="2016"/>
+          </w:tcPr>
+          <w:p>
+            <w:r>
+              <w:t>Establish and maintain broad awareness</w:t>
+            </w:r>
+          </w:p>
+        </w:tc>
+        <w:tc>
+          <w:tcPr>
+            <w:tcW w:type="dxa" w:w="2016"/>
+          </w:tcPr>
+          <w:p>
+            <w:r>
+              <w:t>Continuous 360° coverage; coarse angular sampling</w:t>
+            </w:r>
+          </w:p>
+        </w:tc>
+        <w:tc>
+          <w:tcPr>
+            <w:tcW w:type="dxa" w:w="2016"/>
+          </w:tcPr>
+          <w:p>
+            <w:r>
+              <w:t>Short CPI; search waveform; high coverage rate</w:t>
+            </w:r>
+          </w:p>
+        </w:tc>
+        <w:tc>
+          <w:tcPr>
+            <w:tcW w:type="dxa" w:w="2016"/>
+          </w:tcPr>
+          <w:p>
+            <w:r>
+              <w:t>Area of interest, due revisit or operator sector request</w:t>
+            </w:r>
+          </w:p>
+        </w:tc>
+      </w:tr>
+      <w:tr>
+        <w:tc>
+          <w:tcPr>
+            <w:tcW w:type="dxa" w:w="2016"/>
+          </w:tcPr>
+          <w:p>
+            <w:r>
+              <w:t>Sector search</w:t>
+            </w:r>
+          </w:p>
+        </w:tc>
+        <w:tc>
+          <w:tcPr>
+            <w:tcW w:type="dxa" w:w="2016"/>
+          </w:tcPr>
+          <w:p>
+            <w:r>
+              <w:t>Resolve an area of interest</w:t>
+            </w:r>
+          </w:p>
+        </w:tc>
+        <w:tc>
+          <w:tcPr>
+            <w:tcW w:type="dxa" w:w="2016"/>
+          </w:tcPr>
+          <w:p>
+            <w:r>
+              <w:t>Bounded sector; smaller angular step or slower scan</w:t>
+            </w:r>
+          </w:p>
+        </w:tc>
+        <w:tc>
+          <w:tcPr>
+            <w:tcW w:type="dxa" w:w="2016"/>
+          </w:tcPr>
+          <w:p>
+            <w:r>
+              <w:t>Higher sensitivity/resolution profile within timing limits</w:t>
+            </w:r>
+          </w:p>
+        </w:tc>
+        <w:tc>
+          <w:tcPr>
+            <w:tcW w:type="dxa" w:w="2016"/>
+          </w:tcPr>
+          <w:p>
+            <w:r>
+              <w:t>Sector complete, track confirmation or coverage limit</w:t>
+            </w:r>
+          </w:p>
+        </w:tc>
+      </w:tr>
+      <w:tr>
+        <w:tc>
+          <w:tcPr>
+            <w:tcW w:type="dxa" w:w="2016"/>
+          </w:tcPr>
+          <w:p>
+            <w:r>
+              <w:t>Track revisit</w:t>
+            </w:r>
+          </w:p>
+        </w:tc>
+        <w:tc>
+          <w:tcPr>
+            <w:tcW w:type="dxa" w:w="2016"/>
+          </w:tcPr>
+          <w:p>
+            <w:r>
+              <w:t>Update a confirmed track</w:t>
+            </w:r>
+          </w:p>
+        </w:tc>
+        <w:tc>
+          <w:tcPr>
+            <w:tcW w:type="dxa" w:w="2016"/>
+          </w:tcPr>
+          <w:p>
+            <w:r>
+              <w:t>Goto predicted true bearing and hold</w:t>
+            </w:r>
+          </w:p>
+        </w:tc>
+        <w:tc>
+          <w:tcPr>
+            <w:tcW w:type="dxa" w:w="2016"/>
+          </w:tcPr>
+          <w:p>
+            <w:r>
+              <w:t>Dedicated track profile; deadline-driven</w:t>
+            </w:r>
+          </w:p>
+        </w:tc>
+        <w:tc>
+          <w:tcPr>
+            <w:tcW w:type="dxa" w:w="2016"/>
+          </w:tcPr>
+          <w:p>
+            <w:r>
+              <w:t>Successful update or missed revisit</w:t>
+            </w:r>
+          </w:p>
+        </w:tc>
+      </w:tr>
+      <w:tr>
+        <w:tc>
+          <w:tcPr>
+            <w:tcW w:type="dxa" w:w="2016"/>
+          </w:tcPr>
+          <w:p>
+            <w:r>
+              <w:t>Local reacquisition</w:t>
+            </w:r>
+          </w:p>
+        </w:tc>
+        <w:tc>
+          <w:tcPr>
+            <w:tcW w:type="dxa" w:w="2016"/>
+          </w:tcPr>
+          <w:p>
+            <w:r>
+              <w:t>Recover/refine a missed track</w:t>
+            </w:r>
+          </w:p>
+        </w:tc>
+        <w:tc>
+          <w:tcPr>
+            <w:tcW w:type="dxa" w:w="2016"/>
+          </w:tcPr>
+          <w:p>
+            <w:r>
+              <w:t>Small scan about predicted bearing, typically configurable ±2–5°</w:t>
+            </w:r>
+          </w:p>
+        </w:tc>
+        <w:tc>
+          <w:tcPr>
+            <w:tcW w:type="dxa" w:w="2016"/>
+          </w:tcPr>
+          <w:p>
+            <w:r>
+              <w:t>Limited number of fine-angle dwells</w:t>
+            </w:r>
+          </w:p>
+        </w:tc>
+        <w:tc>
+          <w:tcPr>
+            <w:tcW w:type="dxa" w:w="2016"/>
+          </w:tcPr>
+          <w:p>
+            <w:r>
+              <w:t>Target recovered, retry limit reached or track dropped</w:t>
+            </w:r>
+          </w:p>
+        </w:tc>
+      </w:tr>
+    </w:tbl>
+    <w:p>
+      <w:pPr>
+        <w:pStyle w:val="Heading2"/>
+      </w:pPr>
+      <w:r>
+        <w:t>7.6 Mission transition and resource rules</w:t>
+      </w:r>
+    </w:p>
+    <w:p>
+      <w:pPr>
+        <w:pStyle w:val="ListBullet"/>
+      </w:pPr>
+      <w:r>
+        <w:t>Begin in rapid surveillance unless the operator loads a sector-limited mission.</w:t>
+      </w:r>
+    </w:p>
+    <w:p>
+      <w:pPr>
+        <w:pStyle w:val="ListBullet"/>
+      </w:pPr>
+      <w:r>
+        <w:t>Create sector-search work from operator direction or persistent detections; do not alter waveform timing inside the scheduler.</w:t>
+      </w:r>
+    </w:p>
+    <w:p>
+      <w:pPr>
+        <w:pStyle w:val="ListBullet"/>
+      </w:pPr>
+      <w:r>
+        <w:t>Convert confirmed-track predictions into deadline-bearing RevisitRequest objects.</w:t>
+      </w:r>
+    </w:p>
+    <w:p>
+      <w:pPr>
+        <w:pStyle w:val="ListBullet"/>
+      </w:pPr>
+      <w:r>
+        <w:t>On a missed revisit, generate a bounded local reacquisition scan around the predicted bearing rather than an unbounded search.</w:t>
+      </w:r>
+    </w:p>
+    <w:p>
+      <w:pPr>
+        <w:pStyle w:val="ListBullet"/>
+      </w:pPr>
+      <w:r>
+        <w:t>On successful reacquisition, return to track revisits; on retry exhaustion, demote or drop the track according to tracker policy.</w:t>
+      </w:r>
+    </w:p>
+    <w:p>
+      <w:pPr>
+        <w:pStyle w:val="ListBullet"/>
+      </w:pPr>
+      <w:r>
+        <w:t>After higher-priority work, resume the interrupted coverage state and enforce MissionProfile surveillance-duty limits.</w:t>
+      </w:r>
+    </w:p>
+    <w:p>
+      <w:r>
+        <w:br w:type="page"/>
+      </w:r>
+    </w:p>
+    <w:p>
+      <w:pPr>
+        <w:jc w:val="center"/>
+      </w:pPr>
+      <w:r>
+        <w:drawing>
+          <wp:inline xmlns:a="http://schemas.openxmlformats.org/drawingml/2006/main" xmlns:pic="http://schemas.openxmlformats.org/drawingml/2006/picture">
+            <wp:extent cx="5989320" cy="2763703"/>
+            <wp:docPr id="9" name="Picture 9"/>
+            <wp:cNvGraphicFramePr>
+              <a:graphicFrameLocks noChangeAspect="1"/>
+            </wp:cNvGraphicFramePr>
+            <a:graphic>
+              <a:graphicData uri="http://schemas.openxmlformats.org/drawingml/2006/picture">
+                <pic:pic>
+                  <pic:nvPicPr>
+                    <pic:cNvPr id="0" name="mission_scheduler_dwell_flow.png"/>
+                    <pic:cNvPicPr/>
+                  </pic:nvPicPr>
+                  <pic:blipFill>
+                    <a:blip r:embed="rId23"/>
+                    <a:stretch>
+                      <a:fillRect/>
+                    </a:stretch>
+                  </pic:blipFill>
+                  <pic:spPr>
+                    <a:xfrm>
+                      <a:off x="0" y="0"/>
+                      <a:ext cx="5989320" cy="2763703"/>
+                    </a:xfrm>
+                    <a:prstGeom prst="rect"/>
+                  </pic:spPr>
+                </pic:pic>
+              </a:graphicData>
+            </a:graphic>
+          </wp:inline>
+        </w:drawing>
+      </w:r>
+    </w:p>
+    <w:p>
+      <w:pPr>
+        <w:jc w:val="center"/>
+      </w:pPr>
+      <w:r>
+        <w:rPr>
+          <w:i/>
+        </w:rPr>
+        <w:t>Figure 4. Mission intent, scheduler arbitration and dwell-management ownership.</w:t>
+      </w:r>
+    </w:p>
+    <w:p>
+      <w:r>
+        <w:br w:type="page"/>
+      </w:r>
+    </w:p>
+    <w:p>
+      <w:pPr>
+        <w:jc w:val="center"/>
+      </w:pPr>
+      <w:r>
+        <w:drawing>
+          <wp:inline xmlns:a="http://schemas.openxmlformats.org/drawingml/2006/main" xmlns:pic="http://schemas.openxmlformats.org/drawingml/2006/picture">
+            <wp:extent cx="5989320" cy="2684772"/>
+            <wp:docPr id="10" name="Picture 10"/>
+            <wp:cNvGraphicFramePr>
+              <a:graphicFrameLocks noChangeAspect="1"/>
+            </wp:cNvGraphicFramePr>
+            <a:graphic>
+              <a:graphicData uri="http://schemas.openxmlformats.org/drawingml/2006/picture">
+                <pic:pic>
+                  <pic:nvPicPr>
+                    <pic:cNvPr id="0" name="mission_mode_transitions.png"/>
+                    <pic:cNvPicPr/>
+                  </pic:nvPicPr>
+                  <pic:blipFill>
+                    <a:blip r:embed="rId24"/>
+                    <a:stretch>
+                      <a:fillRect/>
+                    </a:stretch>
+                  </pic:blipFill>
+                  <pic:spPr>
+                    <a:xfrm>
+                      <a:off x="0" y="0"/>
+                      <a:ext cx="5989320" cy="2684772"/>
+                    </a:xfrm>
+                    <a:prstGeom prst="rect"/>
+                  </pic:spPr>
+                </pic:pic>
+              </a:graphicData>
+            </a:graphic>
+          </wp:inline>
+        </w:drawing>
+      </w:r>
+    </w:p>
+    <w:p>
+      <w:pPr>
+        <w:jc w:val="center"/>
+      </w:pPr>
+      <w:r>
+        <w:rPr>
+          <w:i/>
+        </w:rPr>
+        <w:t>Figure 5. Planned adaptive mission-mode transitions and search-resumption policy.</w:t>
+      </w:r>
+    </w:p>
+    <w:p>
+      <w:pPr>
+        <w:pStyle w:val="Heading2"/>
+      </w:pPr>
+      <w:r>
+        <w:t>7.7 Implementation status</w:t>
+      </w:r>
+    </w:p>
+    <w:p>
+      <w:r>
+        <w:t>Persistent search, deadline-prioritised TrackTask selection, duplicate revisit suppression, search pause/resume, pointing readiness and task-to-dwell execution are implemented. MissionProfile, automatic sector promotion, bounded local reacquisition and surveillance-duty enforcement are architectural commitments for staged implementation.</w:t>
+      </w:r>
+    </w:p>
+    <w:p>
+      <w:pPr>
         <w:pStyle w:val="Heading1"/>
       </w:pPr>
       <w:r>
@@ -2309,11 +2979,7 @@
         <w:jc w:val="center"/>
       </w:pPr>
       <w:r>
-        <w:rPr>
-          <w:i/>
-          <w:sz w:val="17"/>
-        </w:rPr>
-        <w:t>Figure 4. Scheduler-selected task execution through RadarExecutor.</w:t>
+        <w:t>Figure 6. Scheduler-selected task execution through RadarExecutor.</w:t>
       </w:r>
     </w:p>
     <w:p>
@@ -2369,7 +3035,76 @@
         <w:pStyle w:val="Heading2"/>
       </w:pPr>
       <w:r>
-        <w:t>9.2 Excluded responsibilities</w:t>
+        <w:t>9.2 Dwell-management lifecycle</w:t>
+      </w:r>
+    </w:p>
+    <w:p>
+      <w:r>
+        <w:t>There is no separate DwellManager class in the current baseline. RadarExecutor is the dwell-management boundary and advances one selected RadarTask through one executable dwell step. This name describes an architectural responsibility, not an additional scheduler or hardware-control owner.</w:t>
+      </w:r>
+    </w:p>
+    <w:p>
+      <w:pPr>
+        <w:pStyle w:val="ListNumber"/>
+      </w:pPr>
+      <w:r>
+        <w:t>Activate the selected task in PointingManager when task ownership changes.</w:t>
+      </w:r>
+    </w:p>
+    <w:p>
+      <w:pPr>
+        <w:pStyle w:val="ListNumber"/>
+      </w:pPr>
+      <w:r>
+        <w:t>Update PointingState and wait when pointing is invalid or a TrackTask has not reached goto-and-hold readiness.</w:t>
+      </w:r>
+    </w:p>
+    <w:p>
+      <w:pPr>
+        <w:pStyle w:val="ListNumber"/>
+      </w:pPr>
+      <w:r>
+        <w:t>Select the task-specific ExecutionProfile containing waveform, sample rate, pulse count, PRI, sample count, attenuation and SDR profile.</w:t>
+      </w:r>
+    </w:p>
+    <w:p>
+      <w:pPr>
+        <w:pStyle w:val="ListNumber"/>
+      </w:pPr>
+      <w:r>
+        <w:t>Allocate a DwellId and expand the profile into an immutable pulse sequence and ProcessingPlan.</w:t>
+      </w:r>
+    </w:p>
+    <w:p>
+      <w:pPr>
+        <w:pStyle w:val="ListNumber"/>
+      </w:pPr>
+      <w:r>
+        <w:t>Execute the DwellPlan through SimulatedSource or EttusRadarSource using the common RadarSource boundary.</w:t>
+      </w:r>
+    </w:p>
+    <w:p>
+      <w:pPr>
+        <w:pStyle w:val="ListNumber"/>
+      </w:pPr>
+      <w:r>
+        <w:t>Attach task, pointing, navigation, timing and source diagnostics to RawDwellData and return the ExecutionResult.</w:t>
+      </w:r>
+    </w:p>
+    <w:p>
+      <w:pPr>
+        <w:pStyle w:val="ListNumber"/>
+      </w:pPr>
+      <w:r>
+        <w:t>Release dwell ownership when the scheduler completes or fails the active task; never select the next task inside RadarExecutor.</w:t>
+      </w:r>
+    </w:p>
+    <w:p>
+      <w:pPr>
+        <w:pStyle w:val="Heading2"/>
+      </w:pPr>
+      <w:r>
+        <w:t>9.3 Excluded responsibilities</w:t>
       </w:r>
     </w:p>
     <w:p>
@@ -2417,7 +3152,7 @@
         <w:pStyle w:val="Heading2"/>
       </w:pPr>
       <w:r>
-        <w:t>9.3 Source selection</w:t>
+        <w:t>9.4 Source selection</w:t>
       </w:r>
     </w:p>
     <w:p>
@@ -3267,6 +4002,67 @@
     </w:p>
     <w:p>
       <w:pPr>
+        <w:pStyle w:val="Heading3"/>
+      </w:pPr>
+      <w:r>
+        <w:t>10.1.2 Catalogue ownership and selection</w:t>
+      </w:r>
+    </w:p>
+    <w:p>
+      <w:r>
+        <w:t>WaveformLibrary is the authoritative runtime catalogue. A waveform definition records signal identity and sampled representation only; it does not contain mission priority, antenna pointing or search/track policy. ExecutionProfile selects a catalogue WaveformId together with PRF, pulse count, receive extent, attenuation and SDR configuration. ProcessingPlan then states how the completed CPI is interpreted.</w:t>
+      </w:r>
+    </w:p>
+    <w:p>
+      <w:pPr>
+        <w:pStyle w:val="ListBullet"/>
+      </w:pPr>
+      <w:r>
+        <w:t>Catalogue lookup is by exact, rate-qualified WaveformId and rejects unknown or ambiguous identifiers.</w:t>
+      </w:r>
+    </w:p>
+    <w:p>
+      <w:pPr>
+        <w:pStyle w:val="ListBullet"/>
+      </w:pPr>
+      <w:r>
+        <w:t>Definition arrays are immutable after construction so transmit and matched-filter coefficients cannot diverge during a dwell.</w:t>
+      </w:r>
+    </w:p>
+    <w:p>
+      <w:pPr>
+        <w:pStyle w:val="ListBullet"/>
+      </w:pPr>
+      <w:r>
+        <w:t>The catalogue validates the fixed 40 MS/s sample rate, unit-magnitude phase chips and integer samples per chip.</w:t>
+      </w:r>
+    </w:p>
+    <w:p>
+      <w:pPr>
+        <w:pStyle w:val="ListBullet"/>
+      </w:pPr>
+      <w:r>
+        <w:t>Transmit, SimulatedSource and RadarProcessor consume the same sampled waveform definition.</w:t>
+      </w:r>
+    </w:p>
+    <w:p>
+      <w:pPr>
+        <w:pStyle w:val="ListBullet"/>
+      </w:pPr>
+      <w:r>
+        <w:t>Processing gain and code identity use chip count; matched-filter length and pulse duration use expanded sample count.</w:t>
+      </w:r>
+    </w:p>
+    <w:p>
+      <w:pPr>
+        <w:pStyle w:val="ListBullet"/>
+      </w:pPr>
+      <w:r>
+        <w:t>Mission profiles refer to reusable execution profiles; they do not duplicate or rewrite waveform samples.</w:t>
+      </w:r>
+    </w:p>
+    <w:p>
+      <w:pPr>
         <w:pStyle w:val="Heading2"/>
       </w:pPr>
       <w:r>
@@ -3452,7 +4248,7 @@
     </w:p>
     <w:p>
       <w:r>
-        <w:t>The Ettus B200mini executes hardware-timed SDR commands and returns received IQ. Version 0.7 implements timed receive scheduling. Version 0.8 adds timed waveform transmission and ATR-controlled T/R switching using the same hardware clock.</w:t>
+        <w:t>The Ettus B200mini executes finite hardware-timed transmit bursts and receive windows on one SDR clock. Version 0.7c has validated TX and RX independently and as bounded matched pairs under protected cable-loopback conditions. ATR GPIO timing remains disabled and shall be oscilloscope-verified before the TRM or PA is connected.</w:t>
       </w:r>
     </w:p>
     <w:p>
@@ -3533,11 +4329,54 @@
         <w:jc w:val="center"/>
       </w:pPr>
       <w:r>
-        <w:rPr>
-          <w:i/>
-          <w:sz w:val="17"/>
-        </w:rPr>
-        <w:t>Figure 5. Hardware-timed PRI, transmit, guard and receive-window model.</w:t>
+        <w:t>Figure 7. Hardware-timed PRI, transmit, guard and receive-window model.</w:t>
+      </w:r>
+    </w:p>
+    <w:p>
+      <w:pPr>
+        <w:jc w:val="center"/>
+      </w:pPr>
+      <w:r>
+        <w:drawing>
+          <wp:inline xmlns:a="http://schemas.openxmlformats.org/drawingml/2006/main" xmlns:pic="http://schemas.openxmlformats.org/drawingml/2006/picture">
+            <wp:extent cx="5989320" cy="1968140"/>
+            <wp:docPr id="8" name="Picture 8"/>
+            <wp:cNvGraphicFramePr>
+              <a:graphicFrameLocks noChangeAspect="1"/>
+            </wp:cNvGraphicFramePr>
+            <a:graphic>
+              <a:graphicData uri="http://schemas.openxmlformats.org/drawingml/2006/picture">
+                <pic:pic>
+                  <pic:nvPicPr>
+                    <pic:cNvPr id="0" name="post_cpi_processing_sequence.png"/>
+                    <pic:cNvPicPr/>
+                  </pic:nvPicPr>
+                  <pic:blipFill>
+                    <a:blip r:embed="rId22"/>
+                    <a:stretch>
+                      <a:fillRect/>
+                    </a:stretch>
+                  </pic:blipFill>
+                  <pic:spPr>
+                    <a:xfrm>
+                      <a:off x="0" y="0"/>
+                      <a:ext cx="5989320" cy="1968140"/>
+                    </a:xfrm>
+                    <a:prstGeom prst="rect"/>
+                  </pic:spPr>
+                </pic:pic>
+              </a:graphicData>
+            </a:graphic>
+          </wp:inline>
+        </w:drawing>
+      </w:r>
+    </w:p>
+    <w:p>
+      <w:pPr>
+        <w:jc w:val="center"/>
+      </w:pPr>
+      <w:r>
+        <w:t>Figure 8. Complete-CPI acquisition followed by post-CPI signal processing.</w:t>
       </w:r>
     </w:p>
     <w:p>
@@ -3840,7 +4679,7 @@
         <w:pStyle w:val="Heading2"/>
       </w:pPr>
       <w:r>
-        <w:t>13.4 Version 0.7 timed receive sequence</w:t>
+        <w:t>13.4 Bounded finite per-PRI execution</w:t>
       </w:r>
     </w:p>
     <w:p>
@@ -3848,7 +4687,7 @@
         <w:pStyle w:val="ListBullet"/>
       </w:pPr>
       <w:r>
-        <w:t>Determine one hardware start time for the dwell.</w:t>
+        <w:t>Warm the receive path once, then determine one future hardware start time for the dwell.</w:t>
       </w:r>
     </w:p>
     <w:p>
@@ -3856,7 +4695,7 @@
         <w:pStyle w:val="ListBullet"/>
       </w:pPr>
       <w:r>
-        <w:t>Calculate each scheduled receive time from Tpri1 plus the PulsePlan time offsets.</w:t>
+        <w:t>Calculate every TX and RX time from Tpri1 plus fixed PulsePlan offsets; do not query hardware time inside the PRI loop.</w:t>
       </w:r>
     </w:p>
     <w:p>
@@ -3864,7 +4703,7 @@
         <w:pStyle w:val="ListBullet"/>
       </w:pPr>
       <w:r>
-        <w:t>Issue all finite timed receive commands before blocking for collection.</w:t>
+        <w:t>Prime a bounded queue of finite individual PRI operations and replenish one pair immediately after the oldest RX window is collected.</w:t>
       </w:r>
     </w:p>
     <w:p>
@@ -3872,7 +4711,7 @@
         <w:pStyle w:val="ListBullet"/>
       </w:pPr>
       <w:r>
-        <w:t>Collect the returned samples into an array shaped (NumPulses, NumSamples).</w:t>
+        <w:t>Check every TX send count and asynchronous event, and collect RX samples into an array shaped (NumPulses, NumSamples).</w:t>
       </w:r>
     </w:p>
     <w:p>
@@ -3880,7 +4719,7 @@
         <w:pStyle w:val="ListBullet"/>
       </w:pPr>
       <w:r>
-        <w:t>Record late-command, timeout, received-sample and validity diagnostics.</w:t>
+        <w:t>Record TX acknowledgements, late/time events, underflows, RX metadata errors, timestamps, received-sample counts and validity diagnostics.</w:t>
       </w:r>
     </w:p>
     <w:p>
@@ -3888,7 +4727,7 @@
         <w:pStyle w:val="ListBullet"/>
       </w:pPr>
       <w:r>
-        <w:t>Return RawDwellData through RadarExecutor.</w:t>
+        <w:t>Complete the CPI before matched filtering or other signal processing, then return RawDwellData through RadarExecutor.</w:t>
       </w:r>
     </w:p>
     <w:p>
@@ -3909,12 +4748,12 @@
         <w:pStyle w:val="Heading2"/>
       </w:pPr>
       <w:r>
-        <w:t>13.6 Observed baseline timing</w:t>
-      </w:r>
-    </w:p>
-    <w:p>
-      <w:r>
-        <w:t>With EttusCommandLeadTimeSec configured to 5 ms, measured collection time is approximately 11.8 ms for the current CPI. The scheduler continues to launch dwells at approximately 100 ms intervals. End-to-end dwell processing is approximately 27-31 ms, leaving substantial idle margin before the next scheduled dwell.</w:t>
+        <w:t>13.6 Observed hardware validation</w:t>
+      </w:r>
+    </w:p>
+    <w:p>
+      <w:r>
+        <w:t>Receive-only hardware tests used 40 MS/s, Frank10_20MHz, 4 kHz PRF, 128 pulses and 4,043 RX samples per pulse. A fixed depth-20 RX pipeline returned all 517,504 samples without timeout, overflow or late command. Protected combined TX/RX loopback used a depth-8 paired pipeline at 4 kHz and 128 pulses; all 128 TX sends, burst acknowledgements and RX windows completed with zero transport errors and a repeatable +175 ns RX timestamp offset.</w:t>
       </w:r>
     </w:p>
     <w:tbl>
@@ -4243,11 +5082,7 @@
         <w:jc w:val="center"/>
       </w:pPr>
       <w:r>
-        <w:rPr>
-          <w:i/>
-          <w:sz w:val="17"/>
-        </w:rPr>
-        <w:t>Figure 6. EttusRadarSource execution state machine.</w:t>
+        <w:t>Figure 9. EttusRadarSource execution state machine.</w:t>
       </w:r>
     </w:p>
     <w:p>
@@ -4255,12 +5090,12 @@
         <w:pStyle w:val="Heading2"/>
       </w:pPr>
       <w:r>
-        <w:t>13.8 Version 0.8 timed transmit extension</w:t>
-      </w:r>
-    </w:p>
-    <w:p>
-      <w:r>
-        <w:t>Timed transmit shall reuse Tpri1 and the same SDR hardware clock at the fixed 40 MS/s sample rate. The host shall queue receive commands first, then queue transmit bursts, then collect samples. For each pulse, transmit occurs at Ttx[n] = Tpri1 + pulse offset. The transmitted buffer is the authoritative sampled waveform from WaveformLibrary. The receive window begins only after transmit is inactive and the configured T/R switching and receiver-recovery guard interval has elapsed.</w:t>
+        <w:t>13.8 Timed transmit and receive pairing</w:t>
+      </w:r>
+    </w:p>
+    <w:p>
+      <w:r>
+        <w:t>Timed transmit reuses Tpri1 and the fixed 40 MS/s hardware clock. Each pulse uses the authoritative sampled waveform from WaveformLibrary and explicit start/end-of-burst metadata. The host maintains a bounded horizon of finite pulse-specific operations rather than queuing an unbounded dwell or using continuous receive. Queue replenishment occurs before copying, diagnostic formatting or processing can consume the scheduling horizon. Operationally, TX occurs at Ttx[n] and RX begins only after TX is inactive and the configured guard has elapsed.</w:t>
       </w:r>
     </w:p>
     <w:p>
@@ -4268,7 +5103,21 @@
         <w:pStyle w:val="Heading2"/>
       </w:pPr>
       <w:r>
-        <w:t>13.9 SDR design rules</w:t>
+        <w:t>13.9 Protected loopback evidence</w:t>
+      </w:r>
+    </w:p>
+    <w:p>
+      <w:pPr/>
+      <w:r>
+        <w:t>The non-operational cable-loopback test connected TX/RX through 30 dB attenuation to RX2, with TX gain 50 dB and RX gain 30 dB. RX opened at T and the 5 microsecond Frank10_20MHz pulse was scheduled at T + 10 microseconds so it could be observed directly. At 4 kHz and 128 pulses, the matched-filter peak was 31.56-47.69 dB above the estimated floor and locked on every pulse. The measured diagnostic-path delay was 166 samples (4.15 microseconds), with the physical response at sample 566. This value is test-path calibration evidence, not yet an operational range correction.</w:t>
+      </w:r>
+    </w:p>
+    <w:p>
+      <w:pPr>
+        <w:pStyle w:val="Heading2"/>
+      </w:pPr>
+      <w:r>
+        <w:t>13.10 SDR design rules</w:t>
       </w:r>
     </w:p>
     <w:p>
@@ -4292,7 +5141,15 @@
         <w:pStyle w:val="ListBullet"/>
       </w:pPr>
       <w:r>
-        <w:t>Queue timed commands before acquisition blocks the host.</w:t>
+        <w:t>Maintain a bounded future command horizon and replenish immediately after collection of the oldest RX window.</w:t>
+      </w:r>
+    </w:p>
+    <w:p>
+      <w:pPr>
+        <w:pStyle w:val="ListBullet"/>
+      </w:pPr>
+      <w:r>
+        <w:t>Perform pulse compression and all other CPI processing only after the complete dwell has been captured.</w:t>
       </w:r>
     </w:p>
     <w:p>
@@ -5463,7 +6320,15 @@
         <w:pStyle w:val="ListBullet"/>
       </w:pPr>
       <w:r>
-        <w:t>AllReceiveCommandsQueuedBeforeCollection flag.</w:t>
+        <w:t>Configured and maximum outstanding finite TX/RX command depth.</w:t>
+      </w:r>
+    </w:p>
+    <w:p>
+      <w:pPr>
+        <w:pStyle w:val="ListBullet"/>
+      </w:pPr>
+      <w:r>
+        <w:t>TX send count, burst acknowledgement count and asynchronous underflow/time/sequence events.</w:t>
       </w:r>
     </w:p>
     <w:p>
@@ -5552,11 +6417,7 @@
         <w:jc w:val="center"/>
       </w:pPr>
       <w:r>
-        <w:rPr>
-          <w:i/>
-          <w:sz w:val="17"/>
-        </w:rPr>
-        <w:t>Figure 7. Verification maturity progression.</w:t>
+        <w:t>Figure 10. Verification maturity progression.</w:t>
       </w:r>
     </w:p>
     <w:p>
@@ -5577,7 +6438,7 @@
         <w:pStyle w:val="Heading2"/>
       </w:pPr>
       <w:r>
-        <w:t>17.2 Version 0.7 completed verification</w:t>
+        <w:t>17.2 Version 0.7c completed verification</w:t>
       </w:r>
     </w:p>
     <w:p>
@@ -5601,7 +6462,7 @@
         <w:pStyle w:val="ListBullet"/>
       </w:pPr>
       <w:r>
-        <w:t>Receive tuning and finite timed receives complete successfully.</w:t>
+        <w:t>Receive tuning and bounded finite per-PRI RX execution complete successfully through 4 kHz and 128 pulses.</w:t>
       </w:r>
     </w:p>
     <w:p>
@@ -5609,7 +6470,7 @@
         <w:pStyle w:val="ListBullet"/>
       </w:pPr>
       <w:r>
-        <w:t>Returned IQ shape and type match the existing processing chain.</w:t>
+        <w:t>Timed Frank10_20MHz transmission produces the expected 200-sample, 5 microsecond RF pulse.</w:t>
       </w:r>
     </w:p>
     <w:p>
@@ -5617,7 +6478,7 @@
         <w:pStyle w:val="ListBullet"/>
       </w:pPr>
       <w:r>
-        <w:t>All timed receive commands are queued before collection.</w:t>
+        <w:t>Protected combined loopback passes at 4 kHz, 128 pulses and paired depth 8 with 128/128 sends, acknowledgements and RX windows.</w:t>
       </w:r>
     </w:p>
     <w:p>
@@ -5625,7 +6486,7 @@
         <w:pStyle w:val="ListBullet"/>
       </w:pPr>
       <w:r>
-        <w:t>Collection time is reduced from the previous lead-time-dominated behaviour to approximately 11.8 ms.</w:t>
+        <w:t>Matched filtering occurs after CPI collection and locks to the calibrated response on every pulse.</w:t>
       </w:r>
     </w:p>
     <w:p>
@@ -5641,7 +6502,7 @@
         <w:pStyle w:val="Heading2"/>
       </w:pPr>
       <w:r>
-        <w:t>17.3 Version 0.8 verification</w:t>
+        <w:t>17.3 Outstanding ATR and operational-path verification</w:t>
       </w:r>
     </w:p>
     <w:p>
@@ -5657,7 +6518,7 @@
         <w:pStyle w:val="ListBullet"/>
       </w:pPr>
       <w:r>
-        <w:t>Transmit pulse-width verification at low power into a suitable load or attenuator.</w:t>
+        <w:t>Measurement of TX-to-RX guard interval.</w:t>
       </w:r>
     </w:p>
     <w:p>
@@ -5665,7 +6526,7 @@
         <w:pStyle w:val="ListBullet"/>
       </w:pPr>
       <w:r>
-        <w:t>Measurement of TX-to-RX guard interval.</w:t>
+        <w:t>Confirmation that the first pulse of each dwell follows the scheduler cadence without accumulated drift.</w:t>
       </w:r>
     </w:p>
     <w:p>
@@ -5673,39 +6534,7 @@
         <w:pStyle w:val="ListBullet"/>
       </w:pPr>
       <w:r>
-        <w:t>Confirmation that the first pulse of each dwell follows the scheduler cadence without accumulated drift.</w:t>
-      </w:r>
-    </w:p>
-    <w:p>
-      <w:pPr>
-        <w:pStyle w:val="ListBullet"/>
-      </w:pPr>
-      <w:r>
-        <w:t>Timed TX/RX loopback with stable range bin and pulse-to-pulse phase.</w:t>
-      </w:r>
-    </w:p>
-    <w:p>
-      <w:pPr>
-        <w:pStyle w:val="ListBullet"/>
-      </w:pPr>
-      <w:r>
         <w:t>ATR non-overlap and receiver-recovery verification before connection to the 50 W path.</w:t>
-      </w:r>
-    </w:p>
-    <w:p>
-      <w:pPr>
-        <w:pStyle w:val="ListBullet"/>
-      </w:pPr>
-      <w:r>
-        <w:t>Verification that Barker13_20MHz and Frank10_20MHz contain 26 and 200 samples respectively, and that Barker13_10MHz and Frank10_10MHz contain 52 and 400 samples respectively, at the fixed 40 MS/s sample rate.</w:t>
-      </w:r>
-    </w:p>
-    <w:p>
-      <w:pPr>
-        <w:pStyle w:val="ListBullet"/>
-      </w:pPr>
-      <w:r>
-        <w:t>PRF limit, derived PRI, CPI-duration and timing-safety validation across the 1-4 kHz operator range.</w:t>
       </w:r>
     </w:p>
     <w:p>
@@ -6573,16 +7402,8 @@
             </w:tcMar>
           </w:tcPr>
           <w:p>
-            <w:pPr>
-              <w:spacing w:before="0" w:after="0" w:line="240" w:lineRule="auto"/>
-              <w:jc w:val="left"/>
-            </w:pPr>
-            <w:r>
-              <w:rPr>
-                <w:b w:val="0"/>
-                <w:sz w:val="16"/>
-              </w:rPr>
-              <w:t>All timed receive commands shall be queued before collection blocks.</w:t>
+            <w:r>
+              <w:t>Finite per-PRI TX/RX operations shall use a bounded future command horizon.</w:t>
             </w:r>
           </w:p>
         </w:tc>
@@ -6598,16 +7419,8 @@
             </w:tcMar>
           </w:tcPr>
           <w:p>
-            <w:pPr>
-              <w:spacing w:before="0" w:after="0" w:line="240" w:lineRule="auto"/>
-              <w:jc w:val="left"/>
-            </w:pPr>
-            <w:r>
-              <w:rPr>
-                <w:b w:val="0"/>
-                <w:sz w:val="16"/>
-              </w:rPr>
-              <w:t>Section 13.4</w:t>
+            <w:r>
+              <w:t>Sections 13.4, 13.8</w:t>
             </w:r>
           </w:p>
         </w:tc>
@@ -6623,15 +7436,7 @@
             </w:tcMar>
           </w:tcPr>
           <w:p>
-            <w:pPr>
-              <w:spacing w:before="0" w:after="0" w:line="240" w:lineRule="auto"/>
-              <w:jc w:val="left"/>
-            </w:pPr>
-            <w:r>
-              <w:rPr>
-                <w:b w:val="0"/>
-                <w:sz w:val="16"/>
-              </w:rPr>
+            <w:r>
               <w:t>EttusRadarSource.py</w:t>
             </w:r>
           </w:p>
@@ -6648,16 +7453,8 @@
             </w:tcMar>
           </w:tcPr>
           <w:p>
-            <w:pPr>
-              <w:spacing w:before="0" w:after="0" w:line="240" w:lineRule="auto"/>
-              <w:jc w:val="left"/>
-            </w:pPr>
-            <w:r>
-              <w:rPr>
-                <w:b w:val="0"/>
-                <w:sz w:val="16"/>
-              </w:rPr>
-              <w:t>Diagnostic flag and hardware test</w:t>
+            <w:r>
+              <w:t>4 kHz / 128-pulse hardware test</w:t>
             </w:r>
           </w:p>
         </w:tc>
@@ -7093,16 +7890,8 @@
             </w:tcMar>
           </w:tcPr>
           <w:p>
-            <w:pPr>
-              <w:spacing w:before="0" w:after="0" w:line="240" w:lineRule="auto"/>
-              <w:jc w:val="left"/>
-            </w:pPr>
-            <w:r>
-              <w:rPr>
-                <w:b w:val="0"/>
-                <w:sz w:val="16"/>
-              </w:rPr>
-              <w:t>Timed TX shall be scope-verified before connection to the high-power path.</w:t>
+            <w:r>
+              <w:t>Timed TX and ATR non-overlap shall be scope-verified before connection to the high-power path.</w:t>
             </w:r>
           </w:p>
         </w:tc>
@@ -7143,16 +7932,8 @@
             </w:tcMar>
           </w:tcPr>
           <w:p>
-            <w:pPr>
-              <w:spacing w:before="0" w:after="0" w:line="240" w:lineRule="auto"/>
-              <w:jc w:val="left"/>
-            </w:pPr>
-            <w:r>
-              <w:rPr>
-                <w:b w:val="0"/>
-                <w:sz w:val="16"/>
-              </w:rPr>
-              <w:t>Version 0.8</w:t>
+            <w:r>
+              <w:t>Version 0.7c TX; Version 0.8 ATR</w:t>
             </w:r>
           </w:p>
         </w:tc>
@@ -7168,16 +7949,8 @@
             </w:tcMar>
           </w:tcPr>
           <w:p>
-            <w:pPr>
-              <w:spacing w:before="0" w:after="0" w:line="240" w:lineRule="auto"/>
-              <w:jc w:val="left"/>
-            </w:pPr>
-            <w:r>
-              <w:rPr>
-                <w:b w:val="0"/>
-                <w:sz w:val="16"/>
-              </w:rPr>
-              <w:t>Oscilloscope procedure</w:t>
+            <w:r>
+              <w:t>TX scope evidence complete; ATR CRO procedure outstanding</w:t>
             </w:r>
           </w:p>
         </w:tc>
@@ -7846,6 +8619,450 @@
                 <w:sz w:val="16"/>
               </w:rPr>
               <w:t>Timing-model unit test and scope verification</w:t>
+            </w:r>
+          </w:p>
+        </w:tc>
+      </w:tr>
+      <w:tr>
+        <w:tc>
+          <w:tcPr>
+            <w:tcW w:type="dxa" w:w="1250"/>
+            <w:tcW w:type="dxa" w:w="2016"/>
+            <w:vAlign w:val="center"/>
+            <w:tcMar>
+              <w:top w:w="55" w:type="dxa"/>
+              <w:bottom w:w="55" w:type="dxa"/>
+              <w:start w:w="80" w:type="dxa"/>
+              <w:end w:w="80" w:type="dxa"/>
+            </w:tcMar>
+          </w:tcPr>
+          <w:p>
+            <w:r>
+              <w:t>VX-SDR-004</w:t>
+            </w:r>
+          </w:p>
+        </w:tc>
+        <w:tc>
+          <w:tcPr>
+            <w:tcW w:type="dxa" w:w="2600"/>
+            <w:tcW w:type="dxa" w:w="2016"/>
+            <w:vAlign w:val="center"/>
+            <w:tcMar>
+              <w:top w:w="55" w:type="dxa"/>
+              <w:bottom w:w="55" w:type="dxa"/>
+              <w:start w:w="80" w:type="dxa"/>
+              <w:end w:w="80" w:type="dxa"/>
+            </w:tcMar>
+          </w:tcPr>
+          <w:p>
+            <w:r>
+              <w:t>Timed TX/RX execution shall check every TX send/acknowledgement and every finite RX window.</w:t>
+            </w:r>
+          </w:p>
+        </w:tc>
+        <w:tc>
+          <w:tcPr>
+            <w:tcW w:type="dxa" w:w="1400"/>
+            <w:tcW w:type="dxa" w:w="2016"/>
+            <w:vAlign w:val="center"/>
+            <w:tcMar>
+              <w:top w:w="55" w:type="dxa"/>
+              <w:bottom w:w="55" w:type="dxa"/>
+              <w:start w:w="80" w:type="dxa"/>
+              <w:end w:w="80" w:type="dxa"/>
+            </w:tcMar>
+          </w:tcPr>
+          <w:p>
+            <w:r>
+              <w:t>Sections 13.8, 16.1</w:t>
+            </w:r>
+          </w:p>
+        </w:tc>
+        <w:tc>
+          <w:tcPr>
+            <w:tcW w:type="dxa" w:w="2300"/>
+            <w:tcW w:type="dxa" w:w="2016"/>
+            <w:vAlign w:val="center"/>
+            <w:tcMar>
+              <w:top w:w="55" w:type="dxa"/>
+              <w:bottom w:w="55" w:type="dxa"/>
+              <w:start w:w="80" w:type="dxa"/>
+              <w:end w:w="80" w:type="dxa"/>
+            </w:tcMar>
+          </w:tcPr>
+          <w:p>
+            <w:r>
+              <w:t>EttusRadarSource.py</w:t>
+            </w:r>
+          </w:p>
+        </w:tc>
+        <w:tc>
+          <w:tcPr>
+            <w:tcW w:type="dxa" w:w="2290"/>
+            <w:tcW w:type="dxa" w:w="2016"/>
+            <w:vAlign w:val="center"/>
+            <w:tcMar>
+              <w:top w:w="55" w:type="dxa"/>
+              <w:bottom w:w="55" w:type="dxa"/>
+              <w:start w:w="80" w:type="dxa"/>
+              <w:end w:w="80" w:type="dxa"/>
+            </w:tcMar>
+          </w:tcPr>
+          <w:p>
+            <w:r>
+              <w:t>Protected paired-loopback test</w:t>
+            </w:r>
+          </w:p>
+        </w:tc>
+      </w:tr>
+      <w:tr>
+        <w:tc>
+          <w:tcPr>
+            <w:tcW w:type="dxa" w:w="1250"/>
+            <w:tcW w:type="dxa" w:w="2016"/>
+            <w:vAlign w:val="center"/>
+            <w:tcMar>
+              <w:top w:w="55" w:type="dxa"/>
+              <w:bottom w:w="55" w:type="dxa"/>
+              <w:start w:w="80" w:type="dxa"/>
+              <w:end w:w="80" w:type="dxa"/>
+            </w:tcMar>
+          </w:tcPr>
+          <w:p>
+            <w:r>
+              <w:t>VX-PROC-002</w:t>
+            </w:r>
+          </w:p>
+        </w:tc>
+        <w:tc>
+          <w:tcPr>
+            <w:tcW w:type="dxa" w:w="2600"/>
+            <w:tcW w:type="dxa" w:w="2016"/>
+            <w:vAlign w:val="center"/>
+            <w:tcMar>
+              <w:top w:w="55" w:type="dxa"/>
+              <w:bottom w:w="55" w:type="dxa"/>
+              <w:start w:w="80" w:type="dxa"/>
+              <w:end w:w="80" w:type="dxa"/>
+            </w:tcMar>
+          </w:tcPr>
+          <w:p>
+            <w:r>
+              <w:t>CPI processing shall begin only after acquisition of the complete dwell.</w:t>
+            </w:r>
+          </w:p>
+        </w:tc>
+        <w:tc>
+          <w:tcPr>
+            <w:tcW w:type="dxa" w:w="1400"/>
+            <w:tcW w:type="dxa" w:w="2016"/>
+            <w:vAlign w:val="center"/>
+            <w:tcMar>
+              <w:top w:w="55" w:type="dxa"/>
+              <w:bottom w:w="55" w:type="dxa"/>
+              <w:start w:w="80" w:type="dxa"/>
+              <w:end w:w="80" w:type="dxa"/>
+            </w:tcMar>
+          </w:tcPr>
+          <w:p>
+            <w:r>
+              <w:t>Sections 11, 13.10</w:t>
+            </w:r>
+          </w:p>
+        </w:tc>
+        <w:tc>
+          <w:tcPr>
+            <w:tcW w:type="dxa" w:w="2300"/>
+            <w:tcW w:type="dxa" w:w="2016"/>
+            <w:vAlign w:val="center"/>
+            <w:tcMar>
+              <w:top w:w="55" w:type="dxa"/>
+              <w:bottom w:w="55" w:type="dxa"/>
+              <w:start w:w="80" w:type="dxa"/>
+              <w:end w:w="80" w:type="dxa"/>
+            </w:tcMar>
+          </w:tcPr>
+          <w:p>
+            <w:r>
+              <w:t>RadarProcessor.py; acquisition harness</w:t>
+            </w:r>
+          </w:p>
+        </w:tc>
+        <w:tc>
+          <w:tcPr>
+            <w:tcW w:type="dxa" w:w="2290"/>
+            <w:tcW w:type="dxa" w:w="2016"/>
+            <w:vAlign w:val="center"/>
+            <w:tcMar>
+              <w:top w:w="55" w:type="dxa"/>
+              <w:bottom w:w="55" w:type="dxa"/>
+              <w:start w:w="80" w:type="dxa"/>
+              <w:end w:w="80" w:type="dxa"/>
+            </w:tcMar>
+          </w:tcPr>
+          <w:p>
+            <w:r>
+              <w:t>Post-CPI processing regression</w:t>
+            </w:r>
+          </w:p>
+        </w:tc>
+      </w:tr>
+      <w:tr>
+        <w:tc>
+          <w:tcPr>
+            <w:tcW w:type="dxa" w:w="1250"/>
+          </w:tcPr>
+          <w:p>
+            <w:r>
+              <w:t>VX-MSN-001</w:t>
+            </w:r>
+          </w:p>
+        </w:tc>
+        <w:tc>
+          <w:tcPr>
+            <w:tcW w:type="dxa" w:w="2600"/>
+          </w:tcPr>
+          <w:p>
+            <w:r>
+              <w:t>Mission policy shall generate tasks without directly commanding pointing, SDR or processing hardware.</w:t>
+            </w:r>
+          </w:p>
+        </w:tc>
+        <w:tc>
+          <w:tcPr>
+            <w:tcW w:type="dxa" w:w="1400"/>
+          </w:tcPr>
+          <w:p>
+            <w:r>
+              <w:t>Sections 2.5, 7.5</w:t>
+            </w:r>
+          </w:p>
+        </w:tc>
+        <w:tc>
+          <w:tcPr>
+            <w:tcW w:type="dxa" w:w="2300"/>
+          </w:tcPr>
+          <w:p>
+            <w:r>
+              <w:t>MissionProfile.py (planned); RadarScheduler.py</w:t>
+            </w:r>
+          </w:p>
+        </w:tc>
+        <w:tc>
+          <w:tcPr>
+            <w:tcW w:type="dxa" w:w="2290"/>
+          </w:tcPr>
+          <w:p>
+            <w:r>
+              <w:t>Mission task-generation regression</w:t>
+            </w:r>
+          </w:p>
+        </w:tc>
+      </w:tr>
+      <w:tr>
+        <w:tc>
+          <w:tcPr>
+            <w:tcW w:type="dxa" w:w="1250"/>
+          </w:tcPr>
+          <w:p>
+            <w:r>
+              <w:t>VX-SCH-001</w:t>
+            </w:r>
+          </w:p>
+        </w:tc>
+        <w:tc>
+          <w:tcPr>
+            <w:tcW w:type="dxa" w:w="2600"/>
+          </w:tcPr>
+          <w:p>
+            <w:r>
+              <w:t>The scheduler shall prioritise ready track revisits by priority and deadline, otherwise resuming persistent search.</w:t>
+            </w:r>
+          </w:p>
+        </w:tc>
+        <w:tc>
+          <w:tcPr>
+            <w:tcW w:type="dxa" w:w="1400"/>
+          </w:tcPr>
+          <w:p>
+            <w:r>
+              <w:t>Sections 7.1, 7.4</w:t>
+            </w:r>
+          </w:p>
+        </w:tc>
+        <w:tc>
+          <w:tcPr>
+            <w:tcW w:type="dxa" w:w="2300"/>
+          </w:tcPr>
+          <w:p>
+            <w:r>
+              <w:t>RadarScheduler.py</w:t>
+            </w:r>
+          </w:p>
+        </w:tc>
+        <w:tc>
+          <w:tcPr>
+            <w:tcW w:type="dxa" w:w="2290"/>
+          </w:tcPr>
+          <w:p>
+            <w:r>
+              <w:t>Scheduler integration regression</w:t>
+            </w:r>
+          </w:p>
+        </w:tc>
+      </w:tr>
+      <w:tr>
+        <w:tc>
+          <w:tcPr>
+            <w:tcW w:type="dxa" w:w="1250"/>
+          </w:tcPr>
+          <w:p>
+            <w:r>
+              <w:t>VX-SCH-002</w:t>
+            </w:r>
+          </w:p>
+        </w:tc>
+        <w:tc>
+          <w:tcPr>
+            <w:tcW w:type="dxa" w:w="2600"/>
+          </w:tcPr>
+          <w:p>
+            <w:r>
+              <w:t>Interrupted search state shall be preserved and resumed after higher-priority work.</w:t>
+            </w:r>
+          </w:p>
+        </w:tc>
+        <w:tc>
+          <w:tcPr>
+            <w:tcW w:type="dxa" w:w="1400"/>
+          </w:tcPr>
+          <w:p>
+            <w:r>
+              <w:t>Sections 7.2, 7.6</w:t>
+            </w:r>
+          </w:p>
+        </w:tc>
+        <w:tc>
+          <w:tcPr>
+            <w:tcW w:type="dxa" w:w="2300"/>
+          </w:tcPr>
+          <w:p>
+            <w:r>
+              <w:t>RadarScheduler.py; PointingManager.py</w:t>
+            </w:r>
+          </w:p>
+        </w:tc>
+        <w:tc>
+          <w:tcPr>
+            <w:tcW w:type="dxa" w:w="2290"/>
+          </w:tcPr>
+          <w:p>
+            <w:r>
+              <w:t>Search interruption/resumption regression</w:t>
+            </w:r>
+          </w:p>
+        </w:tc>
+      </w:tr>
+      <w:tr>
+        <w:tc>
+          <w:tcPr>
+            <w:tcW w:type="dxa" w:w="1250"/>
+          </w:tcPr>
+          <w:p>
+            <w:r>
+              <w:t>VX-EXEC-002</w:t>
+            </w:r>
+          </w:p>
+        </w:tc>
+        <w:tc>
+          <w:tcPr>
+            <w:tcW w:type="dxa" w:w="2600"/>
+          </w:tcPr>
+          <w:p>
+            <w:r>
+              <w:t>RadarExecutor shall own dwell construction and source execution but shall not select the next radar task.</w:t>
+            </w:r>
+          </w:p>
+        </w:tc>
+        <w:tc>
+          <w:tcPr>
+            <w:tcW w:type="dxa" w:w="1400"/>
+          </w:tcPr>
+          <w:p>
+            <w:r>
+              <w:t>Section 9.2</w:t>
+            </w:r>
+          </w:p>
+        </w:tc>
+        <w:tc>
+          <w:tcPr>
+            <w:tcW w:type="dxa" w:w="2300"/>
+          </w:tcPr>
+          <w:p>
+            <w:r>
+              <w:t>RadarExecutor.py</w:t>
+            </w:r>
+          </w:p>
+        </w:tc>
+        <w:tc>
+          <w:tcPr>
+            <w:tcW w:type="dxa" w:w="2290"/>
+          </w:tcPr>
+          <w:p>
+            <w:r>
+              <w:t>Execution-boundary regression</w:t>
+            </w:r>
+          </w:p>
+        </w:tc>
+      </w:tr>
+      <w:tr>
+        <w:tc>
+          <w:tcPr>
+            <w:tcW w:type="dxa" w:w="1250"/>
+          </w:tcPr>
+          <w:p>
+            <w:r>
+              <w:t>VX-WFM-004</w:t>
+            </w:r>
+          </w:p>
+        </w:tc>
+        <w:tc>
+          <w:tcPr>
+            <w:tcW w:type="dxa" w:w="2600"/>
+          </w:tcPr>
+          <w:p>
+            <w:r>
+              <w:t>Mission and execution profiles shall select immutable, rate-qualified waveform definitions from the authoritative catalogue.</w:t>
+            </w:r>
+          </w:p>
+        </w:tc>
+        <w:tc>
+          <w:tcPr>
+            <w:tcW w:type="dxa" w:w="1400"/>
+          </w:tcPr>
+          <w:p>
+            <w:r>
+              <w:t>Sections 10.1, 10.1.2</w:t>
+            </w:r>
+          </w:p>
+        </w:tc>
+        <w:tc>
+          <w:tcPr>
+            <w:tcW w:type="dxa" w:w="2300"/>
+          </w:tcPr>
+          <w:p>
+            <w:r>
+              <w:t>WaveformLibrary.py; RadarExecutor.py</w:t>
+            </w:r>
+          </w:p>
+        </w:tc>
+        <w:tc>
+          <w:tcPr>
+            <w:tcW w:type="dxa" w:w="2290"/>
+          </w:tcPr>
+          <w:p>
+            <w:r>
+              <w:t>Waveform catalogue regression</w:t>
             </w:r>
           </w:p>
         </w:tc>
@@ -8171,10 +9388,8 @@
             <w:vAlign w:val="center"/>
           </w:tcPr>
           <w:p>
-            <w:pPr/>
-            <w:r>
-              <w:rPr/>
-              <w:t>Current decision baseline</w:t>
+            <w:r>
+              <w:t>Superseded</w:t>
             </w:r>
           </w:p>
         </w:tc>
@@ -8189,7 +9404,7 @@
           </w:tcPr>
           <w:p>
             <w:r>
-              <w:t>0.8</w:t>
+              <w:t>0.7c</w:t>
             </w:r>
           </w:p>
         </w:tc>
@@ -8199,7 +9414,7 @@
           </w:tcPr>
           <w:p>
             <w:r>
-              <w:t>Timed TX, ATR gating, oscilloscope and loopback verification</w:t>
+              <w:t>Bounded timed TX/RX protected hardware validation</w:t>
             </w:r>
           </w:p>
         </w:tc>
@@ -8209,7 +9424,7 @@
           </w:tcPr>
           <w:p>
             <w:r>
-              <w:t>B200mini TX / ATR / protected loopback</w:t>
+              <w:t>B200mini low-power TX and attenuated RX2 loopback; TRM disconnected</w:t>
             </w:r>
           </w:p>
         </w:tc>
@@ -8219,7 +9434,49 @@
           </w:tcPr>
           <w:p>
             <w:r>
-              <w:t>Next</w:t>
+              <w:t>Completed hardware-validation baseline</w:t>
+            </w:r>
+          </w:p>
+        </w:tc>
+      </w:tr>
+      <w:tr>
+        <w:tc>
+          <w:tcPr>
+            <w:tcW w:type="dxa" w:w="2520"/>
+          </w:tcPr>
+          <w:p>
+            <w:r>
+              <w:t>0.7d</w:t>
+            </w:r>
+          </w:p>
+        </w:tc>
+        <w:tc>
+          <w:tcPr>
+            <w:tcW w:type="dxa" w:w="2520"/>
+          </w:tcPr>
+          <w:p>
+            <w:r>
+              <w:t>Mission profiles, scheduler arbitration, dwell-management and waveform-catalogue architecture</w:t>
+            </w:r>
+          </w:p>
+        </w:tc>
+        <w:tc>
+          <w:tcPr>
+            <w:tcW w:type="dxa" w:w="2520"/>
+          </w:tcPr>
+          <w:p>
+            <w:r>
+              <w:t>Documentation and simulation only; no ATR/TRM enable</w:t>
+            </w:r>
+          </w:p>
+        </w:tc>
+        <w:tc>
+          <w:tcPr>
+            <w:tcW w:type="dxa" w:w="2520"/>
+          </w:tcPr>
+          <w:p>
+            <w:r>
+              <w:t>Current architecture baseline</w:t>
             </w:r>
           </w:p>
         </w:tc>
@@ -8234,7 +9491,7 @@
           </w:tcPr>
           <w:p>
             <w:r>
-              <w:t>0.9</w:t>
+              <w:t>0.8</w:t>
             </w:r>
           </w:p>
         </w:tc>
@@ -8244,7 +9501,7 @@
           </w:tcPr>
           <w:p>
             <w:r>
-              <w:t>First coherent radar trials, calibration and clutter tuning</w:t>
+              <w:t>Operational TX/RX timing, ATR GPIO and guard verification</w:t>
             </w:r>
           </w:p>
         </w:tc>
@@ -8254,7 +9511,7 @@
           </w:tcPr>
           <w:p>
             <w:r>
-              <w:t>TRM and antenna at controlled power</w:t>
+              <w:t>B200mini ATR outputs observed on CRO; TRM initially disconnected</w:t>
             </w:r>
           </w:p>
         </w:tc>
@@ -8264,7 +9521,7 @@
           </w:tcPr>
           <w:p>
             <w:r>
-              <w:t>Planned</w:t>
+              <w:t>Next</w:t>
             </w:r>
           </w:p>
         </w:tc>
@@ -8328,7 +9585,7 @@
         <w:pStyle w:val="ListBullet"/>
       </w:pPr>
       <w:r>
-        <w:t>Commit Version 0.7b waveform and timing decision baseline.</w:t>
+        <w:t>Commit the Version 0.7d mission, scheduling, dwell-management and waveform-catalogue architecture baseline.</w:t>
       </w:r>
     </w:p>
     <w:p>
@@ -8336,7 +9593,7 @@
         <w:pStyle w:val="ListBullet"/>
       </w:pPr>
       <w:r>
-        <w:t>Perform receive timing and scheduler verification on the oscilloscope where observable timing signals are available.</w:t>
+        <w:t>Configure TX and RX ATR GPIO with the TRM disconnected and verify pulse width, non-overlap and guard timing on the oscilloscope.</w:t>
       </w:r>
     </w:p>
     <w:p>
@@ -8344,7 +9601,7 @@
         <w:pStyle w:val="ListBullet"/>
       </w:pPr>
       <w:r>
-        <w:t>Implement the explicit Barker13_10MHz, Barker13_20MHz, Frank10_10MHz and Frank10_20MHz definitions, sampled-waveform metadata and integer samples-per-chip expansion at the fixed 40 MS/s sample rate.</w:t>
+        <w:t>Integrate the validated bounded paired pipeline into the operational EttusRadarSource while retaining receive-only mode.</w:t>
       </w:r>
     </w:p>
     <w:p>
@@ -8352,7 +9609,7 @@
         <w:pStyle w:val="ListBullet"/>
       </w:pPr>
       <w:r>
-        <w:t>Implement operator PRF and pulses-per-CPI controls with timing-derived validation and displayed consequences.</w:t>
+        <w:t>Measure receiver recovery and replace provisional guard values with controlled hardware evidence.</w:t>
       </w:r>
     </w:p>
     <w:p>
@@ -8360,7 +9617,7 @@
         <w:pStyle w:val="ListBullet"/>
       </w:pPr>
       <w:r>
-        <w:t>Derive receive sample count and range-axis offset from maximum range and measured timing parameters.</w:t>
+        <w:t>Calibrate operational range offset separately from the 166-sample diagnostic cable-loopback delay.</w:t>
       </w:r>
     </w:p>
     <w:p>
@@ -8368,7 +9625,7 @@
         <w:pStyle w:val="ListBullet"/>
       </w:pPr>
       <w:r>
-        <w:t>Implement optional timed transmit without removing receive-only mode.</w:t>
+        <w:t>Run operational non-overlapping TX-at-T and RX-at-T+6 microsecond timing tests across 1-4 kHz.</w:t>
       </w:r>
     </w:p>
     <w:p>
@@ -8376,7 +9633,7 @@
         <w:pStyle w:val="ListBullet"/>
       </w:pPr>
       <w:r>
-        <w:t>Add ATR definitions and guarded non-overlapping T/R control.</w:t>
+        <w:t>Connect the TRM only after ATR polarity, idle state and non-overlap are verified.</w:t>
       </w:r>
     </w:p>
     <w:p>
@@ -8384,7 +9641,39 @@
         <w:pStyle w:val="ListBullet"/>
       </w:pPr>
       <w:r>
-        <w:t>Perform protected low-power loopback and verify coherent phase.</w:t>
+        <w:t>Profile acquisition and post-CPI processing; consider CPU affinity only if measured scheduling margin requires it.</w:t>
+      </w:r>
+    </w:p>
+    <w:p>
+      <w:pPr>
+        <w:pStyle w:val="ListBullet"/>
+      </w:pPr>
+      <w:r>
+        <w:t>Define a versioned MissionProfile data contract and load the first rapid-360-degree surveillance profile.</w:t>
+      </w:r>
+    </w:p>
+    <w:p>
+      <w:pPr>
+        <w:pStyle w:val="ListBullet"/>
+      </w:pPr>
+      <w:r>
+        <w:t>Generate existing persistent SearchTask and ExecutionProfile settings from MissionProfile without changing the proven dwell boundary.</w:t>
+      </w:r>
+    </w:p>
+    <w:p>
+      <w:pPr>
+        <w:pStyle w:val="ListBullet"/>
+      </w:pPr>
+      <w:r>
+        <w:t>Add simulation regressions for surveillance-to-sector promotion, deadline revisits, local reacquisition and exact search resumption.</w:t>
+      </w:r>
+    </w:p>
+    <w:p>
+      <w:pPr>
+        <w:pStyle w:val="ListBullet"/>
+      </w:pPr>
+      <w:r>
+        <w:t>Instrument surveillance duty cycle, sector coverage debt, revisit lateness and reacquisition outcomes before introducing a richer cost model.</w:t>
       </w:r>
     </w:p>
     <w:p>
@@ -8689,6 +9978,100 @@
       <w:pPr/>
       <w:r>
         <w:t>Decision and rationale: Derive receive start, receive end, sample count, buffer size, range-axis offset and maximum safe PRF from sampled waveform duration, receiver recovery, maximum instrumented range and configured timing margins. Recovery and guard values remain provisional until measured.</w:t>
+      </w:r>
+    </w:p>
+    <w:p>
+      <w:pPr>
+        <w:pStyle w:val="Heading2"/>
+      </w:pPr>
+      <w:r>
+        <w:t>ADR-0014: Bounded finite per-PRI command pipeline</w:t>
+      </w:r>
+    </w:p>
+    <w:p>
+      <w:pPr/>
+      <w:r>
+        <w:t>Status: Accepted</w:t>
+      </w:r>
+    </w:p>
+    <w:p>
+      <w:pPr/>
+      <w:r>
+        <w:t>Decision and rationale: Use finite pulse-specific timed TX bursts and RX windows within a bounded future horizon. Replenish immediately after collecting the oldest RX window. This avoids unbounded command queues, continuous-RX semantics and host-latency collapse while preserving pulse-level ATR intent.</w:t>
+      </w:r>
+    </w:p>
+    <w:p>
+      <w:pPr>
+        <w:pStyle w:val="Heading2"/>
+      </w:pPr>
+      <w:r>
+        <w:t>ADR-0015: Post-CPI signal processing</w:t>
+      </w:r>
+    </w:p>
+    <w:p>
+      <w:pPr/>
+      <w:r>
+        <w:t>Status: Accepted</w:t>
+      </w:r>
+    </w:p>
+    <w:p>
+      <w:pPr/>
+      <w:r>
+        <w:t>Decision and rationale: The timing-critical acquisition loop performs only queue replenishment, streamer I/O and minimal validity accounting. Matched filtering, Doppler processing, plotting and diagnostic formatting occur after the complete CPI is captured.</w:t>
+      </w:r>
+    </w:p>
+    <w:p>
+      <w:pPr>
+        <w:pStyle w:val="Heading2"/>
+      </w:pPr>
+      <w:r>
+        <w:t>ADR-0016: Mission policy above task arbitration</w:t>
+      </w:r>
+    </w:p>
+    <w:p>
+      <w:r>
+        <w:t>Status: Accepted</w:t>
+      </w:r>
+    </w:p>
+    <w:p>
+      <w:r>
+        <w:t>Decision and rationale: MissionProfile defines modes, resource limits and task-generation policy, while RadarScheduler continues to arbitrate concrete RadarTask objects. This prevents mission logic from bypassing pointing, execution or hardware boundaries.</w:t>
+      </w:r>
+    </w:p>
+    <w:p>
+      <w:pPr>
+        <w:pStyle w:val="Heading2"/>
+      </w:pPr>
+      <w:r>
+        <w:t>ADR-0017: RadarExecutor is the dwell-management boundary</w:t>
+      </w:r>
+    </w:p>
+    <w:p>
+      <w:r>
+        <w:t>Status: Accepted</w:t>
+      </w:r>
+    </w:p>
+    <w:p>
+      <w:r>
+        <w:t>Decision and rationale: Keep task selection in RadarScheduler and consolidate execution-profile selection, pointing readiness, DwellPlan construction, source invocation and provenance in RadarExecutor. Do not introduce a second owner unless measured complexity requires one.</w:t>
+      </w:r>
+    </w:p>
+    <w:p>
+      <w:pPr>
+        <w:pStyle w:val="Heading2"/>
+      </w:pPr>
+      <w:r>
+        <w:t>ADR-0018: Preserve surveillance continuity</w:t>
+      </w:r>
+    </w:p>
+    <w:p>
+      <w:r>
+        <w:t>Status: Accepted</w:t>
+      </w:r>
+    </w:p>
+    <w:p>
+      <w:r>
+        <w:t>Decision and rationale: Track revisits and local reacquisition may pre-empt search, but interrupted coverage state shall be resumed and MissionProfile shall bound time away from surveillance so track demand cannot consume the radar indefinitely.</w:t>
       </w:r>
     </w:p>
     <w:p>
@@ -9169,6 +10552,94 @@
           </w:p>
         </w:tc>
       </w:tr>
+      <w:tr>
+        <w:tc>
+          <w:tcPr>
+            <w:tcW w:type="dxa" w:w="5040"/>
+          </w:tcPr>
+          <w:p>
+            <w:r>
+              <w:t>MissionProfile</w:t>
+            </w:r>
+          </w:p>
+        </w:tc>
+        <w:tc>
+          <w:tcPr>
+            <w:tcW w:type="dxa" w:w="5040"/>
+          </w:tcPr>
+          <w:p>
+            <w:r>
+              <w:t>Versioned policy defining surveillance, sector, revisit and reacquisition task generation and resource limits.</w:t>
+            </w:r>
+          </w:p>
+        </w:tc>
+      </w:tr>
+      <w:tr>
+        <w:tc>
+          <w:tcPr>
+            <w:tcW w:type="dxa" w:w="5040"/>
+          </w:tcPr>
+          <w:p>
+            <w:r>
+              <w:t>Dwell management</w:t>
+            </w:r>
+          </w:p>
+        </w:tc>
+        <w:tc>
+          <w:tcPr>
+            <w:tcW w:type="dxa" w:w="5040"/>
+          </w:tcPr>
+          <w:p>
+            <w:r>
+              <w:t>RadarExecutor responsibility that converts a selected task and measured pointing state into one executable DwellPlan and returns its result.</w:t>
+            </w:r>
+          </w:p>
+        </w:tc>
+      </w:tr>
+      <w:tr>
+        <w:tc>
+          <w:tcPr>
+            <w:tcW w:type="dxa" w:w="5040"/>
+          </w:tcPr>
+          <w:p>
+            <w:r>
+              <w:t>Coverage debt</w:t>
+            </w:r>
+          </w:p>
+        </w:tc>
+        <w:tc>
+          <w:tcPr>
+            <w:tcW w:type="dxa" w:w="5040"/>
+          </w:tcPr>
+          <w:p>
+            <w:r>
+              <w:t>Measure of surveillance area or time left unobserved because higher-priority work interrupted search.</w:t>
+            </w:r>
+          </w:p>
+        </w:tc>
+      </w:tr>
+      <w:tr>
+        <w:tc>
+          <w:tcPr>
+            <w:tcW w:type="dxa" w:w="5040"/>
+          </w:tcPr>
+          <w:p>
+            <w:r>
+              <w:t>Local reacquisition</w:t>
+            </w:r>
+          </w:p>
+        </w:tc>
+        <w:tc>
+          <w:tcPr>
+            <w:tcW w:type="dxa" w:w="5040"/>
+          </w:tcPr>
+          <w:p>
+            <w:r>
+              <w:t>Bounded fine-angle scan around a missed track's predicted bearing.</w:t>
+            </w:r>
+          </w:p>
+        </w:tc>
+      </w:tr>
     </w:tbl>
     <w:p>
       <w:pPr>
@@ -9277,6 +10748,10 @@
     <w:sectPr>
       <w:headerReference w:type="default" r:id="rId9"/>
       <w:footerReference w:type="default" r:id="rId10"/>
+      <w:headerReference w:type="first" r:id="rId18"/>
+      <w:headerReference w:type="even" r:id="rId19"/>
+      <w:footerReference w:type="first" r:id="rId20"/>
+      <w:footerReference w:type="even" r:id="rId21"/>
       <w:pgSz w:w="12240" w:h="15840"/>
       <w:pgMar w:top="936" w:right="1080" w:bottom="936" w:left="1080" w:header="720" w:footer="720" w:gutter="0"/>
       <w:cols w:space="720"/>
@@ -9305,6 +10780,26 @@
 </w:ftr>
 </file>
 
+<file path=word/footer2.xml><?xml version="1.0" encoding="utf-8"?>
+<w:ftr xmlns:m="http://schemas.openxmlformats.org/officeDocument/2006/math" xmlns:mc="http://schemas.openxmlformats.org/markup-compatibility/2006" xmlns:mo="http://schemas.microsoft.com/office/mac/office/2008/main" xmlns:mv="urn:schemas-microsoft-com:mac:vml" xmlns:o="urn:schemas-microsoft-com:office:office" xmlns:r="http://schemas.openxmlformats.org/officeDocument/2006/relationships" xmlns:v="urn:schemas-microsoft-com:vml" xmlns:w10="urn:schemas-microsoft-com:office:word" xmlns:w14="http://schemas.microsoft.com/office/word/2010/wordml" xmlns:w="http://schemas.openxmlformats.org/wordprocessingml/2006/main" xmlns:wne="http://schemas.microsoft.com/office/word/2006/wordml" xmlns:wp14="http://schemas.microsoft.com/office/word/2010/wordprocessingDrawing" xmlns:wp="http://schemas.openxmlformats.org/drawingml/2006/wordprocessingDrawing" xmlns:wpc="http://schemas.microsoft.com/office/word/2010/wordprocessingCanvas" xmlns:wpg="http://schemas.microsoft.com/office/word/2010/wordprocessingGroup" xmlns:wpi="http://schemas.microsoft.com/office/word/2010/wordprocessingInk" xmlns:wps="http://schemas.microsoft.com/office/word/2010/wordprocessingShape" mc:Ignorable="w14 wp14">
+  <w:p>
+    <w:pPr>
+      <w:pStyle w:val="Footer"/>
+    </w:pPr>
+  </w:p>
+</w:ftr>
+</file>
+
+<file path=word/footer3.xml><?xml version="1.0" encoding="utf-8"?>
+<w:ftr xmlns:m="http://schemas.openxmlformats.org/officeDocument/2006/math" xmlns:mc="http://schemas.openxmlformats.org/markup-compatibility/2006" xmlns:mo="http://schemas.microsoft.com/office/mac/office/2008/main" xmlns:mv="urn:schemas-microsoft-com:mac:vml" xmlns:o="urn:schemas-microsoft-com:office:office" xmlns:r="http://schemas.openxmlformats.org/officeDocument/2006/relationships" xmlns:v="urn:schemas-microsoft-com:vml" xmlns:w10="urn:schemas-microsoft-com:office:word" xmlns:w14="http://schemas.microsoft.com/office/word/2010/wordml" xmlns:w="http://schemas.openxmlformats.org/wordprocessingml/2006/main" xmlns:wne="http://schemas.microsoft.com/office/word/2006/wordml" xmlns:wp14="http://schemas.microsoft.com/office/word/2010/wordprocessingDrawing" xmlns:wp="http://schemas.openxmlformats.org/drawingml/2006/wordprocessingDrawing" xmlns:wpc="http://schemas.microsoft.com/office/word/2010/wordprocessingCanvas" xmlns:wpg="http://schemas.microsoft.com/office/word/2010/wordprocessingGroup" xmlns:wpi="http://schemas.microsoft.com/office/word/2010/wordprocessingInk" xmlns:wps="http://schemas.microsoft.com/office/word/2010/wordprocessingShape" mc:Ignorable="w14 wp14">
+  <w:p>
+    <w:pPr>
+      <w:pStyle w:val="Footer"/>
+    </w:pPr>
+  </w:p>
+</w:ftr>
+</file>
+
 <file path=word/header1.xml><?xml version="1.0" encoding="utf-8"?>
 <w:hdr xmlns:m="http://schemas.openxmlformats.org/officeDocument/2006/math" xmlns:mc="http://schemas.openxmlformats.org/markup-compatibility/2006" xmlns:mo="http://schemas.microsoft.com/office/mac/office/2008/main" xmlns:mv="urn:schemas-microsoft-com:mac:vml" xmlns:o="urn:schemas-microsoft-com:office:office" xmlns:r="http://schemas.openxmlformats.org/officeDocument/2006/relationships" xmlns:v="urn:schemas-microsoft-com:vml" xmlns:w10="urn:schemas-microsoft-com:office:word" xmlns:w14="http://schemas.microsoft.com/office/word/2010/wordml" xmlns:w="http://schemas.openxmlformats.org/wordprocessingml/2006/main" xmlns:wne="http://schemas.microsoft.com/office/word/2006/wordml" xmlns:wp14="http://schemas.microsoft.com/office/word/2010/wordprocessingDrawing" xmlns:wp="http://schemas.openxmlformats.org/drawingml/2006/wordprocessingDrawing" xmlns:wpc="http://schemas.microsoft.com/office/word/2010/wordprocessingCanvas" xmlns:wpg="http://schemas.microsoft.com/office/word/2010/wordprocessingGroup" xmlns:wpi="http://schemas.microsoft.com/office/word/2010/wordprocessingInk" xmlns:wps="http://schemas.microsoft.com/office/word/2010/wordprocessingShape" mc:Ignorable="w14 wp14">
   <w:p>
@@ -9313,12 +10808,28 @@
       <w:jc w:val="center"/>
     </w:pPr>
     <w:r>
-      <w:rPr>
-        <w:color w:val="595959"/>
-        <w:sz w:val="16"/>
-      </w:rPr>
-      <w:t>VX-SSA-001 | Vanguard X Software &amp; System Architecture | Version 0.7b</w:t>
+      <w:t>VX-SSA-001 | Vanguard X Software &amp; System Architecture | Version 0.7d</w:t>
     </w:r>
+  </w:p>
+</w:hdr>
+</file>
+
+<file path=word/header2.xml><?xml version="1.0" encoding="utf-8"?>
+<w:hdr xmlns:m="http://schemas.openxmlformats.org/officeDocument/2006/math" xmlns:mc="http://schemas.openxmlformats.org/markup-compatibility/2006" xmlns:mo="http://schemas.microsoft.com/office/mac/office/2008/main" xmlns:mv="urn:schemas-microsoft-com:mac:vml" xmlns:o="urn:schemas-microsoft-com:office:office" xmlns:r="http://schemas.openxmlformats.org/officeDocument/2006/relationships" xmlns:v="urn:schemas-microsoft-com:vml" xmlns:w10="urn:schemas-microsoft-com:office:word" xmlns:w14="http://schemas.microsoft.com/office/word/2010/wordml" xmlns:w="http://schemas.openxmlformats.org/wordprocessingml/2006/main" xmlns:wne="http://schemas.microsoft.com/office/word/2006/wordml" xmlns:wp14="http://schemas.microsoft.com/office/word/2010/wordprocessingDrawing" xmlns:wp="http://schemas.openxmlformats.org/drawingml/2006/wordprocessingDrawing" xmlns:wpc="http://schemas.microsoft.com/office/word/2010/wordprocessingCanvas" xmlns:wpg="http://schemas.microsoft.com/office/word/2010/wordprocessingGroup" xmlns:wpi="http://schemas.microsoft.com/office/word/2010/wordprocessingInk" xmlns:wps="http://schemas.microsoft.com/office/word/2010/wordprocessingShape" mc:Ignorable="w14 wp14">
+  <w:p>
+    <w:pPr>
+      <w:pStyle w:val="Header"/>
+    </w:pPr>
+  </w:p>
+</w:hdr>
+</file>
+
+<file path=word/header3.xml><?xml version="1.0" encoding="utf-8"?>
+<w:hdr xmlns:m="http://schemas.openxmlformats.org/officeDocument/2006/math" xmlns:mc="http://schemas.openxmlformats.org/markup-compatibility/2006" xmlns:mo="http://schemas.microsoft.com/office/mac/office/2008/main" xmlns:mv="urn:schemas-microsoft-com:mac:vml" xmlns:o="urn:schemas-microsoft-com:office:office" xmlns:r="http://schemas.openxmlformats.org/officeDocument/2006/relationships" xmlns:v="urn:schemas-microsoft-com:vml" xmlns:w10="urn:schemas-microsoft-com:office:word" xmlns:w14="http://schemas.microsoft.com/office/word/2010/wordml" xmlns:w="http://schemas.openxmlformats.org/wordprocessingml/2006/main" xmlns:wne="http://schemas.microsoft.com/office/word/2006/wordml" xmlns:wp14="http://schemas.microsoft.com/office/word/2010/wordprocessingDrawing" xmlns:wp="http://schemas.openxmlformats.org/drawingml/2006/wordprocessingDrawing" xmlns:wpc="http://schemas.microsoft.com/office/word/2010/wordprocessingCanvas" xmlns:wpg="http://schemas.microsoft.com/office/word/2010/wordprocessingGroup" xmlns:wpi="http://schemas.microsoft.com/office/word/2010/wordprocessingInk" xmlns:wps="http://schemas.microsoft.com/office/word/2010/wordprocessingShape" mc:Ignorable="w14 wp14">
+  <w:p>
+    <w:pPr>
+      <w:pStyle w:val="Header"/>
+    </w:pPr>
   </w:p>
 </w:hdr>
 </file>

</xml_diff>

<commit_message>
Document measured CPI timing and 5 ms Ettus command lead
</commit_message>
<xml_diff>
--- a/docs/architecture/VX-SSA-001_Vanguard_X_Software_System_Architecture.docx
+++ b/docs/architecture/VX-SSA-001_Vanguard_X_Software_System_Architecture.docx
@@ -32,7 +32,7 @@
         <w:jc w:val="center"/>
       </w:pPr>
       <w:r>
-        <w:t>Version 0.7d - Mission, Scheduling and Dwell-Management Architecture Baseline</w:t>
+        <w:t>Version 0.7e - Measured CPI Timing and 5 ms Command-Lead Baseline</w:t>
       </w:r>
     </w:p>
     <w:p>
@@ -107,7 +107,7 @@
           </w:tcPr>
           <w:p>
             <w:r>
-              <w:t>0.7d</w:t>
+              <w:t>0.7e</w:t>
             </w:r>
           </w:p>
         </w:tc>
@@ -167,7 +167,7 @@
           </w:tcPr>
           <w:p>
             <w:r>
-              <w:t>18 July 2026</w:t>
+              <w:t>19 July 2026</w:t>
             </w:r>
           </w:p>
         </w:tc>
@@ -257,7 +257,7 @@
           </w:tcPr>
           <w:p>
             <w:r>
-              <w:t>Fixed 40 MS/s waveform/timing and bounded timed TX/RX baseline, extended with mission profiles, scheduler arbitration and explicit dwell-management architecture; ATR/TRM integration deferred</w:t>
+              <w:t>Fixed 40 MS/s waveform/timing and bounded timed TX/RX baseline, including measured CPI collection timing, 5 ms command lead, mission profiles, scheduler arbitration and dwell management; ATR/TRM integration deferred</w:t>
             </w:r>
           </w:p>
         </w:tc>
@@ -862,6 +862,48 @@
           </w:tcPr>
           <w:p>
             <w:r>
+              <w:t>Superseded</w:t>
+            </w:r>
+          </w:p>
+        </w:tc>
+      </w:tr>
+      <w:tr>
+        <w:tc>
+          <w:tcPr>
+            <w:tcW w:type="dxa" w:w="2520"/>
+          </w:tcPr>
+          <w:p>
+            <w:r>
+              <w:t>0.7e</w:t>
+            </w:r>
+          </w:p>
+        </w:tc>
+        <w:tc>
+          <w:tcPr>
+            <w:tcW w:type="dxa" w:w="2520"/>
+          </w:tcPr>
+          <w:p>
+            <w:r>
+              <w:t>19 Jul 2026</w:t>
+            </w:r>
+          </w:p>
+        </w:tc>
+        <w:tc>
+          <w:tcPr>
+            <w:tcW w:type="dxa" w:w="2520"/>
+          </w:tcPr>
+          <w:p>
+            <w:r>
+              <w:t>Defined CPI duration versus scheduler cadence and recorded the hardware-proven 5 ms command lead at 4 kHz/128 pulses</w:t>
+            </w:r>
+          </w:p>
+        </w:tc>
+        <w:tc>
+          <w:tcPr>
+            <w:tcW w:type="dxa" w:w="2520"/>
+          </w:tcPr>
+          <w:p>
+            <w:r>
               <w:t>Current</w:t>
             </w:r>
           </w:p>
@@ -1272,7 +1314,7 @@
     </w:p>
     <w:p>
       <w:r>
-        <w:t>Version 0.7 remains the first hardware execution baseline. Version 0.7b recorded the accepted waveform-sampling and operator timing decisions. Version 0.7c records their implementation and protected B200mini timed TX/RX validation. The operational application remains transmitter-inhibited until ATR non-overlap is verified on the oscilloscope; the TRM and PA remain disconnected.</w:t>
+        <w:t>Version 0.7 remains the first hardware execution baseline. Version 0.7b recorded the accepted waveform-sampling and operator timing decisions. Version 0.7c records their implementation and protected B200mini timed TX/RX validation. Version 0.7d records the mission, scheduler and dwell-management architecture. Version 0.7e records the measured CPI timing baseline and hardware validation of the 5 ms command lead. The operational application remains transmitter-inhibited until ATR non-overlap is verified on the oscilloscope; the TRM and PA remain disconnected.</w:t>
       </w:r>
     </w:p>
     <w:p>
@@ -4917,7 +4959,7 @@
           </w:tcPr>
           <w:p>
             <w:r>
-              <w:t>11.76-11.93 ms</w:t>
+              <w:t>~21 ms expected at 2 kHz/32 pulses; 36.963-37.016 ms measured at 4 kHz/128 pulses</w:t>
             </w:r>
           </w:p>
         </w:tc>
@@ -4927,7 +4969,7 @@
           </w:tcPr>
           <w:p>
             <w:r>
-              <w:t>5 ms lead plus CPI and transport overhead.</w:t>
+              <w:t>5 ms lead plus the CPI, final RX-window completion and transport/ACK overhead.</w:t>
             </w:r>
           </w:p>
         </w:tc>
@@ -5057,7 +5099,7 @@
           </w:tcPr>
           <w:p>
             <w:r>
-              <w:t>27-31 ms</w:t>
+              <w:t>~36-41 ms expected at the default profile</w:t>
             </w:r>
           </w:p>
         </w:tc>
@@ -5067,7 +5109,7 @@
           </w:tcPr>
           <w:p>
             <w:r>
-              <w:t>Approximately 70 ms scheduling margin.</w:t>
+              <w:t>Approximately 59-64 ms margin within the 100 ms scheduler interval.</w:t>
             </w:r>
           </w:p>
         </w:tc>
@@ -5253,7 +5295,19 @@
     </w:p>
     <w:p>
       <w:r>
-        <w:t>A dwell consists of pointing-state acquisition, optional TRM state verification, SDR timed execution, raw-data return and downstream processing. Pointing and SDR time shall be recorded for provenance. Host scheduler cadence is distinct from PRI and CPI timing. For the initial uniform-PRI path, CPI duration equals the number of pulses per CPI multiplied by PRI.</w:t>
+        <w:t>A dwell consists of pointing-state acquisition, optional TRM state verification, SDR timed execution, raw-data return and downstream processing. Pointing and SDR time shall be recorded for provenance. Host scheduler cadence is distinct from PRI and CPI timing. For the uniform-PRI path, nominal CPI duration is Npulses x PRI, equivalently Npulses / PRF.</w:t>
+      </w:r>
+    </w:p>
+    <w:p>
+      <w:pPr/>
+      <w:r>
+        <w:t>The configured operational search profile is 2.0 kHz PRF, 500 microsecond PRI and 32 pulses per CPI, giving a nominal 16.000 ms CPI. The main scheduler interval remains 100 ms, so accepted dwell starts and the corresponding SDR CPI grids occur at approximately 10 Hz. The console WallDt value is the host interval between accepted dwell starts; it is not the CPI duration.</w:t>
+      </w:r>
+    </w:p>
+    <w:p>
+      <w:pPr/>
+      <w:r>
+        <w:t>The console Collect value is the blocking duration of source execution. It includes the 5 ms command lead, the pulse train, the final receive window and UHD transport/acknowledgement overhead. At 2.0 kHz and 32 pulses it is expected to be approximately 21 ms. The same 5 ms lead is applied to every dwell and therefore cancels from the difference between consecutive SDR CPI start times; it does not change the 100 ms scheduler cadence.</w:t>
       </w:r>
     </w:p>
     <w:p>
@@ -5317,26 +5371,38 @@
     <w:tbl>
       <w:tblPr>
         <w:tblStyle w:val="TableGrid"/>
-        <w:tblW w:type="auto" w:w="0"/>
+        <w:tblW w:type="dxa" w:w="10080"/>
         <w:jc w:val="center"/>
+        <w:tblLayout w:type="fixed"/>
         <w:tblLook w:firstColumn="1" w:firstRow="1" w:lastColumn="0" w:lastRow="0" w:noHBand="0" w:noVBand="1" w:val="04A0"/>
       </w:tblPr>
       <w:tblGrid>
-        <w:gridCol w:w="3360"/>
-        <w:gridCol w:w="3360"/>
-        <w:gridCol w:w="3360"/>
+        <w:gridCol w:w="2600"/>
+        <w:gridCol w:w="4700"/>
+        <w:gridCol w:w="2780"/>
       </w:tblGrid>
       <w:tr>
         <w:trPr>
           <w:tblHeader/>
           <w:cantSplit/>
+          <w:tblHeader w:val="true"/>
         </w:trPr>
         <w:tc>
           <w:tcPr>
-            <w:tcW w:type="dxa" w:w="3360"/>
-            <w:shd w:fill="1F4E79"/>
-          </w:tcPr>
-          <w:p>
+            <w:tcW w:type="dxa" w:w="2600"/>
+            <w:shd w:fill="1F4E78"/>
+            <w:vAlign w:val="center"/>
+          </w:tcPr>
+          <w:p>
+            <w:pPr>
+              <w:jc w:val="left"/>
+            </w:pPr>
+            <w:r>
+              <w:rPr>
+                <w:b/>
+                <w:color w:val="FFFFFF"/>
+              </w:rPr>
+            </w:r>
             <w:r>
               <w:rPr>
                 <w:b/>
@@ -5348,25 +5414,45 @@
         </w:tc>
         <w:tc>
           <w:tcPr>
-            <w:tcW w:type="dxa" w:w="3360"/>
-            <w:shd w:fill="1F4E79"/>
-          </w:tcPr>
-          <w:p>
+            <w:tcW w:type="dxa" w:w="4700"/>
+            <w:shd w:fill="1F4E78"/>
+            <w:vAlign w:val="center"/>
+          </w:tcPr>
+          <w:p>
+            <w:pPr>
+              <w:jc w:val="left"/>
+            </w:pPr>
             <w:r>
               <w:rPr>
                 <w:b/>
                 <w:color w:val="FFFFFF"/>
               </w:rPr>
-              <w:t>Typical budget</w:t>
-            </w:r>
-          </w:p>
-        </w:tc>
-        <w:tc>
-          <w:tcPr>
-            <w:tcW w:type="dxa" w:w="3360"/>
-            <w:shd w:fill="1F4E79"/>
-          </w:tcPr>
-          <w:p>
+            </w:r>
+            <w:r>
+              <w:rPr>
+                <w:b/>
+                <w:color w:val="FFFFFF"/>
+              </w:rPr>
+              <w:t>Current baseline</w:t>
+            </w:r>
+          </w:p>
+        </w:tc>
+        <w:tc>
+          <w:tcPr>
+            <w:tcW w:type="dxa" w:w="2780"/>
+            <w:shd w:fill="1F4E78"/>
+            <w:vAlign w:val="center"/>
+          </w:tcPr>
+          <w:p>
+            <w:pPr>
+              <w:jc w:val="left"/>
+            </w:pPr>
+            <w:r>
+              <w:rPr>
+                <w:b/>
+                <w:color w:val="FFFFFF"/>
+              </w:rPr>
+            </w:r>
             <w:r>
               <w:rPr>
                 <w:b/>
@@ -5378,357 +5464,1241 @@
         </w:tc>
       </w:tr>
       <w:tr>
-        <w:trPr>
-          <w:cantSplit/>
-        </w:trPr>
-        <w:tc>
-          <w:tcPr>
-            <w:tcW w:type="dxa" w:w="3360"/>
-          </w:tcPr>
-          <w:p>
-            <w:r>
+        <w:tc>
+          <w:tcPr>
+            <w:tcW w:type="dxa" w:w="2600"/>
+            <w:vAlign w:val="center"/>
+          </w:tcPr>
+          <w:p>
+            <w:pPr>
+              <w:jc w:val="left"/>
+            </w:pPr>
+            <w:r/>
+            <w:r>
+              <w:rPr>
+                <w:b w:val="0"/>
+              </w:rPr>
               <w:t>Command lead time</w:t>
             </w:r>
           </w:p>
         </w:tc>
         <w:tc>
           <w:tcPr>
-            <w:tcW w:type="dxa" w:w="3360"/>
-          </w:tcPr>
-          <w:p>
-            <w:r>
-              <w:t>5 ms</w:t>
-            </w:r>
-          </w:p>
-        </w:tc>
-        <w:tc>
-          <w:tcPr>
-            <w:tcW w:type="dxa" w:w="3360"/>
-          </w:tcPr>
-          <w:p>
-            <w:r>
+            <w:tcW w:type="dxa" w:w="4700"/>
+            <w:vAlign w:val="center"/>
+          </w:tcPr>
+          <w:p>
+            <w:pPr>
+              <w:jc w:val="left"/>
+            </w:pPr>
+            <w:r/>
+            <w:r>
+              <w:rPr>
+                <w:b w:val="0"/>
+              </w:rPr>
+              <w:t>5 ms, hardware proven</w:t>
+            </w:r>
+          </w:p>
+        </w:tc>
+        <w:tc>
+          <w:tcPr>
+            <w:tcW w:type="dxa" w:w="2780"/>
+            <w:vAlign w:val="center"/>
+          </w:tcPr>
+          <w:p>
+            <w:pPr>
+              <w:jc w:val="left"/>
+            </w:pPr>
+            <w:r/>
+            <w:r>
+              <w:rPr>
+                <w:b w:val="0"/>
+              </w:rPr>
               <w:t>EttusRadarSource</w:t>
             </w:r>
           </w:p>
         </w:tc>
       </w:tr>
       <w:tr>
-        <w:trPr>
-          <w:cantSplit/>
-        </w:trPr>
-        <w:tc>
-          <w:tcPr>
-            <w:tcW w:type="dxa" w:w="3360"/>
-          </w:tcPr>
-          <w:p>
-            <w:r>
-              <w:t>Default CPI</w:t>
-            </w:r>
-          </w:p>
-        </w:tc>
-        <w:tc>
-          <w:tcPr>
-            <w:tcW w:type="dxa" w:w="3360"/>
-          </w:tcPr>
-          <w:p>
-            <w:r>
-              <w:t>16 ms (32 pulses at 2 kHz PRF)</w:t>
-            </w:r>
-          </w:p>
-        </w:tc>
-        <w:tc>
-          <w:tcPr>
-            <w:tcW w:type="dxa" w:w="3360"/>
-          </w:tcPr>
-          <w:p>
-            <w:r>
+        <w:tc>
+          <w:tcPr>
+            <w:tcW w:type="dxa" w:w="2600"/>
+            <w:vAlign w:val="center"/>
+          </w:tcPr>
+          <w:p>
+            <w:pPr>
+              <w:jc w:val="left"/>
+            </w:pPr>
+            <w:r/>
+            <w:r>
+              <w:rPr>
+                <w:b w:val="0"/>
+              </w:rPr>
+              <w:t>Default pulse timing</w:t>
+            </w:r>
+          </w:p>
+        </w:tc>
+        <w:tc>
+          <w:tcPr>
+            <w:tcW w:type="dxa" w:w="4700"/>
+            <w:vAlign w:val="center"/>
+          </w:tcPr>
+          <w:p>
+            <w:pPr>
+              <w:jc w:val="left"/>
+            </w:pPr>
+            <w:r/>
+            <w:r>
+              <w:rPr>
+                <w:b w:val="0"/>
+              </w:rPr>
+              <w:t>2 kHz PRF; 500 us PRI; 32 pulses; 16 ms CPI</w:t>
+            </w:r>
+          </w:p>
+        </w:tc>
+        <w:tc>
+          <w:tcPr>
+            <w:tcW w:type="dxa" w:w="2780"/>
+            <w:vAlign w:val="center"/>
+          </w:tcPr>
+          <w:p>
+            <w:pPr>
+              <w:jc w:val="left"/>
+            </w:pPr>
+            <w:r/>
+            <w:r>
+              <w:rPr>
+                <w:b w:val="0"/>
+              </w:rPr>
               <w:t>Operator selection + SDR hardware</w:t>
             </w:r>
           </w:p>
         </w:tc>
       </w:tr>
       <w:tr>
-        <w:trPr>
-          <w:cantSplit/>
-        </w:trPr>
-        <w:tc>
-          <w:tcPr>
-            <w:tcW w:type="dxa" w:w="3360"/>
-          </w:tcPr>
-          <w:p>
-            <w:r>
-              <w:t>Signal processing</w:t>
-            </w:r>
-          </w:p>
-        </w:tc>
-        <w:tc>
-          <w:tcPr>
-            <w:tcW w:type="dxa" w:w="3360"/>
-          </w:tcPr>
-          <w:p>
-            <w:r>
-              <w:t>8-13 ms</w:t>
-            </w:r>
-          </w:p>
-        </w:tc>
-        <w:tc>
-          <w:tcPr>
-            <w:tcW w:type="dxa" w:w="3360"/>
-          </w:tcPr>
-          <w:p>
-            <w:r>
-              <w:t>RadarProcessor</w:t>
+        <w:tc>
+          <w:tcPr>
+            <w:tcW w:type="dxa" w:w="2600"/>
+            <w:vAlign w:val="center"/>
+          </w:tcPr>
+          <w:p>
+            <w:pPr>
+              <w:jc w:val="left"/>
+            </w:pPr>
+            <w:r/>
+            <w:r>
+              <w:rPr>
+                <w:b w:val="0"/>
+              </w:rPr>
+              <w:t>Main scheduler cadence</w:t>
+            </w:r>
+          </w:p>
+        </w:tc>
+        <w:tc>
+          <w:tcPr>
+            <w:tcW w:type="dxa" w:w="4700"/>
+            <w:vAlign w:val="center"/>
+          </w:tcPr>
+          <w:p>
+            <w:pPr>
+              <w:jc w:val="left"/>
+            </w:pPr>
+            <w:r/>
+            <w:r>
+              <w:rPr>
+                <w:b w:val="0"/>
+              </w:rPr>
+              <w:t>100 ms start-to-start; approximately 10 CPI grids/s</w:t>
+            </w:r>
+          </w:p>
+        </w:tc>
+        <w:tc>
+          <w:tcPr>
+            <w:tcW w:type="dxa" w:w="2780"/>
+            <w:vAlign w:val="center"/>
+          </w:tcPr>
+          <w:p>
+            <w:pPr>
+              <w:jc w:val="left"/>
+            </w:pPr>
+            <w:r/>
+            <w:r>
+              <w:rPr>
+                <w:b w:val="0"/>
+              </w:rPr>
+              <w:t>Main scheduler loop</w:t>
             </w:r>
           </w:p>
         </w:tc>
       </w:tr>
       <w:tr>
-        <w:trPr>
-          <w:cantSplit/>
-        </w:trPr>
-        <w:tc>
-          <w:tcPr>
-            <w:tcW w:type="dxa" w:w="3360"/>
-          </w:tcPr>
-          <w:p>
-            <w:r>
-              <w:t>Detection and tracking</w:t>
-            </w:r>
-          </w:p>
-        </w:tc>
-        <w:tc>
-          <w:tcPr>
-            <w:tcW w:type="dxa" w:w="3360"/>
-          </w:tcPr>
-          <w:p>
-            <w:r>
-              <w:t>~3 ms</w:t>
-            </w:r>
-          </w:p>
-        </w:tc>
-        <w:tc>
-          <w:tcPr>
-            <w:tcW w:type="dxa" w:w="3360"/>
-          </w:tcPr>
-          <w:p>
-            <w:r>
-              <w:t>Detector / Tracker</w:t>
+        <w:tc>
+          <w:tcPr>
+            <w:tcW w:type="dxa" w:w="2600"/>
+            <w:vAlign w:val="center"/>
+          </w:tcPr>
+          <w:p>
+            <w:pPr>
+              <w:jc w:val="left"/>
+            </w:pPr>
+            <w:r/>
+            <w:r>
+              <w:rPr>
+                <w:b w:val="0"/>
+              </w:rPr>
+              <w:t>Expected default source execution</w:t>
+            </w:r>
+          </w:p>
+        </w:tc>
+        <w:tc>
+          <w:tcPr>
+            <w:tcW w:type="dxa" w:w="4700"/>
+            <w:vAlign w:val="center"/>
+          </w:tcPr>
+          <w:p>
+            <w:pPr>
+              <w:jc w:val="left"/>
+            </w:pPr>
+            <w:r/>
+            <w:r>
+              <w:rPr>
+                <w:b w:val="0"/>
+              </w:rPr>
+              <w:t>Approximately 21 ms including the 5 ms lead</w:t>
+            </w:r>
+          </w:p>
+        </w:tc>
+        <w:tc>
+          <w:tcPr>
+            <w:tcW w:type="dxa" w:w="2780"/>
+            <w:vAlign w:val="center"/>
+          </w:tcPr>
+          <w:p>
+            <w:pPr>
+              <w:jc w:val="left"/>
+            </w:pPr>
+            <w:r/>
+            <w:r>
+              <w:rPr>
+                <w:b w:val="0"/>
+              </w:rPr>
+              <w:t>EttusRadarSource</w:t>
             </w:r>
           </w:p>
         </w:tc>
       </w:tr>
       <w:tr>
-        <w:trPr>
-          <w:cantSplit/>
-        </w:trPr>
-        <w:tc>
-          <w:tcPr>
-            <w:tcW w:type="dxa" w:w="3360"/>
-          </w:tcPr>
-          <w:p>
-            <w:r>
-              <w:t>Display update</w:t>
-            </w:r>
-          </w:p>
-        </w:tc>
-        <w:tc>
-          <w:tcPr>
-            <w:tcW w:type="dxa" w:w="3360"/>
-          </w:tcPr>
-          <w:p>
-            <w:r>
-              <w:t>~4 ms</w:t>
-            </w:r>
-          </w:p>
-        </w:tc>
-        <w:tc>
-          <w:tcPr>
-            <w:tcW w:type="dxa" w:w="3360"/>
-          </w:tcPr>
-          <w:p>
-            <w:r>
-              <w:t>RadarDisplayQt5</w:t>
+        <w:tc>
+          <w:tcPr>
+            <w:tcW w:type="dxa" w:w="2600"/>
+            <w:vAlign w:val="center"/>
+          </w:tcPr>
+          <w:p>
+            <w:pPr>
+              <w:jc w:val="left"/>
+            </w:pPr>
+            <w:r/>
+            <w:r>
+              <w:rPr>
+                <w:b w:val="0"/>
+              </w:rPr>
+              <w:t>Bounded command pipeline</w:t>
+            </w:r>
+          </w:p>
+        </w:tc>
+        <w:tc>
+          <w:tcPr>
+            <w:tcW w:type="dxa" w:w="4700"/>
+            <w:vAlign w:val="center"/>
+          </w:tcPr>
+          <w:p>
+            <w:pPr>
+              <w:jc w:val="left"/>
+            </w:pPr>
+            <w:r/>
+            <w:r>
+              <w:rPr>
+                <w:b w:val="0"/>
+              </w:rPr>
+              <w:t>Depth 20; 10 ms horizon at 2 kHz and 5 ms at 4 kHz</w:t>
+            </w:r>
+          </w:p>
+        </w:tc>
+        <w:tc>
+          <w:tcPr>
+            <w:tcW w:type="dxa" w:w="2780"/>
+            <w:vAlign w:val="center"/>
+          </w:tcPr>
+          <w:p>
+            <w:pPr>
+              <w:jc w:val="left"/>
+            </w:pPr>
+            <w:r/>
+            <w:r>
+              <w:rPr>
+                <w:b w:val="0"/>
+              </w:rPr>
+              <w:t>EttusRadarSource</w:t>
             </w:r>
           </w:p>
         </w:tc>
       </w:tr>
       <w:tr>
-        <w:trPr>
-          <w:cantSplit/>
-        </w:trPr>
-        <w:tc>
-          <w:tcPr>
-            <w:tcW w:type="dxa" w:w="3360"/>
-          </w:tcPr>
-          <w:p>
-            <w:r>
-              <w:t>Scheduler interval</w:t>
-            </w:r>
-          </w:p>
-        </w:tc>
-        <w:tc>
-          <w:tcPr>
-            <w:tcW w:type="dxa" w:w="3360"/>
-          </w:tcPr>
-          <w:p>
-            <w:r>
-              <w:t>100 ms</w:t>
-            </w:r>
-          </w:p>
-        </w:tc>
-        <w:tc>
-          <w:tcPr>
-            <w:tcW w:type="dxa" w:w="3360"/>
-          </w:tcPr>
-          <w:p>
-            <w:r>
-              <w:t>Main scheduler loop</w:t>
+        <w:tc>
+          <w:tcPr>
+            <w:tcW w:type="dxa" w:w="2600"/>
+            <w:vAlign w:val="center"/>
+          </w:tcPr>
+          <w:p>
+            <w:pPr>
+              <w:jc w:val="left"/>
+            </w:pPr>
+            <w:r/>
+            <w:r>
+              <w:rPr>
+                <w:b w:val="0"/>
+              </w:rPr>
+              <w:t>Signal processing</w:t>
+            </w:r>
+          </w:p>
+        </w:tc>
+        <w:tc>
+          <w:tcPr>
+            <w:tcW w:type="dxa" w:w="4700"/>
+            <w:vAlign w:val="center"/>
+          </w:tcPr>
+          <w:p>
+            <w:pPr>
+              <w:jc w:val="left"/>
+            </w:pPr>
+            <w:r/>
+            <w:r>
+              <w:rPr>
+                <w:b w:val="0"/>
+              </w:rPr>
+              <w:t>8-13 ms</w:t>
+            </w:r>
+          </w:p>
+        </w:tc>
+        <w:tc>
+          <w:tcPr>
+            <w:tcW w:type="dxa" w:w="2780"/>
+            <w:vAlign w:val="center"/>
+          </w:tcPr>
+          <w:p>
+            <w:pPr>
+              <w:jc w:val="left"/>
+            </w:pPr>
+            <w:r/>
+            <w:r>
+              <w:rPr>
+                <w:b w:val="0"/>
+              </w:rPr>
+              <w:t>RadarProcessor</w:t>
             </w:r>
           </w:p>
         </w:tc>
       </w:tr>
       <w:tr>
-        <w:trPr>
-          <w:cantSplit/>
-        </w:trPr>
-        <w:tc>
-          <w:tcPr>
-            <w:tcW w:type="dxa" w:w="3360"/>
-            <w:tcW w:type="dxa" w:w="3360"/>
+        <w:tc>
+          <w:tcPr>
+            <w:tcW w:type="dxa" w:w="2600"/>
             <w:vAlign w:val="center"/>
           </w:tcPr>
           <w:p>
-            <w:pPr/>
-            <w:r>
-              <w:rPr/>
-              <w:t>SDR sample rate</w:t>
-            </w:r>
-          </w:p>
-        </w:tc>
-        <w:tc>
-          <w:tcPr>
-            <w:tcW w:type="dxa" w:w="3360"/>
-            <w:tcW w:type="dxa" w:w="3360"/>
+            <w:pPr>
+              <w:jc w:val="left"/>
+            </w:pPr>
+            <w:r/>
+            <w:r>
+              <w:rPr>
+                <w:b w:val="0"/>
+              </w:rPr>
+              <w:t>Detection and tracking</w:t>
+            </w:r>
+          </w:p>
+        </w:tc>
+        <w:tc>
+          <w:tcPr>
+            <w:tcW w:type="dxa" w:w="4700"/>
             <w:vAlign w:val="center"/>
           </w:tcPr>
           <w:p>
-            <w:pPr/>
-            <w:r>
-              <w:rPr/>
-              <w:t>40 MS/s fixed</w:t>
-            </w:r>
-          </w:p>
-        </w:tc>
-        <w:tc>
-          <w:tcPr>
-            <w:tcW w:type="dxa" w:w="3360"/>
-            <w:tcW w:type="dxa" w:w="3360"/>
+            <w:pPr>
+              <w:jc w:val="left"/>
+            </w:pPr>
+            <w:r/>
+            <w:r>
+              <w:rPr>
+                <w:b w:val="0"/>
+              </w:rPr>
+              <w:t>Approximately 3 ms</w:t>
+            </w:r>
+          </w:p>
+        </w:tc>
+        <w:tc>
+          <w:tcPr>
+            <w:tcW w:type="dxa" w:w="2780"/>
             <w:vAlign w:val="center"/>
           </w:tcPr>
           <w:p>
-            <w:pPr/>
-            <w:r>
-              <w:rPr/>
-              <w:t>WaveformLibrary / EttusRadarSource</w:t>
+            <w:pPr>
+              <w:jc w:val="left"/>
+            </w:pPr>
+            <w:r/>
+            <w:r>
+              <w:rPr>
+                <w:b w:val="0"/>
+              </w:rPr>
+              <w:t>Detector / Tracker</w:t>
             </w:r>
           </w:p>
         </w:tc>
       </w:tr>
       <w:tr>
-        <w:trPr>
-          <w:cantSplit/>
-        </w:trPr>
-        <w:tc>
-          <w:tcPr>
-            <w:tcW w:type="dxa" w:w="3360"/>
-            <w:tcW w:type="dxa" w:w="3360"/>
+        <w:tc>
+          <w:tcPr>
+            <w:tcW w:type="dxa" w:w="2600"/>
             <w:vAlign w:val="center"/>
           </w:tcPr>
           <w:p>
-            <w:pPr/>
-            <w:r>
-              <w:rPr/>
-              <w:t>Operator PRF range</w:t>
-            </w:r>
-          </w:p>
-        </w:tc>
-        <w:tc>
-          <w:tcPr>
-            <w:tcW w:type="dxa" w:w="3360"/>
-            <w:tcW w:type="dxa" w:w="3360"/>
+            <w:pPr>
+              <w:jc w:val="left"/>
+            </w:pPr>
+            <w:r/>
+            <w:r>
+              <w:rPr>
+                <w:b w:val="0"/>
+              </w:rPr>
+              <w:t>Display update</w:t>
+            </w:r>
+          </w:p>
+        </w:tc>
+        <w:tc>
+          <w:tcPr>
+            <w:tcW w:type="dxa" w:w="4700"/>
             <w:vAlign w:val="center"/>
           </w:tcPr>
           <w:p>
-            <w:pPr/>
-            <w:r>
-              <w:rPr/>
-              <w:t>1-4 kHz; 2 kHz default</w:t>
-            </w:r>
-          </w:p>
-        </w:tc>
-        <w:tc>
-          <w:tcPr>
-            <w:tcW w:type="dxa" w:w="3360"/>
-            <w:tcW w:type="dxa" w:w="3360"/>
+            <w:pPr>
+              <w:jc w:val="left"/>
+            </w:pPr>
+            <w:r/>
+            <w:r>
+              <w:rPr>
+                <w:b w:val="0"/>
+              </w:rPr>
+              <w:t>Approximately 4 ms</w:t>
+            </w:r>
+          </w:p>
+        </w:tc>
+        <w:tc>
+          <w:tcPr>
+            <w:tcW w:type="dxa" w:w="2780"/>
             <w:vAlign w:val="center"/>
           </w:tcPr>
           <w:p>
-            <w:pPr/>
-            <w:r>
-              <w:rPr/>
-              <w:t>Operator UI / RadarExecutor</w:t>
+            <w:pPr>
+              <w:jc w:val="left"/>
+            </w:pPr>
+            <w:r/>
+            <w:r>
+              <w:rPr>
+                <w:b w:val="0"/>
+              </w:rPr>
+              <w:t>RadarDisplayQt5</w:t>
             </w:r>
           </w:p>
         </w:tc>
       </w:tr>
       <w:tr>
-        <w:trPr>
-          <w:cantSplit/>
-        </w:trPr>
-        <w:tc>
-          <w:tcPr>
-            <w:tcW w:type="dxa" w:w="3360"/>
-            <w:tcW w:type="dxa" w:w="3360"/>
+        <w:tc>
+          <w:tcPr>
+            <w:tcW w:type="dxa" w:w="2600"/>
             <w:vAlign w:val="center"/>
           </w:tcPr>
           <w:p>
-            <w:pPr/>
-            <w:r>
-              <w:rPr/>
+            <w:pPr>
+              <w:jc w:val="left"/>
+            </w:pPr>
+            <w:r/>
+            <w:r>
+              <w:rPr>
+                <w:b w:val="0"/>
+              </w:rPr>
+              <w:t>SDR sample rate</w:t>
+            </w:r>
+          </w:p>
+        </w:tc>
+        <w:tc>
+          <w:tcPr>
+            <w:tcW w:type="dxa" w:w="4700"/>
+            <w:vAlign w:val="center"/>
+          </w:tcPr>
+          <w:p>
+            <w:pPr>
+              <w:jc w:val="left"/>
+            </w:pPr>
+            <w:r/>
+            <w:r>
+              <w:rPr>
+                <w:b w:val="0"/>
+              </w:rPr>
+              <w:t>40 MS/s fixed</w:t>
+            </w:r>
+          </w:p>
+        </w:tc>
+        <w:tc>
+          <w:tcPr>
+            <w:tcW w:type="dxa" w:w="2780"/>
+            <w:vAlign w:val="center"/>
+          </w:tcPr>
+          <w:p>
+            <w:pPr>
+              <w:jc w:val="left"/>
+            </w:pPr>
+            <w:r/>
+            <w:r>
+              <w:rPr>
+                <w:b w:val="0"/>
+              </w:rPr>
+              <w:t>WaveformLibrary / EttusRadarSource</w:t>
+            </w:r>
+          </w:p>
+        </w:tc>
+      </w:tr>
+      <w:tr>
+        <w:tc>
+          <w:tcPr>
+            <w:tcW w:type="dxa" w:w="2600"/>
+            <w:vAlign w:val="center"/>
+          </w:tcPr>
+          <w:p>
+            <w:pPr>
+              <w:jc w:val="left"/>
+            </w:pPr>
+            <w:r/>
+            <w:r>
+              <w:rPr>
+                <w:b w:val="0"/>
+              </w:rPr>
+              <w:t>Operator PRF range</w:t>
+            </w:r>
+          </w:p>
+        </w:tc>
+        <w:tc>
+          <w:tcPr>
+            <w:tcW w:type="dxa" w:w="4700"/>
+            <w:vAlign w:val="center"/>
+          </w:tcPr>
+          <w:p>
+            <w:pPr>
+              <w:jc w:val="left"/>
+            </w:pPr>
+            <w:r/>
+            <w:r>
+              <w:rPr>
+                <w:b w:val="0"/>
+              </w:rPr>
+              <w:t>1-4 kHz; 2 kHz default</w:t>
+            </w:r>
+          </w:p>
+        </w:tc>
+        <w:tc>
+          <w:tcPr>
+            <w:tcW w:type="dxa" w:w="2780"/>
+            <w:vAlign w:val="center"/>
+          </w:tcPr>
+          <w:p>
+            <w:pPr>
+              <w:jc w:val="left"/>
+            </w:pPr>
+            <w:r/>
+            <w:r>
+              <w:rPr>
+                <w:b w:val="0"/>
+              </w:rPr>
+              <w:t>Operator UI / RadarExecutor</w:t>
+            </w:r>
+          </w:p>
+        </w:tc>
+      </w:tr>
+      <w:tr>
+        <w:tc>
+          <w:tcPr>
+            <w:tcW w:type="dxa" w:w="2600"/>
+            <w:vAlign w:val="center"/>
+          </w:tcPr>
+          <w:p>
+            <w:pPr>
+              <w:jc w:val="left"/>
+            </w:pPr>
+            <w:r/>
+            <w:r>
+              <w:rPr>
+                <w:b w:val="0"/>
+              </w:rPr>
               <w:t>Receiver recovery and guards</w:t>
             </w:r>
           </w:p>
         </w:tc>
         <w:tc>
           <w:tcPr>
-            <w:tcW w:type="dxa" w:w="3360"/>
-            <w:tcW w:type="dxa" w:w="3360"/>
+            <w:tcW w:type="dxa" w:w="4700"/>
             <w:vAlign w:val="center"/>
           </w:tcPr>
           <w:p>
-            <w:pPr/>
-            <w:r>
-              <w:rPr/>
+            <w:pPr>
+              <w:jc w:val="left"/>
+            </w:pPr>
+            <w:r/>
+            <w:r>
+              <w:rPr>
+                <w:b w:val="0"/>
+              </w:rPr>
               <w:t>Provisional until scope measurement</w:t>
             </w:r>
           </w:p>
         </w:tc>
         <w:tc>
           <w:tcPr>
-            <w:tcW w:type="dxa" w:w="3360"/>
-            <w:tcW w:type="dxa" w:w="3360"/>
+            <w:tcW w:type="dxa" w:w="2780"/>
             <w:vAlign w:val="center"/>
           </w:tcPr>
           <w:p>
-            <w:pPr/>
-            <w:r>
-              <w:rPr/>
+            <w:pPr>
+              <w:jc w:val="left"/>
+            </w:pPr>
+            <w:r/>
+            <w:r>
+              <w:rPr>
+                <w:b w:val="0"/>
+              </w:rPr>
               <w:t>RF hardware verification</w:t>
             </w:r>
           </w:p>
         </w:tc>
       </w:tr>
     </w:tbl>
+    <w:p>
+      <w:pPr>
+        <w:pStyle w:val="Heading2"/>
+      </w:pPr>
+      <w:r>
+        <w:t>14.5 Configured CPI cadence and hardware evidence</w:t>
+      </w:r>
+    </w:p>
+    <w:p>
+      <w:pPr/>
+      <w:r>
+        <w:t>The configured operational profile and the hardware stress test use the same fixed 40 MS/s sample rate, 4,043 receive samples per pulse, depth-20 bounded paired queue and 5 ms command lead. The stress test exercises the maximum selectable PRF and a longer 128-pulse CPI; the main scheduler's 100 ms cadence is not part of the standalone harness.</w:t>
+      </w:r>
+    </w:p>
+    <w:tbl>
+      <w:tblPr>
+        <w:tblStyle w:val="TableGrid"/>
+        <w:tblW w:type="dxa" w:w="10080"/>
+        <w:tblLayout w:type="fixed"/>
+        <w:tblLook w:firstColumn="1" w:firstRow="1" w:lastColumn="0" w:lastRow="0" w:noHBand="0" w:noVBand="1" w:val="04A0"/>
+      </w:tblPr>
+      <w:tblGrid>
+        <w:gridCol w:w="2300"/>
+        <w:gridCol w:w="3600"/>
+        <w:gridCol w:w="4180"/>
+      </w:tblGrid>
+      <w:tr>
+        <w:trPr>
+          <w:tblHeader w:val="true"/>
+        </w:trPr>
+        <w:tc>
+          <w:tcPr>
+            <w:tcW w:type="dxa" w:w="2300"/>
+            <w:shd w:fill="1F4E78"/>
+            <w:vAlign w:val="center"/>
+          </w:tcPr>
+          <w:p>
+            <w:pPr>
+              <w:jc w:val="left"/>
+            </w:pPr>
+            <w:r>
+              <w:rPr>
+                <w:b/>
+                <w:color w:val="FFFFFF"/>
+              </w:rPr>
+            </w:r>
+            <w:r>
+              <w:rPr>
+                <w:b/>
+                <w:color w:val="FFFFFF"/>
+              </w:rPr>
+              <w:t>Parameter</w:t>
+            </w:r>
+          </w:p>
+        </w:tc>
+        <w:tc>
+          <w:tcPr>
+            <w:tcW w:type="dxa" w:w="3600"/>
+            <w:shd w:fill="1F4E78"/>
+            <w:vAlign w:val="center"/>
+          </w:tcPr>
+          <w:p>
+            <w:pPr>
+              <w:jc w:val="left"/>
+            </w:pPr>
+            <w:r>
+              <w:rPr>
+                <w:b/>
+                <w:color w:val="FFFFFF"/>
+              </w:rPr>
+            </w:r>
+            <w:r>
+              <w:rPr>
+                <w:b/>
+                <w:color w:val="FFFFFF"/>
+              </w:rPr>
+              <w:t>Configured operational profile</w:t>
+            </w:r>
+          </w:p>
+        </w:tc>
+        <w:tc>
+          <w:tcPr>
+            <w:tcW w:type="dxa" w:w="4180"/>
+            <w:shd w:fill="1F4E78"/>
+            <w:vAlign w:val="center"/>
+          </w:tcPr>
+          <w:p>
+            <w:pPr>
+              <w:jc w:val="left"/>
+            </w:pPr>
+            <w:r>
+              <w:rPr>
+                <w:b/>
+                <w:color w:val="FFFFFF"/>
+              </w:rPr>
+            </w:r>
+            <w:r>
+              <w:rPr>
+                <w:b/>
+                <w:color w:val="FFFFFF"/>
+              </w:rPr>
+              <w:t>Hardware stress test</w:t>
+            </w:r>
+          </w:p>
+        </w:tc>
+      </w:tr>
+      <w:tr>
+        <w:tc>
+          <w:tcPr>
+            <w:tcW w:type="dxa" w:w="2300"/>
+            <w:vAlign w:val="center"/>
+          </w:tcPr>
+          <w:p>
+            <w:pPr>
+              <w:jc w:val="left"/>
+            </w:pPr>
+            <w:r/>
+            <w:r>
+              <w:rPr>
+                <w:b w:val="0"/>
+              </w:rPr>
+              <w:t>PRF / PRI</w:t>
+            </w:r>
+          </w:p>
+        </w:tc>
+        <w:tc>
+          <w:tcPr>
+            <w:tcW w:type="dxa" w:w="3600"/>
+            <w:vAlign w:val="center"/>
+          </w:tcPr>
+          <w:p>
+            <w:pPr>
+              <w:jc w:val="left"/>
+            </w:pPr>
+            <w:r/>
+            <w:r>
+              <w:rPr>
+                <w:b w:val="0"/>
+              </w:rPr>
+              <w:t>2 kHz / 500 us</w:t>
+            </w:r>
+          </w:p>
+        </w:tc>
+        <w:tc>
+          <w:tcPr>
+            <w:tcW w:type="dxa" w:w="4180"/>
+            <w:vAlign w:val="center"/>
+          </w:tcPr>
+          <w:p>
+            <w:pPr>
+              <w:jc w:val="left"/>
+            </w:pPr>
+            <w:r/>
+            <w:r>
+              <w:rPr>
+                <w:b w:val="0"/>
+              </w:rPr>
+              <w:t>4 kHz / 250 us</w:t>
+            </w:r>
+          </w:p>
+        </w:tc>
+      </w:tr>
+      <w:tr>
+        <w:tc>
+          <w:tcPr>
+            <w:tcW w:type="dxa" w:w="2300"/>
+            <w:vAlign w:val="center"/>
+          </w:tcPr>
+          <w:p>
+            <w:pPr>
+              <w:jc w:val="left"/>
+            </w:pPr>
+            <w:r/>
+            <w:r>
+              <w:rPr>
+                <w:b w:val="0"/>
+              </w:rPr>
+              <w:t>Pulses per CPI</w:t>
+            </w:r>
+          </w:p>
+        </w:tc>
+        <w:tc>
+          <w:tcPr>
+            <w:tcW w:type="dxa" w:w="3600"/>
+            <w:vAlign w:val="center"/>
+          </w:tcPr>
+          <w:p>
+            <w:pPr>
+              <w:jc w:val="left"/>
+            </w:pPr>
+            <w:r/>
+            <w:r>
+              <w:rPr>
+                <w:b w:val="0"/>
+              </w:rPr>
+              <w:t>32</w:t>
+            </w:r>
+          </w:p>
+        </w:tc>
+        <w:tc>
+          <w:tcPr>
+            <w:tcW w:type="dxa" w:w="4180"/>
+            <w:vAlign w:val="center"/>
+          </w:tcPr>
+          <w:p>
+            <w:pPr>
+              <w:jc w:val="left"/>
+            </w:pPr>
+            <w:r/>
+            <w:r>
+              <w:rPr>
+                <w:b w:val="0"/>
+              </w:rPr>
+              <w:t>128</w:t>
+            </w:r>
+          </w:p>
+        </w:tc>
+      </w:tr>
+      <w:tr>
+        <w:tc>
+          <w:tcPr>
+            <w:tcW w:type="dxa" w:w="2300"/>
+            <w:vAlign w:val="center"/>
+          </w:tcPr>
+          <w:p>
+            <w:pPr>
+              <w:jc w:val="left"/>
+            </w:pPr>
+            <w:r/>
+            <w:r>
+              <w:rPr>
+                <w:b w:val="0"/>
+              </w:rPr>
+              <w:t>Nominal CPI duration</w:t>
+            </w:r>
+          </w:p>
+        </w:tc>
+        <w:tc>
+          <w:tcPr>
+            <w:tcW w:type="dxa" w:w="3600"/>
+            <w:vAlign w:val="center"/>
+          </w:tcPr>
+          <w:p>
+            <w:pPr>
+              <w:jc w:val="left"/>
+            </w:pPr>
+            <w:r/>
+            <w:r>
+              <w:rPr>
+                <w:b w:val="0"/>
+              </w:rPr>
+              <w:t>16.000 ms</w:t>
+            </w:r>
+          </w:p>
+        </w:tc>
+        <w:tc>
+          <w:tcPr>
+            <w:tcW w:type="dxa" w:w="4180"/>
+            <w:vAlign w:val="center"/>
+          </w:tcPr>
+          <w:p>
+            <w:pPr>
+              <w:jc w:val="left"/>
+            </w:pPr>
+            <w:r/>
+            <w:r>
+              <w:rPr>
+                <w:b w:val="0"/>
+              </w:rPr>
+              <w:t>32.000 ms</w:t>
+            </w:r>
+          </w:p>
+        </w:tc>
+      </w:tr>
+      <w:tr>
+        <w:tc>
+          <w:tcPr>
+            <w:tcW w:type="dxa" w:w="2300"/>
+            <w:vAlign w:val="center"/>
+          </w:tcPr>
+          <w:p>
+            <w:pPr>
+              <w:jc w:val="left"/>
+            </w:pPr>
+            <w:r/>
+            <w:r>
+              <w:rPr>
+                <w:b w:val="0"/>
+              </w:rPr>
+              <w:t>Command lead</w:t>
+            </w:r>
+          </w:p>
+        </w:tc>
+        <w:tc>
+          <w:tcPr>
+            <w:tcW w:type="dxa" w:w="3600"/>
+            <w:vAlign w:val="center"/>
+          </w:tcPr>
+          <w:p>
+            <w:pPr>
+              <w:jc w:val="left"/>
+            </w:pPr>
+            <w:r/>
+            <w:r>
+              <w:rPr>
+                <w:b w:val="0"/>
+              </w:rPr>
+              <w:t>5.000 ms</w:t>
+            </w:r>
+          </w:p>
+        </w:tc>
+        <w:tc>
+          <w:tcPr>
+            <w:tcW w:type="dxa" w:w="4180"/>
+            <w:vAlign w:val="center"/>
+          </w:tcPr>
+          <w:p>
+            <w:pPr>
+              <w:jc w:val="left"/>
+            </w:pPr>
+            <w:r/>
+            <w:r>
+              <w:rPr>
+                <w:b w:val="0"/>
+              </w:rPr>
+              <w:t>5.000 ms</w:t>
+            </w:r>
+          </w:p>
+        </w:tc>
+      </w:tr>
+      <w:tr>
+        <w:tc>
+          <w:tcPr>
+            <w:tcW w:type="dxa" w:w="2300"/>
+            <w:vAlign w:val="center"/>
+          </w:tcPr>
+          <w:p>
+            <w:pPr>
+              <w:jc w:val="left"/>
+            </w:pPr>
+            <w:r/>
+            <w:r>
+              <w:rPr>
+                <w:b w:val="0"/>
+              </w:rPr>
+              <w:t>Queue depth / horizon</w:t>
+            </w:r>
+          </w:p>
+        </w:tc>
+        <w:tc>
+          <w:tcPr>
+            <w:tcW w:type="dxa" w:w="3600"/>
+            <w:vAlign w:val="center"/>
+          </w:tcPr>
+          <w:p>
+            <w:pPr>
+              <w:jc w:val="left"/>
+            </w:pPr>
+            <w:r/>
+            <w:r>
+              <w:rPr>
+                <w:b w:val="0"/>
+              </w:rPr>
+              <w:t>20 / 10.000 ms</w:t>
+            </w:r>
+          </w:p>
+        </w:tc>
+        <w:tc>
+          <w:tcPr>
+            <w:tcW w:type="dxa" w:w="4180"/>
+            <w:vAlign w:val="center"/>
+          </w:tcPr>
+          <w:p>
+            <w:pPr>
+              <w:jc w:val="left"/>
+            </w:pPr>
+            <w:r/>
+            <w:r>
+              <w:rPr>
+                <w:b w:val="0"/>
+              </w:rPr>
+              <w:t>20 / 5.000 ms</w:t>
+            </w:r>
+          </w:p>
+        </w:tc>
+      </w:tr>
+      <w:tr>
+        <w:tc>
+          <w:tcPr>
+            <w:tcW w:type="dxa" w:w="2300"/>
+            <w:vAlign w:val="center"/>
+          </w:tcPr>
+          <w:p>
+            <w:pPr>
+              <w:jc w:val="left"/>
+            </w:pPr>
+            <w:r/>
+            <w:r>
+              <w:rPr>
+                <w:b w:val="0"/>
+              </w:rPr>
+              <w:t>RX samples</w:t>
+            </w:r>
+          </w:p>
+        </w:tc>
+        <w:tc>
+          <w:tcPr>
+            <w:tcW w:type="dxa" w:w="3600"/>
+            <w:vAlign w:val="center"/>
+          </w:tcPr>
+          <w:p>
+            <w:pPr>
+              <w:jc w:val="left"/>
+            </w:pPr>
+            <w:r/>
+            <w:r>
+              <w:rPr>
+                <w:b w:val="0"/>
+              </w:rPr>
+              <w:t>4,043 per pulse</w:t>
+            </w:r>
+          </w:p>
+        </w:tc>
+        <w:tc>
+          <w:tcPr>
+            <w:tcW w:type="dxa" w:w="4180"/>
+            <w:vAlign w:val="center"/>
+          </w:tcPr>
+          <w:p>
+            <w:pPr>
+              <w:jc w:val="left"/>
+            </w:pPr>
+            <w:r/>
+            <w:r>
+              <w:rPr>
+                <w:b w:val="0"/>
+              </w:rPr>
+              <w:t>4,043 per pulse; 517,504 total</w:t>
+            </w:r>
+          </w:p>
+        </w:tc>
+      </w:tr>
+      <w:tr>
+        <w:tc>
+          <w:tcPr>
+            <w:tcW w:type="dxa" w:w="2300"/>
+            <w:vAlign w:val="center"/>
+          </w:tcPr>
+          <w:p>
+            <w:pPr>
+              <w:jc w:val="left"/>
+            </w:pPr>
+            <w:r/>
+            <w:r>
+              <w:rPr>
+                <w:b w:val="0"/>
+              </w:rPr>
+              <w:t>Source execution wall time</w:t>
+            </w:r>
+          </w:p>
+        </w:tc>
+        <w:tc>
+          <w:tcPr>
+            <w:tcW w:type="dxa" w:w="3600"/>
+            <w:vAlign w:val="center"/>
+          </w:tcPr>
+          <w:p>
+            <w:pPr>
+              <w:jc w:val="left"/>
+            </w:pPr>
+            <w:r/>
+            <w:r>
+              <w:rPr>
+                <w:b w:val="0"/>
+              </w:rPr>
+              <w:t>Approximately 21 ms expected</w:t>
+            </w:r>
+          </w:p>
+        </w:tc>
+        <w:tc>
+          <w:tcPr>
+            <w:tcW w:type="dxa" w:w="4180"/>
+            <w:vAlign w:val="center"/>
+          </w:tcPr>
+          <w:p>
+            <w:pPr>
+              <w:jc w:val="left"/>
+            </w:pPr>
+            <w:r/>
+            <w:r>
+              <w:rPr>
+                <w:b w:val="0"/>
+              </w:rPr>
+              <w:t>36.963-37.016 ms measured</w:t>
+            </w:r>
+          </w:p>
+        </w:tc>
+      </w:tr>
+      <w:tr>
+        <w:tc>
+          <w:tcPr>
+            <w:tcW w:type="dxa" w:w="2300"/>
+            <w:vAlign w:val="center"/>
+          </w:tcPr>
+          <w:p>
+            <w:pPr>
+              <w:jc w:val="left"/>
+            </w:pPr>
+            <w:r/>
+            <w:r>
+              <w:rPr>
+                <w:b w:val="0"/>
+              </w:rPr>
+              <w:t>Scheduler/CPI-grid cadence</w:t>
+            </w:r>
+          </w:p>
+        </w:tc>
+        <w:tc>
+          <w:tcPr>
+            <w:tcW w:type="dxa" w:w="3600"/>
+            <w:vAlign w:val="center"/>
+          </w:tcPr>
+          <w:p>
+            <w:pPr>
+              <w:jc w:val="left"/>
+            </w:pPr>
+            <w:r/>
+            <w:r>
+              <w:rPr>
+                <w:b w:val="0"/>
+              </w:rPr>
+              <w:t>100 ms nominal; approximately 10 Hz</w:t>
+            </w:r>
+          </w:p>
+        </w:tc>
+        <w:tc>
+          <w:tcPr>
+            <w:tcW w:type="dxa" w:w="4180"/>
+            <w:vAlign w:val="center"/>
+          </w:tcPr>
+          <w:p>
+            <w:pPr>
+              <w:jc w:val="left"/>
+            </w:pPr>
+            <w:r/>
+            <w:r>
+              <w:rPr>
+                <w:b w:val="0"/>
+              </w:rPr>
+              <w:t>Not applied by standalone harness</w:t>
+            </w:r>
+          </w:p>
+        </w:tc>
+      </w:tr>
+      <w:tr>
+        <w:tc>
+          <w:tcPr>
+            <w:tcW w:type="dxa" w:w="2300"/>
+            <w:vAlign w:val="center"/>
+          </w:tcPr>
+          <w:p>
+            <w:pPr>
+              <w:jc w:val="left"/>
+            </w:pPr>
+            <w:r/>
+            <w:r>
+              <w:rPr>
+                <w:b w:val="0"/>
+              </w:rPr>
+              <w:t>Verification result</w:t>
+            </w:r>
+          </w:p>
+        </w:tc>
+        <w:tc>
+          <w:tcPr>
+            <w:tcW w:type="dxa" w:w="3600"/>
+            <w:vAlign w:val="center"/>
+          </w:tcPr>
+          <w:p>
+            <w:pPr>
+              <w:jc w:val="left"/>
+            </w:pPr>
+            <w:r/>
+            <w:r>
+              <w:rPr>
+                <w:b w:val="0"/>
+              </w:rPr>
+              <w:t>Operational baseline setting</w:t>
+            </w:r>
+          </w:p>
+        </w:tc>
+        <w:tc>
+          <w:tcPr>
+            <w:tcW w:type="dxa" w:w="4180"/>
+            <w:vAlign w:val="center"/>
+          </w:tcPr>
+          <w:p>
+            <w:pPr>
+              <w:jc w:val="left"/>
+            </w:pPr>
+            <w:r/>
+            <w:r>
+              <w:rPr>
+                <w:b w:val="0"/>
+              </w:rPr>
+              <w:t>10/10 dwells passed; 128/128 TX sends and ACKs per dwell; complete RX samples; no reported transport faults</w:t>
+            </w:r>
+          </w:p>
+        </w:tc>
+      </w:tr>
+    </w:tbl>
+    <w:p>
+      <w:pPr>
+        <w:spacing w:before="120"/>
+      </w:pPr>
+      <w:r>
+        <w:t>The stress test used a protected TX/RX-to-RX2 cable loopback with 30 dB attenuation, 0 dB TX gain and 10 dB RX gain. ATR, TRM and PA were disabled. The result validates the 5 ms command lead and bounded timed-pair transport at the tested load; it does not constitute ATR non-overlap or integrated TRM/PA verification. Exact SDR CPI-grid spacing is obtained from consecutive ScheduledPriHardwareTimesSec[0] values in RawDwellData diagnostics.</w:t>
+      </w:r>
+    </w:p>
     <w:p>
       <w:pPr>
         <w:pStyle w:val="Heading1"/>
@@ -9519,6 +10489,48 @@
           </w:tcPr>
           <w:p>
             <w:r>
+              <w:t>Superseded</w:t>
+            </w:r>
+          </w:p>
+        </w:tc>
+      </w:tr>
+      <w:tr>
+        <w:tc>
+          <w:tcPr>
+            <w:tcW w:type="dxa" w:w="2520"/>
+          </w:tcPr>
+          <w:p>
+            <w:r>
+              <w:t>0.7e</w:t>
+            </w:r>
+          </w:p>
+        </w:tc>
+        <w:tc>
+          <w:tcPr>
+            <w:tcW w:type="dxa" w:w="2520"/>
+          </w:tcPr>
+          <w:p>
+            <w:r>
+              <w:t>Measured CPI timing, 5 ms command lead and explicit 100 ms scheduler cadence</w:t>
+            </w:r>
+          </w:p>
+        </w:tc>
+        <w:tc>
+          <w:tcPr>
+            <w:tcW w:type="dxa" w:w="2520"/>
+          </w:tcPr>
+          <w:p>
+            <w:r>
+              <w:t>Protected B200mini timed TX/RX stress test; ATR/TRM/PA disabled</w:t>
+            </w:r>
+          </w:p>
+        </w:tc>
+        <w:tc>
+          <w:tcPr>
+            <w:tcW w:type="dxa" w:w="2520"/>
+          </w:tcPr>
+          <w:p>
+            <w:r>
               <w:t>Current architecture baseline</w:t>
             </w:r>
           </w:p>
@@ -9618,6 +10630,7 @@
     <w:p>
       <w:pPr>
         <w:pStyle w:val="Heading2"/>
+        <w:pageBreakBefore/>
       </w:pPr>
       <w:r>
         <w:t>19.1 Immediate next steps</w:t>
@@ -9628,7 +10641,7 @@
         <w:pStyle w:val="ListBullet"/>
       </w:pPr>
       <w:r>
-        <w:t>Commit the Version 0.7d mission, scheduling, dwell-management and waveform-catalogue architecture baseline.</w:t>
+        <w:t>Commit the Version 0.7e measured CPI timing and 5 ms command-lead architecture baseline.</w:t>
       </w:r>
     </w:p>
     <w:p>
@@ -10881,7 +11894,7 @@
       <w:jc w:val="center"/>
     </w:pPr>
     <w:r>
-      <w:t>VX-SSA-001 | Vanguard X Software &amp; System Architecture | Version 0.7d</w:t>
+      <w:t>VX-SSA-001 | Vanguard X Software &amp; System Architecture | Version 0.7e</w:t>
     </w:r>
   </w:p>
 </w:hdr>

</xml_diff>

<commit_message>
Integrate operational X6-60 control and SIM/HARD modes
</commit_message>
<xml_diff>
--- a/docs/architecture/VX-SSA-001_Vanguard_X_Software_System_Architecture.docx
+++ b/docs/architecture/VX-SSA-001_Vanguard_X_Software_System_Architecture.docx
@@ -32,7 +32,7 @@
         <w:jc w:val="center"/>
       </w:pPr>
       <w:r>
-        <w:t>Version 0.7f - ATR CRO Verification and TX Pre-Roll Baseline</w:t>
+        <w:t>Version 0.8 - Operational Golay Timing and X6-60 Integration Baseline</w:t>
       </w:r>
     </w:p>
     <w:p>
@@ -145,14 +145,8 @@
             </w:tcMar>
           </w:tcPr>
           <w:p>
-            <w:pPr>
-              <w:spacing w:before="0" w:after="0"/>
-            </w:pPr>
-            <w:r>
-              <w:rPr>
-                <w:sz w:val="17"/>
-              </w:rPr>
-              <w:t>0.7f</w:t>
+            <w:r>
+              <w:t>0.8</w:t>
             </w:r>
           </w:p>
         </w:tc>
@@ -249,14 +243,8 @@
             </w:tcMar>
           </w:tcPr>
           <w:p>
-            <w:pPr>
-              <w:spacing w:before="0" w:after="0"/>
-            </w:pPr>
-            <w:r>
-              <w:rPr>
-                <w:sz w:val="17"/>
-              </w:rPr>
-              <w:t>20 July 2026</w:t>
+            <w:r>
+              <w:t>22 July 2026</w:t>
             </w:r>
           </w:p>
         </w:tc>
@@ -405,14 +393,8 @@
             </w:tcMar>
           </w:tcPr>
           <w:p>
-            <w:pPr>
-              <w:spacing w:before="0" w:after="0"/>
-            </w:pPr>
-            <w:r>
-              <w:rPr>
-                <w:sz w:val="17"/>
-              </w:rPr>
-              <w:t>Fixed 40 MS/s waveform/timing and bounded timed TX/RX baseline, including measured B200mini ATR polarity, 500 us PRI, 5 us TX, approximately 100 us RX, 1 us non-overlap guard and the accepted 8-sample/200 ns TX pre-roll; TRM and PA remain disconnected</w:t>
+            <w:r>
+              <w:t>Operational Golay64_20MHz A/B timing at 40 MS/s and 4 kHz/64 physical pulses (16 ms CPI), guarded B200mini timed TX/RX and ATR profiles, and operational X6-60 SocketCAN pointing with absolute encoder feedback, North=0 degrees, clockwise-positive azimuth, 20 deg/s scan rate and current-position startup; no-profile startup remains receive-only and the TRM/PA remain disconnected.</w:t>
             </w:r>
           </w:p>
         </w:tc>
@@ -1403,6 +1385,9 @@
         </w:tc>
       </w:tr>
       <w:tr>
+        <w:trPr>
+          <w:cantSplit/>
+        </w:trPr>
         <w:tc>
           <w:tcPr>
             <w:tcW w:type="dxa" w:w="2520"/>
@@ -1501,6 +1486,9 @@
         </w:tc>
       </w:tr>
       <w:tr>
+        <w:trPr>
+          <w:cantSplit/>
+        </w:trPr>
         <w:tc>
           <w:tcPr>
             <w:tcW w:type="dxa" w:w="2520"/>
@@ -1595,6 +1583,9 @@
         </w:tc>
       </w:tr>
       <w:tr>
+        <w:trPr>
+          <w:cantSplit/>
+        </w:trPr>
         <w:tc>
           <w:tcPr>
             <w:tcW w:type="dxa" w:w="2520"/>
@@ -1689,6 +1680,9 @@
         </w:tc>
       </w:tr>
       <w:tr>
+        <w:trPr>
+          <w:cantSplit/>
+        </w:trPr>
         <w:tc>
           <w:tcPr>
             <w:tcW w:type="dxa" w:w="2520"/>
@@ -1770,13 +1764,52 @@
             </w:tcMar>
           </w:tcPr>
           <w:p>
-            <w:pPr>
-              <w:spacing w:before="0" w:after="0"/>
-            </w:pPr>
-            <w:r>
-              <w:rPr>
-                <w:sz w:val="17"/>
-              </w:rPr>
+            <w:r>
+              <w:t>Superseded</w:t>
+            </w:r>
+          </w:p>
+        </w:tc>
+      </w:tr>
+      <w:tr>
+        <w:trPr>
+          <w:cantSplit/>
+        </w:trPr>
+        <w:tc>
+          <w:tcPr>
+            <w:tcW w:type="dxa" w:w="2520"/>
+          </w:tcPr>
+          <w:p>
+            <w:r>
+              <w:t>0.8</w:t>
+            </w:r>
+          </w:p>
+        </w:tc>
+        <w:tc>
+          <w:tcPr>
+            <w:tcW w:type="dxa" w:w="2520"/>
+          </w:tcPr>
+          <w:p>
+            <w:r>
+              <w:t>22 Jul 2026</w:t>
+            </w:r>
+          </w:p>
+        </w:tc>
+        <w:tc>
+          <w:tcPr>
+            <w:tcW w:type="dxa" w:w="2520"/>
+          </w:tcPr>
+          <w:p>
+            <w:r>
+              <w:t>Operational Golay A/B timing, guarded loopback/ATR profiles, X6-60 SocketCAN motion and encoder integration, current-position startup, 20 deg/s scan evidence and North-up PPI convention</w:t>
+            </w:r>
+          </w:p>
+        </w:tc>
+        <w:tc>
+          <w:tcPr>
+            <w:tcW w:type="dxa" w:w="2520"/>
+          </w:tcPr>
+          <w:p>
+            <w:r>
               <w:t>Current</w:t>
             </w:r>
           </w:p>
@@ -1963,6 +1996,46 @@
     </w:p>
     <w:p>
       <w:pPr>
+        <w:pStyle w:val="ListBullet"/>
+      </w:pPr>
+      <w:r>
+        <w:t>ADR-0020: Use Golay64_20MHz as the operational A/B complementary waveform at 4 kHz and 64 physical pulses.</w:t>
+      </w:r>
+    </w:p>
+    <w:p>
+      <w:pPr>
+        <w:pStyle w:val="ListBullet"/>
+      </w:pPr>
+      <w:r>
+        <w:t>ADR-0021: Use the X6-60 absolute multi-turn encoder over 1 Mbit/s SocketCAN as the operational azimuth source.</w:t>
+      </w:r>
+    </w:p>
+    <w:p>
+      <w:pPr>
+        <w:pStyle w:val="ListBullet"/>
+      </w:pPr>
+      <w:r>
+        <w:t>ADR-0022: Treat the X6-60 as unlimited azimuth and adopt its measured current position at startup without forced motion.</w:t>
+      </w:r>
+    </w:p>
+    <w:p>
+      <w:pPr>
+        <w:pStyle w:val="ListBullet"/>
+      </w:pPr>
+      <w:r>
+        <w:t>ADR-0023: Keep live X6-60 motion opt-in, guarded, allow-listed and owned only by PointingManager.</w:t>
+      </w:r>
+    </w:p>
+    <w:p>
+      <w:pPr>
+        <w:pStyle w:val="ListBullet"/>
+      </w:pPr>
+      <w:r>
+        <w:t>ADR-0024: Use a North-up PPI with 0 degrees at the top and bearings increasing clockwise.</w:t>
+      </w:r>
+    </w:p>
+    <w:p>
+      <w:pPr>
         <w:pStyle w:val="Heading1"/>
       </w:pPr>
       <w:r>
@@ -2182,7 +2255,7 @@
         <w:pStyle w:val="ListBullet"/>
       </w:pPr>
       <w:r>
-        <w:t>Future timed transmit, ATR gating, waveform agility and adaptive operation.</w:t>
+        <w:t>Guarded timed transmit, ATR gating and Golay complementary operation, with future PRI, frequency and waveform agility.</w:t>
       </w:r>
     </w:p>
     <w:p>
@@ -2195,7 +2268,7 @@
     </w:p>
     <w:p>
       <w:r>
-        <w:t>Version 0.7 remains the first hardware execution baseline. Version 0.7b recorded the accepted waveform-sampling and operator timing decisions. Version 0.7c records their implementation and protected B200mini timed TX/RX validation. Version 0.7d records the mission, scheduler and dwell-management architecture. Version 0.7e records the measured CPI timing baseline and hardware validation of the 5 ms command lead. The operational application remains transmitter-inhibited until ATR non-overlap is verified on the oscilloscope; the TRM and PA remain disconnected. Version 0.7f adds CRO evidence for the isolated B200mini ATR outputs and accepts a 200 ns TX transport pre-roll; it does not enable ATR in the operational main program or authorize TRM/PA connection.</w:t>
+        <w:t>Version 0.8 supersedes the earlier Frank/2 kHz operational timing baseline. The configured search and track profile now uses Golay64_20MHz as strict A-then-B pulses at 4 kHz, 64 physical pulses and a 16 ms CPI. The B200mini retains the fixed 40 MS/s clock, 5 ms command lead, depth-20 bounded queue, 8-sample/200 ns transmit pre-roll and 4,043-sample receive window. The operational X6-60 path now uses absolute encoder feedback and guarded SocketCAN motion. No-profile application startup remains fail-closed in receive-only mode; timed transmit and ATR require explicit guarded profiles, and this baseline does not authorise connection of the TRM or 50 W PA.</w:t>
       </w:r>
     </w:p>
     <w:p>
@@ -2359,7 +2432,7 @@
     </w:p>
     <w:p>
       <w:r>
-        <w:t>The radar mission is a time allocation policy above individual tasks and dwells. The initial adaptive mission concept begins with rapid 360-degree surveillance, promotes areas of interest to higher-resolution sector search, services confirmed tracks through predicted-position revisits, and performs a small local scan around the prediction when a revisit misses. Mission policy changes task generation and scheduling parameters; it does not directly command the PTZ, SDR or signal processor.</w:t>
+        <w:t>The radar mission is a time allocation policy above individual tasks and dwells. The initial adaptive mission concept begins with rapid 360-degree surveillance, promotes areas of interest to higher-resolution sector search, services confirmed tracks through predicted-position revisits, and performs a small local scan around the prediction when a revisit misses. Mission policy changes task generation and scheduling parameters; it does not directly command the X6-60, SDR or signal processor.</w:t>
       </w:r>
     </w:p>
     <w:p>
@@ -2455,7 +2528,7 @@
         <w:pStyle w:val="ListBullet"/>
       </w:pPr>
       <w:r>
-        <w:t>Ettus B200mini SDR providing timed receive acquisition and future timed waveform transmission and ATR GPIO.</w:t>
+        <w:t>Ettus B200mini SDR providing finite hardware-timed receive windows, guarded timed waveform transmission and CRO-verified ATR GPIO.</w:t>
       </w:r>
     </w:p>
     <w:p>
@@ -2479,7 +2552,7 @@
         <w:pStyle w:val="ListBullet"/>
       </w:pPr>
       <w:r>
-        <w:t>QAN X6-60 motorised pointing unit with position feedback.</w:t>
+        <w:t>QAN X6-60 unlimited-azimuth motor/positioning unit with absolute multi-turn encoder feedback over SocketCAN.</w:t>
       </w:r>
     </w:p>
     <w:p>
@@ -2500,7 +2573,7 @@
     </w:p>
     <w:p>
       <w:r>
-        <w:t>Slow TRM configuration is written before operation or when settings change. Fast pulse-by-pulse transmit/receive switching belongs to Ettus ATR. Pointing commands belong exclusively to PointingManager through the X6-60 controller interface. RadarExecutor consumes measured PointingState and never commands the motor directly.</w:t>
+        <w:t>Slow TRM configuration is written before operation or when settings change. Fast pulse-by-pulse transmit/receive switching belongs to Ettus ATR. Pointing commands belong exclusively to PointingManager through the X6-60 controller interface. RadarExecutor consumes measured PointingState and never commands the motor directly. The operational application does not bring SocketCAN up or change its bitrate; can0 must already exist, be UP and report 1 Mbit/s before live X6-60 control is opened.</w:t>
       </w:r>
     </w:p>
     <w:p>
@@ -2887,7 +2960,7 @@
           </w:tcPr>
           <w:p>
             <w:r>
-              <w:t>Operator presentation and status display.</w:t>
+              <w:t>North-up clockwise-positive PPI, operator controls and status display.</w:t>
             </w:r>
           </w:p>
         </w:tc>
@@ -2913,6 +2986,81 @@
           <w:p>
             <w:r>
               <w:t>Configuration-controlled data and diagnostic logging.</w:t>
+            </w:r>
+          </w:p>
+        </w:tc>
+      </w:tr>
+      <w:tr>
+        <w:trPr>
+          <w:cantSplit/>
+        </w:trPr>
+        <w:tc>
+          <w:tcPr>
+            <w:tcW w:type="dxa" w:w="5040"/>
+          </w:tcPr>
+          <w:p>
+            <w:r>
+              <w:t>X660ReadOnlyController.py</w:t>
+            </w:r>
+          </w:p>
+        </w:tc>
+        <w:tc>
+          <w:tcPr>
+            <w:tcW w:type="dxa" w:w="5040"/>
+          </w:tcPr>
+          <w:p>
+            <w:r>
+              <w:t>Validated SocketCAN telemetry, absolute multi-turn angle and calibrated North-relative azimuth.</w:t>
+            </w:r>
+          </w:p>
+        </w:tc>
+      </w:tr>
+      <w:tr>
+        <w:trPr>
+          <w:cantSplit/>
+        </w:trPr>
+        <w:tc>
+          <w:tcPr>
+            <w:tcW w:type="dxa" w:w="5040"/>
+          </w:tcPr>
+          <w:p>
+            <w:r>
+              <w:t>X660OperationalController.py</w:t>
+            </w:r>
+          </w:p>
+        </w:tc>
+        <w:tc>
+          <w:tcPr>
+            <w:tcW w:type="dxa" w:w="5040"/>
+          </w:tcPr>
+          <w:p>
+            <w:r>
+              <w:t>Operational slew, absolute-position, nudge and stop commands with encoder-based state.</w:t>
+            </w:r>
+          </w:p>
+        </w:tc>
+      </w:tr>
+      <w:tr>
+        <w:trPr>
+          <w:cantSplit/>
+        </w:trPr>
+        <w:tc>
+          <w:tcPr>
+            <w:tcW w:type="dxa" w:w="5040"/>
+          </w:tcPr>
+          <w:p>
+            <w:r>
+              <w:t>X660GuardedMotionTransport.py</w:t>
+            </w:r>
+          </w:p>
+        </w:tc>
+        <w:tc>
+          <w:tcPr>
+            <w:tcW w:type="dxa" w:w="5040"/>
+          </w:tcPr>
+          <w:p>
+            <w:r>
+              <w:t>Dry-run-first, allow-listed and acknowledgement-gated CAN motion transport.</w:t>
             </w:r>
           </w:p>
         </w:tc>
@@ -3019,7 +3167,7 @@
         <w:pStyle w:val="ListBullet"/>
       </w:pPr>
       <w:r>
-        <w:t>PTZ/antenna frame: encoder pan and tilt angles.</w:t>
+        <w:t>X6-60/antenna frame: clockwise-positive azimuth from calibrated North and absolute multi-turn raw encoder angle.</w:t>
       </w:r>
     </w:p>
     <w:p>
@@ -3040,7 +3188,7 @@
     </w:p>
     <w:p>
       <w:r>
-        <w:t>For the initial azimuth-only implementation, true beam bearing equals platform true heading plus antenna-relative azimuth, wrapped into 0-360 degrees. The inverse transformation subtracts platform heading from the requested true bearing. Full roll, pitch and tilt compensation will use a future three-dimensional rotation model.</w:t>
+        <w:t>For the initial azimuth-only implementation, true beam bearing equals platform true heading plus X6-60 relative azimuth, wrapped into 0-360 degrees. The inverse transformation subtracts platform heading from the requested true bearing. Public azimuth is North=0 degrees and increases clockwise. Full roll, pitch and tilt compensation will use a future three-dimensional rotation model.</w:t>
       </w:r>
     </w:p>
     <w:p>
@@ -3065,6 +3213,20 @@
       </w:pPr>
       <w:r>
         <w:t>TRUE-fixed sectors remain geographically fixed and are continuously transformed into platform-relative motor coordinates.</w:t>
+      </w:r>
+    </w:p>
+    <w:p>
+      <w:pPr>
+        <w:pStyle w:val="Heading2"/>
+      </w:pPr>
+      <w:r>
+        <w:t>5.4 North-up PPI convention</w:t>
+      </w:r>
+    </w:p>
+    <w:p>
+      <w:pPr/>
+      <w:r>
+        <w:t>RadarDisplayQt5 uses the conventional radar mapping x = range x sin(bearing) and y = range x cos(bearing). Therefore 0 degrees/North is at the top, 90 degrees/East at the right, 180 degrees/South at the bottom and 270 degrees/West at the left. Bearings increase clockwise. Beam lines, sector boundaries, detections, plots, tracks, labels and mouse selection shall all use this single conversion.</w:t>
       </w:r>
     </w:p>
     <w:p>
@@ -3399,6 +3561,9 @@
         <w:gridCol w:w="2016"/>
       </w:tblGrid>
       <w:tr>
+        <w:trPr>
+          <w:cantSplit/>
+        </w:trPr>
         <w:tc>
           <w:tcPr>
             <w:tcW w:type="dxa" w:w="2016"/>
@@ -3451,6 +3616,9 @@
         </w:tc>
       </w:tr>
       <w:tr>
+        <w:trPr>
+          <w:cantSplit/>
+        </w:trPr>
         <w:tc>
           <w:tcPr>
             <w:tcW w:type="dxa" w:w="2016"/>
@@ -3503,6 +3671,9 @@
         </w:tc>
       </w:tr>
       <w:tr>
+        <w:trPr>
+          <w:cantSplit/>
+        </w:trPr>
         <w:tc>
           <w:tcPr>
             <w:tcW w:type="dxa" w:w="2016"/>
@@ -3555,6 +3726,9 @@
         </w:tc>
       </w:tr>
       <w:tr>
+        <w:trPr>
+          <w:cantSplit/>
+        </w:trPr>
         <w:tc>
           <w:tcPr>
             <w:tcW w:type="dxa" w:w="2016"/>
@@ -3607,6 +3781,9 @@
         </w:tc>
       </w:tr>
       <w:tr>
+        <w:trPr>
+          <w:cantSplit/>
+        </w:trPr>
         <w:tc>
           <w:tcPr>
             <w:tcW w:type="dxa" w:w="2016"/>
@@ -3851,7 +4028,7 @@
     </w:p>
     <w:p>
       <w:r>
-        <w:t>PointingManager commands continuous slew toward the active endpoint and reverses when measured beam angle reaches or crosses that endpoint. Reversal uses measured motion and endpoint crossing to avoid repeated reversals at descending-sector boundaries.</w:t>
+        <w:t>PointingManager commands continuous slew toward the active endpoint and reverses when measured beam angle reaches or crosses that endpoint. The current sector is 120 to 10 degrees and the operational scan command is 20 deg/s. Reversal uses measured encoder motion and endpoint crossing to avoid repeated reversals at descending-sector boundaries.</w:t>
       </w:r>
     </w:p>
     <w:p>
@@ -3872,12 +4049,12 @@
         <w:pStyle w:val="Heading2"/>
       </w:pPr>
       <w:r>
-        <w:t>8.3 Mechanical limits</w:t>
-      </w:r>
-    </w:p>
-    <w:p>
-      <w:r>
-        <w:t>PointingManager validates converted relative azimuth against the configured mechanical window. Unreachable commands are identified and may be clipped for safe behaviour. Future scheduling policy may defer, reverse, flag incomplete coverage or request platform manoeuvre.</w:t>
+        <w:t>8.3 Azimuth reachability and installation limits</w:t>
+      </w:r>
+    </w:p>
+    <w:p>
+      <w:r>
+        <w:t>The operational X6-60 azimuth axis is unlimited and multi-turn. PointingManager therefore normalises public bearings into 0-360 degrees without applying a legacy left/right software window. Raw multi-turn angle is retained for command construction and provenance. Installation-specific cable-wrap or obstruction limits, if introduced later, shall be explicit mission safety constraints rather than assumed X6-60 end stops.</w:t>
       </w:r>
     </w:p>
     <w:p>
@@ -3890,7 +4067,35 @@
     </w:p>
     <w:p>
       <w:r>
-        <w:t>Every dwell shall carry measured encoder angle and navigation state corresponding as closely as practicable to illumination time. The initial implementation may use before-and-after position samples with dwell-centre interpolation. Future hardware shall use timestamped encoder and attitude streams.</w:t>
+        <w:t>Every dwell carries measured X6-60 encoder azimuth, pan rate, raw multi-turn angle, validity, source and navigation state corresponding as closely as practicable to illumination time. The measured encoder bearing is the beam source unless a separately enabled and valid IMU source takes priority.</w:t>
+      </w:r>
+    </w:p>
+    <w:p>
+      <w:pPr>
+        <w:pStyle w:val="Heading2"/>
+      </w:pPr>
+      <w:r>
+        <w:t>8.5 Operational SocketCAN controller</w:t>
+      </w:r>
+    </w:p>
+    <w:p>
+      <w:pPr/>
+      <w:r>
+        <w:t>The X6-60 uses Linux SocketCAN interface can0 at 1 Mbit/s and node 1. Standard 11-bit request and reply identifiers are 0x141 and 0x241. The calibrated North raw angle is -361.53 degrees and DirectionSign=+1, meaning increasing raw angle is clockwise. The operational scan-rate ceiling is 20 deg/s; absolute-position commands retain a 14 deg/s speed limit; manual nudges are limited to 10 degrees per command.</w:t>
+      </w:r>
+    </w:p>
+    <w:p>
+      <w:pPr>
+        <w:pStyle w:val="Heading2"/>
+      </w:pPr>
+      <w:r>
+        <w:t>8.6 Startup and motion safety</w:t>
+      </w:r>
+    </w:p>
+    <w:p>
+      <w:pPr/>
+      <w:r>
+        <w:t>Live motion is selected only through the x660-operational profile and requires explicit acknowledgements that motion will occur and the motion area is clear. The transport accepts only closed-loop stop (0x81), signed speed (0xA2), absolute position (0xA4) and incremental position (0xA8). At startup the controller reads and validates the current encoder pose, updates the PPI beam and remains in STOP without issuing any position, slew, nudge or stop command. Motion begins only after an operator SCAN, STARE/goto or nudge action. Missing, DOWN or incorrectly configured can0 causes the operational controller to fail closed before motion.</w:t>
       </w:r>
     </w:p>
     <w:p>
@@ -4156,7 +4361,7 @@
     <w:p>
       <w:pPr/>
       <w:r>
-        <w:t>The initial search waveform is Frank10_20MHz and the initial track waveform is Barker13_20MHz. At 20 Mchip/s these use two samples per chip: Barker13_20MHz contains 26 transmit samples and lasts 0.65 microseconds; Frank10_20MHz contains 200 transmit samples and lasts 5.00 microseconds.</w:t>
+        <w:t>The configured search and track waveform is Golay64_20MHz. Each A or B member contains 64 chips at 20 Mchip/s and two samples per chip, giving 128 waveform samples and 3.20 microseconds duration. The transport adds eight leading zero samples (0.20 microseconds) without changing the matched-filter reference. Frank and Barker definitions remain available as rate-qualified catalogue entries for controlled tests and future profiles.</w:t>
       </w:r>
     </w:p>
     <w:p>
@@ -4170,7 +4375,7 @@
         <w:pStyle w:val="Heading3"/>
       </w:pPr>
       <w:r>
-        <w:t>10.1.1 Initial waveform identifiers</w:t>
+        <w:t>10.1.1 Rate-qualified waveform identifiers</w:t>
       </w:r>
     </w:p>
     <w:tbl>
@@ -4193,6 +4398,7 @@
       <w:tr>
         <w:trPr>
           <w:tblHeader w:val="true"/>
+          <w:cantSplit/>
         </w:trPr>
         <w:tc>
           <w:tcPr>
@@ -4346,7 +4552,9 @@
         </w:tc>
       </w:tr>
       <w:tr>
-        <w:trPr/>
+        <w:trPr>
+          <w:cantSplit/>
+        </w:trPr>
         <w:tc>
           <w:tcPr>
             <w:tcW w:type="dxa" w:w="2700"/>
@@ -4499,7 +4707,9 @@
         </w:tc>
       </w:tr>
       <w:tr>
-        <w:trPr/>
+        <w:trPr>
+          <w:cantSplit/>
+        </w:trPr>
         <w:tc>
           <w:tcPr>
             <w:tcW w:type="dxa" w:w="2700"/>
@@ -4652,7 +4862,9 @@
         </w:tc>
       </w:tr>
       <w:tr>
-        <w:trPr/>
+        <w:trPr>
+          <w:cantSplit/>
+        </w:trPr>
         <w:tc>
           <w:tcPr>
             <w:tcW w:type="dxa" w:w="2700"/>
@@ -4805,7 +5017,9 @@
         </w:tc>
       </w:tr>
       <w:tr>
-        <w:trPr/>
+        <w:trPr>
+          <w:cantSplit/>
+        </w:trPr>
         <w:tc>
           <w:tcPr>
             <w:tcW w:type="dxa" w:w="2700"/>
@@ -4957,6 +5171,136 @@
           </w:p>
         </w:tc>
       </w:tr>
+      <w:tr>
+        <w:trPr>
+          <w:cantSplit/>
+        </w:trPr>
+        <w:tc>
+          <w:tcPr>
+            <w:tcW w:type="dxa" w:w="2700"/>
+          </w:tcPr>
+          <w:p>
+            <w:r>
+              <w:t>Golay64A_20MHz</w:t>
+            </w:r>
+          </w:p>
+        </w:tc>
+        <w:tc>
+          <w:tcPr>
+            <w:tcW w:type="dxa" w:w="900"/>
+          </w:tcPr>
+          <w:p>
+            <w:r>
+              <w:t>64</w:t>
+            </w:r>
+          </w:p>
+        </w:tc>
+        <w:tc>
+          <w:tcPr>
+            <w:tcW w:type="dxa" w:w="1600"/>
+          </w:tcPr>
+          <w:p>
+            <w:r>
+              <w:t>20 Mchip/s</w:t>
+            </w:r>
+          </w:p>
+        </w:tc>
+        <w:tc>
+          <w:tcPr>
+            <w:tcW w:type="dxa" w:w="1550"/>
+          </w:tcPr>
+          <w:p>
+            <w:r>
+              <w:t>2</w:t>
+            </w:r>
+          </w:p>
+        </w:tc>
+        <w:tc>
+          <w:tcPr>
+            <w:tcW w:type="dxa" w:w="1450"/>
+          </w:tcPr>
+          <w:p>
+            <w:r>
+              <w:t>128</w:t>
+            </w:r>
+          </w:p>
+        </w:tc>
+        <w:tc>
+          <w:tcPr>
+            <w:tcW w:type="dxa" w:w="1640"/>
+          </w:tcPr>
+          <w:p>
+            <w:r>
+              <w:t>3.20 µs</w:t>
+            </w:r>
+          </w:p>
+        </w:tc>
+      </w:tr>
+      <w:tr>
+        <w:trPr>
+          <w:cantSplit/>
+        </w:trPr>
+        <w:tc>
+          <w:tcPr>
+            <w:tcW w:type="dxa" w:w="2700"/>
+          </w:tcPr>
+          <w:p>
+            <w:r>
+              <w:t>Golay64B_20MHz</w:t>
+            </w:r>
+          </w:p>
+        </w:tc>
+        <w:tc>
+          <w:tcPr>
+            <w:tcW w:type="dxa" w:w="900"/>
+          </w:tcPr>
+          <w:p>
+            <w:r>
+              <w:t>64</w:t>
+            </w:r>
+          </w:p>
+        </w:tc>
+        <w:tc>
+          <w:tcPr>
+            <w:tcW w:type="dxa" w:w="1600"/>
+          </w:tcPr>
+          <w:p>
+            <w:r>
+              <w:t>20 Mchip/s</w:t>
+            </w:r>
+          </w:p>
+        </w:tc>
+        <w:tc>
+          <w:tcPr>
+            <w:tcW w:type="dxa" w:w="1550"/>
+          </w:tcPr>
+          <w:p>
+            <w:r>
+              <w:t>2</w:t>
+            </w:r>
+          </w:p>
+        </w:tc>
+        <w:tc>
+          <w:tcPr>
+            <w:tcW w:type="dxa" w:w="1450"/>
+          </w:tcPr>
+          <w:p>
+            <w:r>
+              <w:t>128</w:t>
+            </w:r>
+          </w:p>
+        </w:tc>
+        <w:tc>
+          <w:tcPr>
+            <w:tcW w:type="dxa" w:w="1640"/>
+          </w:tcPr>
+          <w:p>
+            <w:r>
+              <w:t>3.20 µs</w:t>
+            </w:r>
+          </w:p>
+        </w:tc>
+      </w:tr>
     </w:tbl>
     <w:p>
       <w:pPr>
@@ -5029,6 +5373,20 @@
     </w:p>
     <w:p>
       <w:pPr>
+        <w:pStyle w:val="Heading3"/>
+      </w:pPr>
+      <w:r>
+        <w:t>10.1.3 Operational Golay pair</w:t>
+      </w:r>
+    </w:p>
+    <w:p>
+      <w:pPr/>
+      <w:r>
+        <w:t>Golay64_20MHz is a logical pair identifier resolved by RadarExecutor into strict alternating Golay64A_20MHz then Golay64B_20MHz physical pulses. Every pulse carries pair index and A/B role metadata. A 64-pulse dwell therefore contains 32 complementary pairs. Missing, reordered, disabled or mismatched pair members are rejected before processing.</w:t>
+      </w:r>
+    </w:p>
+    <w:p>
+      <w:pPr>
         <w:pStyle w:val="Heading2"/>
       </w:pPr>
       <w:r>
@@ -5050,7 +5408,7 @@
     </w:p>
     <w:p>
       <w:r>
-        <w:t>DwellPlan describes one complete radar action, linking task identity, pointing, pulse sequence, attenuation and metadata. ProcessingPlan states how returned pulses are interpreted. The implemented hardware baseline uses uniform-PRI receive and standard Doppler FFT processing.</w:t>
+        <w:t>DwellPlan describes one complete radar action, linking task identity, pointing, pulse sequence, attenuation and metadata. ProcessingPlan states how returned pulses are interpreted. The operational Golay path applies separate A and B matched filters, combines each complementary pair, then performs the Doppler FFT across the 32 pair outputs. Uniform single-code processing remains available for Frank and Barker profiles.</w:t>
       </w:r>
     </w:p>
     <w:p>
@@ -5127,7 +5485,7 @@
     </w:p>
     <w:p>
       <w:r>
-        <w:t>Raw IQ is pulse-compressed, windowed in slow time and transformed by Doppler FFT for uniform-PRI dwells. The detector operates on the range-Doppler power map. The tracker forms blobs, initiates tentative tracks, confirms tracks and maintains state estimates using an alpha-beta model.</w:t>
+        <w:t>Raw IQ is pulse-compressed before Doppler processing. For Golay, A and B pulses are compressed separately and summed by complementary pair before the slow-time window and Doppler FFT. For single-code uniform-PRI dwells, the Doppler FFT operates directly across physical pulses. The detector operates on the resulting range-Doppler power map; the tracker forms blobs, initiates tentative tracks, confirms tracks and maintains alpha-beta state estimates.</w:t>
       </w:r>
     </w:p>
     <w:p>
@@ -5214,7 +5572,7 @@
     </w:p>
     <w:p>
       <w:r>
-        <w:t>The Ettus B200mini executes finite hardware-timed transmit bursts and receive windows on one SDR clock. Version 0.7c has validated TX and RX independently and as bounded matched pairs under protected cable-loopback conditions. ATR GPIO timing remains disabled and shall be oscilloscope-verified before the TRM or PA is connected.</w:t>
+        <w:t>The Ettus B200mini executes finite hardware-timed transmit bursts and receive windows on one SDR clock. Timed TX/RX, 8-sample pre-roll, depth-20 queueing, ATR polarity/idle behaviour and protected cable loopback have been validated in guarded profiles. No-profile application startup remains receive-only. ATR-enabled diagnostic profiles require explicit RF, loopback, TRM/PA-disconnected and CRO-verification confirmations.</w:t>
       </w:r>
     </w:p>
     <w:p>
@@ -5227,7 +5585,21 @@
     </w:p>
     <w:p>
       <w:r>
-        <w:t>The controller interface provides simulated and Pelco-D implementations for the X6-60. NavigationState currently supplies simulated attitude and can later be replaced by an IMU/GPS/INS adapter without changing scheduler or pointing interfaces.</w:t>
+        <w:t>The controller interface provides simulated, telemetry-only SocketCAN and guarded operational SocketCAN implementations for the X6-60. Legacy class or module names may still contain PTZ, but the installed pointing hardware is the QAN X6-60 motor/positioning unit. NavigationState currently supplies simulated attitude and can later be replaced by an IMU/GPS/INS adapter without changing scheduler or pointing interfaces.</w:t>
+      </w:r>
+    </w:p>
+    <w:p>
+      <w:pPr>
+        <w:pStyle w:val="Heading2"/>
+      </w:pPr>
+      <w:r>
+        <w:t>12.4 SocketCAN deployment boundary</w:t>
+      </w:r>
+    </w:p>
+    <w:p>
+      <w:pPr/>
+      <w:r>
+        <w:t>Linux owns discovery and configuration of the USB-CAN adapter. Vanguard X checks that can0 exists, is UP and reports 1 Mbit/s; it does not invoke privileged ip-link configuration. Closing Vanguard X stops/holds the motor through the controller and releases the CAN bus object, but does not bring can0 down. A PC restart, USB adapter reset or reconnection may therefore require can0 to be configured again unless the host is later configured to do so automatically.</w:t>
       </w:r>
     </w:p>
     <w:p>
@@ -5719,7 +6091,7 @@
     </w:p>
     <w:p>
       <w:r>
-        <w:t>Receive-only hardware tests used 40 MS/s, Frank10_20MHz, 4 kHz PRF, 128 pulses and 4,043 RX samples per pulse. A fixed depth-20 RX pipeline returned all 517,504 samples without timeout, overflow or late command. Protected combined TX/RX loopback used a depth-8 paired pipeline at 4 kHz and 128 pulses; all 128 TX sends, burst acknowledgements and RX windows completed with zero transport errors and a repeatable +175 ns RX timestamp offset.</w:t>
+        <w:t>Receive-only and timed-pair hardware tests use the fixed 40 MS/s clock, 4,043 receive samples per physical pulse, a 5 ms command lead and bounded future queue. The depth-20 stress test passed 10/10 dwells at 4 kHz and 128 pulses with complete 517,504-sample receive arrays, all transmit sends and acknowledgements, and no reported transport faults. The operational Golay profile uses the same 4 kHz physical PRF and depth-20 queue with 64 pulses, reducing the CPI from the stress-test 32 ms to 16 ms.</w:t>
       </w:r>
     </w:p>
     <w:tbl>
@@ -5815,7 +6187,7 @@
           </w:tcPr>
           <w:p>
             <w:r>
-              <w:t>Approximately 10 dwells per second.</w:t>
+              <w:t>Approximately 10 accepted dwells per second.</w:t>
             </w:r>
           </w:p>
         </w:tc>
@@ -5840,7 +6212,7 @@
           </w:tcPr>
           <w:p>
             <w:r>
-              <w:t>~21 ms expected at 2 kHz/32 pulses; 36.963-37.016 ms measured at 4 kHz/128 pulses</w:t>
+              <w:t>21.6-23.3 ms measured at 4 kHz/64 Golay; 36.963-37.016 ms at 4 kHz/128 stress</w:t>
             </w:r>
           </w:p>
         </w:tc>
@@ -5850,7 +6222,7 @@
           </w:tcPr>
           <w:p>
             <w:r>
-              <w:t>5 ms lead plus the CPI, final RX-window completion and transport/ACK overhead.</w:t>
+              <w:t>Includes one 5 ms lead, CPI, final RX completion and transport/ACK overhead.</w:t>
             </w:r>
           </w:p>
         </w:tc>
@@ -5875,7 +6247,7 @@
           </w:tcPr>
           <w:p>
             <w:r>
-              <w:t>8-13 ms</w:t>
+              <w:t>Approximately 9-20 ms observed</w:t>
             </w:r>
           </w:p>
         </w:tc>
@@ -5885,7 +6257,7 @@
           </w:tcPr>
           <w:p>
             <w:r>
-              <w:t>Pulse compression and Doppler processing.</w:t>
+              <w:t>Golay A/B compression, complementary combination and Doppler processing.</w:t>
             </w:r>
           </w:p>
         </w:tc>
@@ -5910,7 +6282,7 @@
           </w:tcPr>
           <w:p>
             <w:r>
-              <w:t>~3 ms</w:t>
+              <w:t>Approximately 2.7-4.7 ms observed</w:t>
             </w:r>
           </w:p>
         </w:tc>
@@ -5920,7 +6292,7 @@
           </w:tcPr>
           <w:p>
             <w:r>
-              <w:t>Current zero-detection baseline.</w:t>
+              <w:t>Current low-detection hardware runs.</w:t>
             </w:r>
           </w:p>
         </w:tc>
@@ -5945,7 +6317,7 @@
           </w:tcPr>
           <w:p>
             <w:r>
-              <w:t>~4 ms</w:t>
+              <w:t>Approximately 6-11 ms observed</w:t>
             </w:r>
           </w:p>
         </w:tc>
@@ -5955,7 +6327,7 @@
           </w:tcPr>
           <w:p>
             <w:r>
-              <w:t>Qt display update.</w:t>
+              <w:t>Qt PPI and range-profile update.</w:t>
             </w:r>
           </w:p>
         </w:tc>
@@ -5980,7 +6352,7 @@
           </w:tcPr>
           <w:p>
             <w:r>
-              <w:t>~36-41 ms expected at the default profile</w:t>
+              <w:t>Approximately 39-53 ms observed</w:t>
             </w:r>
           </w:p>
         </w:tc>
@@ -5990,7 +6362,7 @@
           </w:tcPr>
           <w:p>
             <w:r>
-              <w:t>Approximately 59-64 ms margin within the 100 ms scheduler interval.</w:t>
+              <w:t>Fits the verified 100 ms cadence; 50 ms requires further profiling before acceptance.</w:t>
             </w:r>
           </w:p>
         </w:tc>
@@ -6131,7 +6503,7 @@
         <w:pStyle w:val="ListBullet"/>
       </w:pPr>
       <w:r>
-        <w:t>Keep receive-only mode available until timed TX and ATR verification are complete.</w:t>
+        <w:t>Keep receive-only as the fail-closed no-profile application mode; timed TX and ATR are enabled only by explicit guarded operating profiles.</w:t>
       </w:r>
     </w:p>
     <w:p>
@@ -6160,6 +6532,20 @@
     </w:p>
     <w:p>
       <w:pPr>
+        <w:pStyle w:val="Heading2"/>
+      </w:pPr>
+      <w:r>
+        <w:t>13.11 Guarded operating profiles</w:t>
+      </w:r>
+    </w:p>
+    <w:p>
+      <w:pPr/>
+      <w:r>
+        <w:t>The operational application separates capability from authorisation. Receive-only startup exposes no timed transmit or ATR capability. Guarded loopback profiles enable timed TX/RX only after explicit acknowledgements of RF output, the TX/RX-to-RX2 attenuated cable path and external-hardware state. ATR-enabled diagnostic profiles additionally require confirmation of the CRO-verified mapping. Any profile that intentionally overlaps ATR states is simulation/diagnostic-only and shall never be connected to the TRM or PA.</w:t>
+      </w:r>
+    </w:p>
+    <w:p>
+      <w:pPr>
         <w:pStyle w:val="Heading1"/>
       </w:pPr>
       <w:r>
@@ -6182,13 +6568,13 @@
     <w:p>
       <w:pPr/>
       <w:r>
-        <w:t>The configured operational search profile is 2.0 kHz PRF, 500 microsecond PRI and 32 pulses per CPI, giving a nominal 16.000 ms CPI. The main scheduler interval remains 100 ms, so accepted dwell starts and the corresponding SDR CPI grids occur at approximately 10 Hz. The console WallDt value is the host interval between accepted dwell starts; it is not the CPI duration.</w:t>
+        <w:t>The configured operational search and track profile is Golay64_20MHz at 4.0 kHz physical PRF, 250 microsecond physical PRI and 64 physical A/B pulses, giving a nominal 16.000 ms CPI and 32 complementary pair outputs. After A+B combination, slow-time samples are spaced by 500 microseconds and the effective pair rate is 2.0 kHz. The main scheduler interval remains 100 ms, so accepted dwell starts occur at approximately 10 Hz. Console WallDt is the host interval between accepted starts, not CPI duration.</w:t>
       </w:r>
     </w:p>
     <w:p>
       <w:pPr/>
       <w:r>
-        <w:t>The console Collect value is the blocking duration of source execution. It includes the 5 ms command lead, the pulse train, the final receive window and UHD transport/acknowledgement overhead. At 2.0 kHz and 32 pulses it is expected to be approximately 21 ms. The same 5 ms lead is applied to every dwell and therefore cancels from the difference between consecutive SDR CPI start times; it does not change the 100 ms scheduler cadence.</w:t>
+        <w:t>The console Collect value is the blocking duration of source execution. It includes the 5 ms command lead, pulse train, final receive window and UHD transport/acknowledgement overhead. Recent 4 kHz/64-pulse Golay receive-only runs measured approximately 21.6-23.3 ms collection. The lead is applied once per dwell and cancels from differences between consecutive SDR CPI start times; it does not change the 100 ms scheduler cadence.</w:t>
       </w:r>
     </w:p>
     <w:p>
@@ -6201,19 +6587,19 @@
     </w:p>
     <w:p>
       <w:r>
-        <w:t>Receive start time is derived from the pulse plan. In the timed-TX path, Trx[n] = Ttx[n] + TxAtrEnvelope[n] + ReceiverRecoveryTime[n]. With the TRM and PA disconnected, CRO measurement confirmed a 1 us both-low interval between the B200mini TX and RX ATR outputs. The measured GPIO guard is accepted for the isolated SDR interface; TRM switching and receiver recovery remain unverified until the external RF hardware is connected through the staged safety process.</w:t>
+        <w:t>Receive start time is derived from the physical waveform and transport envelope. For Golay64_20MHz, the eight-sample pre-roll lasts 0.200 us, each A or B code lasts 3.200 us, and TX ATR therefore spans 3.400 us. With the provisional 1.000 us receiver-recovery value, RX begins 4.400 us after the physical PRI origin. The first non-zero RF sample at 0.200 us is the range origin. The 1 us recovery value is consistent with the isolated B200mini guard evidence but remains provisional for the TRM/receiver chain.</w:t>
       </w:r>
     </w:p>
     <w:p>
       <w:pPr/>
       <w:r>
-        <w:t>To capture the complete coded return from maximum range, receive end time equals maximum-range round-trip delay plus transmit pulse duration plus end margin. The receive sample count is the ceiling of receive capture duration multiplied by 40 MS/s.</w:t>
+        <w:t>For the 15.000 km instrumented range, receive end time includes round-trip delay, the 3.200 us physical Golay member and 2.000 us end margin. Rounding up at 40 MS/s produces 4,043 complex samples, a 101.075 us capture and an actual receive end 105.475 us after PRI origin. Adding the 2.000 us next-TX guard gives a 107.475 us timing-derived minimum PRI, comfortably below the selected 250 us PRI.</w:t>
       </w:r>
     </w:p>
     <w:p>
       <w:pPr/>
       <w:r>
-        <w:t>When capture starts after transmission, received sample zero represents a non-zero range. RawDwellData shall carry the receive-window start delay, and RadarProcessor shall include the corresponding range offset in the range axis.</w:t>
+        <w:t>When capture starts after transmission, received sample zero represents a non-zero range. For the Golay baseline, RX begins 4.200 us after the first non-zero RF sample, corresponding to approximately 629.6 m. RawDwellData carries the receive-window start delay and RadarProcessor applies the range offset. The separate 166-sample protected loopback delay is diagnostic-path calibration and shall not be applied as a universal operational range correction.</w:t>
       </w:r>
     </w:p>
     <w:p>
@@ -6226,19 +6612,19 @@
     </w:p>
     <w:p>
       <w:r>
-        <w:t>Uniform PRI remains the initial hardware path. The operator selects PRF from 1.0 to 4.0 kHz, with 2.0 kHz as the default; software derives PRI as the reciprocal of PRF. The operator also selects pulses per CPI, with 32 as the default. Staggered and jittered PRI require actual pulse timestamps and a compatible nonuniform slow-time processor.</w:t>
+        <w:t>Uniform physical PRI remains the operational hardware path. The operator selects physical PRF from 1.0 to 4.0 kHz; Golay requires a positive even pulse count and currently defaults to 4.0 kHz/64 pulses. Software derives physical PRI and CPI duration. Staggered and jittered PRI require actual pulse timestamps and a compatible nonuniform slow-time processor.</w:t>
       </w:r>
     </w:p>
     <w:p>
       <w:pPr/>
       <w:r>
-        <w:t>The UI shall display derived PRI, CPI duration, unambiguous radial velocity, velocity-bin spacing and estimated antenna movement during the CPI.</w:t>
+        <w:t>The UI shall distinguish physical PRF/PRI and pulse count from effective Golay pair rate/spacing and pair count. Doppler axes for the operational Golay processor use the 500 us pair spacing, yielding an approximate +/-15.95 m/s unambiguous radial-velocity interval at 9.4 GHz and about 1.00 m/s bin spacing for the 16 ms CPI.</w:t>
       </w:r>
     </w:p>
     <w:p>
       <w:pPr/>
       <w:r>
-        <w:t>The execution layer shall validate every selection independently of the UI. The accepted PRF shall remain within 1-4 kHz and its derived PRI shall not be shorter than maximum-range echo completion plus configured margins and the next-transmit guard.</w:t>
+        <w:t>The execution layer validates every selection independently of the UI. Accepted physical PRF remains within 1-4 kHz and the derived PRI shall not be shorter than maximum-range echo completion plus configured margins and next-transmit guard. Golay plans additionally reject odd pulse counts, missing or reordered pairs and inconsistent A/B timing.</w:t>
       </w:r>
     </w:p>
     <w:p>
@@ -6372,6 +6758,9 @@
         </w:tc>
       </w:tr>
       <w:tr>
+        <w:trPr>
+          <w:cantSplit/>
+        </w:trPr>
         <w:tc>
           <w:tcPr>
             <w:tcW w:type="dxa" w:w="2600"/>
@@ -6464,6 +6853,9 @@
         </w:tc>
       </w:tr>
       <w:tr>
+        <w:trPr>
+          <w:cantSplit/>
+        </w:trPr>
         <w:tc>
           <w:tcPr>
             <w:tcW w:type="dxa" w:w="2600"/>
@@ -6476,21 +6868,8 @@
             </w:tcMar>
           </w:tcPr>
           <w:p>
-            <w:pPr>
-              <w:spacing w:before="0" w:after="0"/>
-              <w:jc w:val="left"/>
-            </w:pPr>
-            <w:r>
-              <w:rPr>
-                <w:sz w:val="17"/>
-              </w:rPr>
-            </w:r>
-            <w:r>
-              <w:rPr>
-                <w:b w:val="0"/>
-                <w:sz w:val="17"/>
-              </w:rPr>
-              <w:t>Default pulse timing</w:t>
+            <w:r>
+              <w:t>Default physical pulse timing</w:t>
             </w:r>
           </w:p>
         </w:tc>
@@ -6506,21 +6885,8 @@
             </w:tcMar>
           </w:tcPr>
           <w:p>
-            <w:pPr>
-              <w:spacing w:before="0" w:after="0"/>
-              <w:jc w:val="left"/>
-            </w:pPr>
-            <w:r>
-              <w:rPr>
-                <w:sz w:val="17"/>
-              </w:rPr>
-            </w:r>
-            <w:r>
-              <w:rPr>
-                <w:b w:val="0"/>
-                <w:sz w:val="17"/>
-              </w:rPr>
-              <w:t>2 kHz PRF; 500 us PRI; 32 pulses; 16 ms CPI</w:t>
+            <w:r>
+              <w:t>4 kHz PRF; 250 us PRI; 64 A/B pulses; 16 ms CPI</w:t>
             </w:r>
           </w:p>
         </w:tc>
@@ -6536,26 +6902,16 @@
             </w:tcMar>
           </w:tcPr>
           <w:p>
-            <w:pPr>
-              <w:spacing w:before="0" w:after="0"/>
-              <w:jc w:val="left"/>
-            </w:pPr>
-            <w:r>
-              <w:rPr>
-                <w:sz w:val="17"/>
-              </w:rPr>
-            </w:r>
-            <w:r>
-              <w:rPr>
-                <w:b w:val="0"/>
-                <w:sz w:val="17"/>
-              </w:rPr>
+            <w:r>
               <w:t>Operator selection + SDR hardware</w:t>
             </w:r>
           </w:p>
         </w:tc>
       </w:tr>
       <w:tr>
+        <w:trPr>
+          <w:cantSplit/>
+        </w:trPr>
         <w:tc>
           <w:tcPr>
             <w:tcW w:type="dxa" w:w="2600"/>
@@ -6568,20 +6924,7 @@
             </w:tcMar>
           </w:tcPr>
           <w:p>
-            <w:pPr>
-              <w:spacing w:before="0" w:after="0"/>
-              <w:jc w:val="left"/>
-            </w:pPr>
-            <w:r>
-              <w:rPr>
-                <w:sz w:val="17"/>
-              </w:rPr>
-            </w:r>
-            <w:r>
-              <w:rPr>
-                <w:b w:val="0"/>
-                <w:sz w:val="17"/>
-              </w:rPr>
+            <w:r>
               <w:t>Main scheduler cadence</w:t>
             </w:r>
           </w:p>
@@ -6598,20 +6941,7 @@
             </w:tcMar>
           </w:tcPr>
           <w:p>
-            <w:pPr>
-              <w:spacing w:before="0" w:after="0"/>
-              <w:jc w:val="left"/>
-            </w:pPr>
-            <w:r>
-              <w:rPr>
-                <w:sz w:val="17"/>
-              </w:rPr>
-            </w:r>
-            <w:r>
-              <w:rPr>
-                <w:b w:val="0"/>
-                <w:sz w:val="17"/>
-              </w:rPr>
+            <w:r>
               <w:t>100 ms start-to-start; approximately 10 CPI grids/s</w:t>
             </w:r>
           </w:p>
@@ -6628,26 +6958,16 @@
             </w:tcMar>
           </w:tcPr>
           <w:p>
-            <w:pPr>
-              <w:spacing w:before="0" w:after="0"/>
-              <w:jc w:val="left"/>
-            </w:pPr>
-            <w:r>
-              <w:rPr>
-                <w:sz w:val="17"/>
-              </w:rPr>
-            </w:r>
-            <w:r>
-              <w:rPr>
-                <w:b w:val="0"/>
-                <w:sz w:val="17"/>
-              </w:rPr>
+            <w:r>
               <w:t>Main scheduler loop</w:t>
             </w:r>
           </w:p>
         </w:tc>
       </w:tr>
       <w:tr>
+        <w:trPr>
+          <w:cantSplit/>
+        </w:trPr>
         <w:tc>
           <w:tcPr>
             <w:tcW w:type="dxa" w:w="2600"/>
@@ -6660,21 +6980,8 @@
             </w:tcMar>
           </w:tcPr>
           <w:p>
-            <w:pPr>
-              <w:spacing w:before="0" w:after="0"/>
-              <w:jc w:val="left"/>
-            </w:pPr>
-            <w:r>
-              <w:rPr>
-                <w:sz w:val="17"/>
-              </w:rPr>
-            </w:r>
-            <w:r>
-              <w:rPr>
-                <w:b w:val="0"/>
-                <w:sz w:val="17"/>
-              </w:rPr>
-              <w:t>Expected default source execution</w:t>
+            <w:r>
+              <w:t>Measured default source execution</w:t>
             </w:r>
           </w:p>
         </w:tc>
@@ -6690,21 +6997,8 @@
             </w:tcMar>
           </w:tcPr>
           <w:p>
-            <w:pPr>
-              <w:spacing w:before="0" w:after="0"/>
-              <w:jc w:val="left"/>
-            </w:pPr>
-            <w:r>
-              <w:rPr>
-                <w:sz w:val="17"/>
-              </w:rPr>
-            </w:r>
-            <w:r>
-              <w:rPr>
-                <w:b w:val="0"/>
-                <w:sz w:val="17"/>
-              </w:rPr>
-              <w:t>Approximately 21 ms including the 5 ms lead</w:t>
+            <w:r>
+              <w:t>Approximately 21.6-23.3 ms at 4 kHz/64 Golay</w:t>
             </w:r>
           </w:p>
         </w:tc>
@@ -6720,26 +7014,16 @@
             </w:tcMar>
           </w:tcPr>
           <w:p>
-            <w:pPr>
-              <w:spacing w:before="0" w:after="0"/>
-              <w:jc w:val="left"/>
-            </w:pPr>
-            <w:r>
-              <w:rPr>
-                <w:sz w:val="17"/>
-              </w:rPr>
-            </w:r>
-            <w:r>
-              <w:rPr>
-                <w:b w:val="0"/>
-                <w:sz w:val="17"/>
-              </w:rPr>
+            <w:r>
               <w:t>EttusRadarSource</w:t>
             </w:r>
           </w:p>
         </w:tc>
       </w:tr>
       <w:tr>
+        <w:trPr>
+          <w:cantSplit/>
+        </w:trPr>
         <w:tc>
           <w:tcPr>
             <w:tcW w:type="dxa" w:w="2600"/>
@@ -6752,20 +7036,7 @@
             </w:tcMar>
           </w:tcPr>
           <w:p>
-            <w:pPr>
-              <w:spacing w:before="0" w:after="0"/>
-              <w:jc w:val="left"/>
-            </w:pPr>
-            <w:r>
-              <w:rPr>
-                <w:sz w:val="17"/>
-              </w:rPr>
-            </w:r>
-            <w:r>
-              <w:rPr>
-                <w:b w:val="0"/>
-                <w:sz w:val="17"/>
-              </w:rPr>
+            <w:r>
               <w:t>Bounded command pipeline</w:t>
             </w:r>
           </w:p>
@@ -6782,21 +7053,8 @@
             </w:tcMar>
           </w:tcPr>
           <w:p>
-            <w:pPr>
-              <w:spacing w:before="0" w:after="0"/>
-              <w:jc w:val="left"/>
-            </w:pPr>
-            <w:r>
-              <w:rPr>
-                <w:sz w:val="17"/>
-              </w:rPr>
-            </w:r>
-            <w:r>
-              <w:rPr>
-                <w:b w:val="0"/>
-                <w:sz w:val="17"/>
-              </w:rPr>
-              <w:t>Depth 20; 10 ms horizon at 2 kHz and 5 ms at 4 kHz</w:t>
+            <w:r>
+              <w:t>Depth 20; 5 ms horizon at 4 kHz</w:t>
             </w:r>
           </w:p>
         </w:tc>
@@ -6812,26 +7070,16 @@
             </w:tcMar>
           </w:tcPr>
           <w:p>
-            <w:pPr>
-              <w:spacing w:before="0" w:after="0"/>
-              <w:jc w:val="left"/>
-            </w:pPr>
-            <w:r>
-              <w:rPr>
-                <w:sz w:val="17"/>
-              </w:rPr>
-            </w:r>
-            <w:r>
-              <w:rPr>
-                <w:b w:val="0"/>
-                <w:sz w:val="17"/>
-              </w:rPr>
+            <w:r>
               <w:t>EttusRadarSource</w:t>
             </w:r>
           </w:p>
         </w:tc>
       </w:tr>
       <w:tr>
+        <w:trPr>
+          <w:cantSplit/>
+        </w:trPr>
         <w:tc>
           <w:tcPr>
             <w:tcW w:type="dxa" w:w="2600"/>
@@ -6844,20 +7092,7 @@
             </w:tcMar>
           </w:tcPr>
           <w:p>
-            <w:pPr>
-              <w:spacing w:before="0" w:after="0"/>
-              <w:jc w:val="left"/>
-            </w:pPr>
-            <w:r>
-              <w:rPr>
-                <w:sz w:val="17"/>
-              </w:rPr>
-            </w:r>
-            <w:r>
-              <w:rPr>
-                <w:b w:val="0"/>
-                <w:sz w:val="17"/>
-              </w:rPr>
+            <w:r>
               <w:t>Signal processing</w:t>
             </w:r>
           </w:p>
@@ -6874,21 +7109,8 @@
             </w:tcMar>
           </w:tcPr>
           <w:p>
-            <w:pPr>
-              <w:spacing w:before="0" w:after="0"/>
-              <w:jc w:val="left"/>
-            </w:pPr>
-            <w:r>
-              <w:rPr>
-                <w:sz w:val="17"/>
-              </w:rPr>
-            </w:r>
-            <w:r>
-              <w:rPr>
-                <w:b w:val="0"/>
-                <w:sz w:val="17"/>
-              </w:rPr>
-              <w:t>8-13 ms</w:t>
+            <w:r>
+              <w:t>Approximately 9-20 ms observed</w:t>
             </w:r>
           </w:p>
         </w:tc>
@@ -6904,26 +7126,16 @@
             </w:tcMar>
           </w:tcPr>
           <w:p>
-            <w:pPr>
-              <w:spacing w:before="0" w:after="0"/>
-              <w:jc w:val="left"/>
-            </w:pPr>
-            <w:r>
-              <w:rPr>
-                <w:sz w:val="17"/>
-              </w:rPr>
-            </w:r>
-            <w:r>
-              <w:rPr>
-                <w:b w:val="0"/>
-                <w:sz w:val="17"/>
-              </w:rPr>
+            <w:r>
               <w:t>RadarProcessor</w:t>
             </w:r>
           </w:p>
         </w:tc>
       </w:tr>
       <w:tr>
+        <w:trPr>
+          <w:cantSplit/>
+        </w:trPr>
         <w:tc>
           <w:tcPr>
             <w:tcW w:type="dxa" w:w="2600"/>
@@ -6936,20 +7148,7 @@
             </w:tcMar>
           </w:tcPr>
           <w:p>
-            <w:pPr>
-              <w:spacing w:before="0" w:after="0"/>
-              <w:jc w:val="left"/>
-            </w:pPr>
-            <w:r>
-              <w:rPr>
-                <w:sz w:val="17"/>
-              </w:rPr>
-            </w:r>
-            <w:r>
-              <w:rPr>
-                <w:b w:val="0"/>
-                <w:sz w:val="17"/>
-              </w:rPr>
+            <w:r>
               <w:t>Detection and tracking</w:t>
             </w:r>
           </w:p>
@@ -6966,21 +7165,8 @@
             </w:tcMar>
           </w:tcPr>
           <w:p>
-            <w:pPr>
-              <w:spacing w:before="0" w:after="0"/>
-              <w:jc w:val="left"/>
-            </w:pPr>
-            <w:r>
-              <w:rPr>
-                <w:sz w:val="17"/>
-              </w:rPr>
-            </w:r>
-            <w:r>
-              <w:rPr>
-                <w:b w:val="0"/>
-                <w:sz w:val="17"/>
-              </w:rPr>
-              <w:t>Approximately 3 ms</w:t>
+            <w:r>
+              <w:t>Approximately 2.7-4.7 ms observed</w:t>
             </w:r>
           </w:p>
         </w:tc>
@@ -6996,26 +7182,16 @@
             </w:tcMar>
           </w:tcPr>
           <w:p>
-            <w:pPr>
-              <w:spacing w:before="0" w:after="0"/>
-              <w:jc w:val="left"/>
-            </w:pPr>
-            <w:r>
-              <w:rPr>
-                <w:sz w:val="17"/>
-              </w:rPr>
-            </w:r>
-            <w:r>
-              <w:rPr>
-                <w:b w:val="0"/>
-                <w:sz w:val="17"/>
-              </w:rPr>
+            <w:r>
               <w:t>Detector / Tracker</w:t>
             </w:r>
           </w:p>
         </w:tc>
       </w:tr>
       <w:tr>
+        <w:trPr>
+          <w:cantSplit/>
+        </w:trPr>
         <w:tc>
           <w:tcPr>
             <w:tcW w:type="dxa" w:w="2600"/>
@@ -7028,20 +7204,7 @@
             </w:tcMar>
           </w:tcPr>
           <w:p>
-            <w:pPr>
-              <w:spacing w:before="0" w:after="0"/>
-              <w:jc w:val="left"/>
-            </w:pPr>
-            <w:r>
-              <w:rPr>
-                <w:sz w:val="17"/>
-              </w:rPr>
-            </w:r>
-            <w:r>
-              <w:rPr>
-                <w:b w:val="0"/>
-                <w:sz w:val="17"/>
-              </w:rPr>
+            <w:r>
               <w:t>Display update</w:t>
             </w:r>
           </w:p>
@@ -7058,21 +7221,8 @@
             </w:tcMar>
           </w:tcPr>
           <w:p>
-            <w:pPr>
-              <w:spacing w:before="0" w:after="0"/>
-              <w:jc w:val="left"/>
-            </w:pPr>
-            <w:r>
-              <w:rPr>
-                <w:sz w:val="17"/>
-              </w:rPr>
-            </w:r>
-            <w:r>
-              <w:rPr>
-                <w:b w:val="0"/>
-                <w:sz w:val="17"/>
-              </w:rPr>
-              <w:t>Approximately 4 ms</w:t>
+            <w:r>
+              <w:t>Approximately 6-11 ms observed</w:t>
             </w:r>
           </w:p>
         </w:tc>
@@ -7088,26 +7238,16 @@
             </w:tcMar>
           </w:tcPr>
           <w:p>
-            <w:pPr>
-              <w:spacing w:before="0" w:after="0"/>
-              <w:jc w:val="left"/>
-            </w:pPr>
-            <w:r>
-              <w:rPr>
-                <w:sz w:val="17"/>
-              </w:rPr>
-            </w:r>
-            <w:r>
-              <w:rPr>
-                <w:b w:val="0"/>
-                <w:sz w:val="17"/>
-              </w:rPr>
+            <w:r>
               <w:t>RadarDisplayQt5</w:t>
             </w:r>
           </w:p>
         </w:tc>
       </w:tr>
       <w:tr>
+        <w:trPr>
+          <w:cantSplit/>
+        </w:trPr>
         <w:tc>
           <w:tcPr>
             <w:tcW w:type="dxa" w:w="2600"/>
@@ -7200,6 +7340,9 @@
         </w:tc>
       </w:tr>
       <w:tr>
+        <w:trPr>
+          <w:cantSplit/>
+        </w:trPr>
         <w:tc>
           <w:tcPr>
             <w:tcW w:type="dxa" w:w="2600"/>
@@ -7212,20 +7355,7 @@
             </w:tcMar>
           </w:tcPr>
           <w:p>
-            <w:pPr>
-              <w:spacing w:before="0" w:after="0"/>
-              <w:jc w:val="left"/>
-            </w:pPr>
-            <w:r>
-              <w:rPr>
-                <w:sz w:val="17"/>
-              </w:rPr>
-            </w:r>
-            <w:r>
-              <w:rPr>
-                <w:b w:val="0"/>
-                <w:sz w:val="17"/>
-              </w:rPr>
+            <w:r>
               <w:t>Operator PRF range</w:t>
             </w:r>
           </w:p>
@@ -7242,21 +7372,8 @@
             </w:tcMar>
           </w:tcPr>
           <w:p>
-            <w:pPr>
-              <w:spacing w:before="0" w:after="0"/>
-              <w:jc w:val="left"/>
-            </w:pPr>
-            <w:r>
-              <w:rPr>
-                <w:sz w:val="17"/>
-              </w:rPr>
-            </w:r>
-            <w:r>
-              <w:rPr>
-                <w:b w:val="0"/>
-                <w:sz w:val="17"/>
-              </w:rPr>
-              <w:t>1-4 kHz; 2 kHz default</w:t>
+            <w:r>
+              <w:t>1-4 kHz physical; 4 kHz Golay default</w:t>
             </w:r>
           </w:p>
         </w:tc>
@@ -7272,26 +7389,16 @@
             </w:tcMar>
           </w:tcPr>
           <w:p>
-            <w:pPr>
-              <w:spacing w:before="0" w:after="0"/>
-              <w:jc w:val="left"/>
-            </w:pPr>
-            <w:r>
-              <w:rPr>
-                <w:sz w:val="17"/>
-              </w:rPr>
-            </w:r>
-            <w:r>
-              <w:rPr>
-                <w:b w:val="0"/>
-                <w:sz w:val="17"/>
-              </w:rPr>
+            <w:r>
               <w:t>Operator UI / RadarExecutor</w:t>
             </w:r>
           </w:p>
         </w:tc>
       </w:tr>
       <w:tr>
+        <w:trPr>
+          <w:cantSplit/>
+        </w:trPr>
         <w:tc>
           <w:tcPr>
             <w:tcW w:type="dxa" w:w="2600"/>
@@ -7304,20 +7411,7 @@
             </w:tcMar>
           </w:tcPr>
           <w:p>
-            <w:pPr>
-              <w:spacing w:before="0" w:after="0"/>
-              <w:jc w:val="left"/>
-            </w:pPr>
-            <w:r>
-              <w:rPr>
-                <w:sz w:val="17"/>
-              </w:rPr>
-            </w:r>
-            <w:r>
-              <w:rPr>
-                <w:b w:val="0"/>
-                <w:sz w:val="17"/>
-              </w:rPr>
+            <w:r>
               <w:t>Receiver recovery and guards</w:t>
             </w:r>
           </w:p>
@@ -7334,14 +7428,8 @@
             </w:tcMar>
           </w:tcPr>
           <w:p>
-            <w:pPr>
-              <w:spacing w:before="0" w:after="0"/>
-            </w:pPr>
-            <w:r>
-              <w:rPr>
-                <w:sz w:val="17"/>
-              </w:rPr>
-              <w:t>B200mini ATR: 1 us both-low guard measured; approximately 100 ns edge rise; TRM/receiver recovery not yet verified</w:t>
+            <w:r>
+              <w:t>Golay: 3.4 us TX ATR, 4.4 us RX start, 4,043 samples; TRM/receiver recovery remains unverified</w:t>
             </w:r>
           </w:p>
         </w:tc>
@@ -7357,21 +7445,78 @@
             </w:tcMar>
           </w:tcPr>
           <w:p>
-            <w:pPr>
-              <w:spacing w:before="0" w:after="0"/>
-              <w:jc w:val="left"/>
-            </w:pPr>
-            <w:r>
-              <w:rPr>
-                <w:sz w:val="17"/>
-              </w:rPr>
-            </w:r>
-            <w:r>
-              <w:rPr>
-                <w:b w:val="0"/>
-                <w:sz w:val="17"/>
-              </w:rPr>
-              <w:t>RF hardware verification</w:t>
+            <w:r>
+              <w:t>RadarTiming / RF verification</w:t>
+            </w:r>
+          </w:p>
+        </w:tc>
+      </w:tr>
+      <w:tr>
+        <w:trPr>
+          <w:cantSplit/>
+        </w:trPr>
+        <w:tc>
+          <w:tcPr>
+            <w:tcW w:type="dxa" w:w="2600"/>
+          </w:tcPr>
+          <w:p>
+            <w:r>
+              <w:t>Golay slow-time timing</w:t>
+            </w:r>
+          </w:p>
+        </w:tc>
+        <w:tc>
+          <w:tcPr>
+            <w:tcW w:type="dxa" w:w="4700"/>
+          </w:tcPr>
+          <w:p>
+            <w:r>
+              <w:t>32 pairs at 2 kHz effective pair rate; 500 us pair spacing</w:t>
+            </w:r>
+          </w:p>
+        </w:tc>
+        <w:tc>
+          <w:tcPr>
+            <w:tcW w:type="dxa" w:w="2780"/>
+          </w:tcPr>
+          <w:p>
+            <w:r>
+              <w:t>RadarProcessor</w:t>
+            </w:r>
+          </w:p>
+        </w:tc>
+      </w:tr>
+      <w:tr>
+        <w:trPr>
+          <w:cantSplit/>
+        </w:trPr>
+        <w:tc>
+          <w:tcPr>
+            <w:tcW w:type="dxa" w:w="2600"/>
+          </w:tcPr>
+          <w:p>
+            <w:r>
+              <w:t>Antenna motion</w:t>
+            </w:r>
+          </w:p>
+        </w:tc>
+        <w:tc>
+          <w:tcPr>
+            <w:tcW w:type="dxa" w:w="4700"/>
+          </w:tcPr>
+          <w:p>
+            <w:r>
+              <w:t>20 deg/s; 0.32 deg per 16 ms CPI; approximately 2 deg per 100 ms dwell</w:t>
+            </w:r>
+          </w:p>
+        </w:tc>
+        <w:tc>
+          <w:tcPr>
+            <w:tcW w:type="dxa" w:w="2780"/>
+          </w:tcPr>
+          <w:p>
+            <w:r>
+              <w:t>PointingManager / X6-60</w:t>
             </w:r>
           </w:p>
         </w:tc>
@@ -7388,7 +7533,7 @@
     <w:p>
       <w:pPr/>
       <w:r>
-        <w:t>The configured operational profile and the hardware stress test use the same fixed 40 MS/s sample rate, 4,043 receive samples per pulse, depth-20 bounded paired queue and 5 ms command lead. The stress test exercises the maximum selectable PRF and a longer 128-pulse CPI; the main scheduler's 100 ms cadence is not part of the standalone harness.</w:t>
+        <w:t>The configured Golay profile and hardware stress test use the same fixed 40 MS/s sample rate, 4,043 receive samples per physical pulse, depth-20 bounded paired queue and 5 ms command lead. The operational profile uses 4 kHz/64 pulses/16 ms; the stress test uses 4 kHz/128 pulses/32 ms. The main scheduler's 100 ms cadence is not part of the standalone stress harness.</w:t>
       </w:r>
     </w:p>
     <w:tbl>
@@ -7406,6 +7551,7 @@
       <w:tr>
         <w:trPr>
           <w:tblHeader w:val="true"/>
+          <w:cantSplit/>
         </w:trPr>
         <w:tc>
           <w:tcPr>
@@ -7484,6 +7630,123 @@
         </w:tc>
       </w:tr>
       <w:tr>
+        <w:trPr>
+          <w:cantSplit/>
+        </w:trPr>
+        <w:tc>
+          <w:tcPr>
+            <w:tcW w:type="dxa" w:w="2300"/>
+            <w:vAlign w:val="center"/>
+          </w:tcPr>
+          <w:p>
+            <w:r>
+              <w:t>PRF / PRI</w:t>
+            </w:r>
+          </w:p>
+        </w:tc>
+        <w:tc>
+          <w:tcPr>
+            <w:tcW w:type="dxa" w:w="3600"/>
+            <w:vAlign w:val="center"/>
+          </w:tcPr>
+          <w:p>
+            <w:r>
+              <w:t>4 kHz / 250 us physical</w:t>
+            </w:r>
+          </w:p>
+        </w:tc>
+        <w:tc>
+          <w:tcPr>
+            <w:tcW w:type="dxa" w:w="4180"/>
+            <w:vAlign w:val="center"/>
+          </w:tcPr>
+          <w:p>
+            <w:r>
+              <w:t>4 kHz / 250 us</w:t>
+            </w:r>
+          </w:p>
+        </w:tc>
+      </w:tr>
+      <w:tr>
+        <w:trPr>
+          <w:cantSplit/>
+        </w:trPr>
+        <w:tc>
+          <w:tcPr>
+            <w:tcW w:type="dxa" w:w="2300"/>
+            <w:vAlign w:val="center"/>
+          </w:tcPr>
+          <w:p>
+            <w:r>
+              <w:t>Pulses per CPI</w:t>
+            </w:r>
+          </w:p>
+        </w:tc>
+        <w:tc>
+          <w:tcPr>
+            <w:tcW w:type="dxa" w:w="3600"/>
+            <w:vAlign w:val="center"/>
+          </w:tcPr>
+          <w:p>
+            <w:r>
+              <w:t>64 physical A/B; 32 pairs</w:t>
+            </w:r>
+          </w:p>
+        </w:tc>
+        <w:tc>
+          <w:tcPr>
+            <w:tcW w:type="dxa" w:w="4180"/>
+            <w:vAlign w:val="center"/>
+          </w:tcPr>
+          <w:p>
+            <w:r>
+              <w:t>128</w:t>
+            </w:r>
+          </w:p>
+        </w:tc>
+      </w:tr>
+      <w:tr>
+        <w:trPr>
+          <w:cantSplit/>
+        </w:trPr>
+        <w:tc>
+          <w:tcPr>
+            <w:tcW w:type="dxa" w:w="2300"/>
+            <w:vAlign w:val="center"/>
+          </w:tcPr>
+          <w:p>
+            <w:r>
+              <w:t>Nominal CPI duration</w:t>
+            </w:r>
+          </w:p>
+        </w:tc>
+        <w:tc>
+          <w:tcPr>
+            <w:tcW w:type="dxa" w:w="3600"/>
+            <w:vAlign w:val="center"/>
+          </w:tcPr>
+          <w:p>
+            <w:r>
+              <w:t>16.000 ms</w:t>
+            </w:r>
+          </w:p>
+        </w:tc>
+        <w:tc>
+          <w:tcPr>
+            <w:tcW w:type="dxa" w:w="4180"/>
+            <w:vAlign w:val="center"/>
+          </w:tcPr>
+          <w:p>
+            <w:r>
+              <w:t>32.000 ms</w:t>
+            </w:r>
+          </w:p>
+        </w:tc>
+      </w:tr>
+      <w:tr>
+        <w:trPr>
+          <w:cantSplit/>
+        </w:trPr>
         <w:tc>
           <w:tcPr>
             <w:tcW w:type="dxa" w:w="2300"/>
@@ -7498,7 +7761,7 @@
               <w:rPr>
                 <w:b w:val="0"/>
               </w:rPr>
-              <w:t>PRF / PRI</w:t>
+              <w:t>Command lead</w:t>
             </w:r>
           </w:p>
         </w:tc>
@@ -7516,7 +7779,7 @@
               <w:rPr>
                 <w:b w:val="0"/>
               </w:rPr>
-              <w:t>2 kHz / 500 us</w:t>
+              <w:t>5.000 ms</w:t>
             </w:r>
           </w:p>
         </w:tc>
@@ -7534,12 +7797,53 @@
               <w:rPr>
                 <w:b w:val="0"/>
               </w:rPr>
-              <w:t>4 kHz / 250 us</w:t>
+              <w:t>5.000 ms</w:t>
             </w:r>
           </w:p>
         </w:tc>
       </w:tr>
       <w:tr>
+        <w:trPr>
+          <w:cantSplit/>
+        </w:trPr>
+        <w:tc>
+          <w:tcPr>
+            <w:tcW w:type="dxa" w:w="2300"/>
+            <w:vAlign w:val="center"/>
+          </w:tcPr>
+          <w:p>
+            <w:r>
+              <w:t>Queue depth / horizon</w:t>
+            </w:r>
+          </w:p>
+        </w:tc>
+        <w:tc>
+          <w:tcPr>
+            <w:tcW w:type="dxa" w:w="3600"/>
+            <w:vAlign w:val="center"/>
+          </w:tcPr>
+          <w:p>
+            <w:r>
+              <w:t>20 / 5.000 ms</w:t>
+            </w:r>
+          </w:p>
+        </w:tc>
+        <w:tc>
+          <w:tcPr>
+            <w:tcW w:type="dxa" w:w="4180"/>
+            <w:vAlign w:val="center"/>
+          </w:tcPr>
+          <w:p>
+            <w:r>
+              <w:t>20 / 5.000 ms</w:t>
+            </w:r>
+          </w:p>
+        </w:tc>
+      </w:tr>
+      <w:tr>
+        <w:trPr>
+          <w:cantSplit/>
+        </w:trPr>
         <w:tc>
           <w:tcPr>
             <w:tcW w:type="dxa" w:w="2300"/>
@@ -7554,7 +7858,7 @@
               <w:rPr>
                 <w:b w:val="0"/>
               </w:rPr>
-              <w:t>Pulses per CPI</w:t>
+              <w:t>RX samples</w:t>
             </w:r>
           </w:p>
         </w:tc>
@@ -7572,7 +7876,7 @@
               <w:rPr>
                 <w:b w:val="0"/>
               </w:rPr>
-              <w:t>32</w:t>
+              <w:t>4,043 per pulse</w:t>
             </w:r>
           </w:p>
         </w:tc>
@@ -7590,12 +7894,53 @@
               <w:rPr>
                 <w:b w:val="0"/>
               </w:rPr>
-              <w:t>128</w:t>
+              <w:t>4,043 per pulse; 517,504 total</w:t>
             </w:r>
           </w:p>
         </w:tc>
       </w:tr>
       <w:tr>
+        <w:trPr>
+          <w:cantSplit/>
+        </w:trPr>
+        <w:tc>
+          <w:tcPr>
+            <w:tcW w:type="dxa" w:w="2300"/>
+            <w:vAlign w:val="center"/>
+          </w:tcPr>
+          <w:p>
+            <w:r>
+              <w:t>Source execution wall time</w:t>
+            </w:r>
+          </w:p>
+        </w:tc>
+        <w:tc>
+          <w:tcPr>
+            <w:tcW w:type="dxa" w:w="3600"/>
+            <w:vAlign w:val="center"/>
+          </w:tcPr>
+          <w:p>
+            <w:r>
+              <w:t>21.6-23.3 ms measured</w:t>
+            </w:r>
+          </w:p>
+        </w:tc>
+        <w:tc>
+          <w:tcPr>
+            <w:tcW w:type="dxa" w:w="4180"/>
+            <w:vAlign w:val="center"/>
+          </w:tcPr>
+          <w:p>
+            <w:r>
+              <w:t>36.963-37.016 ms measured</w:t>
+            </w:r>
+          </w:p>
+        </w:tc>
+      </w:tr>
+      <w:tr>
+        <w:trPr>
+          <w:cantSplit/>
+        </w:trPr>
         <w:tc>
           <w:tcPr>
             <w:tcW w:type="dxa" w:w="2300"/>
@@ -7610,7 +7955,7 @@
               <w:rPr>
                 <w:b w:val="0"/>
               </w:rPr>
-              <w:t>Nominal CPI duration</w:t>
+              <w:t>Scheduler/CPI-grid cadence</w:t>
             </w:r>
           </w:p>
         </w:tc>
@@ -7628,7 +7973,7 @@
               <w:rPr>
                 <w:b w:val="0"/>
               </w:rPr>
-              <w:t>16.000 ms</w:t>
+              <w:t>100 ms nominal; approximately 10 Hz</w:t>
             </w:r>
           </w:p>
         </w:tc>
@@ -7646,27 +7991,23 @@
               <w:rPr>
                 <w:b w:val="0"/>
               </w:rPr>
-              <w:t>32.000 ms</w:t>
+              <w:t>Not applied by standalone harness</w:t>
             </w:r>
           </w:p>
         </w:tc>
       </w:tr>
       <w:tr>
+        <w:trPr>
+          <w:cantSplit/>
+        </w:trPr>
         <w:tc>
           <w:tcPr>
             <w:tcW w:type="dxa" w:w="2300"/>
             <w:vAlign w:val="center"/>
           </w:tcPr>
           <w:p>
-            <w:pPr>
-              <w:jc w:val="left"/>
-            </w:pPr>
-            <w:r/>
-            <w:r>
-              <w:rPr>
-                <w:b w:val="0"/>
-              </w:rPr>
-              <w:t>Command lead</w:t>
+            <w:r>
+              <w:t>Verification result</w:t>
             </w:r>
           </w:p>
         </w:tc>
@@ -7676,15 +8017,8 @@
             <w:vAlign w:val="center"/>
           </w:tcPr>
           <w:p>
-            <w:pPr>
-              <w:jc w:val="left"/>
-            </w:pPr>
-            <w:r/>
-            <w:r>
-              <w:rPr>
-                <w:b w:val="0"/>
-              </w:rPr>
-              <w:t>5.000 ms</w:t>
+            <w:r>
+              <w:t>Operational Golay timing and receive-only application runs complete</w:t>
             </w:r>
           </w:p>
         </w:tc>
@@ -7694,295 +8028,8 @@
             <w:vAlign w:val="center"/>
           </w:tcPr>
           <w:p>
-            <w:pPr>
-              <w:jc w:val="left"/>
-            </w:pPr>
-            <w:r/>
-            <w:r>
-              <w:rPr>
-                <w:b w:val="0"/>
-              </w:rPr>
-              <w:t>5.000 ms</w:t>
-            </w:r>
-          </w:p>
-        </w:tc>
-      </w:tr>
-      <w:tr>
-        <w:tc>
-          <w:tcPr>
-            <w:tcW w:type="dxa" w:w="2300"/>
-            <w:vAlign w:val="center"/>
-          </w:tcPr>
-          <w:p>
-            <w:pPr>
-              <w:jc w:val="left"/>
-            </w:pPr>
-            <w:r/>
-            <w:r>
-              <w:rPr>
-                <w:b w:val="0"/>
-              </w:rPr>
-              <w:t>Queue depth / horizon</w:t>
-            </w:r>
-          </w:p>
-        </w:tc>
-        <w:tc>
-          <w:tcPr>
-            <w:tcW w:type="dxa" w:w="3600"/>
-            <w:vAlign w:val="center"/>
-          </w:tcPr>
-          <w:p>
-            <w:pPr>
-              <w:jc w:val="left"/>
-            </w:pPr>
-            <w:r/>
-            <w:r>
-              <w:rPr>
-                <w:b w:val="0"/>
-              </w:rPr>
-              <w:t>20 / 10.000 ms</w:t>
-            </w:r>
-          </w:p>
-        </w:tc>
-        <w:tc>
-          <w:tcPr>
-            <w:tcW w:type="dxa" w:w="4180"/>
-            <w:vAlign w:val="center"/>
-          </w:tcPr>
-          <w:p>
-            <w:pPr>
-              <w:jc w:val="left"/>
-            </w:pPr>
-            <w:r/>
-            <w:r>
-              <w:rPr>
-                <w:b w:val="0"/>
-              </w:rPr>
-              <w:t>20 / 5.000 ms</w:t>
-            </w:r>
-          </w:p>
-        </w:tc>
-      </w:tr>
-      <w:tr>
-        <w:tc>
-          <w:tcPr>
-            <w:tcW w:type="dxa" w:w="2300"/>
-            <w:vAlign w:val="center"/>
-          </w:tcPr>
-          <w:p>
-            <w:pPr>
-              <w:jc w:val="left"/>
-            </w:pPr>
-            <w:r/>
-            <w:r>
-              <w:rPr>
-                <w:b w:val="0"/>
-              </w:rPr>
-              <w:t>RX samples</w:t>
-            </w:r>
-          </w:p>
-        </w:tc>
-        <w:tc>
-          <w:tcPr>
-            <w:tcW w:type="dxa" w:w="3600"/>
-            <w:vAlign w:val="center"/>
-          </w:tcPr>
-          <w:p>
-            <w:pPr>
-              <w:jc w:val="left"/>
-            </w:pPr>
-            <w:r/>
-            <w:r>
-              <w:rPr>
-                <w:b w:val="0"/>
-              </w:rPr>
-              <w:t>4,043 per pulse</w:t>
-            </w:r>
-          </w:p>
-        </w:tc>
-        <w:tc>
-          <w:tcPr>
-            <w:tcW w:type="dxa" w:w="4180"/>
-            <w:vAlign w:val="center"/>
-          </w:tcPr>
-          <w:p>
-            <w:pPr>
-              <w:jc w:val="left"/>
-            </w:pPr>
-            <w:r/>
-            <w:r>
-              <w:rPr>
-                <w:b w:val="0"/>
-              </w:rPr>
-              <w:t>4,043 per pulse; 517,504 total</w:t>
-            </w:r>
-          </w:p>
-        </w:tc>
-      </w:tr>
-      <w:tr>
-        <w:tc>
-          <w:tcPr>
-            <w:tcW w:type="dxa" w:w="2300"/>
-            <w:vAlign w:val="center"/>
-          </w:tcPr>
-          <w:p>
-            <w:pPr>
-              <w:jc w:val="left"/>
-            </w:pPr>
-            <w:r/>
-            <w:r>
-              <w:rPr>
-                <w:b w:val="0"/>
-              </w:rPr>
-              <w:t>Source execution wall time</w:t>
-            </w:r>
-          </w:p>
-        </w:tc>
-        <w:tc>
-          <w:tcPr>
-            <w:tcW w:type="dxa" w:w="3600"/>
-            <w:vAlign w:val="center"/>
-          </w:tcPr>
-          <w:p>
-            <w:pPr>
-              <w:jc w:val="left"/>
-            </w:pPr>
-            <w:r/>
-            <w:r>
-              <w:rPr>
-                <w:b w:val="0"/>
-              </w:rPr>
-              <w:t>Approximately 21 ms expected</w:t>
-            </w:r>
-          </w:p>
-        </w:tc>
-        <w:tc>
-          <w:tcPr>
-            <w:tcW w:type="dxa" w:w="4180"/>
-            <w:vAlign w:val="center"/>
-          </w:tcPr>
-          <w:p>
-            <w:pPr>
-              <w:jc w:val="left"/>
-            </w:pPr>
-            <w:r/>
-            <w:r>
-              <w:rPr>
-                <w:b w:val="0"/>
-              </w:rPr>
-              <w:t>36.963-37.016 ms measured</w:t>
-            </w:r>
-          </w:p>
-        </w:tc>
-      </w:tr>
-      <w:tr>
-        <w:tc>
-          <w:tcPr>
-            <w:tcW w:type="dxa" w:w="2300"/>
-            <w:vAlign w:val="center"/>
-          </w:tcPr>
-          <w:p>
-            <w:pPr>
-              <w:jc w:val="left"/>
-            </w:pPr>
-            <w:r/>
-            <w:r>
-              <w:rPr>
-                <w:b w:val="0"/>
-              </w:rPr>
-              <w:t>Scheduler/CPI-grid cadence</w:t>
-            </w:r>
-          </w:p>
-        </w:tc>
-        <w:tc>
-          <w:tcPr>
-            <w:tcW w:type="dxa" w:w="3600"/>
-            <w:vAlign w:val="center"/>
-          </w:tcPr>
-          <w:p>
-            <w:pPr>
-              <w:jc w:val="left"/>
-            </w:pPr>
-            <w:r/>
-            <w:r>
-              <w:rPr>
-                <w:b w:val="0"/>
-              </w:rPr>
-              <w:t>100 ms nominal; approximately 10 Hz</w:t>
-            </w:r>
-          </w:p>
-        </w:tc>
-        <w:tc>
-          <w:tcPr>
-            <w:tcW w:type="dxa" w:w="4180"/>
-            <w:vAlign w:val="center"/>
-          </w:tcPr>
-          <w:p>
-            <w:pPr>
-              <w:jc w:val="left"/>
-            </w:pPr>
-            <w:r/>
-            <w:r>
-              <w:rPr>
-                <w:b w:val="0"/>
-              </w:rPr>
-              <w:t>Not applied by standalone harness</w:t>
-            </w:r>
-          </w:p>
-        </w:tc>
-      </w:tr>
-      <w:tr>
-        <w:tc>
-          <w:tcPr>
-            <w:tcW w:type="dxa" w:w="2300"/>
-            <w:vAlign w:val="center"/>
-          </w:tcPr>
-          <w:p>
-            <w:pPr>
-              <w:jc w:val="left"/>
-            </w:pPr>
-            <w:r/>
-            <w:r>
-              <w:rPr>
-                <w:b w:val="0"/>
-              </w:rPr>
-              <w:t>Verification result</w:t>
-            </w:r>
-          </w:p>
-        </w:tc>
-        <w:tc>
-          <w:tcPr>
-            <w:tcW w:type="dxa" w:w="3600"/>
-            <w:vAlign w:val="center"/>
-          </w:tcPr>
-          <w:p>
-            <w:pPr>
-              <w:jc w:val="left"/>
-            </w:pPr>
-            <w:r/>
-            <w:r>
-              <w:rPr>
-                <w:b w:val="0"/>
-              </w:rPr>
-              <w:t>Operational baseline setting</w:t>
-            </w:r>
-          </w:p>
-        </w:tc>
-        <w:tc>
-          <w:tcPr>
-            <w:tcW w:type="dxa" w:w="4180"/>
-            <w:vAlign w:val="center"/>
-          </w:tcPr>
-          <w:p>
-            <w:pPr>
-              <w:jc w:val="left"/>
-            </w:pPr>
-            <w:r/>
-            <w:r>
-              <w:rPr>
-                <w:b w:val="0"/>
-              </w:rPr>
-              <w:t>10/10 dwells passed; 128/128 TX sends and ACKs per dwell; complete RX samples; no reported transport faults</w:t>
+            <w:r>
+              <w:t>10/10 dwells passed; complete TX sends/ACKs and RX samples; no reported transport faults</w:t>
             </w:r>
           </w:p>
         </w:tc>
@@ -7993,7 +8040,7 @@
         <w:spacing w:before="120"/>
       </w:pPr>
       <w:r>
-        <w:t>The stress test used a protected TX/RX-to-RX2 cable loopback with 30 dB attenuation, 0 dB TX gain and 10 dB RX gain. ATR, TRM and PA were disabled. The result validates the 5 ms command lead and bounded timed-pair transport at the tested load; it does not constitute ATR non-overlap or integrated TRM/PA verification. Exact SDR CPI-grid spacing is obtained from consecutive ScheduledPriHardwareTimesSec[0] values in RawDwellData diagnostics.</w:t>
+        <w:t>The protected TX/RX-to-RX2 cable tests use 30 dB external attenuation and explicit guarded RF confirmations. The 5 ms lead and depth-20 transport passed the 4 kHz/128-pulse load. ATR, TRM and PA state depends on the selected guarded profile and is printed at startup; no result authorises connection of the TRM or 50 W PA. Exact SDR CPI-grid spacing is obtained from consecutive ScheduledPriHardwareTimesSec[0] diagnostics.</w:t>
       </w:r>
     </w:p>
     <w:p>
@@ -8007,7 +8054,7 @@
     </w:p>
     <w:p>
       <w:r>
-        <w:t>On 20 July 2026 the B200mini serial 34A0320 ATR outputs were measured with the TRM and PA physically disconnected. J6 pin 3 / GPIO_1 was the active-high TX output and J6 pin 4 / GPIO_2 was the active-high RX output. The CRO-only harness used the fixed 40 MS/s clock, 2 kHz PRF, 32 pulses per CPI, depth-20 bounded timed-pair queue, 5 ms command lead and 100 ms dwell cadence. The photographs below record the timing before the subsequently accepted 200 ns leading-zero pre-roll.</w:t>
+        <w:t>On 20 July 2026 the B200mini serial 34A0320 ATR outputs were measured with the TRM and PA physically disconnected. J6 pin 3/GPIO_1 was active-high TX and J6 pin 4/GPIO_2 was active-high RX. The CRO-only harness used 40 MS/s, 2 kHz, 32 Frank10_20MHz pulses, depth-20 queue, 5 ms lead and 100 ms dwell cadence. These photographs remain evidence for polarity, idle state, edge rise and non-overlap; the shorter Golay envelope is derived and separately exercised by the timed operational code.</w:t>
       </w:r>
     </w:p>
     <w:tbl>
@@ -8024,6 +8071,7 @@
       <w:tr>
         <w:trPr>
           <w:tblHeader/>
+          <w:cantSplit/>
         </w:trPr>
         <w:tc>
           <w:tcPr>
@@ -8099,6 +8147,9 @@
         </w:tc>
       </w:tr>
       <w:tr>
+        <w:trPr>
+          <w:cantSplit/>
+        </w:trPr>
         <w:tc>
           <w:tcPr>
             <w:tcW w:type="dxa" w:w="1944"/>
@@ -8170,6 +8221,9 @@
         </w:tc>
       </w:tr>
       <w:tr>
+        <w:trPr>
+          <w:cantSplit/>
+        </w:trPr>
         <w:tc>
           <w:tcPr>
             <w:tcW w:type="dxa" w:w="1944"/>
@@ -8241,6 +8295,9 @@
         </w:tc>
       </w:tr>
       <w:tr>
+        <w:trPr>
+          <w:cantSplit/>
+        </w:trPr>
         <w:tc>
           <w:tcPr>
             <w:tcW w:type="dxa" w:w="1944"/>
@@ -8312,6 +8369,9 @@
         </w:tc>
       </w:tr>
       <w:tr>
+        <w:trPr>
+          <w:cantSplit/>
+        </w:trPr>
         <w:tc>
           <w:tcPr>
             <w:tcW w:type="dxa" w:w="1944"/>
@@ -8383,6 +8443,9 @@
         </w:tc>
       </w:tr>
       <w:tr>
+        <w:trPr>
+          <w:cantSplit/>
+        </w:trPr>
         <w:tc>
           <w:tcPr>
             <w:tcW w:type="dxa" w:w="1944"/>
@@ -8454,6 +8517,9 @@
         </w:tc>
       </w:tr>
       <w:tr>
+        <w:trPr>
+          <w:cantSplit/>
+        </w:trPr>
         <w:tc>
           <w:tcPr>
             <w:tcW w:type="dxa" w:w="1944"/>
@@ -8648,7 +8714,21 @@
     </w:p>
     <w:p>
       <w:r>
-        <w:t>Architecture disposition. The approximately 100 ns output-edge rise time is accommodated by an 8-sample/200 ns zero-valued prefix in the timed-transmit transport envelope. The 200-sample Frank10_20MHz code and matched-filter reference remain unchanged. Nominal TX ATR duration therefore becomes 5.2 us and RX start moves to 6.2 us, preserving the measured 1 us both-low guard. The first non-zero sample remains the RF and range time origin.</w:t>
+        <w:t>Architecture disposition. The approximately 100 ns output-edge rise time is accommodated by an 8-sample/200 ns zero-valued prefix in the timed-TX transport envelope. For Frank10_20MHz this gives 5.2 us TX ATR and 6.2 us RX start. For the operational Golay64 member it gives 3.4 us TX ATR and 4.4 us RX start. WaveformLibrary and matched-filter references exclude the padding; the first non-zero sample remains the RF and range time origin.</w:t>
+      </w:r>
+    </w:p>
+    <w:p>
+      <w:pPr>
+        <w:pStyle w:val="Heading2"/>
+      </w:pPr>
+      <w:r>
+        <w:t>14.7 Antenna motion within CPI and dwell cadence</w:t>
+      </w:r>
+    </w:p>
+    <w:p>
+      <w:pPr/>
+      <w:r>
+        <w:t>At the verified 20 deg/s scan rate, the X6-60 moves approximately 0.32 degrees during the 16 ms Golay CPI and approximately 2 degrees between 100 ms dwell starts. A 50 ms cadence would nominally give one degree per dwell, but recent end-to-end active-dwell measurements occasionally reach about 52 ms. Therefore 100 ms remains the verified baseline. A 50 ms setting shall be accepted only after sustained profiling demonstrates adequate worst-case margin and correct scheduler behaviour.</w:t>
       </w:r>
     </w:p>
     <w:p>
@@ -9103,6 +9183,51 @@
           </w:p>
         </w:tc>
       </w:tr>
+      <w:tr>
+        <w:trPr>
+          <w:cantSplit/>
+        </w:trPr>
+        <w:tc>
+          <w:tcPr>
+            <w:tcW w:type="dxa" w:w="2520"/>
+          </w:tcPr>
+          <w:p>
+            <w:r>
+              <w:t>X6-60 state</w:t>
+            </w:r>
+          </w:p>
+        </w:tc>
+        <w:tc>
+          <w:tcPr>
+            <w:tcW w:type="dxa" w:w="2520"/>
+          </w:tcPr>
+          <w:p>
+            <w:r>
+              <w:t>X660 controller</w:t>
+            </w:r>
+          </w:p>
+        </w:tc>
+        <w:tc>
+          <w:tcPr>
+            <w:tcW w:type="dxa" w:w="2520"/>
+          </w:tcPr>
+          <w:p>
+            <w:r>
+              <w:t>PointingManager, logger, display</w:t>
+            </w:r>
+          </w:p>
+        </w:tc>
+        <w:tc>
+          <w:tcPr>
+            <w:tcW w:type="dxa" w:w="2520"/>
+          </w:tcPr>
+          <w:p>
+            <w:r>
+              <w:t>Measured North-relative azimuth, raw angle, rate, validity and target state.</w:t>
+            </w:r>
+          </w:p>
+        </w:tc>
+      </w:tr>
     </w:tbl>
     <w:p>
       <w:pPr>
@@ -9333,6 +9458,20 @@
     <w:p>
       <w:r>
         <w:t>Shutdown shall stop active streaming, release the UHD streamer and device references, close pointing and TRM interfaces and permit the Qt application to terminate cleanly. Exceptions during shutdown shall be logged without preventing remaining resources from being released.</w:t>
+      </w:r>
+    </w:p>
+    <w:p>
+      <w:pPr>
+        <w:pStyle w:val="Heading2"/>
+      </w:pPr>
+      <w:r>
+        <w:t>16.4 X6-60 and SocketCAN faults</w:t>
+      </w:r>
+    </w:p>
+    <w:p>
+      <w:pPr/>
+      <w:r>
+        <w:t>The live X6-60 controller shall reject startup when can0 is absent, DOWN or not configured for 1 Mbit/s, when encoder telemetry is invalid, or when the required motion acknowledgements are absent. Startup failure shall not fall through into a simulated or limited-azimuth controller. Runtime CAN timeouts and malformed replies shall fail the current pointing action, preserve diagnostics and drive the system toward STOP/hold and clean bus release.</w:t>
       </w:r>
     </w:p>
     <w:p>
@@ -9400,7 +9539,7 @@
     </w:p>
     <w:p>
       <w:r>
-        <w:t>Major architectural behaviour is validated with SimulatedSource, SimulatedPTZController and SimulatedNavigationSource before hardware changes. Hardware implementations replace interfaces rather than reshape the architecture.</w:t>
+        <w:t>Major architectural behaviour is validated with SimulatedSource, the simulated X6-60 controller and SimulatedNavigationSource before hardware changes. Hardware implementations replace interfaces rather than reshape the architecture. Legacy class names containing PTZ may remain where needed for source compatibility.</w:t>
       </w:r>
     </w:p>
     <w:p>
@@ -9408,7 +9547,7 @@
         <w:pStyle w:val="Heading2"/>
       </w:pPr>
       <w:r>
-        <w:t>17.2 Completed hardware verification through Version 0.7f</w:t>
+        <w:t>17.2 Completed verification through Version 0.8</w:t>
       </w:r>
     </w:p>
     <w:p>
@@ -9416,7 +9555,7 @@
         <w:pStyle w:val="ListBullet"/>
       </w:pPr>
       <w:r>
-        <w:t>UHD Python bindings load under the selected non-Snap Python environment.</w:t>
+        <w:t>UHD Python bindings load under the selected non-Snap Python environment and the B200mini is detected over USB3.</w:t>
       </w:r>
     </w:p>
     <w:p>
@@ -9424,7 +9563,7 @@
         <w:pStyle w:val="ListBullet"/>
       </w:pPr>
       <w:r>
-        <w:t>Ettus B200mini is detected over USB3.</w:t>
+        <w:t>Depth-20 timed TX/RX stress execution passes 10/10 dwells at 4 kHz/128 pulses with complete send, acknowledgement and receive accounting.</w:t>
       </w:r>
     </w:p>
     <w:p>
@@ -9432,7 +9571,7 @@
         <w:pStyle w:val="ListBullet"/>
       </w:pPr>
       <w:r>
-        <w:t>Receive tuning and bounded finite per-PRI RX execution complete successfully through 4 kHz and 128 pulses.</w:t>
+        <w:t>Golay64_20MHz is implemented as strict A-then-B physical pulses with 64 pulses, 32 complementary outputs and post-combination Doppler processing.</w:t>
       </w:r>
     </w:p>
     <w:p>
@@ -9440,7 +9579,7 @@
         <w:pStyle w:val="ListBullet"/>
       </w:pPr>
       <w:r>
-        <w:t>Timed Frank10_20MHz transmission produces the expected 200-sample, 5 microsecond RF pulse.</w:t>
+        <w:t>Operational Golay timing is 4 kHz physical PRF, 250 us PRI, 64 pulses, 16 ms CPI, 3.4 us TX ATR envelope and 4.4 us RX start.</w:t>
       </w:r>
     </w:p>
     <w:p>
@@ -9448,7 +9587,7 @@
         <w:pStyle w:val="ListBullet"/>
       </w:pPr>
       <w:r>
-        <w:t>Protected combined loopback passes at 4 kHz, 128 pulses and paired depth 8 with 128/128 sends, acknowledgements and RX windows.</w:t>
+        <w:t>Protected loopback and one-shot Golay diagnostics confirm coherent A/B capture without clipping; measured gain/phase balance and combined sidelobes are retained as test evidence.</w:t>
       </w:r>
     </w:p>
     <w:p>
@@ -9456,7 +9595,7 @@
         <w:pStyle w:val="ListBullet"/>
       </w:pPr>
       <w:r>
-        <w:t>Matched filtering occurs after CPI collection and locks to the calibrated response on every pulse.</w:t>
+        <w:t>X6-60 absolute multi-turn telemetry, North calibration, clockwise-positive mapping, guarded motion commands, sector reversal, STARE/goto, nudging and clean shutdown have been exercised on hardware.</w:t>
       </w:r>
     </w:p>
     <w:p>
@@ -9464,7 +9603,7 @@
         <w:pStyle w:val="ListBullet"/>
       </w:pPr>
       <w:r>
-        <w:t>Scheduler cadence, simulated PTZ angle step, processing, display and clean shutdown remain stable.</w:t>
+        <w:t>The operational X6-60 adopts the current encoder pose without startup motion, scans at approximately 20 deg/s and advances approximately 2 degrees per verified 100 ms dwell.</w:t>
       </w:r>
     </w:p>
     <w:p>
@@ -9472,7 +9611,7 @@
         <w:pStyle w:val="Heading2"/>
       </w:pPr>
       <w:r>
-        <w:t>17.3 Remaining operational-path verification</w:t>
+        <w:t>17.3 Remaining integration and high-power verification</w:t>
       </w:r>
     </w:p>
     <w:p>
@@ -9480,7 +9619,7 @@
         <w:pStyle w:val="ListBullet"/>
       </w:pPr>
       <w:r>
-        <w:t>CRO-only B200mini ATR verification confirmed 2.00 kHz PRF, 500 us PRI, approximately 5 us TX high time and approximately 100 us RX high time.</w:t>
+        <w:t>Integrate the already proven guarded timed TX/RX loopback source with the live moving X6-60 in the full scheduler and verify displayed target bearing against measured encoder bearing.</w:t>
       </w:r>
     </w:p>
     <w:p>
@@ -9488,7 +9627,7 @@
         <w:pStyle w:val="ListBullet"/>
       </w:pPr>
       <w:r>
-        <w:t>CRO-only B200mini ATR verification confirmed a 1 us both-low TX-to-RX guard and approximately 100 ns GPIO edge rise time.</w:t>
+        <w:t>Measure the complete TRM switching, PA sequencing and receiver recovery path before connecting or enabling the 50 W RF chain.</w:t>
       </w:r>
     </w:p>
     <w:p>
@@ -9496,7 +9635,7 @@
         <w:pStyle w:val="ListBullet"/>
       </w:pPr>
       <w:r>
-        <w:t>Confirmation that the first pulse of each dwell follows the scheduler cadence without accumulated drift.</w:t>
+        <w:t>Verify first-pulse SDR timestamps against scheduler cadence over sustained runs and confirm no accumulated drift.</w:t>
       </w:r>
     </w:p>
     <w:p>
@@ -9504,7 +9643,7 @@
         <w:pStyle w:val="ListBullet"/>
       </w:pPr>
       <w:r>
-        <w:t>Verify the revised 5.2 us TX ATR envelope and 6.2 us RX start after adding the 200 ns pre-roll; then verify TRM switching, PA sequencing and receiver recovery before the 50 W path is connected.</w:t>
+        <w:t>Re-verify the active Golay 3.4 us TX ATR envelope and 4.4 us RX start on the CRO when preparing the external TRM integration stage.</w:t>
       </w:r>
     </w:p>
     <w:p>
@@ -9512,7 +9651,7 @@
         <w:pStyle w:val="ListBullet"/>
       </w:pPr>
       <w:r>
-        <w:t>Verification of range-axis offset when the receive window begins after transmit and receiver recovery.</w:t>
+        <w:t>Verify operational range calibration separately from the 629.6 m receive-start offset and the 166-sample protected cable-loopback delay.</w:t>
       </w:r>
     </w:p>
     <w:p>
@@ -10469,15 +10608,7 @@
             </w:tcMar>
           </w:tcPr>
           <w:p>
-            <w:pPr>
-              <w:spacing w:before="0" w:after="0" w:line="240" w:lineRule="auto"/>
-              <w:jc w:val="left"/>
-            </w:pPr>
-            <w:r>
-              <w:rPr>
-                <w:b w:val="0"/>
-                <w:sz w:val="17"/>
-              </w:rPr>
+            <w:r>
               <w:t>VX-PTZ-001</w:t>
             </w:r>
           </w:p>
@@ -10494,16 +10625,8 @@
             </w:tcMar>
           </w:tcPr>
           <w:p>
-            <w:pPr>
-              <w:spacing w:before="0" w:after="0" w:line="240" w:lineRule="auto"/>
-              <w:jc w:val="left"/>
-            </w:pPr>
-            <w:r>
-              <w:rPr>
-                <w:b w:val="0"/>
-                <w:sz w:val="17"/>
-              </w:rPr>
-              <w:t>Measured pointing shall be associated with every dwell.</w:t>
+            <w:r>
+              <w:t>Measured X6-60 pointing shall be associated with every dwell (legacy requirement identifier retained).</w:t>
             </w:r>
           </w:p>
         </w:tc>
@@ -10519,15 +10642,7 @@
             </w:tcMar>
           </w:tcPr>
           <w:p>
-            <w:pPr>
-              <w:spacing w:before="0" w:after="0" w:line="240" w:lineRule="auto"/>
-              <w:jc w:val="left"/>
-            </w:pPr>
-            <w:r>
-              <w:rPr>
-                <w:b w:val="0"/>
-                <w:sz w:val="17"/>
-              </w:rPr>
+            <w:r>
               <w:t>Sections 8, 15</w:t>
             </w:r>
           </w:p>
@@ -10544,15 +10659,7 @@
             </w:tcMar>
           </w:tcPr>
           <w:p>
-            <w:pPr>
-              <w:spacing w:before="0" w:after="0" w:line="240" w:lineRule="auto"/>
-              <w:jc w:val="left"/>
-            </w:pPr>
-            <w:r>
-              <w:rPr>
-                <w:b w:val="0"/>
-                <w:sz w:val="17"/>
-              </w:rPr>
+            <w:r>
               <w:t>PointingManager.py; RadarExecutor.py</w:t>
             </w:r>
           </w:p>
@@ -10569,16 +10676,8 @@
             </w:tcMar>
           </w:tcPr>
           <w:p>
-            <w:pPr>
-              <w:spacing w:before="0" w:after="0" w:line="240" w:lineRule="auto"/>
-              <w:jc w:val="left"/>
-            </w:pPr>
-            <w:r>
-              <w:rPr>
-                <w:b w:val="0"/>
-                <w:sz w:val="17"/>
-              </w:rPr>
-              <w:t>Metadata inspection</w:t>
+            <w:r>
+              <w:t>Metadata and hardware-run inspection</w:t>
             </w:r>
           </w:p>
         </w:tc>
@@ -10859,15 +10958,7 @@
             </w:tcMar>
           </w:tcPr>
           <w:p>
-            <w:pPr>
-              <w:spacing w:before="0" w:after="0" w:line="240" w:lineRule="auto"/>
-              <w:jc w:val="left"/>
-            </w:pPr>
-            <w:r>
-              <w:rPr>
-                <w:b w:val="0"/>
-                <w:sz w:val="17"/>
-              </w:rPr>
+            <w:r>
               <w:t>VX-VER-001</w:t>
             </w:r>
           </w:p>
@@ -10884,13 +10975,7 @@
             </w:tcMar>
           </w:tcPr>
           <w:p>
-            <w:pPr>
-              <w:spacing w:before="0" w:after="0"/>
-            </w:pPr>
-            <w:r>
-              <w:rPr>
-                <w:sz w:val="17"/>
-              </w:rPr>
+            <w:r>
               <w:t>Timed TX and ATR non-overlap shall be scope-verified before connection to the high-power path.</w:t>
             </w:r>
           </w:p>
@@ -10907,13 +10992,7 @@
             </w:tcMar>
           </w:tcPr>
           <w:p>
-            <w:pPr>
-              <w:spacing w:before="0" w:after="0"/>
-            </w:pPr>
-            <w:r>
-              <w:rPr>
-                <w:sz w:val="17"/>
-              </w:rPr>
+            <w:r>
               <w:t>Sections 14.6 and 17.2</w:t>
             </w:r>
           </w:p>
@@ -10930,14 +11009,8 @@
             </w:tcMar>
           </w:tcPr>
           <w:p>
-            <w:pPr>
-              <w:spacing w:before="0" w:after="0"/>
-            </w:pPr>
-            <w:r>
-              <w:rPr>
-                <w:sz w:val="17"/>
-              </w:rPr>
-              <w:t>RunEttusAtrCroVerification.py; operational main remains ATR-disabled</w:t>
+            <w:r>
+              <w:t>Guarded ATR and operating-profile harnesses</w:t>
             </w:r>
           </w:p>
         </w:tc>
@@ -10953,14 +11026,8 @@
             </w:tcMar>
           </w:tcPr>
           <w:p>
-            <w:pPr>
-              <w:spacing w:before="0" w:after="0"/>
-            </w:pPr>
-            <w:r>
-              <w:rPr>
-                <w:sz w:val="17"/>
-              </w:rPr>
-              <w:t>CRO evidence complete with TRM/PA disconnected; controlled-shutdown and external hardware recovery remain staged checks</w:t>
+            <w:r>
+              <w:t>CRO evidence complete with TRM/PA disconnected; external receiver recovery remains staged</w:t>
             </w:r>
           </w:p>
         </w:tc>
@@ -11236,7 +11303,9 @@
         </w:tc>
       </w:tr>
       <w:tr>
-        <w:trPr/>
+        <w:trPr>
+          <w:cantSplit/>
+        </w:trPr>
         <w:tc>
           <w:tcPr>
             <w:tcW w:type="dxa" w:w="1250"/>
@@ -11380,15 +11449,7 @@
             </w:tcMar>
           </w:tcPr>
           <w:p>
-            <w:pPr>
-              <w:spacing w:before="0" w:after="0" w:line="240" w:lineRule="auto"/>
-              <w:jc w:val="left"/>
-            </w:pPr>
-            <w:r>
-              <w:rPr>
-                <w:b w:val="0"/>
-                <w:sz w:val="17"/>
-              </w:rPr>
+            <w:r>
               <w:t>VX-TIM-001</w:t>
             </w:r>
           </w:p>
@@ -11406,16 +11467,8 @@
             </w:tcMar>
           </w:tcPr>
           <w:p>
-            <w:pPr>
-              <w:spacing w:before="0" w:after="0" w:line="240" w:lineRule="auto"/>
-              <w:jc w:val="left"/>
-            </w:pPr>
-            <w:r>
-              <w:rPr>
-                <w:b w:val="0"/>
-                <w:sz w:val="17"/>
-              </w:rPr>
-              <w:t>The operator shall select PRF from 1-4 kHz and pulses per CPI; PRI and CPI duration shall be derived.</w:t>
+            <w:r>
+              <w:t>The operator shall select physical PRF from 1-4 kHz and pulses per CPI; PRI, pair timing and CPI duration shall be derived.</w:t>
             </w:r>
           </w:p>
         </w:tc>
@@ -11432,15 +11485,7 @@
             </w:tcMar>
           </w:tcPr>
           <w:p>
-            <w:pPr>
-              <w:spacing w:before="0" w:after="0" w:line="240" w:lineRule="auto"/>
-              <w:jc w:val="left"/>
-            </w:pPr>
-            <w:r>
-              <w:rPr>
-                <w:b w:val="0"/>
-                <w:sz w:val="17"/>
-              </w:rPr>
+            <w:r>
               <w:t>Section 14</w:t>
             </w:r>
           </w:p>
@@ -11458,15 +11503,7 @@
             </w:tcMar>
           </w:tcPr>
           <w:p>
-            <w:pPr>
-              <w:spacing w:before="0" w:after="0" w:line="240" w:lineRule="auto"/>
-              <w:jc w:val="left"/>
-            </w:pPr>
-            <w:r>
-              <w:rPr>
-                <w:b w:val="0"/>
-                <w:sz w:val="17"/>
-              </w:rPr>
+            <w:r>
               <w:t>RadarDisplayQt5.py; RadarExecutor.py</w:t>
             </w:r>
           </w:p>
@@ -11484,16 +11521,8 @@
             </w:tcMar>
           </w:tcPr>
           <w:p>
-            <w:pPr>
-              <w:spacing w:before="0" w:after="0" w:line="240" w:lineRule="auto"/>
-              <w:jc w:val="left"/>
-            </w:pPr>
-            <w:r>
-              <w:rPr>
-                <w:b w:val="0"/>
-                <w:sz w:val="17"/>
-              </w:rPr>
-              <w:t>UI and plan validation test</w:t>
+            <w:r>
+              <w:t>UI, plan and Golay timing tests</w:t>
             </w:r>
           </w:p>
         </w:tc>
@@ -11634,6 +11663,9 @@
         </w:tc>
       </w:tr>
       <w:tr>
+        <w:trPr>
+          <w:cantSplit/>
+        </w:trPr>
         <w:tc>
           <w:tcPr>
             <w:tcW w:type="dxa" w:w="1250"/>
@@ -11756,6 +11788,9 @@
         </w:tc>
       </w:tr>
       <w:tr>
+        <w:trPr>
+          <w:cantSplit/>
+        </w:trPr>
         <w:tc>
           <w:tcPr>
             <w:tcW w:type="dxa" w:w="1250"/>
@@ -11878,6 +11913,9 @@
         </w:tc>
       </w:tr>
       <w:tr>
+        <w:trPr>
+          <w:cantSplit/>
+        </w:trPr>
         <w:tc>
           <w:tcPr>
             <w:tcW w:type="dxa" w:w="1250"/>
@@ -11995,6 +12033,9 @@
         </w:tc>
       </w:tr>
       <w:tr>
+        <w:trPr>
+          <w:cantSplit/>
+        </w:trPr>
         <w:tc>
           <w:tcPr>
             <w:tcW w:type="dxa" w:w="1250"/>
@@ -12112,6 +12153,9 @@
         </w:tc>
       </w:tr>
       <w:tr>
+        <w:trPr>
+          <w:cantSplit/>
+        </w:trPr>
         <w:tc>
           <w:tcPr>
             <w:tcW w:type="dxa" w:w="1250"/>
@@ -12229,6 +12273,9 @@
         </w:tc>
       </w:tr>
       <w:tr>
+        <w:trPr>
+          <w:cantSplit/>
+        </w:trPr>
         <w:tc>
           <w:tcPr>
             <w:tcW w:type="dxa" w:w="1250"/>
@@ -12346,6 +12393,9 @@
         </w:tc>
       </w:tr>
       <w:tr>
+        <w:trPr>
+          <w:cantSplit/>
+        </w:trPr>
         <w:tc>
           <w:tcPr>
             <w:tcW w:type="dxa" w:w="1250"/>
@@ -12458,6 +12508,281 @@
                 <w:sz w:val="17"/>
               </w:rPr>
               <w:t>Waveform catalogue regression</w:t>
+            </w:r>
+          </w:p>
+        </w:tc>
+      </w:tr>
+      <w:tr>
+        <w:trPr>
+          <w:cantSplit/>
+        </w:trPr>
+        <w:tc>
+          <w:tcPr>
+            <w:tcW w:type="dxa" w:w="1250"/>
+          </w:tcPr>
+          <w:p>
+            <w:r>
+              <w:t>VX-WFM-005</w:t>
+            </w:r>
+          </w:p>
+        </w:tc>
+        <w:tc>
+          <w:tcPr>
+            <w:tcW w:type="dxa" w:w="2600"/>
+          </w:tcPr>
+          <w:p>
+            <w:r>
+              <w:t>Golay operation shall transmit strict A-then-B pairs, combine complementary matched-filter outputs before Doppler and reject invalid pair ordering.</w:t>
+            </w:r>
+          </w:p>
+        </w:tc>
+        <w:tc>
+          <w:tcPr>
+            <w:tcW w:type="dxa" w:w="1400"/>
+          </w:tcPr>
+          <w:p>
+            <w:r>
+              <w:t>Sections 10, 11, 14</w:t>
+            </w:r>
+          </w:p>
+        </w:tc>
+        <w:tc>
+          <w:tcPr>
+            <w:tcW w:type="dxa" w:w="2300"/>
+          </w:tcPr>
+          <w:p>
+            <w:r>
+              <w:t>WaveformLibrary.py; RadarPlans.py; RadarProcessor.py</w:t>
+            </w:r>
+          </w:p>
+        </w:tc>
+        <w:tc>
+          <w:tcPr>
+            <w:tcW w:type="dxa" w:w="2290"/>
+          </w:tcPr>
+          <w:p>
+            <w:r>
+              <w:t>TestGolayOperational.py</w:t>
+            </w:r>
+          </w:p>
+        </w:tc>
+      </w:tr>
+      <w:tr>
+        <w:trPr>
+          <w:cantSplit/>
+        </w:trPr>
+        <w:tc>
+          <w:tcPr>
+            <w:tcW w:type="dxa" w:w="1250"/>
+          </w:tcPr>
+          <w:p>
+            <w:r>
+              <w:t>VX-X660-001</w:t>
+            </w:r>
+          </w:p>
+        </w:tc>
+        <w:tc>
+          <w:tcPr>
+            <w:tcW w:type="dxa" w:w="2600"/>
+          </w:tcPr>
+          <w:p>
+            <w:r>
+              <w:t>Operational azimuth shall use calibrated absolute multi-turn X6-60 encoder feedback with North=0 degrees and clockwise-positive public bearings.</w:t>
+            </w:r>
+          </w:p>
+        </w:tc>
+        <w:tc>
+          <w:tcPr>
+            <w:tcW w:type="dxa" w:w="1400"/>
+          </w:tcPr>
+          <w:p>
+            <w:r>
+              <w:t>Sections 5, 8, 12</w:t>
+            </w:r>
+          </w:p>
+        </w:tc>
+        <w:tc>
+          <w:tcPr>
+            <w:tcW w:type="dxa" w:w="2300"/>
+          </w:tcPr>
+          <w:p>
+            <w:r>
+              <w:t>X660ReadOnlyController.py; X660OperationalController.py</w:t>
+            </w:r>
+          </w:p>
+        </w:tc>
+        <w:tc>
+          <w:tcPr>
+            <w:tcW w:type="dxa" w:w="2290"/>
+          </w:tcPr>
+          <w:p>
+            <w:r>
+              <w:t>Calibration and operational scan evidence</w:t>
+            </w:r>
+          </w:p>
+        </w:tc>
+      </w:tr>
+      <w:tr>
+        <w:trPr>
+          <w:cantSplit/>
+        </w:trPr>
+        <w:tc>
+          <w:tcPr>
+            <w:tcW w:type="dxa" w:w="1250"/>
+          </w:tcPr>
+          <w:p>
+            <w:r>
+              <w:t>VX-X660-002</w:t>
+            </w:r>
+          </w:p>
+        </w:tc>
+        <w:tc>
+          <w:tcPr>
+            <w:tcW w:type="dxa" w:w="2600"/>
+          </w:tcPr>
+          <w:p>
+            <w:r>
+              <w:t>Live X6-60 motion shall be opt-in, acknowledgement-gated, allow-listed and commanded only through PointingManager.</w:t>
+            </w:r>
+          </w:p>
+        </w:tc>
+        <w:tc>
+          <w:tcPr>
+            <w:tcW w:type="dxa" w:w="1400"/>
+          </w:tcPr>
+          <w:p>
+            <w:r>
+              <w:t>Sections 8.6, 12.4, 16.4</w:t>
+            </w:r>
+          </w:p>
+        </w:tc>
+        <w:tc>
+          <w:tcPr>
+            <w:tcW w:type="dxa" w:w="2300"/>
+          </w:tcPr>
+          <w:p>
+            <w:r>
+              <w:t>X660GuardedMotionTransport.py; PointingManager.py</w:t>
+            </w:r>
+          </w:p>
+        </w:tc>
+        <w:tc>
+          <w:tcPr>
+            <w:tcW w:type="dxa" w:w="2290"/>
+          </w:tcPr>
+          <w:p>
+            <w:r>
+              <w:t>Guarded transport and controller tests</w:t>
+            </w:r>
+          </w:p>
+        </w:tc>
+      </w:tr>
+      <w:tr>
+        <w:trPr>
+          <w:cantSplit/>
+        </w:trPr>
+        <w:tc>
+          <w:tcPr>
+            <w:tcW w:type="dxa" w:w="1250"/>
+          </w:tcPr>
+          <w:p>
+            <w:r>
+              <w:t>VX-X660-003</w:t>
+            </w:r>
+          </w:p>
+        </w:tc>
+        <w:tc>
+          <w:tcPr>
+            <w:tcW w:type="dxa" w:w="2600"/>
+          </w:tcPr>
+          <w:p>
+            <w:r>
+              <w:t>Startup shall adopt valid current encoder position and update the display without issuing a motion command.</w:t>
+            </w:r>
+          </w:p>
+        </w:tc>
+        <w:tc>
+          <w:tcPr>
+            <w:tcW w:type="dxa" w:w="1400"/>
+          </w:tcPr>
+          <w:p>
+            <w:r>
+              <w:t>Section 8.6</w:t>
+            </w:r>
+          </w:p>
+        </w:tc>
+        <w:tc>
+          <w:tcPr>
+            <w:tcW w:type="dxa" w:w="2300"/>
+          </w:tcPr>
+          <w:p>
+            <w:r>
+              <w:t>VanguardxMain_scheduler.py</w:t>
+            </w:r>
+          </w:p>
+        </w:tc>
+        <w:tc>
+          <w:tcPr>
+            <w:tcW w:type="dxa" w:w="2290"/>
+          </w:tcPr>
+          <w:p>
+            <w:r>
+              <w:t>TestX660StartupCurrentPosition.py</w:t>
+            </w:r>
+          </w:p>
+        </w:tc>
+      </w:tr>
+      <w:tr>
+        <w:trPr>
+          <w:cantSplit/>
+        </w:trPr>
+        <w:tc>
+          <w:tcPr>
+            <w:tcW w:type="dxa" w:w="1250"/>
+          </w:tcPr>
+          <w:p>
+            <w:r>
+              <w:t>VX-DSP-001</w:t>
+            </w:r>
+          </w:p>
+        </w:tc>
+        <w:tc>
+          <w:tcPr>
+            <w:tcW w:type="dxa" w:w="2600"/>
+          </w:tcPr>
+          <w:p>
+            <w:r>
+              <w:t>The PPI shall be North-up with bearings increasing clockwise and shall apply one geometry mapping to all PPI objects.</w:t>
+            </w:r>
+          </w:p>
+        </w:tc>
+        <w:tc>
+          <w:tcPr>
+            <w:tcW w:type="dxa" w:w="1400"/>
+          </w:tcPr>
+          <w:p>
+            <w:r>
+              <w:t>Section 5.4</w:t>
+            </w:r>
+          </w:p>
+        </w:tc>
+        <w:tc>
+          <w:tcPr>
+            <w:tcW w:type="dxa" w:w="2300"/>
+          </w:tcPr>
+          <w:p>
+            <w:r>
+              <w:t>RadarDisplayQt5.py</w:t>
+            </w:r>
+          </w:p>
+        </w:tc>
+        <w:tc>
+          <w:tcPr>
+            <w:tcW w:type="dxa" w:w="2290"/>
+          </w:tcPr>
+          <w:p>
+            <w:r>
+              <w:t>TestRadarDisplayGeometry.py</w:t>
             </w:r>
           </w:p>
         </w:tc>
@@ -12804,13 +13129,7 @@
             </w:tcMar>
           </w:tcPr>
           <w:p>
-            <w:pPr>
-              <w:spacing w:before="0" w:after="0"/>
-            </w:pPr>
-            <w:r>
-              <w:rPr>
-                <w:sz w:val="17"/>
-              </w:rPr>
+            <w:r>
               <w:t>0.6</w:t>
             </w:r>
           </w:p>
@@ -12827,13 +13146,7 @@
             </w:tcMar>
           </w:tcPr>
           <w:p>
-            <w:pPr>
-              <w:spacing w:before="0" w:after="0"/>
-            </w:pPr>
-            <w:r>
-              <w:rPr>
-                <w:sz w:val="17"/>
-              </w:rPr>
+            <w:r>
               <w:t>PointingManager sole motor ownership</w:t>
             </w:r>
           </w:p>
@@ -12850,14 +13163,8 @@
             </w:tcMar>
           </w:tcPr>
           <w:p>
-            <w:pPr>
-              <w:spacing w:before="0" w:after="0"/>
-            </w:pPr>
-            <w:r>
-              <w:rPr>
-                <w:sz w:val="17"/>
-              </w:rPr>
-              <w:t>Motor simulator and PTZ</w:t>
+            <w:r>
+              <w:t>Motor simulator and X6-60 abstraction</w:t>
             </w:r>
           </w:p>
         </w:tc>
@@ -12873,13 +13180,7 @@
             </w:tcMar>
           </w:tcPr>
           <w:p>
-            <w:pPr>
-              <w:spacing w:before="0" w:after="0"/>
-            </w:pPr>
-            <w:r>
-              <w:rPr>
-                <w:sz w:val="17"/>
-              </w:rPr>
+            <w:r>
               <w:t>Complete</w:t>
             </w:r>
           </w:p>
@@ -13181,6 +13482,9 @@
         </w:tc>
       </w:tr>
       <w:tr>
+        <w:trPr>
+          <w:cantSplit/>
+        </w:trPr>
         <w:tc>
           <w:tcPr>
             <w:tcW w:type="dxa" w:w="2520"/>
@@ -13275,6 +13579,9 @@
         </w:tc>
       </w:tr>
       <w:tr>
+        <w:trPr>
+          <w:cantSplit/>
+        </w:trPr>
         <w:tc>
           <w:tcPr>
             <w:tcW w:type="dxa" w:w="2520"/>
@@ -13384,14 +13691,8 @@
             </w:tcMar>
           </w:tcPr>
           <w:p>
-            <w:pPr>
-              <w:spacing w:before="0" w:after="0"/>
-            </w:pPr>
-            <w:r>
-              <w:rPr>
-                <w:sz w:val="17"/>
-              </w:rPr>
-              <w:t>0.8</w:t>
+            <w:r>
+              <w:t>0.7f</w:t>
             </w:r>
           </w:p>
         </w:tc>
@@ -13407,14 +13708,8 @@
             </w:tcMar>
           </w:tcPr>
           <w:p>
-            <w:pPr>
-              <w:spacing w:before="0" w:after="0"/>
-            </w:pPr>
-            <w:r>
-              <w:rPr>
-                <w:sz w:val="17"/>
-              </w:rPr>
-              <w:t>Operational TX/RX timing, ATR GPIO and guard verification</w:t>
+            <w:r>
+              <w:t>B200mini CRO-only ATR timing evidence and 200 ns TX pre-roll decision</w:t>
             </w:r>
           </w:p>
         </w:tc>
@@ -13430,14 +13725,8 @@
             </w:tcMar>
           </w:tcPr>
           <w:p>
-            <w:pPr>
-              <w:spacing w:before="0" w:after="0"/>
-            </w:pPr>
-            <w:r>
-              <w:rPr>
-                <w:sz w:val="17"/>
-              </w:rPr>
-              <w:t>B200mini ATR outputs observed on CRO; TRM initially disconnected</w:t>
+            <w:r>
+              <w:t>GPIO/CRO only; TRM and PA disconnected</w:t>
             </w:r>
           </w:p>
         </w:tc>
@@ -13453,14 +13742,8 @@
             </w:tcMar>
           </w:tcPr>
           <w:p>
-            <w:pPr>
-              <w:spacing w:before="0" w:after="0"/>
-            </w:pPr>
-            <w:r>
-              <w:rPr>
-                <w:sz w:val="17"/>
-              </w:rPr>
-              <w:t>In progress</w:t>
+            <w:r>
+              <w:t>Superseded</w:t>
             </w:r>
           </w:p>
         </w:tc>
@@ -13481,14 +13764,8 @@
             </w:tcMar>
           </w:tcPr>
           <w:p>
-            <w:pPr>
-              <w:spacing w:before="0" w:after="0"/>
-            </w:pPr>
-            <w:r>
-              <w:rPr>
-                <w:sz w:val="17"/>
-              </w:rPr>
-              <w:t>1.0</w:t>
+            <w:r>
+              <w:t>0.8</w:t>
             </w:r>
           </w:p>
         </w:tc>
@@ -13504,14 +13781,8 @@
             </w:tcMar>
           </w:tcPr>
           <w:p>
-            <w:pPr>
-              <w:spacing w:before="0" w:after="0"/>
-            </w:pPr>
-            <w:r>
-              <w:rPr>
-                <w:sz w:val="17"/>
-              </w:rPr>
-              <w:t>Operational multifunction radar engineering baseline</w:t>
+            <w:r>
+              <w:t>Operational Golay timing, guarded timed TX/RX/ATR profiles, X6-60 SocketCAN integration and North-up PPI</w:t>
             </w:r>
           </w:p>
         </w:tc>
@@ -13527,14 +13798,8 @@
             </w:tcMar>
           </w:tcPr>
           <w:p>
-            <w:pPr>
-              <w:spacing w:before="0" w:after="0"/>
-            </w:pPr>
-            <w:r>
-              <w:rPr>
-                <w:sz w:val="17"/>
-              </w:rPr>
-              <w:t>Integrated platform</w:t>
+            <w:r>
+              <w:t>Low-power/attenuated B200mini plus live X6-60; TRM/PA disconnected</w:t>
             </w:r>
           </w:p>
         </w:tc>
@@ -13550,19 +13815,16 @@
             </w:tcMar>
           </w:tcPr>
           <w:p>
-            <w:pPr>
-              <w:spacing w:before="0" w:after="0"/>
-            </w:pPr>
-            <w:r>
-              <w:rPr>
-                <w:sz w:val="17"/>
-              </w:rPr>
-              <w:t>Planned</w:t>
+            <w:r>
+              <w:t>Current architecture baseline</w:t>
             </w:r>
           </w:p>
         </w:tc>
       </w:tr>
       <w:tr>
+        <w:trPr>
+          <w:cantSplit/>
+        </w:trPr>
         <w:tc>
           <w:tcPr>
             <w:tcW w:type="dxa" w:w="2520"/>
@@ -13582,7 +13844,7 @@
               <w:rPr>
                 <w:sz w:val="17"/>
               </w:rPr>
-              <w:t>0.7f</w:t>
+              <w:t>1.0</w:t>
             </w:r>
           </w:p>
         </w:tc>
@@ -13605,7 +13867,7 @@
               <w:rPr>
                 <w:sz w:val="17"/>
               </w:rPr>
-              <w:t>B200mini CRO-only ATR timing evidence and 200 ns TX pre-roll decision</w:t>
+              <w:t>Operational multifunction radar engineering baseline</w:t>
             </w:r>
           </w:p>
         </w:tc>
@@ -13628,7 +13890,7 @@
               <w:rPr>
                 <w:sz w:val="17"/>
               </w:rPr>
-              <w:t>GPIO/CRO only; TRM and PA disconnected</w:t>
+              <w:t>Integrated platform</w:t>
             </w:r>
           </w:p>
         </w:tc>
@@ -13651,7 +13913,7 @@
               <w:rPr>
                 <w:sz w:val="17"/>
               </w:rPr>
-              <w:t>Current architecture baseline</w:t>
+              <w:t>Planned</w:t>
             </w:r>
           </w:p>
         </w:tc>
@@ -13671,7 +13933,7 @@
         <w:pStyle w:val="ListBullet"/>
       </w:pPr>
       <w:r>
-        <w:t>Commit the Version 0.7f ATR CRO evidence and 200 ns TX pre-roll architecture baseline.</w:t>
+        <w:t>Commit Version 0.8 with the operational Golay timing, X6-60 SocketCAN and North-up PPI architecture baseline.</w:t>
       </w:r>
     </w:p>
     <w:p>
@@ -13679,7 +13941,7 @@
         <w:pStyle w:val="ListBullet"/>
       </w:pPr>
       <w:r>
-        <w:t>Re-run the CRO-only harness with the 8-sample pre-roll and confirm the revised 5.2 us TX envelope, 6.2 us RX start and retained 1 us guard.</w:t>
+        <w:t>Run the full scheduler with both live X6-60 motion and the proven guarded timed loopback target, then verify target bearing against encoder bearing on the North-up PPI.</w:t>
       </w:r>
     </w:p>
     <w:p>
@@ -13687,7 +13949,7 @@
         <w:pStyle w:val="ListBullet"/>
       </w:pPr>
       <w:r>
-        <w:t>Integrate the validated bounded paired pipeline into the operational EttusRadarSource while retaining receive-only mode.</w:t>
+        <w:t>Retain receive-only no-profile startup and require explicit guarded confirmations for every timed-TX/ATR run.</w:t>
       </w:r>
     </w:p>
     <w:p>
@@ -13695,7 +13957,7 @@
         <w:pStyle w:val="ListBullet"/>
       </w:pPr>
       <w:r>
-        <w:t>Measure receiver recovery and replace provisional guard values with controlled hardware evidence.</w:t>
+        <w:t>Measure TRM switching, receiver recovery, PA sequencing and the safe non-overlap guard before the 50 W path is connected.</w:t>
       </w:r>
     </w:p>
     <w:p>
@@ -13703,7 +13965,7 @@
         <w:pStyle w:val="ListBullet"/>
       </w:pPr>
       <w:r>
-        <w:t>Calibrate operational range offset separately from the 166-sample diagnostic cable-loopback delay.</w:t>
+        <w:t>Calibrate operational range independently of receive-start offset and the 166-sample diagnostic cable path.</w:t>
       </w:r>
     </w:p>
     <w:p>
@@ -13711,7 +13973,7 @@
         <w:pStyle w:val="ListBullet"/>
       </w:pPr>
       <w:r>
-        <w:t>Run operational non-overlapping TX-at-T and RX-at-T+6.2 microsecond timing tests across 1-4 kHz after transport pre-roll integration.</w:t>
+        <w:t>Profile sustained 4 kHz/64-pulse Golay acquisition and processing with live pointing; accept 50 ms cadence only after worst-case margin is demonstrated.</w:t>
       </w:r>
     </w:p>
     <w:p>
@@ -13719,7 +13981,7 @@
         <w:pStyle w:val="ListBullet"/>
       </w:pPr>
       <w:r>
-        <w:t>Connect the TRM only after ATR polarity, idle state and non-overlap are verified.</w:t>
+        <w:t>Configure automatic host startup for can0 at 1 Mbit/s and add a clean top-level failure message for missing or DOWN SocketCAN.</w:t>
       </w:r>
     </w:p>
     <w:p>
@@ -13727,7 +13989,7 @@
         <w:pStyle w:val="ListBullet"/>
       </w:pPr>
       <w:r>
-        <w:t>Profile acquisition and post-CPI processing; consider CPU affinity only if measured scheduling margin requires it.</w:t>
+        <w:t>Complete sea-trial recording with Golay diagnostics, calibrated range, measured bearing and navigation provenance.</w:t>
       </w:r>
     </w:p>
     <w:p>
@@ -13743,7 +14005,7 @@
         <w:pStyle w:val="ListBullet"/>
       </w:pPr>
       <w:r>
-        <w:t>Load the first rapid-360-degree surveillance profile and have MissionController submit the persistent search task without changing the proven dwell boundary.</w:t>
+        <w:t>Load the first rapid-surveillance profile and submit persistent search without changing the proven dwell boundary.</w:t>
       </w:r>
     </w:p>
     <w:p>
@@ -13751,7 +14013,7 @@
         <w:pStyle w:val="ListBullet"/>
       </w:pPr>
       <w:r>
-        <w:t>Route tracker events through MissionController and retain the direct RevisitRequest-to-scheduler path only during controlled migration.</w:t>
+        <w:t>Route tracker events through MissionController while retaining controlled migration support.</w:t>
       </w:r>
     </w:p>
     <w:p>
@@ -13767,7 +14029,7 @@
         <w:pStyle w:val="ListBullet"/>
       </w:pPr>
       <w:r>
-        <w:t>Instrument surveillance duty cycle, sector coverage debt, revisit lateness and reacquisition outcomes before introducing a richer cost model.</w:t>
+        <w:t>Instrument surveillance duty cycle, sector coverage debt, revisit lateness and reacquisition outcomes before a richer cost model.</w:t>
       </w:r>
     </w:p>
     <w:p>
@@ -14051,7 +14313,7 @@
     <w:p>
       <w:pPr/>
       <w:r>
-        <w:t>Decision and rationale: Expose PRF from 1.0 to 4.0 kHz and pulses per CPI through the front UI, with defaults of 2.0 kHz and 32 pulses. Derive PRI and CPI duration so contradictory timing inputs cannot be entered independently. Validate the selection below the UI boundary.</w:t>
+        <w:t>Decision and rationale: Expose physical PRF from 1.0 to 4.0 kHz and pulses per CPI through the front UI. Derive PRI and CPI duration so contradictory timing inputs cannot be entered independently and validate below the UI boundary. Defaults are execution-profile-specific: the current operational Golay profile uses 4.0 kHz and 64 physical A/B pulses, while earlier Frank profiles used 2.0 kHz and 32 pulses.</w:t>
       </w:r>
     </w:p>
     <w:p>
@@ -14184,6 +14446,141 @@
     <w:p>
       <w:r>
         <w:t>Decision and rationale: CRO measurement found approximately 100 ns GPIO edge rise time. Prepend eight zero-valued complex samples at 40 MS/s (200 ns) before the unchanged 200-sample Frank10_20MHz waveform. The padding belongs to the timed-transmit transport envelope, not WaveformLibrary or the matched-filter reference. Move RX start by the same 200 ns to preserve the measured 1 us both-low guard, and use the first non-zero sample as the RF/range origin to avoid a 30 m bias.</w:t>
+      </w:r>
+    </w:p>
+    <w:p>
+      <w:pPr>
+        <w:pStyle w:val="Heading2"/>
+      </w:pPr>
+      <w:r>
+        <w:t>ADR-0020: Operational Golay A/B timing</w:t>
+      </w:r>
+    </w:p>
+    <w:p>
+      <w:pPr>
+        <w:spacing w:after="60"/>
+      </w:pPr>
+      <w:r>
+        <w:rPr>
+          <w:b/>
+        </w:rPr>
+        <w:t>Status: Accepted</w:t>
+      </w:r>
+    </w:p>
+    <w:p>
+      <w:pPr>
+        <w:spacing w:after="120"/>
+      </w:pPr>
+      <w:r>
+        <w:t>Decision and rationale: Use Golay64_20MHz as strict alternating A then B physical pulses at 4 kHz and 64 physical pulses per 16 ms CPI. Apply separate matched filters, combine 32 complementary pairs, then perform Doppler processing at 500 us pair spacing. Preserve physical pulse metadata and reject incomplete or reordered pairs.</w:t>
+      </w:r>
+    </w:p>
+    <w:p>
+      <w:pPr>
+        <w:pStyle w:val="Heading2"/>
+      </w:pPr>
+      <w:r>
+        <w:t>ADR-0021: X6-60 absolute encoder and SocketCAN</w:t>
+      </w:r>
+    </w:p>
+    <w:p>
+      <w:pPr>
+        <w:spacing w:after="60"/>
+      </w:pPr>
+      <w:r>
+        <w:rPr>
+          <w:b/>
+        </w:rPr>
+        <w:t>Status: Accepted</w:t>
+      </w:r>
+    </w:p>
+    <w:p>
+      <w:pPr>
+        <w:spacing w:after="120"/>
+      </w:pPr>
+      <w:r>
+        <w:t>Decision and rationale: Use the QAN X6-60 absolute multi-turn encoder over can0 at 1 Mbit/s as the operational azimuth source. Calibrate NorthRawAngleDeg=-361.53 and DirectionSign=+1 so public azimuth is North=0 degrees and clockwise-positive while retaining raw angle provenance.</w:t>
+      </w:r>
+    </w:p>
+    <w:p>
+      <w:pPr>
+        <w:pStyle w:val="Heading2"/>
+      </w:pPr>
+      <w:r>
+        <w:t>ADR-0022: Unlimited azimuth and current-position startup</w:t>
+      </w:r>
+    </w:p>
+    <w:p>
+      <w:pPr>
+        <w:spacing w:after="60"/>
+      </w:pPr>
+      <w:r>
+        <w:rPr>
+          <w:b/>
+        </w:rPr>
+        <w:t>Status: Accepted</w:t>
+      </w:r>
+    </w:p>
+    <w:p>
+      <w:pPr>
+        <w:spacing w:after="120"/>
+      </w:pPr>
+      <w:r>
+        <w:t>Decision and rationale: Treat the installed X6-60 azimuth axis as unlimited rather than applying legacy software end stops. At startup read and validate the current encoder position, update the PPI and remain stopped without forcing a move to an arbitrary bearing.</w:t>
+      </w:r>
+    </w:p>
+    <w:p>
+      <w:pPr>
+        <w:pStyle w:val="Heading2"/>
+      </w:pPr>
+      <w:r>
+        <w:t>ADR-0023: Guarded operational motion</w:t>
+      </w:r>
+    </w:p>
+    <w:p>
+      <w:pPr>
+        <w:spacing w:after="60"/>
+      </w:pPr>
+      <w:r>
+        <w:rPr>
+          <w:b/>
+        </w:rPr>
+        <w:t>Status: Accepted</w:t>
+      </w:r>
+    </w:p>
+    <w:p>
+      <w:pPr>
+        <w:spacing w:after="120"/>
+      </w:pPr>
+      <w:r>
+        <w:t>Decision and rationale: Keep motion disabled unless the x660-operational profile and both installation acknowledgements are present. Limit the live transport to stop, speed, absolute-position and incremental-position commands, and retain PointingManager as the sole operational command owner.</w:t>
+      </w:r>
+    </w:p>
+    <w:p>
+      <w:pPr>
+        <w:pStyle w:val="Heading2"/>
+      </w:pPr>
+      <w:r>
+        <w:t>ADR-0024: North-up clockwise-positive PPI</w:t>
+      </w:r>
+    </w:p>
+    <w:p>
+      <w:pPr>
+        <w:spacing w:after="60"/>
+      </w:pPr>
+      <w:r>
+        <w:rPr>
+          <w:b/>
+        </w:rPr>
+        <w:t>Status: Accepted</w:t>
+      </w:r>
+    </w:p>
+    <w:p>
+      <w:pPr>
+        <w:spacing w:after="120"/>
+      </w:pPr>
+      <w:r>
+        <w:t>Decision and rationale: Use x=range*sin(bearing) and y=range*cos(bearing) so 0/North is top and bearings increase clockwise. Apply the same conversion to the beam, sectors, detections, plots, tracks, labels and mouse selection.</w:t>
       </w:r>
     </w:p>
     <w:p>
@@ -14536,7 +14933,7 @@
           </w:tcPr>
           <w:p>
             <w:r>
-              <w:t>QAN X6-60 motorised pan/tilt pointing unit.</w:t>
+              <w:t>QAN unlimited-azimuth motor/positioning unit with absolute multi-turn encoder feedback over SocketCAN.</w:t>
             </w:r>
           </w:p>
         </w:tc>
@@ -14625,6 +15022,9 @@
         </w:tc>
       </w:tr>
       <w:tr>
+        <w:trPr>
+          <w:cantSplit/>
+        </w:trPr>
         <w:tc>
           <w:tcPr>
             <w:tcW w:type="dxa" w:w="5040"/>
@@ -14665,6 +15065,9 @@
         </w:tc>
       </w:tr>
       <w:tr>
+        <w:trPr>
+          <w:cantSplit/>
+        </w:trPr>
         <w:tc>
           <w:tcPr>
             <w:tcW w:type="dxa" w:w="5040"/>
@@ -14687,6 +15090,9 @@
         </w:tc>
       </w:tr>
       <w:tr>
+        <w:trPr>
+          <w:cantSplit/>
+        </w:trPr>
         <w:tc>
           <w:tcPr>
             <w:tcW w:type="dxa" w:w="5040"/>
@@ -14709,6 +15115,9 @@
         </w:tc>
       </w:tr>
       <w:tr>
+        <w:trPr>
+          <w:cantSplit/>
+        </w:trPr>
         <w:tc>
           <w:tcPr>
             <w:tcW w:type="dxa" w:w="5040"/>
@@ -14731,6 +15140,9 @@
         </w:tc>
       </w:tr>
       <w:tr>
+        <w:trPr>
+          <w:cantSplit/>
+        </w:trPr>
         <w:tc>
           <w:tcPr>
             <w:tcW w:type="dxa" w:w="5040"/>
@@ -14753,6 +15165,9 @@
         </w:tc>
       </w:tr>
       <w:tr>
+        <w:trPr>
+          <w:cantSplit/>
+        </w:trPr>
         <w:tc>
           <w:tcPr>
             <w:tcW w:type="dxa" w:w="5040"/>
@@ -14770,6 +15185,106 @@
           <w:p>
             <w:r>
               <w:t>Bounded fine-angle scan around a missed track's predicted bearing.</w:t>
+            </w:r>
+          </w:p>
+        </w:tc>
+      </w:tr>
+      <w:tr>
+        <w:trPr>
+          <w:cantSplit/>
+        </w:trPr>
+        <w:tc>
+          <w:tcPr>
+            <w:tcW w:type="dxa" w:w="5040"/>
+          </w:tcPr>
+          <w:p>
+            <w:r>
+              <w:t>Physical PRI</w:t>
+            </w:r>
+          </w:p>
+        </w:tc>
+        <w:tc>
+          <w:tcPr>
+            <w:tcW w:type="dxa" w:w="5040"/>
+          </w:tcPr>
+          <w:p>
+            <w:r>
+              <w:t>Time between consecutive transmitted Golay A or B physical pulses; 250 us at the 4 kHz baseline.</w:t>
+            </w:r>
+          </w:p>
+        </w:tc>
+      </w:tr>
+      <w:tr>
+        <w:trPr>
+          <w:cantSplit/>
+        </w:trPr>
+        <w:tc>
+          <w:tcPr>
+            <w:tcW w:type="dxa" w:w="5040"/>
+          </w:tcPr>
+          <w:p>
+            <w:r>
+              <w:t>Pair PRI</w:t>
+            </w:r>
+          </w:p>
+        </w:tc>
+        <w:tc>
+          <w:tcPr>
+            <w:tcW w:type="dxa" w:w="5040"/>
+          </w:tcPr>
+          <w:p>
+            <w:r>
+              <w:t>Time between consecutive complementary A+B outputs used for Doppler; 500 us at the operational Golay baseline.</w:t>
+            </w:r>
+          </w:p>
+        </w:tc>
+      </w:tr>
+      <w:tr>
+        <w:trPr>
+          <w:cantSplit/>
+        </w:trPr>
+        <w:tc>
+          <w:tcPr>
+            <w:tcW w:type="dxa" w:w="5040"/>
+          </w:tcPr>
+          <w:p>
+            <w:r>
+              <w:t>North-up PPI</w:t>
+            </w:r>
+          </w:p>
+        </w:tc>
+        <w:tc>
+          <w:tcPr>
+            <w:tcW w:type="dxa" w:w="5040"/>
+          </w:tcPr>
+          <w:p>
+            <w:r>
+              <w:t>Display convention with North/0 degrees at the top and bearing increasing clockwise.</w:t>
+            </w:r>
+          </w:p>
+        </w:tc>
+      </w:tr>
+      <w:tr>
+        <w:trPr>
+          <w:cantSplit/>
+        </w:trPr>
+        <w:tc>
+          <w:tcPr>
+            <w:tcW w:type="dxa" w:w="5040"/>
+          </w:tcPr>
+          <w:p>
+            <w:r>
+              <w:t>SocketCAN</w:t>
+            </w:r>
+          </w:p>
+        </w:tc>
+        <w:tc>
+          <w:tcPr>
+            <w:tcW w:type="dxa" w:w="5040"/>
+          </w:tcPr>
+          <w:p>
+            <w:r>
+              <w:t>Linux CAN networking interface used by Vanguard X through can0 at 1 Mbit/s.</w:t>
             </w:r>
           </w:p>
         </w:tc>
@@ -14942,7 +15457,7 @@
       <w:jc w:val="center"/>
     </w:pPr>
     <w:r>
-      <w:t>VX-SSA-001 | Vanguard X Software &amp; System Architecture | Version 0.7f</w:t>
+      <w:t>VX-SSA-001 | Vanguard X Software &amp; System Architecture | Version 0.8</w:t>
     </w:r>
   </w:p>
 </w:hdr>

</xml_diff>

<commit_message>
Validate X6-60 operational scan control
</commit_message>
<xml_diff>
--- a/docs/architecture/VX-SSA-001_Vanguard_X_Software_System_Architecture.docx
+++ b/docs/architecture/VX-SSA-001_Vanguard_X_Software_System_Architecture.docx
@@ -32,7 +32,7 @@
         <w:jc w:val="center"/>
       </w:pPr>
       <w:r>
-        <w:t>Version 0.8 - Operational Golay Timing and X6-60 Integration Baseline</w:t>
+        <w:t>Version 0.9 - Safe Runtime Modes and ATR-Isolated RF Loopback</w:t>
       </w:r>
     </w:p>
     <w:p>
@@ -146,7 +146,7 @@
           </w:tcPr>
           <w:p>
             <w:r>
-              <w:t>0.8</w:t>
+              <w:t>0.9</w:t>
             </w:r>
           </w:p>
         </w:tc>
@@ -394,7 +394,7 @@
           </w:tcPr>
           <w:p>
             <w:r>
-              <w:t>Operational Golay64_20MHz A/B timing at 40 MS/s and 4 kHz/64 physical pulses (16 ms CPI), guarded B200mini timed TX/RX and ATR profiles, and operational X6-60 SocketCAN pointing with absolute encoder feedback, North=0 degrees, clockwise-positive azimuth, 20 deg/s scan rate and current-position startup; no-profile startup remains receive-only and the TRM/PA remain disconnected.</w:t>
+              <w:t>Operational Golay64_20MHz A/B timing at 40 MS/s and 4 kHz/64 physical pulses (16 ms CPI), paired SIM/HARD runtime selection, receive-only HARD mode, and a separately guarded attenuated RF-loopback mode in which both external ATR outputs are forced inactive; operational X6-60 SocketCAN pointing remains guarded and the TRM/50 W PA remain disconnected.</w:t>
             </w:r>
           </w:p>
         </w:tc>
@@ -1815,6 +1815,48 @@
           </w:p>
         </w:tc>
       </w:tr>
+      <w:tr>
+        <w:tc>
+          <w:tcPr>
+            <w:tcW w:type="dxa" w:w="2520"/>
+          </w:tcPr>
+          <w:p>
+            <w:r>
+              <w:t>0.9</w:t>
+            </w:r>
+          </w:p>
+        </w:tc>
+        <w:tc>
+          <w:tcPr>
+            <w:tcW w:type="dxa" w:w="2520"/>
+          </w:tcPr>
+          <w:p>
+            <w:r>
+              <w:t>22 Jul 2026</w:t>
+            </w:r>
+          </w:p>
+        </w:tc>
+        <w:tc>
+          <w:tcPr>
+            <w:tcW w:type="dxa" w:w="2520"/>
+          </w:tcPr>
+          <w:p>
+            <w:r>
+              <w:t>Defined paired SIM/HARD runtime selection and fail-closed ATR-isolated guarded RF loopback</w:t>
+            </w:r>
+          </w:p>
+        </w:tc>
+        <w:tc>
+          <w:tcPr>
+            <w:tcW w:type="dxa" w:w="2520"/>
+          </w:tcPr>
+          <w:p>
+            <w:r>
+              <w:t>Current architecture baseline</w:t>
+            </w:r>
+          </w:p>
+        </w:tc>
+      </w:tr>
     </w:tbl>
     <w:p>
       <w:pPr>
@@ -2036,6 +2078,14 @@
     </w:p>
     <w:p>
       <w:pPr>
+        <w:pStyle w:val="ListBullet"/>
+      </w:pPr>
+      <w:r>
+        <w:t>ADR-0025: Separate receive-only hardware operation from guarded RF loopback and force both external ATR outputs inactive in loopback.</w:t>
+      </w:r>
+    </w:p>
+    <w:p>
+      <w:pPr>
         <w:pStyle w:val="Heading1"/>
       </w:pPr>
       <w:r>
@@ -2105,6 +2155,12 @@
     <w:p>
       <w:r>
         <w:t>13. SDR Execution Architecture</w:t>
+      </w:r>
+    </w:p>
+    <w:p>
+      <w:pPr/>
+      <w:r>
+        <w:t>13.12 ATR-isolated guarded RF loopback</w:t>
       </w:r>
     </w:p>
     <w:p>
@@ -4333,6 +4389,20 @@
     </w:p>
     <w:p>
       <w:pPr>
+        <w:pStyle w:val="Heading2"/>
+      </w:pPr>
+      <w:r>
+        <w:t>9.5 Runtime operating-mode selection</w:t>
+      </w:r>
+    </w:p>
+    <w:p>
+      <w:pPr/>
+      <w:r>
+        <w:t>The top-level operator selector changes the radar source and X6-60 adapter as one coherent configuration. SIM selects SimulatedSource and the X6-60 simulator. HARD selects EttusRadarSource in receive-only mode and the operational X6-60 controller. Startup defaults to SIM; mode changes are accepted only while stopped and are applied through orderly shutdown and restart so no live adapter is replaced during a dwell. HARD requires operator confirmation that the hardware is connected and the X6-60 motion area is clear. HARD does not imply RF transmit authority.</w:t>
+      </w:r>
+    </w:p>
+    <w:p>
+      <w:pPr>
         <w:pStyle w:val="Heading1"/>
       </w:pPr>
       <w:r>
@@ -5615,7 +5685,7 @@
         <w:pStyle w:val="Heading2"/>
       </w:pPr>
       <w:r>
-        <w:t>13.1 Purpose and boundary</w:t>
+        <w:t>13.1 Purpose, boundary and operating modes summary</w:t>
       </w:r>
     </w:p>
     <w:p>
@@ -5623,6 +5693,637 @@
         <w:t>This chapter defines deterministic SDR execution. RadarExecutor owns task-to-dwell translation; EttusRadarSource owns conversion of that DwellPlan into timed UHD receive commands and return of RawDwellData. The scheduler is intentionally unaware of UHD streamers, hardware timestamps and USB transport details.</w:t>
       </w:r>
     </w:p>
+    <w:p>
+      <w:pPr>
+        <w:pStyle w:val="Heading3"/>
+        <w:pageBreakBefore/>
+      </w:pPr>
+      <w:r>
+        <w:t>Operating modes summary</w:t>
+      </w:r>
+    </w:p>
+    <w:p>
+      <w:pPr/>
+      <w:r>
+        <w:t>The following matrix is the controlling high-level summary of source, transmit-authorisation, external ATR and X6-60 behaviour. Detailed arming, verification and fail-closed requirements remain defined in Sections 13.11 and 13.12.</w:t>
+      </w:r>
+    </w:p>
+    <w:tbl>
+      <w:tblPr>
+        <w:tblStyle w:val="TableGrid"/>
+        <w:tblW w:type="auto" w:w="0"/>
+        <w:jc w:val="center"/>
+        <w:tblLayout w:type="fixed"/>
+        <w:tblLook w:firstColumn="1" w:firstRow="1" w:lastColumn="0" w:lastRow="0" w:noHBand="0" w:noVBand="1" w:val="04A0"/>
+      </w:tblPr>
+      <w:tblGrid>
+        <w:gridCol w:w="1680"/>
+        <w:gridCol w:w="1680"/>
+        <w:gridCol w:w="1680"/>
+        <w:gridCol w:w="1680"/>
+        <w:gridCol w:w="1680"/>
+        <w:gridCol w:w="1680"/>
+      </w:tblGrid>
+      <w:tr>
+        <w:trPr>
+          <w:cantSplit/>
+        </w:trPr>
+        <w:tc>
+          <w:tcPr>
+            <w:tcW w:type="dxa" w:w="1512"/>
+            <w:vAlign w:val="center"/>
+            <w:shd w:fill="1F4E78"/>
+          </w:tcPr>
+          <w:p>
+            <w:pPr>
+              <w:spacing w:before="0" w:after="0" w:line="240" w:lineRule="auto"/>
+            </w:pPr>
+            <w:r>
+              <w:rPr>
+                <w:rFonts w:ascii="Arial" w:hAnsi="Arial"/>
+                <w:b/>
+                <w:color w:val="FFFFFF"/>
+                <w:sz w:val="16"/>
+              </w:rPr>
+              <w:t>Mode</w:t>
+            </w:r>
+          </w:p>
+        </w:tc>
+        <w:tc>
+          <w:tcPr>
+            <w:tcW w:type="dxa" w:w="1123"/>
+            <w:vAlign w:val="center"/>
+            <w:shd w:fill="1F4E78"/>
+          </w:tcPr>
+          <w:p>
+            <w:pPr>
+              <w:spacing w:before="0" w:after="0" w:line="240" w:lineRule="auto"/>
+            </w:pPr>
+            <w:r>
+              <w:rPr>
+                <w:rFonts w:ascii="Arial" w:hAnsi="Arial"/>
+                <w:b/>
+                <w:color w:val="FFFFFF"/>
+                <w:sz w:val="16"/>
+              </w:rPr>
+              <w:t>Ettus TX</w:t>
+            </w:r>
+          </w:p>
+        </w:tc>
+        <w:tc>
+          <w:tcPr>
+            <w:tcW w:type="dxa" w:w="1181"/>
+            <w:vAlign w:val="center"/>
+            <w:shd w:fill="1F4E78"/>
+          </w:tcPr>
+          <w:p>
+            <w:pPr>
+              <w:spacing w:before="0" w:after="0" w:line="240" w:lineRule="auto"/>
+            </w:pPr>
+            <w:r>
+              <w:rPr>
+                <w:rFonts w:ascii="Arial" w:hAnsi="Arial"/>
+                <w:b/>
+                <w:color w:val="FFFFFF"/>
+                <w:sz w:val="16"/>
+              </w:rPr>
+              <w:t>Ettus RX</w:t>
+            </w:r>
+          </w:p>
+        </w:tc>
+        <w:tc>
+          <w:tcPr>
+            <w:tcW w:type="dxa" w:w="1181"/>
+            <w:vAlign w:val="center"/>
+            <w:shd w:fill="1F4E78"/>
+          </w:tcPr>
+          <w:p>
+            <w:pPr>
+              <w:spacing w:before="0" w:after="0" w:line="240" w:lineRule="auto"/>
+            </w:pPr>
+            <w:r>
+              <w:rPr>
+                <w:rFonts w:ascii="Arial" w:hAnsi="Arial"/>
+                <w:b/>
+                <w:color w:val="FFFFFF"/>
+                <w:sz w:val="16"/>
+              </w:rPr>
+              <w:t>TX ATR</w:t>
+            </w:r>
+          </w:p>
+        </w:tc>
+        <w:tc>
+          <w:tcPr>
+            <w:tcW w:type="dxa" w:w="2448"/>
+            <w:vAlign w:val="center"/>
+            <w:shd w:fill="1F4E78"/>
+          </w:tcPr>
+          <w:p>
+            <w:pPr>
+              <w:spacing w:before="0" w:after="0" w:line="240" w:lineRule="auto"/>
+            </w:pPr>
+            <w:r>
+              <w:rPr>
+                <w:rFonts w:ascii="Arial" w:hAnsi="Arial"/>
+                <w:b/>
+                <w:color w:val="FFFFFF"/>
+                <w:sz w:val="16"/>
+              </w:rPr>
+              <w:t>RX ATR</w:t>
+            </w:r>
+          </w:p>
+        </w:tc>
+        <w:tc>
+          <w:tcPr>
+            <w:tcW w:type="dxa" w:w="1483"/>
+            <w:vAlign w:val="center"/>
+            <w:shd w:fill="1F4E78"/>
+          </w:tcPr>
+          <w:p>
+            <w:pPr>
+              <w:spacing w:before="0" w:after="0" w:line="240" w:lineRule="auto"/>
+            </w:pPr>
+            <w:r>
+              <w:rPr>
+                <w:rFonts w:ascii="Arial" w:hAnsi="Arial"/>
+                <w:b/>
+                <w:color w:val="FFFFFF"/>
+                <w:sz w:val="16"/>
+              </w:rPr>
+              <w:t>X6-60</w:t>
+            </w:r>
+          </w:p>
+        </w:tc>
+      </w:tr>
+      <w:tr>
+        <w:trPr>
+          <w:cantSplit/>
+        </w:trPr>
+        <w:tc>
+          <w:tcPr>
+            <w:tcW w:type="dxa" w:w="1512"/>
+            <w:vAlign w:val="center"/>
+          </w:tcPr>
+          <w:p>
+            <w:pPr>
+              <w:spacing w:before="0" w:after="0" w:line="240" w:lineRule="auto"/>
+            </w:pPr>
+            <w:r>
+              <w:rPr>
+                <w:rFonts w:ascii="Arial" w:hAnsi="Arial"/>
+                <w:b/>
+                <w:sz w:val="16"/>
+              </w:rPr>
+              <w:t>SIM</w:t>
+            </w:r>
+          </w:p>
+        </w:tc>
+        <w:tc>
+          <w:tcPr>
+            <w:tcW w:type="dxa" w:w="1123"/>
+            <w:vAlign w:val="center"/>
+          </w:tcPr>
+          <w:p>
+            <w:pPr>
+              <w:spacing w:before="0" w:after="0" w:line="240" w:lineRule="auto"/>
+            </w:pPr>
+            <w:r>
+              <w:rPr>
+                <w:rFonts w:ascii="Arial" w:hAnsi="Arial"/>
+                <w:sz w:val="16"/>
+              </w:rPr>
+              <w:t>No</w:t>
+            </w:r>
+          </w:p>
+        </w:tc>
+        <w:tc>
+          <w:tcPr>
+            <w:tcW w:type="dxa" w:w="1181"/>
+            <w:vAlign w:val="center"/>
+          </w:tcPr>
+          <w:p>
+            <w:pPr>
+              <w:spacing w:before="0" w:after="0" w:line="240" w:lineRule="auto"/>
+            </w:pPr>
+            <w:r>
+              <w:rPr>
+                <w:rFonts w:ascii="Arial" w:hAnsi="Arial"/>
+                <w:sz w:val="16"/>
+              </w:rPr>
+              <w:t>Simulated</w:t>
+            </w:r>
+          </w:p>
+        </w:tc>
+        <w:tc>
+          <w:tcPr>
+            <w:tcW w:type="dxa" w:w="1181"/>
+            <w:vAlign w:val="center"/>
+          </w:tcPr>
+          <w:p>
+            <w:pPr>
+              <w:spacing w:before="0" w:after="0" w:line="240" w:lineRule="auto"/>
+            </w:pPr>
+            <w:r>
+              <w:rPr>
+                <w:rFonts w:ascii="Arial" w:hAnsi="Arial"/>
+                <w:sz w:val="16"/>
+              </w:rPr>
+              <w:t>Off</w:t>
+            </w:r>
+          </w:p>
+        </w:tc>
+        <w:tc>
+          <w:tcPr>
+            <w:tcW w:type="dxa" w:w="2448"/>
+            <w:vAlign w:val="center"/>
+          </w:tcPr>
+          <w:p>
+            <w:pPr>
+              <w:spacing w:before="0" w:after="0" w:line="240" w:lineRule="auto"/>
+            </w:pPr>
+            <w:r>
+              <w:rPr>
+                <w:rFonts w:ascii="Arial" w:hAnsi="Arial"/>
+                <w:sz w:val="16"/>
+              </w:rPr>
+              <w:t>Off</w:t>
+            </w:r>
+          </w:p>
+        </w:tc>
+        <w:tc>
+          <w:tcPr>
+            <w:tcW w:type="dxa" w:w="1483"/>
+            <w:vAlign w:val="center"/>
+          </w:tcPr>
+          <w:p>
+            <w:pPr>
+              <w:spacing w:before="0" w:after="0" w:line="240" w:lineRule="auto"/>
+            </w:pPr>
+            <w:r>
+              <w:rPr>
+                <w:rFonts w:ascii="Arial" w:hAnsi="Arial"/>
+                <w:sz w:val="16"/>
+              </w:rPr>
+              <w:t>Simulated</w:t>
+            </w:r>
+          </w:p>
+        </w:tc>
+      </w:tr>
+      <w:tr>
+        <w:trPr>
+          <w:cantSplit/>
+        </w:trPr>
+        <w:tc>
+          <w:tcPr>
+            <w:tcW w:type="dxa" w:w="1512"/>
+            <w:vAlign w:val="center"/>
+            <w:shd w:fill="D9EAF7"/>
+          </w:tcPr>
+          <w:p>
+            <w:pPr>
+              <w:spacing w:before="0" w:after="0" w:line="240" w:lineRule="auto"/>
+            </w:pPr>
+            <w:r>
+              <w:rPr>
+                <w:rFonts w:ascii="Arial" w:hAnsi="Arial"/>
+                <w:b/>
+                <w:sz w:val="16"/>
+              </w:rPr>
+              <w:t>HARD RX</w:t>
+            </w:r>
+          </w:p>
+        </w:tc>
+        <w:tc>
+          <w:tcPr>
+            <w:tcW w:type="dxa" w:w="1123"/>
+            <w:vAlign w:val="center"/>
+            <w:shd w:fill="D9EAF7"/>
+          </w:tcPr>
+          <w:p>
+            <w:pPr>
+              <w:spacing w:before="0" w:after="0" w:line="240" w:lineRule="auto"/>
+            </w:pPr>
+            <w:r>
+              <w:rPr>
+                <w:rFonts w:ascii="Arial" w:hAnsi="Arial"/>
+                <w:sz w:val="16"/>
+              </w:rPr>
+              <w:t>Inhibited</w:t>
+            </w:r>
+          </w:p>
+        </w:tc>
+        <w:tc>
+          <w:tcPr>
+            <w:tcW w:type="dxa" w:w="1181"/>
+            <w:vAlign w:val="center"/>
+            <w:shd w:fill="D9EAF7"/>
+          </w:tcPr>
+          <w:p>
+            <w:pPr>
+              <w:spacing w:before="0" w:after="0" w:line="240" w:lineRule="auto"/>
+            </w:pPr>
+            <w:r>
+              <w:rPr>
+                <w:rFonts w:ascii="Arial" w:hAnsi="Arial"/>
+                <w:sz w:val="16"/>
+              </w:rPr>
+              <w:t>Yes</w:t>
+            </w:r>
+          </w:p>
+        </w:tc>
+        <w:tc>
+          <w:tcPr>
+            <w:tcW w:type="dxa" w:w="1181"/>
+            <w:vAlign w:val="center"/>
+            <w:shd w:fill="D9EAF7"/>
+          </w:tcPr>
+          <w:p>
+            <w:pPr>
+              <w:spacing w:before="0" w:after="0" w:line="240" w:lineRule="auto"/>
+            </w:pPr>
+            <w:r>
+              <w:rPr>
+                <w:rFonts w:ascii="Arial" w:hAnsi="Arial"/>
+                <w:sz w:val="16"/>
+              </w:rPr>
+              <w:t>Off</w:t>
+            </w:r>
+          </w:p>
+        </w:tc>
+        <w:tc>
+          <w:tcPr>
+            <w:tcW w:type="dxa" w:w="2448"/>
+            <w:vAlign w:val="center"/>
+            <w:shd w:fill="D9EAF7"/>
+          </w:tcPr>
+          <w:p>
+            <w:pPr>
+              <w:spacing w:before="0" w:after="0" w:line="240" w:lineRule="auto"/>
+            </w:pPr>
+            <w:r>
+              <w:rPr>
+                <w:rFonts w:ascii="Arial" w:hAnsi="Arial"/>
+                <w:sz w:val="16"/>
+              </w:rPr>
+              <w:t>Forced off (RX-only use subject to later verification)</w:t>
+            </w:r>
+          </w:p>
+        </w:tc>
+        <w:tc>
+          <w:tcPr>
+            <w:tcW w:type="dxa" w:w="1483"/>
+            <w:vAlign w:val="center"/>
+            <w:shd w:fill="D9EAF7"/>
+          </w:tcPr>
+          <w:p>
+            <w:pPr>
+              <w:spacing w:before="0" w:after="0" w:line="240" w:lineRule="auto"/>
+            </w:pPr>
+            <w:r>
+              <w:rPr>
+                <w:rFonts w:ascii="Arial" w:hAnsi="Arial"/>
+                <w:sz w:val="16"/>
+              </w:rPr>
+              <w:t>Operational</w:t>
+            </w:r>
+          </w:p>
+        </w:tc>
+      </w:tr>
+      <w:tr>
+        <w:trPr>
+          <w:cantSplit/>
+        </w:trPr>
+        <w:tc>
+          <w:tcPr>
+            <w:tcW w:type="dxa" w:w="1512"/>
+            <w:vAlign w:val="center"/>
+          </w:tcPr>
+          <w:p>
+            <w:pPr>
+              <w:spacing w:before="0" w:after="0" w:line="240" w:lineRule="auto"/>
+            </w:pPr>
+            <w:r>
+              <w:rPr>
+                <w:rFonts w:ascii="Arial" w:hAnsi="Arial"/>
+                <w:b/>
+                <w:sz w:val="16"/>
+              </w:rPr>
+              <w:t>RF LOOPBACK</w:t>
+            </w:r>
+          </w:p>
+        </w:tc>
+        <w:tc>
+          <w:tcPr>
+            <w:tcW w:type="dxa" w:w="1123"/>
+            <w:vAlign w:val="center"/>
+          </w:tcPr>
+          <w:p>
+            <w:pPr>
+              <w:spacing w:before="0" w:after="0" w:line="240" w:lineRule="auto"/>
+            </w:pPr>
+            <w:r>
+              <w:rPr>
+                <w:rFonts w:ascii="Arial" w:hAnsi="Arial"/>
+                <w:sz w:val="16"/>
+              </w:rPr>
+              <w:t>Yes</w:t>
+            </w:r>
+          </w:p>
+        </w:tc>
+        <w:tc>
+          <w:tcPr>
+            <w:tcW w:type="dxa" w:w="1181"/>
+            <w:vAlign w:val="center"/>
+          </w:tcPr>
+          <w:p>
+            <w:pPr>
+              <w:spacing w:before="0" w:after="0" w:line="240" w:lineRule="auto"/>
+            </w:pPr>
+            <w:r>
+              <w:rPr>
+                <w:rFonts w:ascii="Arial" w:hAnsi="Arial"/>
+                <w:sz w:val="16"/>
+              </w:rPr>
+              <w:t>Yes</w:t>
+            </w:r>
+          </w:p>
+        </w:tc>
+        <w:tc>
+          <w:tcPr>
+            <w:tcW w:type="dxa" w:w="1181"/>
+            <w:vAlign w:val="center"/>
+          </w:tcPr>
+          <w:p>
+            <w:pPr>
+              <w:spacing w:before="0" w:after="0" w:line="240" w:lineRule="auto"/>
+            </w:pPr>
+            <w:r>
+              <w:rPr>
+                <w:rFonts w:ascii="Arial" w:hAnsi="Arial"/>
+                <w:sz w:val="16"/>
+              </w:rPr>
+              <w:t>Forced off</w:t>
+            </w:r>
+          </w:p>
+        </w:tc>
+        <w:tc>
+          <w:tcPr>
+            <w:tcW w:type="dxa" w:w="2448"/>
+            <w:vAlign w:val="center"/>
+          </w:tcPr>
+          <w:p>
+            <w:pPr>
+              <w:spacing w:before="0" w:after="0" w:line="240" w:lineRule="auto"/>
+            </w:pPr>
+            <w:r>
+              <w:rPr>
+                <w:rFonts w:ascii="Arial" w:hAnsi="Arial"/>
+                <w:sz w:val="16"/>
+              </w:rPr>
+              <w:t>Forced off</w:t>
+            </w:r>
+          </w:p>
+        </w:tc>
+        <w:tc>
+          <w:tcPr>
+            <w:tcW w:type="dxa" w:w="1483"/>
+            <w:vAlign w:val="center"/>
+          </w:tcPr>
+          <w:p>
+            <w:pPr>
+              <w:spacing w:before="0" w:after="0" w:line="240" w:lineRule="auto"/>
+            </w:pPr>
+            <w:r>
+              <w:rPr>
+                <w:rFonts w:ascii="Arial" w:hAnsi="Arial"/>
+                <w:sz w:val="16"/>
+              </w:rPr>
+              <w:t>Prefer stopped</w:t>
+            </w:r>
+          </w:p>
+        </w:tc>
+      </w:tr>
+      <w:tr>
+        <w:trPr>
+          <w:cantSplit/>
+        </w:trPr>
+        <w:tc>
+          <w:tcPr>
+            <w:tcW w:type="dxa" w:w="1512"/>
+            <w:vAlign w:val="center"/>
+            <w:shd w:fill="D9EAF7"/>
+          </w:tcPr>
+          <w:p>
+            <w:pPr>
+              <w:spacing w:before="0" w:after="0" w:line="240" w:lineRule="auto"/>
+            </w:pPr>
+            <w:r>
+              <w:rPr>
+                <w:rFonts w:ascii="Arial" w:hAnsi="Arial"/>
+                <w:b/>
+                <w:sz w:val="16"/>
+              </w:rPr>
+              <w:t>Operational radar</w:t>
+            </w:r>
+          </w:p>
+        </w:tc>
+        <w:tc>
+          <w:tcPr>
+            <w:tcW w:type="dxa" w:w="1123"/>
+            <w:vAlign w:val="center"/>
+            <w:shd w:fill="D9EAF7"/>
+          </w:tcPr>
+          <w:p>
+            <w:pPr>
+              <w:spacing w:before="0" w:after="0" w:line="240" w:lineRule="auto"/>
+            </w:pPr>
+            <w:r>
+              <w:rPr>
+                <w:rFonts w:ascii="Arial" w:hAnsi="Arial"/>
+                <w:sz w:val="16"/>
+              </w:rPr>
+              <w:t>Yes</w:t>
+            </w:r>
+          </w:p>
+        </w:tc>
+        <w:tc>
+          <w:tcPr>
+            <w:tcW w:type="dxa" w:w="1181"/>
+            <w:vAlign w:val="center"/>
+            <w:shd w:fill="D9EAF7"/>
+          </w:tcPr>
+          <w:p>
+            <w:pPr>
+              <w:spacing w:before="0" w:after="0" w:line="240" w:lineRule="auto"/>
+            </w:pPr>
+            <w:r>
+              <w:rPr>
+                <w:rFonts w:ascii="Arial" w:hAnsi="Arial"/>
+                <w:sz w:val="16"/>
+              </w:rPr>
+              <w:t>Yes</w:t>
+            </w:r>
+          </w:p>
+        </w:tc>
+        <w:tc>
+          <w:tcPr>
+            <w:tcW w:type="dxa" w:w="1181"/>
+            <w:vAlign w:val="center"/>
+            <w:shd w:fill="D9EAF7"/>
+          </w:tcPr>
+          <w:p>
+            <w:pPr>
+              <w:spacing w:before="0" w:after="0" w:line="240" w:lineRule="auto"/>
+            </w:pPr>
+            <w:r>
+              <w:rPr>
+                <w:rFonts w:ascii="Arial" w:hAnsi="Arial"/>
+                <w:sz w:val="16"/>
+              </w:rPr>
+              <w:t>Timed</w:t>
+            </w:r>
+          </w:p>
+        </w:tc>
+        <w:tc>
+          <w:tcPr>
+            <w:tcW w:type="dxa" w:w="2448"/>
+            <w:vAlign w:val="center"/>
+            <w:shd w:fill="D9EAF7"/>
+          </w:tcPr>
+          <w:p>
+            <w:pPr>
+              <w:spacing w:before="0" w:after="0" w:line="240" w:lineRule="auto"/>
+            </w:pPr>
+            <w:r>
+              <w:rPr>
+                <w:rFonts w:ascii="Arial" w:hAnsi="Arial"/>
+                <w:sz w:val="16"/>
+              </w:rPr>
+              <w:t>Timed</w:t>
+            </w:r>
+          </w:p>
+        </w:tc>
+        <w:tc>
+          <w:tcPr>
+            <w:tcW w:type="dxa" w:w="1483"/>
+            <w:vAlign w:val="center"/>
+            <w:shd w:fill="D9EAF7"/>
+          </w:tcPr>
+          <w:p>
+            <w:pPr>
+              <w:spacing w:before="0" w:after="0" w:line="240" w:lineRule="auto"/>
+            </w:pPr>
+            <w:r>
+              <w:rPr>
+                <w:rFonts w:ascii="Arial" w:hAnsi="Arial"/>
+                <w:sz w:val="16"/>
+              </w:rPr>
+              <w:t>Operational</w:t>
+            </w:r>
+          </w:p>
+        </w:tc>
+      </w:tr>
+    </w:tbl>
     <w:p>
       <w:pPr>
         <w:jc w:val="center"/>
@@ -6503,7 +7204,7 @@
         <w:pStyle w:val="ListBullet"/>
       </w:pPr>
       <w:r>
-        <w:t>Keep receive-only as the fail-closed no-profile application mode; timed TX and ATR are enabled only by explicit guarded operating profiles.</w:t>
+        <w:t>Keep HARD as the fail-closed receive-only application mode. Timed TX is enabled only by a separately guarded RF profile, and external ATR is enabled only by a separately guarded ATR/TRM profile.</w:t>
       </w:r>
     </w:p>
     <w:p>
@@ -6541,7 +7242,21 @@
     <w:p>
       <w:pPr/>
       <w:r>
-        <w:t>The operational application separates capability from authorisation. Receive-only startup exposes no timed transmit or ATR capability. Guarded loopback profiles enable timed TX/RX only after explicit acknowledgements of RF output, the TX/RX-to-RX2 attenuated cable path and external-hardware state. ATR-enabled diagnostic profiles additionally require confirmation of the CRO-verified mapping. Any profile that intentionally overlaps ATR states is simulation/diagnostic-only and shall never be connected to the TRM or PA.</w:t>
+        <w:t>The application separates capability from authorisation. SIM opens neither Ettus nor SocketCAN. HARD opens the Ettus receiver and operational X6-60 but exposes no timed transmit or external ATR capability. Guarded RF LOOPBACK enables timed Ettus TX/RX only after explicit acknowledgement of RF output, the TX/RX-to-RX2 attenuated cable path, and physical disconnection or inhibition of the antenna, TRM and PA. ATR-enabled diagnostic and future operational-radar profiles are separate authorisation domains and require confirmation of the CRO-verified mapping. Any profile that intentionally overlaps ATR states is simulation/diagnostic-only and shall never be connected to the TRM or PA.</w:t>
+      </w:r>
+    </w:p>
+    <w:p>
+      <w:pPr>
+        <w:pStyle w:val="Heading2"/>
+      </w:pPr>
+      <w:r>
+        <w:t>13.12 ATR-isolated guarded RF loopback</w:t>
+      </w:r>
+    </w:p>
+    <w:p>
+      <w:pPr/>
+      <w:r>
+        <w:t>The guarded RF-loopback profile shall use the B200mini's timed transmit and receive streamers while configuring both external GPIO control lines—TX ATR on J6 pin 3/GPIO_1 and RX ATR on J6 pin 4/GPIO_2—as inactive outputs. The RX ATR line controls only external receive hardware; forcing it inactive does not disable the Ettus RX2 receiver. Before the first timed transmit, software shall verify that external ATR control is disabled and refuse to arm the profile if this condition is not met. Normal shutdown, operator cancellation, and every exception path shall force both lines inactive again. The X6-60 should remain stopped for the initial loopback acceptance test; moving-platform loopback is a later, separately controlled integration test.</w:t>
       </w:r>
     </w:p>
     <w:p>
@@ -8738,6 +9453,20 @@
     </w:p>
     <w:p>
       <w:pPr>
+        <w:pStyle w:val="Heading2"/>
+      </w:pPr>
+      <w:r>
+        <w:t>14.8 Loopback ATR timing disposition</w:t>
+      </w:r>
+    </w:p>
+    <w:p>
+      <w:pPr/>
+      <w:r>
+        <w:t>In RF LOOPBACK, the DwellPlan retains the verified 4 kHz/64-pulse Golay timing, 5 ms command lead, depth-20 finite queue, timed TX burst, and timed RX window. The TX and RX ATR intervals remain part of the timing model for later external-hardware integration, but neither interval is driven onto the physical ATR pins during the loopback profile. Consequently, detection of the attenuated cable target verifies the Ettus waveform, transport, capture and processing path only; it does not verify TRM switching, PA sequencing, receiver recovery, or operational range calibration.</w:t>
+      </w:r>
+    </w:p>
+    <w:p>
+      <w:pPr>
         <w:pStyle w:val="Heading1"/>
       </w:pPr>
       <w:r>
@@ -9453,6 +10182,12 @@
       </w:pPr>
       <w:r>
         <w:t>16.3 Shutdown</w:t>
+      </w:r>
+    </w:p>
+    <w:p>
+      <w:pPr/>
+      <w:r>
+        <w:t>All source shutdown paths shall stop further timed transmissions, close active streamers, and force both external ATR outputs inactive. A failure to establish or verify the inactive ATR state is an arming fault for RF LOOPBACK, not a warning. The application shall remain stopped and report that transmit authorisation was refused.</w:t>
       </w:r>
     </w:p>
     <w:p>
@@ -9547,7 +10282,7 @@
         <w:pStyle w:val="Heading2"/>
       </w:pPr>
       <w:r>
-        <w:t>17.2 Completed verification through Version 0.8</w:t>
+        <w:t>17.2 Completed verification through Version 0.9</w:t>
       </w:r>
     </w:p>
     <w:p>
@@ -9608,10 +10343,26 @@
     </w:p>
     <w:p>
       <w:pPr>
+        <w:pStyle w:val="ListBullet"/>
+      </w:pPr>
+      <w:r>
+        <w:t>The stopped-only SIM/HARD selector has been exercised with orderly restart: SIM pairs the simulated radar and X6-60, HARD pairs Ettus receive-only with the operational X6-60, and cancellation preserves the current safe mode.</w:t>
+      </w:r>
+    </w:p>
+    <w:p>
+      <w:pPr>
         <w:pStyle w:val="Heading2"/>
       </w:pPr>
       <w:r>
         <w:t>17.3 Remaining integration and high-power verification</w:t>
+      </w:r>
+    </w:p>
+    <w:p>
+      <w:pPr>
+        <w:pStyle w:val="ListBullet"/>
+      </w:pPr>
+      <w:r>
+        <w:t>Guarded RF-loopback acceptance shall verify a detectable attenuated target with both external ATR outputs held inactive throughout arming, acquisition, cancellation and shutdown. A CRO or logic measurement shall confirm the inactive GPIO state independently of successful IQ capture.</w:t>
       </w:r>
     </w:p>
     <w:p>
@@ -12787,6 +13538,110 @@
           </w:p>
         </w:tc>
       </w:tr>
+      <w:tr>
+        <w:tc>
+          <w:tcPr>
+            <w:tcW w:type="dxa" w:w="1250"/>
+          </w:tcPr>
+          <w:p>
+            <w:r>
+              <w:t>VX-SAFE-001</w:t>
+            </w:r>
+          </w:p>
+        </w:tc>
+        <w:tc>
+          <w:tcPr>
+            <w:tcW w:type="dxa" w:w="2600"/>
+          </w:tcPr>
+          <w:p>
+            <w:r>
+              <w:t>Guarded RF LOOPBACK shall force TX ATR and RX ATR inactive before timed transmit and throughout shutdown/fault handling.</w:t>
+            </w:r>
+          </w:p>
+        </w:tc>
+        <w:tc>
+          <w:tcPr>
+            <w:tcW w:type="dxa" w:w="1400"/>
+          </w:tcPr>
+          <w:p>
+            <w:r>
+              <w:t>Sections 13.11, 13.12, 14.8 and 16.3</w:t>
+            </w:r>
+          </w:p>
+        </w:tc>
+        <w:tc>
+          <w:tcPr>
+            <w:tcW w:type="dxa" w:w="2300"/>
+          </w:tcPr>
+          <w:p>
+            <w:r>
+              <w:t>Ettus operating profile and source GPIO shutdown logic</w:t>
+            </w:r>
+          </w:p>
+        </w:tc>
+        <w:tc>
+          <w:tcPr>
+            <w:tcW w:type="dxa" w:w="2290"/>
+          </w:tcPr>
+          <w:p>
+            <w:r>
+              <w:t>GPIO readback plus CRO/logic verification with attenuated TX/RX-to-RX2 cable path</w:t>
+            </w:r>
+          </w:p>
+        </w:tc>
+      </w:tr>
+      <w:tr>
+        <w:tc>
+          <w:tcPr>
+            <w:tcW w:type="dxa" w:w="1250"/>
+          </w:tcPr>
+          <w:p>
+            <w:r>
+              <w:t>VX-MODE-001</w:t>
+            </w:r>
+          </w:p>
+        </w:tc>
+        <w:tc>
+          <w:tcPr>
+            <w:tcW w:type="dxa" w:w="2600"/>
+          </w:tcPr>
+          <w:p>
+            <w:r>
+              <w:t>SIM and HARD selections shall change radar and X6-60 adapters together; HARD shall remain receive-only.</w:t>
+            </w:r>
+          </w:p>
+        </w:tc>
+        <w:tc>
+          <w:tcPr>
+            <w:tcW w:type="dxa" w:w="1400"/>
+          </w:tcPr>
+          <w:p>
+            <w:r>
+              <w:t>Sections 9.4, 9.5 and 13.11</w:t>
+            </w:r>
+          </w:p>
+        </w:tc>
+        <w:tc>
+          <w:tcPr>
+            <w:tcW w:type="dxa" w:w="2300"/>
+          </w:tcPr>
+          <w:p>
+            <w:r>
+              <w:t>VanguardxMain_scheduler.py; RadarDisplayQt5.py</w:t>
+            </w:r>
+          </w:p>
+        </w:tc>
+        <w:tc>
+          <w:tcPr>
+            <w:tcW w:type="dxa" w:w="2290"/>
+          </w:tcPr>
+          <w:p>
+            <w:r>
+              <w:t>Stopped-only mode-switch, confirmation, restart and no-hardware-open regressions</w:t>
+            </w:r>
+          </w:p>
+        </w:tc>
+      </w:tr>
     </w:tbl>
     <w:p>
       <w:pPr>
@@ -13816,6 +14671,48 @@
           </w:tcPr>
           <w:p>
             <w:r>
+              <w:t>Superseded</w:t>
+            </w:r>
+          </w:p>
+        </w:tc>
+      </w:tr>
+      <w:tr>
+        <w:tc>
+          <w:tcPr>
+            <w:tcW w:type="dxa" w:w="2520"/>
+          </w:tcPr>
+          <w:p>
+            <w:r>
+              <w:t>0.9</w:t>
+            </w:r>
+          </w:p>
+        </w:tc>
+        <w:tc>
+          <w:tcPr>
+            <w:tcW w:type="dxa" w:w="2520"/>
+          </w:tcPr>
+          <w:p>
+            <w:r>
+              <w:t>Paired SIM/HARD runtime selection and ATR-isolated guarded RF-loopback architecture</w:t>
+            </w:r>
+          </w:p>
+        </w:tc>
+        <w:tc>
+          <w:tcPr>
+            <w:tcW w:type="dxa" w:w="2520"/>
+          </w:tcPr>
+          <w:p>
+            <w:r>
+              <w:t>HARD remains receive-only; loopback uses low-power attenuated B200mini TX/RX with TX ATR and RX ATR forced inactive; TRM/PA disconnected</w:t>
+            </w:r>
+          </w:p>
+        </w:tc>
+        <w:tc>
+          <w:tcPr>
+            <w:tcW w:type="dxa" w:w="2520"/>
+          </w:tcPr>
+          <w:p>
+            <w:r>
               <w:t>Current architecture baseline</w:t>
             </w:r>
           </w:p>
@@ -13941,7 +14838,7 @@
         <w:pStyle w:val="ListBullet"/>
       </w:pPr>
       <w:r>
-        <w:t>Run the full scheduler with both live X6-60 motion and the proven guarded timed loopback target, then verify target bearing against encoder bearing on the North-up PPI.</w:t>
+        <w:t>Implement and accept the separate guarded RF LOOPBACK mode first: timed Ettus TX/RX, verified attenuation, both external ATR outputs forced inactive, TRM/PA disconnected, and the X6-60 stopped. Only then combine the proven loopback source with live X6-60 motion to verify displayed target bearing against encoder bearing.</w:t>
       </w:r>
     </w:p>
     <w:p>
@@ -14581,6 +15478,26 @@
       </w:pPr>
       <w:r>
         <w:t>Decision and rationale: Use x=range*sin(bearing) and y=range*cos(bearing) so 0/North is top and bearings increase clockwise. Apply the same conversion to the beam, sectors, detections, plots, tracks, labels and mouse selection.</w:t>
+      </w:r>
+    </w:p>
+    <w:p>
+      <w:pPr>
+        <w:pStyle w:val="Heading2"/>
+      </w:pPr>
+      <w:r>
+        <w:t>ADR-0025: Separate hardware receive and ATR-isolated RF loopback</w:t>
+      </w:r>
+    </w:p>
+    <w:p>
+      <w:pPr/>
+      <w:r>
+        <w:t>Status: Accepted</w:t>
+      </w:r>
+    </w:p>
+    <w:p>
+      <w:pPr/>
+      <w:r>
+        <w:t>Decision and rationale: Keep ordinary HARD mode receive-only with timed transmit inhibited. Provide RF LOOPBACK as a separate guarded profile that enables timed Ettus TX/RX only for the verified attenuated TX/RX-to-RX2 cable path. Force both external ATR pins inactive before arming and during every shutdown or fault path because direct Ettus loopback requires neither the external TX control nor the external RX control. This prevents a bench loopback selection from switching a connected TRM or PA and preserves a distinct, later authorisation boundary for operational radar.</w:t>
       </w:r>
     </w:p>
     <w:p>
@@ -15457,7 +16374,7 @@
       <w:jc w:val="center"/>
     </w:pPr>
     <w:r>
-      <w:t>VX-SSA-001 | Vanguard X Software &amp; System Architecture | Version 0.8</w:t>
+      <w:t>VX-SSA-001 | Vanguard X Software &amp; System Architecture | Version 0.9</w:t>
     </w:r>
   </w:p>
 </w:hdr>

</xml_diff>